<commit_message>
fix: regenerate DOCX with working PlantUML diagrams
- Fixed PlantUML encoding: use ~1 prefix for Huffman encoding
- All 7 diagrams generated via MCP tool (valid PNG, not error pages)
- DOCX image paths fixed: .svg -> .png
- Generated 336KB DOCX with embedded diagrams

Co-Authored-By: Claude Opus 4.7 <noreply@anthropic.com>
</commit_message>
<xml_diff>
--- a/output/booking_module.docx
+++ b/output/booking_module.docx
@@ -2148,7 +2148,7 @@
       <w:r>
         <w:drawing>
           <wp:inline xmlns:a="http://schemas.openxmlformats.org/drawingml/2006/main" xmlns:pic="http://schemas.openxmlformats.org/drawingml/2006/picture">
-            <wp:extent cx="5486400" cy="3177801"/>
+            <wp:extent cx="5486400" cy="8087040"/>
             <wp:docPr id="1" name="Picture 1"/>
             <wp:cNvGraphicFramePr>
               <a:graphicFrameLocks noChangeAspect="1"/>
@@ -2169,7 +2169,7 @@
                   <pic:spPr>
                     <a:xfrm>
                       <a:off x="0" y="0"/>
-                      <a:ext cx="5486400" cy="3177801"/>
+                      <a:ext cx="5486400" cy="8087040"/>
                     </a:xfrm>
                     <a:prstGeom prst="rect"/>
                   </pic:spPr>
@@ -2904,7 +2904,7 @@
       <w:r>
         <w:drawing>
           <wp:inline xmlns:a="http://schemas.openxmlformats.org/drawingml/2006/main" xmlns:pic="http://schemas.openxmlformats.org/drawingml/2006/picture">
-            <wp:extent cx="5486400" cy="3177801"/>
+            <wp:extent cx="5486400" cy="5492456"/>
             <wp:docPr id="2" name="Picture 2"/>
             <wp:cNvGraphicFramePr>
               <a:graphicFrameLocks noChangeAspect="1"/>
@@ -2925,7 +2925,7 @@
                   <pic:spPr>
                     <a:xfrm>
                       <a:off x="0" y="0"/>
-                      <a:ext cx="5486400" cy="3177801"/>
+                      <a:ext cx="5486400" cy="5492456"/>
                     </a:xfrm>
                     <a:prstGeom prst="rect"/>
                   </pic:spPr>
@@ -5727,7 +5727,7 @@
       <w:r>
         <w:drawing>
           <wp:inline xmlns:a="http://schemas.openxmlformats.org/drawingml/2006/main" xmlns:pic="http://schemas.openxmlformats.org/drawingml/2006/picture">
-            <wp:extent cx="5486400" cy="3741043"/>
+            <wp:extent cx="5486400" cy="4884084"/>
             <wp:docPr id="3" name="Picture 3"/>
             <wp:cNvGraphicFramePr>
               <a:graphicFrameLocks noChangeAspect="1"/>
@@ -5748,7 +5748,7 @@
                   <pic:spPr>
                     <a:xfrm>
                       <a:off x="0" y="0"/>
-                      <a:ext cx="5486400" cy="3741043"/>
+                      <a:ext cx="5486400" cy="4884084"/>
                     </a:xfrm>
                     <a:prstGeom prst="rect"/>
                   </pic:spPr>
@@ -5789,7 +5789,7 @@
       <w:r>
         <w:drawing>
           <wp:inline xmlns:a="http://schemas.openxmlformats.org/drawingml/2006/main" xmlns:pic="http://schemas.openxmlformats.org/drawingml/2006/picture">
-            <wp:extent cx="5486400" cy="3518528"/>
+            <wp:extent cx="5486400" cy="4051883"/>
             <wp:docPr id="4" name="Picture 4"/>
             <wp:cNvGraphicFramePr>
               <a:graphicFrameLocks noChangeAspect="1"/>
@@ -5810,7 +5810,7 @@
                   <pic:spPr>
                     <a:xfrm>
                       <a:off x="0" y="0"/>
-                      <a:ext cx="5486400" cy="3518528"/>
+                      <a:ext cx="5486400" cy="4051883"/>
                     </a:xfrm>
                     <a:prstGeom prst="rect"/>
                   </pic:spPr>
@@ -6029,7 +6029,7 @@
       <w:r>
         <w:drawing>
           <wp:inline xmlns:a="http://schemas.openxmlformats.org/drawingml/2006/main" xmlns:pic="http://schemas.openxmlformats.org/drawingml/2006/picture">
-            <wp:extent cx="5486400" cy="2948332"/>
+            <wp:extent cx="5486400" cy="3453063"/>
             <wp:docPr id="5" name="Picture 5"/>
             <wp:cNvGraphicFramePr>
               <a:graphicFrameLocks noChangeAspect="1"/>
@@ -6050,7 +6050,7 @@
                   <pic:spPr>
                     <a:xfrm>
                       <a:off x="0" y="0"/>
-                      <a:ext cx="5486400" cy="2948332"/>
+                      <a:ext cx="5486400" cy="3453063"/>
                     </a:xfrm>
                     <a:prstGeom prst="rect"/>
                   </pic:spPr>
@@ -6203,7 +6203,7 @@
       <w:r>
         <w:drawing>
           <wp:inline xmlns:a="http://schemas.openxmlformats.org/drawingml/2006/main" xmlns:pic="http://schemas.openxmlformats.org/drawingml/2006/picture">
-            <wp:extent cx="5486400" cy="3407270"/>
+            <wp:extent cx="5486400" cy="3699012"/>
             <wp:docPr id="6" name="Picture 6"/>
             <wp:cNvGraphicFramePr>
               <a:graphicFrameLocks noChangeAspect="1"/>
@@ -6224,7 +6224,7 @@
                   <pic:spPr>
                     <a:xfrm>
                       <a:off x="0" y="0"/>
-                      <a:ext cx="5486400" cy="3407270"/>
+                      <a:ext cx="5486400" cy="3699012"/>
                     </a:xfrm>
                     <a:prstGeom prst="rect"/>
                   </pic:spPr>
@@ -6413,7 +6413,7 @@
       <w:r>
         <w:drawing>
           <wp:inline xmlns:a="http://schemas.openxmlformats.org/drawingml/2006/main" xmlns:pic="http://schemas.openxmlformats.org/drawingml/2006/picture">
-            <wp:extent cx="5486400" cy="2948332"/>
+            <wp:extent cx="5486400" cy="4284174"/>
             <wp:docPr id="7" name="Picture 7"/>
             <wp:cNvGraphicFramePr>
               <a:graphicFrameLocks noChangeAspect="1"/>
@@ -6434,7 +6434,7 @@
                   <pic:spPr>
                     <a:xfrm>
                       <a:off x="0" y="0"/>
-                      <a:ext cx="5486400" cy="2948332"/>
+                      <a:ext cx="5486400" cy="4284174"/>
                     </a:xfrm>
                     <a:prstGeom prst="rect"/>
                   </pic:spPr>

</xml_diff>

<commit_message>
fix: wireframe naming — entity attribute headers + correct component suffixes
Updated section-booking-iii.3.1.md:
- Table headers use Entity attribute names (maPhong, loaiPhong, trangThai)
  NOT UI display names (Phong, Loai, Trang thai)
- Component suffixes: Page (pages), Form (input forms), Modal (dialogs)
  NOT View for everything
- Added 2 new screens: CancelBookingPage, CheckInPage
- Total: 7 screens (was 5)

Updated DOCX with working diagrams and correct wireframes.

Co-Authored-By: Claude Opus 4.7 <noreply@anthropic.com>
</commit_message>
<xml_diff>
--- a/output/booking_module.docx
+++ b/output/booking_module.docx
@@ -2950,7 +2950,7 @@
         <w:pStyle w:val="Heading3"/>
       </w:pPr>
       <w:r>
-        <w:t>Màn hình 1: ReceptionistHomeView — Giao diện chính lễ tân</w:t>
+        <w:t>Màn hình 1: ReceptionistHomePage — Giao diện chính lễ tân</w:t>
       </w:r>
     </w:p>
     <w:p>
@@ -2971,11 +2971,11 @@
         </w:rPr>
         <w:t>+------------------------------------------------------------------+</w:t>
         <w:br/>
-        <w:t>|  [Logo]  Quản lý Karaoke ABC            [Nhân viên: Nguyễn Văn A]|</w:t>
+        <w:t>|  [Logo]  Quan ly Karaoke ABC            [Nhan vien: Nguyen Van A]|</w:t>
         <w:br/>
         <w:t>+------------------------------------------------------------------+</w:t>
         <w:br/>
-        <w:t>|  Chi nhánh: Quận 1                        Ngày: 30/05/2026       |</w:t>
+        <w:t>|  Chi nhanh: Quan 1                        Ngay: 30/05/2026       |</w:t>
         <w:br/>
         <w:t>+------------------------------------------------------------------+</w:t>
         <w:br/>
@@ -2983,27 +2983,27 @@
         <w:br/>
         <w:t>|  +------------------+  +------------------+  +------------------+  |</w:t>
         <w:br/>
-        <w:t>|  |   ĐẶT PHÒNG     |  |   CHECK-IN       |  |   CHECK-OUT      |  |</w:t>
+        <w:t>|  |   DAT PHONG      |  |   CHECK-IN       |  |   CHECK-OUT      |  |</w:t>
         <w:br/>
-        <w:t>|  |   [Click để đặt] |  |   [Click để C.I] |  |   [Click để C.O] |  |</w:t>
+        <w:t>|  |   [Click de dat] |  |   [Click de C.I] |  |   [Click de C.O] |  |</w:t>
         <w:br/>
         <w:t>|  +------------------+  +------------------+  +------------------+  |</w:t>
         <w:br/>
         <w:t>|                                                                    |</w:t>
         <w:br/>
-        <w:t>|  Danh sách booking hôm nay:                                        |</w:t>
+        <w:t>|  Danh sach booking hom nay:                                        |</w:t>
         <w:br/>
         <w:t>|  +--------------------------------------------------------------+  |</w:t>
         <w:br/>
-        <w:t>|  | Mã BK  | Khách hàng   | Phòng  | Giờ đặt  | Trạng thái    |  |</w:t>
+        <w:t>|  | maBK | khachHang  | phong  | gioDat    | trangThai         |  |</w:t>
         <w:br/>
-        <w:t>|  |--------|------------- |--------|-----------|---------------|  |</w:t>
+        <w:t>|  |------|------------|--------|-----------|-------------------|  |</w:t>
         <w:br/>
-        <w:t>|  | BK001  | Nguyễn V.A   | P.VIP1 | 14:00     | Chờ nhận      |  |</w:t>
+        <w:t>|  | BK001| Nguyen V.A | P.VIP1 | 14:00     | Cho nhan          |  |</w:t>
         <w:br/>
-        <w:t>|  | BK002  | Trần T.B     | P.Std3 | 15:00     | Đang hoạt động|  |</w:t>
+        <w:t>|  | BK002| Tran T.B   | P.Std3 | 15:00     | Dang hoat dong    |  |</w:t>
         <w:br/>
-        <w:t>|  | BK003  | Lê M.C       | P.VIP2 | 16:00     | Chờ nhận      |  |</w:t>
+        <w:t>|  | BK003| Le M.C     | P.VIP2 | 16:00     | Cho nhan          |  |</w:t>
         <w:br/>
         <w:t>|  +--------------------------------------------------------------+  |</w:t>
         <w:br/>
@@ -3017,7 +3017,7 @@
         <w:pStyle w:val="Heading3"/>
       </w:pPr>
       <w:r>
-        <w:t>Màn hình 2: SearchFreeRoomView — Tìm phòng trống</w:t>
+        <w:t>Màn hình 2: SearchFreeRoomForm — Tìm phòng trống</w:t>
       </w:r>
     </w:p>
     <w:p>
@@ -3038,43 +3038,43 @@
         </w:rPr>
         <w:t>+------------------------------------------------------------------+</w:t>
         <w:br/>
-        <w:t>|  [&lt; Quay lại]   Tìm phòng trống                                   |</w:t>
+        <w:t>|  [&lt; Quay lai]   Tim phong trong                                  |</w:t>
         <w:br/>
         <w:t>+------------------------------------------------------------------+</w:t>
         <w:br/>
         <w:t>|                                                                    |</w:t>
         <w:br/>
-        <w:t>|  Thời gian đặt:  [30/05/2026]  Từ: [14:00]  Đến: [17:00]        |</w:t>
+        <w:t>|  Thoi gian dat:  [30/05/2026]  Tu: [14:00]  Den: [17:00]        |</w:t>
         <w:br/>
-        <w:t>|  Chi nhánh:       [Quận 1        v]                                |</w:t>
+        <w:t>|  Chi nhanh:      [Quan 1       v]                                 |</w:t>
         <w:br/>
-        <w:t>|  Loại phòng:      [Tất cả        v]                                |</w:t>
+        <w:t>|  Loai phong:     [Tat ca        v]                                |</w:t>
         <w:br/>
         <w:t>|                                                                    |</w:t>
         <w:br/>
-        <w:t>|  [Tìm phòng trống]                                                 |</w:t>
+        <w:t>|  [Tim phong trong]                                                 |</w:t>
         <w:br/>
         <w:t>|                                                                    |</w:t>
         <w:br/>
-        <w:t>|  Kết quả: 3 phòng trống                                            |</w:t>
+        <w:t>|  Ket qua: 3 phong trong                                            |</w:t>
         <w:br/>
         <w:t>|  +--------------------------------------------------------------+  |</w:t>
         <w:br/>
-        <w:t>|  | Phòng   | Loại      | Sức chứa | Giá/giờ  | Trạng thái     |  |</w:t>
+        <w:t>|  | maPhong | loaiPhong  | sucChua | giaTheoGio | trangThai     |  |</w:t>
         <w:br/>
-        <w:t>|  |---------|-----------|----------|----------|----------------|  |</w:t>
+        <w:t>|  |---------|------------|---------|------------|---------------|  |</w:t>
         <w:br/>
-        <w:t>|  | P.VIP1  | Super VIP | 15 người | 200.000đ | Trống          |  |</w:t>
+        <w:t>|  | P.VIP1  | Super VIP  | 15      | 200000     | Trong         |  |</w:t>
         <w:br/>
-        <w:t>|  | P.Std3  | Standard  | 8 người  | 100.000đ | Trống          |  |</w:t>
+        <w:t>|  | P.Std3  | Standard   | 8       | 100000     | Trong         |  |</w:t>
         <w:br/>
-        <w:t>|  | P.VIP2  | VIP       | 12 người | 150.000đ | Trống          |  |</w:t>
+        <w:t>|  | P.VIP2  | VIP        | 12      | 150000     | Trong         |  |</w:t>
         <w:br/>
         <w:t>|  +--------------------------------------------------------------+  |</w:t>
         <w:br/>
         <w:t>|                                                                    |</w:t>
         <w:br/>
-        <w:t>|  [Chọn phòng]                                                      |</w:t>
+        <w:t>|  [Chon phong]                                                      |</w:t>
         <w:br/>
         <w:t>+------------------------------------------------------------------+</w:t>
       </w:r>
@@ -3084,7 +3084,7 @@
         <w:pStyle w:val="Heading3"/>
       </w:pPr>
       <w:r>
-        <w:t>Màn hình 3: SearchClientView — Tìm thông tin khách hàng</w:t>
+        <w:t>Màn hình 3: SearchClientForm — Tìm thông tin khách hàng</w:t>
       </w:r>
     </w:p>
     <w:p>
@@ -3105,45 +3105,45 @@
         </w:rPr>
         <w:t>+------------------------------------------------------------------+</w:t>
         <w:br/>
-        <w:t>|  [&lt; Quay lại]   Tìm khách hàng                                    |</w:t>
+        <w:t>|  [&lt; Quay lai]   Tim khach hang                                   |</w:t>
         <w:br/>
         <w:t>+------------------------------------------------------------------+</w:t>
         <w:br/>
         <w:t>|                                                                    |</w:t>
         <w:br/>
-        <w:t>|  Phòng đã chọn: P.VIP1 (Super VIP, 200.000đ/giờ)                |</w:t>
+        <w:t>|  Phong da chon: P.VIP1 (Super VIP, 200000/gio)                   |</w:t>
         <w:br/>
-        <w:t>|  Thời gian: 30/05/2026, 14:00 - 17:00                            |</w:t>
+        <w:t>|  Thoi gian: 30/05/2026, 14:00 - 17:00                            |</w:t>
         <w:br/>
         <w:t>|                                                                    |</w:t>
         <w:br/>
-        <w:t>|  Thông tin khách hàng:                                             |</w:t>
+        <w:t>|  Thong tin khach hang:                                             |</w:t>
         <w:br/>
-        <w:t>|  Họ tên:       [Nguyễn Văn An          ]                          |</w:t>
+        <w:t>|  hoTen:        [Nguyen Van An           ]                         |</w:t>
         <w:br/>
-        <w:t>|  Số điện thoại: [0912345678             ]                          |</w:t>
+        <w:t>|  soDienThoai:  [0912345678              ]                         |</w:t>
         <w:br/>
         <w:t>|                                                                    |</w:t>
         <w:br/>
-        <w:t>|  [Tìm kiếm]                                                        |</w:t>
+        <w:t>|  [Tim kiem]                                                        |</w:t>
         <w:br/>
         <w:t>|                                                                    |</w:t>
         <w:br/>
-        <w:t>|  Kết quả:                                                          |</w:t>
+        <w:t>|  Ket qua:                                                          |</w:t>
         <w:br/>
         <w:t>|  +--------------------------------------------------------------+  |</w:t>
         <w:br/>
-        <w:t>|  | Họ tên         | SĐT        | Hạng    | Điểm   | Chọn      |  |</w:t>
+        <w:t>|  | hoTen          | soDienThoai | hangHoiVien | diemTichLuy    |  |</w:t>
         <w:br/>
-        <w:t>|  |----------------|------------|---------|--------|-----------|  |</w:t>
+        <w:t>|  |----------------|-------------|-------------|----------------|  |</w:t>
         <w:br/>
-        <w:t>|  | Nguyễn Văn An  | 0912345678 | Bạc     | 1250   | [Chọn]    |  |</w:t>
+        <w:t>|  | Nguyen Van An  | 0912345678  | Bac         | 1250           |  |</w:t>
         <w:br/>
         <w:t>|  +--------------------------------------------------------------+  |</w:t>
         <w:br/>
         <w:t>|                                                                    |</w:t>
         <w:br/>
-        <w:t>|  Khách mới? [Đăng ký nhanh]                                        |</w:t>
+        <w:t>|  Khach moi? [Dang ky nhanh]                                        |</w:t>
         <w:br/>
         <w:t>+------------------------------------------------------------------+</w:t>
       </w:r>
@@ -3153,7 +3153,7 @@
         <w:pStyle w:val="Heading3"/>
       </w:pPr>
       <w:r>
-        <w:t>Màn hình 4: ConfirmView — Xác nhận đặt phòng</w:t>
+        <w:t>Màn hình 4: ConfirmBookingModal — Xác nhận đặt phòng</w:t>
       </w:r>
     </w:p>
     <w:p>
@@ -3174,7 +3174,7 @@
         </w:rPr>
         <w:t>+------------------------------------------------------------------+</w:t>
         <w:br/>
-        <w:t>|  [&lt; Quay lại]   Xác nhận đặt phòng                                |</w:t>
+        <w:t>|  [&lt; Quay lai]   Xac nhan dat phong                                |</w:t>
         <w:br/>
         <w:t>+------------------------------------------------------------------+</w:t>
         <w:br/>
@@ -3182,29 +3182,29 @@
         <w:br/>
         <w:t>|  +--------------------------------------------------------------+  |</w:t>
         <w:br/>
-        <w:t>|  | THÔNG TIN ĐẶT PHÒNG                                          |  |</w:t>
+        <w:t>|  | THONG TIN DAT PHONG                                          |  |</w:t>
         <w:br/>
         <w:t>|  |----------------------------------------------------------------|  |</w:t>
         <w:br/>
-        <w:t>|  | Khách hàng:    Nguyễn Văn An (0912345678)                     |  |</w:t>
+        <w:t>|  | khachHang:     Nguyen Van An (0912345678)                     |  |</w:t>
         <w:br/>
-        <w:t>|  | Hạng hội viên: Bạc (giảm 10%)                                 |  |</w:t>
+        <w:t>|  | hangHoiVien:   Bac (giam 10%)                                 |  |</w:t>
         <w:br/>
-        <w:t>|  | Phòng:         P.VIP1 - Super VIP                             |  |</w:t>
+        <w:t>|  | phong:         P.VIP1 - Super VIP                             |  |</w:t>
         <w:br/>
-        <w:t>|  | Chi nhánh:     Quận 1                                          |  |</w:t>
+        <w:t>|  | chiNhanh:      Quan 1                                          |  |</w:t>
         <w:br/>
-        <w:t>|  | Thời gian:     30/05/2026, 14:00 - 17:00 (3 giờ)             |  |</w:t>
+        <w:t>|  | thoiGian:      30/05/2026, 14:00 - 17:00 (3 gio)             |  |</w:t>
         <w:br/>
-        <w:t>|  | Đơn giá:       200.000đ/giờ                                   |  |</w:t>
+        <w:t>|  | giaTheoGio:    200000                                         |  |</w:t>
         <w:br/>
-        <w:t>|  | Dự kiến:       600.000đ                                       |  |</w:t>
+        <w:t>|  | duKien:        600000                                         |  |</w:t>
         <w:br/>
         <w:t>|  +--------------------------------------------------------------+  |</w:t>
         <w:br/>
         <w:t>|                                                                    |</w:t>
         <w:br/>
-        <w:t>|  [Xác nhận đặt phòng]    [Hủy]                                    |</w:t>
+        <w:t>|  [Xac nhan dat phong]    [Huy]                                    |</w:t>
         <w:br/>
         <w:t>+------------------------------------------------------------------+</w:t>
       </w:r>
@@ -3214,7 +3214,7 @@
         <w:pStyle w:val="Heading3"/>
       </w:pPr>
       <w:r>
-        <w:t>Màn hình 5: CheckOutView — Thanh toán check-out</w:t>
+        <w:t>Màn hình 5: CheckOutPage — Thanh toán check-out</w:t>
       </w:r>
     </w:p>
     <w:p>
@@ -3235,7 +3235,7 @@
         </w:rPr>
         <w:t>+------------------------------------------------------------------+</w:t>
         <w:br/>
-        <w:t>|  [&lt; Quay lại]   Check-out - Phòng P.VIP1                          |</w:t>
+        <w:t>|  [&lt; Quay lai]   Check-out - Phong P.VIP1                          |</w:t>
         <w:br/>
         <w:t>+------------------------------------------------------------------+</w:t>
         <w:br/>
@@ -3243,41 +3243,183 @@
         <w:br/>
         <w:t>|  +--------------------------------------------------------------+  |</w:t>
         <w:br/>
-        <w:t>|  | HÓA ĐƠN THANH TOÁN                                           |  |</w:t>
+        <w:t>|  | HOA DON THANH TOAN                                           |  |</w:t>
         <w:br/>
         <w:t>|  |----------------------------------------------------------------|  |</w:t>
         <w:br/>
-        <w:t>|  | Khách hàng:    Nguyễn Văn An (Bạc - giảm 10%)                |  |</w:t>
+        <w:t>|  | khachHang:     Nguyen Van An (Bac - giam 10%)                |  |</w:t>
         <w:br/>
-        <w:t>|  | Phòng:         P.VIP1                                         |  |</w:t>
+        <w:t>|  | phong:         P.VIP1                                         |  |</w:t>
         <w:br/>
-        <w:t>|  | Thời gian:     14:05 - 16:45 (2h40p)                         |  |</w:t>
+        <w:t>|  | thoiGian:      14:05 - 16:45 (2h40p)                         |  |</w:t>
         <w:br/>
         <w:t>|  |----------------------------------------------------------------|  |</w:t>
         <w:br/>
-        <w:t>|  | Tiền phòng:    200.000đ × 2.67h = 534.000đ                   |  |</w:t>
+        <w:t>|  | tienPhong:     200000 x 2.67h = 534000                       |  |</w:t>
         <w:br/>
-        <w:t>|  | Dịch vụ:       2 lon bia + 1 dĩa trái cây = 250.000đ        |  |</w:t>
+        <w:t>|  | tienDichVu:    2 lon bia + 1 dia trai cay = 250000           |  |</w:t>
         <w:br/>
-        <w:t>|  | Tổng cộng:     784.000đ                                       |  |</w:t>
+        <w:t>|  | tongCong:      784000                                         |  |</w:t>
         <w:br/>
-        <w:t>|  | Giảm giá (10%): -78.400đ                                     |  |</w:t>
+        <w:t>|  | giamGia(10%):  -78400                                        |  |</w:t>
         <w:br/>
-        <w:t>|  | THANH TOÁN:    705.600đ                                       |  |</w:t>
+        <w:t>|  | THANH TOAN:    705600                                         |  |</w:t>
         <w:br/>
         <w:t>|  +--------------------------------------------------------------+  |</w:t>
         <w:br/>
         <w:t>|                                                                    |</w:t>
         <w:br/>
-        <w:t>|  Mã voucher: [____________] [Áp dụng]                              |</w:t>
+        <w:t>|  maVoucher: [____________] [Ap dung]                               |</w:t>
         <w:br/>
         <w:t>|                                                                    |</w:t>
         <w:br/>
-        <w:t>|  Phương thức: (o) Tiền mặt  ( ) Chuyển khoản                      |</w:t>
+        <w:t>|  phuongThucThanhToan: (o) Tien mat  ( ) Chuyen khoan              |</w:t>
         <w:br/>
         <w:t>|                                                                    |</w:t>
         <w:br/>
-        <w:t>|  [Xác nhận thanh toán]    [In hóa đơn]    [Hủy]                    |</w:t>
+        <w:t>|  [Xac nhan thanh toan]    [In hoa don]    [Huy]                   |</w:t>
+        <w:br/>
+        <w:t>+------------------------------------------------------------------+</w:t>
+      </w:r>
+    </w:p>
+    <w:p>
+      <w:pPr>
+        <w:pStyle w:val="Heading3"/>
+      </w:pPr>
+      <w:r>
+        <w:t>Màn hình 6: CancelBookingPage — Quản lý đặt phòng (Huỷ)</w:t>
+      </w:r>
+    </w:p>
+    <w:p>
+      <w:pPr>
+        <w:pBdr>
+          <w:top w:val="single" w:sz="4" w:space="4" w:color="808080"/>
+          <w:left w:val="single" w:sz="4" w:space="4" w:color="808080"/>
+          <w:bottom w:val="single" w:sz="4" w:space="4" w:color="808080"/>
+          <w:right w:val="single" w:sz="4" w:space="4" w:color="808080"/>
+        </w:pBdr>
+        <w:shd w:val="clear" w:fill="F5F5F5"/>
+      </w:pPr>
+      <w:r>
+        <w:rPr>
+          <w:rFonts w:ascii="Courier New" w:hAnsi="Courier New"/>
+          <w:color w:val="000000"/>
+          <w:sz w:val="16"/>
+        </w:rPr>
+        <w:t>+------------------------------------------------------------------+</w:t>
+        <w:br/>
+        <w:t>|  [&lt; Quay lai]   Quan ly dat phong                                 |</w:t>
+        <w:br/>
+        <w:t>+------------------------------------------------------------------+</w:t>
+        <w:br/>
+        <w:t>|                                                                    |</w:t>
+        <w:br/>
+        <w:t>|  Tim kiem: [Ten khach / SDT / maBK___________] [Tim kiem]         |</w:t>
+        <w:br/>
+        <w:t>|                                                                    |</w:t>
+        <w:br/>
+        <w:t>|  Ket qua:                                                          |</w:t>
+        <w:br/>
+        <w:t>|  +--------------------------------------------------------------+  |</w:t>
+        <w:br/>
+        <w:t>|  | maBK | khachHang  | phong  | gioDat    | trangThai         |  |</w:t>
+        <w:br/>
+        <w:t>|  |------|------------|--------|-----------|-------------------|  |</w:t>
+        <w:br/>
+        <w:t>|  | BK001| Nguyen V.A | P.VIP1 | 14:00     | Cho nhan          |  |</w:t>
+        <w:br/>
+        <w:t>|  +--------------------------------------------------------------+  |</w:t>
+        <w:br/>
+        <w:t>|                                                                    |</w:t>
+        <w:br/>
+        <w:t>|  +--------------------------------------------------------------+  |</w:t>
+        <w:br/>
+        <w:t>|  | Chi tiet booking BK001                                       |  |</w:t>
+        <w:br/>
+        <w:t>|  |----------------------------------------------------------------|  |</w:t>
+        <w:br/>
+        <w:t>|  | khachHang:     Nguyen Van An (0912345678)                     |  |</w:t>
+        <w:br/>
+        <w:t>|  | phong:         P.VIP1 - Super VIP                             |  |</w:t>
+        <w:br/>
+        <w:t>|  | thoiGian:      30/05/2026, 14:00 - 17:00                     |  |</w:t>
+        <w:br/>
+        <w:t>|  | tienCoc:       200000                                         |  |</w:t>
+        <w:br/>
+        <w:t>|  +--------------------------------------------------------------+  |</w:t>
+        <w:br/>
+        <w:t>|                                                                    |</w:t>
+        <w:br/>
+        <w:t>|  [Huy dat phong]              [Quay lai]                          |</w:t>
+        <w:br/>
+        <w:t>+------------------------------------------------------------------+</w:t>
+      </w:r>
+    </w:p>
+    <w:p>
+      <w:pPr>
+        <w:pStyle w:val="Heading3"/>
+      </w:pPr>
+      <w:r>
+        <w:t>Màn hình 7: CheckInPage — Check-in phòng</w:t>
+      </w:r>
+    </w:p>
+    <w:p>
+      <w:pPr>
+        <w:pBdr>
+          <w:top w:val="single" w:sz="4" w:space="4" w:color="808080"/>
+          <w:left w:val="single" w:sz="4" w:space="4" w:color="808080"/>
+          <w:bottom w:val="single" w:sz="4" w:space="4" w:color="808080"/>
+          <w:right w:val="single" w:sz="4" w:space="4" w:color="808080"/>
+        </w:pBdr>
+        <w:shd w:val="clear" w:fill="F5F5F5"/>
+      </w:pPr>
+      <w:r>
+        <w:rPr>
+          <w:rFonts w:ascii="Courier New" w:hAnsi="Courier New"/>
+          <w:color w:val="000000"/>
+          <w:sz w:val="16"/>
+        </w:rPr>
+        <w:t>+------------------------------------------------------------------+</w:t>
+        <w:br/>
+        <w:t>|  [&lt; Quay lai]   Check-in                                          |</w:t>
+        <w:br/>
+        <w:t>+------------------------------------------------------------------+</w:t>
+        <w:br/>
+        <w:t>|                                                                    |</w:t>
+        <w:br/>
+        <w:t>|  Danh sach booking "Cho nhan" hom nay:                             |</w:t>
+        <w:br/>
+        <w:t>|  +--------------------------------------------------------------+  |</w:t>
+        <w:br/>
+        <w:t>|  | maBK | khachHang  | phong  | gioDat    | trangThai         |  |</w:t>
+        <w:br/>
+        <w:t>|  |------|------------|--------|-----------|-------------------|  |</w:t>
+        <w:br/>
+        <w:t>|  | BK001| Nguyen V.A | P.VIP1 | 14:00     | Cho nhan          |  |</w:t>
+        <w:br/>
+        <w:t>|  | BK003| Le M.C     | P.VIP2 | 16:00     | Cho nhan          |  |</w:t>
+        <w:br/>
+        <w:t>|  +--------------------------------------------------------------+  |</w:t>
+        <w:br/>
+        <w:t>|                                                                    |</w:t>
+        <w:br/>
+        <w:t>|  +--------------------------------------------------------------+  |</w:t>
+        <w:br/>
+        <w:t>|  | Chi tiet booking BK001                                       |  |</w:t>
+        <w:br/>
+        <w:t>|  |----------------------------------------------------------------|  |</w:t>
+        <w:br/>
+        <w:t>|  | khachHang:     Nguyen Van An (0912345678)                     |  |</w:t>
+        <w:br/>
+        <w:t>|  | phong:         P.VIP1 - Super VIP                             |  |</w:t>
+        <w:br/>
+        <w:t>|  | gioDat:        14:00 - 17:00                                  |  |</w:t>
+        <w:br/>
+        <w:t>|  +--------------------------------------------------------------+  |</w:t>
+        <w:br/>
+        <w:t>|                                                                    |</w:t>
+        <w:br/>
+        <w:t>|  [Xac nhan Check-in]           [Huy booking]                      |</w:t>
         <w:br/>
         <w:t>+------------------------------------------------------------------+</w:t>
       </w:r>

</xml_diff>

<commit_message>
fix: Boundary classes — React naming + attributes from analysis
Updated MVC Boundary classes:
- ReceptionistHomeView -> ReceptionistHomePage (+render)
- SearchFreeRoomView -> SearchFreeRoomForm (+startTime, endTime, branchId, roomType, results)
- SearchClientView -> SearchClientForm (+keyword, selectedRoom, results)
- ConfirmBookingView -> ConfirmBookingModal (+booking, room, customer, total)
- CheckInView -> CheckInPage (+pendingBookings, selectedBooking)
- CheckOutView -> CheckOutPage (+activeRooms, invoice, paymentMethod)
- InvoicePanel (+invoice, discount, voucherCode)
- CancelBookingView -> CancelBookingPage (+keyword, bookingList)

Naming follows cnpm skill convention:
- Page = URL/Router page
- Form = Input form
- Modal = Popup dialog
- Table = Data table

Attributes derived from analysis text and wireframe data.

Co-Authored-By: Claude Opus 4.7 <noreply@anthropic.com>
</commit_message>
<xml_diff>
--- a/output/booking_module.docx
+++ b/output/booking_module.docx
@@ -3574,7 +3574,7 @@
                 <w:b/>
                 <w:sz w:val="20"/>
               </w:rPr>
-              <w:t>ReceptionistHomeView</w:t>
+              <w:t>ReceptionistHomePage</w:t>
             </w:r>
           </w:p>
         </w:tc>
@@ -3622,7 +3622,7 @@
                 <w:b/>
                 <w:sz w:val="20"/>
               </w:rPr>
-              <w:t>SearchFreeRoomView</w:t>
+              <w:t>SearchFreeRoomForm</w:t>
             </w:r>
           </w:p>
         </w:tc>
@@ -3670,7 +3670,7 @@
                 <w:b/>
                 <w:sz w:val="20"/>
               </w:rPr>
-              <w:t>SearchClientView</w:t>
+              <w:t>SearchClientForm</w:t>
             </w:r>
           </w:p>
         </w:tc>
@@ -3718,7 +3718,7 @@
                 <w:b/>
                 <w:sz w:val="20"/>
               </w:rPr>
-              <w:t>ConfirmBookingView</w:t>
+              <w:t>ConfirmBookingModal</w:t>
             </w:r>
           </w:p>
         </w:tc>
@@ -4402,7 +4402,7 @@
                 <w:b/>
                 <w:sz w:val="20"/>
               </w:rPr>
-              <w:t>CheckInView</w:t>
+              <w:t>CheckInPage</w:t>
             </w:r>
           </w:p>
         </w:tc>
@@ -4858,7 +4858,7 @@
                 <w:b/>
                 <w:sz w:val="20"/>
               </w:rPr>
-              <w:t>CheckOutView</w:t>
+              <w:t>CheckOutPage</w:t>
             </w:r>
           </w:p>
         </w:tc>
@@ -5485,7 +5485,7 @@
                 <w:b/>
                 <w:sz w:val="20"/>
               </w:rPr>
-              <w:t>CancelBookingView</w:t>
+              <w:t>CancelBookingPage</w:t>
             </w:r>
           </w:p>
         </w:tc>
@@ -5869,7 +5869,7 @@
       <w:r>
         <w:drawing>
           <wp:inline xmlns:a="http://schemas.openxmlformats.org/drawingml/2006/main" xmlns:pic="http://schemas.openxmlformats.org/drawingml/2006/picture">
-            <wp:extent cx="5486400" cy="4884084"/>
+            <wp:extent cx="5486400" cy="4043774"/>
             <wp:docPr id="3" name="Picture 3"/>
             <wp:cNvGraphicFramePr>
               <a:graphicFrameLocks noChangeAspect="1"/>
@@ -5890,7 +5890,7 @@
                   <pic:spPr>
                     <a:xfrm>
                       <a:off x="0" y="0"/>
-                      <a:ext cx="5486400" cy="4884084"/>
+                      <a:ext cx="5486400" cy="4043774"/>
                     </a:xfrm>
                     <a:prstGeom prst="rect"/>
                   </pic:spPr>

</xml_diff>

<commit_message>
fix: update sequence diagram narrative with React class names
All old *View names replaced with correct React component names
in section-booking-iii.4.md narrative blocks.

Co-Authored-By: Claude Opus 4.7 <noreply@anthropic.com>
</commit_message>
<xml_diff>
--- a/output/booking_module.docx
+++ b/output/booking_module.docx
@@ -5982,13 +5982,13 @@
     <w:p>
       <w:pPr/>
       <w:r>
-        <w:t>1. Nhân viên lễ tân click chức năng "Đặt phòng" trên giao diện ReceptionistHomeView.</w:t>
+        <w:t>1. Nhân viên lễ tân click chức năng "Đặt phòng" trên giao diện ReceptionistHomePage.</w:t>
       </w:r>
     </w:p>
     <w:p>
       <w:pPr/>
       <w:r>
-        <w:t>2. Phương thức navigate() của lớp SearchFreeRoomView được gọi, hiển thị form tìm phòng trống.</w:t>
+        <w:t>2. Phương thức navigate() của lớp SearchFreeRoomForm được gọi, hiển thị form tìm phòng trống.</w:t>
       </w:r>
     </w:p>
     <w:p>
@@ -6018,7 +6018,7 @@
     <w:p>
       <w:pPr/>
       <w:r>
-        <w:t>7. SearchFreeRoomView hiển thị danh sách phòng trống cho nhân viên.</w:t>
+        <w:t>7. SearchFreeRoomForm hiển thị danh sách phòng trống cho nhân viên.</w:t>
       </w:r>
     </w:p>
     <w:p>
@@ -6030,7 +6030,7 @@
     <w:p>
       <w:pPr/>
       <w:r>
-        <w:t>9. SearchFreeRoomView chuyển sang SearchClientView với roomId đã chọn.</w:t>
+        <w:t>9. SearchFreeRoomForm chuyển sang SearchClientForm với roomId đã chọn.</w:t>
       </w:r>
     </w:p>
     <w:p>
@@ -6054,7 +6054,7 @@
     <w:p>
       <w:pPr/>
       <w:r>
-        <w:t>13. SearchClientView hiển thị danh sách khách hàng khớp.</w:t>
+        <w:t>13. SearchClientForm hiển thị danh sách khách hàng khớp.</w:t>
       </w:r>
     </w:p>
     <w:p>
@@ -6066,7 +6066,7 @@
     <w:p>
       <w:pPr/>
       <w:r>
-        <w:t>15. SearchClientView chuyển sang ConfirmBookingView với đầy đủ thông tin.</w:t>
+        <w:t>15. SearchClientForm chuyển sang ConfirmBookingModal với đầy đủ thông tin.</w:t>
       </w:r>
     </w:p>
     <w:p>
@@ -6090,13 +6090,13 @@
     <w:p>
       <w:pPr/>
       <w:r>
-        <w:t>19. ConfirmBookingView hiển thị thông báo "Đặt phòng thành công!".</w:t>
+        <w:t>19. ConfirmBookingModal hiển thị thông báo "Đặt phòng thành công!".</w:t>
       </w:r>
     </w:p>
     <w:p>
       <w:pPr/>
       <w:r>
-        <w:t>20. Nhân viên click [OK], hệ thống quay về ReceptionistHomeView.</w:t>
+        <w:t>20. Nhân viên click [OK], hệ thống quay về ReceptionistHomePage.</w:t>
       </w:r>
     </w:p>
     <w:p>
@@ -6119,7 +6119,7 @@
         <w:t>Phòng trống không tìm thấy:</w:t>
       </w:r>
       <w:r>
-        <w:t xml:space="preserve"> BookingController trả về danh sách rỗng. SearchFreeRoomView hiển thị "Không có phòng trống trong khung giờ này."</w:t>
+        <w:t xml:space="preserve"> BookingController trả về danh sách rỗng. SearchFreeRoomForm hiển thị "Không có phòng trống trong khung giờ này."</w:t>
       </w:r>
     </w:p>
     <w:p>
@@ -6133,7 +6133,7 @@
         <w:t>Khách hàng chưa có trong CSDL:</w:t>
       </w:r>
       <w:r>
-        <w:t xml:space="preserve"> SearchClientView hiển thị nút [Đăng ký nhanh]. Nhân viên nhập thông tin mới, hệ thống tạo khách hàng mới trước khi tiếp tục.</w:t>
+        <w:t xml:space="preserve"> SearchClientForm hiển thị nút [Đăng ký nhanh]. Nhân viên nhập thông tin mới, hệ thống tạo khách hàng mới trước khi tiếp tục.</w:t>
       </w:r>
     </w:p>
     <w:p>
@@ -6240,7 +6240,7 @@
     <w:p>
       <w:pPr/>
       <w:r>
-        <w:t>4. CheckInView hiển thị danh sách booking chờ nhận phòng.</w:t>
+        <w:t>4. CheckInPage hiển thị danh sách booking chờ nhận phòng.</w:t>
       </w:r>
     </w:p>
     <w:p>
@@ -6270,7 +6270,7 @@
     <w:p>
       <w:pPr/>
       <w:r>
-        <w:t>9. CheckInView hiển thị "Check-in thành công! Phòng [tên phòng] đã sẵn sàng."</w:t>
+        <w:t>9. CheckInPage hiển thị "Check-in thành công! Phòng [tên phòng] đã sẵn sàng."</w:t>
       </w:r>
     </w:p>
     <w:p>
@@ -6293,7 +6293,7 @@
         <w:t>Phòng đang dọn dẹp:</w:t>
       </w:r>
       <w:r>
-        <w:t xml:space="preserve"> BookingController kiểm tra trạng thái phòng, trả về lỗi. CheckInView hiển thị "Phòng đang dọn dẹp, vui lòng chờ."</w:t>
+        <w:t xml:space="preserve"> BookingController kiểm tra trạng thái phòng, trả về lỗi. CheckInPage hiển thị "Phòng đang dọn dẹp, vui lòng chờ."</w:t>
       </w:r>
     </w:p>
     <w:p>
@@ -6414,7 +6414,7 @@
     <w:p>
       <w:pPr/>
       <w:r>
-        <w:t>4. CheckOutView hiển thị danh sách phòng đang sử dụng.</w:t>
+        <w:t>4. CheckOutPage hiển thị danh sách phòng đang sử dụng.</w:t>
       </w:r>
     </w:p>
     <w:p>
@@ -6426,7 +6426,7 @@
     <w:p>
       <w:pPr/>
       <w:r>
-        <w:t>6. CheckOutView chuyển sang InvoicePanel với bookingId đã chọn.</w:t>
+        <w:t>6. CheckOutPage chuyển sang InvoicePanel với bookingId đã chọn.</w:t>
       </w:r>
     </w:p>
     <w:p>
@@ -6630,7 +6630,7 @@
     <w:p>
       <w:pPr/>
       <w:r>
-        <w:t>5. CancelBookingView hiển thị danh sách booking tìm thấy.</w:t>
+        <w:t>5. CancelBookingPage hiển thị danh sách booking tìm thấy.</w:t>
       </w:r>
     </w:p>
     <w:p>
@@ -6648,7 +6648,7 @@
     <w:p>
       <w:pPr/>
       <w:r>
-        <w:t>8. CancelBookingView hiển thị xác nhận "Bạn có chắc chắn muốn hủy booking này?".</w:t>
+        <w:t>8. CancelBookingPage hiển thị xác nhận "Bạn có chắc chắn muốn hủy booking này?".</w:t>
       </w:r>
     </w:p>
     <w:p>
@@ -6672,7 +6672,7 @@
     <w:p>
       <w:pPr/>
       <w:r>
-        <w:t>12. CancelBookingView hiển thị "Hủy đặt phòng thành công."</w:t>
+        <w:t>12. CancelBookingPage hiển thị "Hủy đặt phòng thành công."</w:t>
       </w:r>
     </w:p>
     <w:p>
@@ -6695,7 +6695,7 @@
         <w:t>Không tìm thấy booking:</w:t>
       </w:r>
       <w:r>
-        <w:t xml:space="preserve"> BookingController trả về danh sách rỗng. CancelBookingView hiển thị "Không tìm thấy booking phù hợp."</w:t>
+        <w:t xml:space="preserve"> BookingController trả về danh sách rỗng. CancelBookingPage hiển thị "Không tìm thấy booking phù hợp."</w:t>
       </w:r>
     </w:p>
     <w:p>
@@ -6709,7 +6709,7 @@
         <w:t>Booking đã quá thời gian hủy:</w:t>
       </w:r>
       <w:r>
-        <w:t xml:space="preserve"> BookingController kiểm tra thời gian, trả về lỗi. CancelBookingView hiển thị "Booking đã quá thời gian hủy."</w:t>
+        <w:t xml:space="preserve"> BookingController kiểm tra thời gian, trả về lỗi. CancelBookingPage hiển thị "Booking đã quá thời gian hủy."</w:t>
       </w:r>
     </w:p>
     <w:p/>

</xml_diff>

<commit_message>
fix: complete missing content + align with updated cnpm skill
New files:
- section-booking-i.md: Phase I (terminology, actors, UC tables)
- section-booking-ii.1-datphong.md: Scenario 1.1 (Dat phong)
- section-booking-ii.3-2.4.md: Analysis BCE diagrams + sequence diagrams
  for all 4 functions (Dat phong, Huy phong, Check-in, Check-out)
  with Vietnamese method names per analysis phase convention

Fixes:
- MVC: "Control/DAO" -> "Control" (React MVC = Spring Boot Controllers, not DAO)
- PlantUML: added packageMaxWidth 800 (required by skill)
- DOCX generator: 10 files in correct order with phase headers

Co-Authored-By: Claude Opus 4.7 <noreply@anthropic.com>
</commit_message>
<xml_diff>
--- a/output/booking_module.docx
+++ b/output/booking_module.docx
@@ -11,7 +11,7 @@
           <w:color w:val="0000C8"/>
           <w:u w:val="single" w:color="0000C8"/>
         </w:rPr>
-        <w:t>II. PHA PHÂN TÍCH</w:t>
+        <w:t>I. PHA XÁC ĐỊNH YÊU CẦU</w:t>
       </w:r>
     </w:p>
     <w:p>
@@ -19,7 +19,1163 @@
         <w:pStyle w:val="Heading2"/>
       </w:pPr>
       <w:r>
-        <w:t>1.2. Kịch bản "Check-in"</w:t>
+        <w:t>Bảng thuật ngữ</w:t>
+      </w:r>
+    </w:p>
+    <w:tbl>
+      <w:tblPr>
+        <w:tblStyle w:val="TableGrid"/>
+        <w:tblW w:type="auto" w:w="0"/>
+        <w:tblLook w:firstColumn="1" w:firstRow="1" w:lastColumn="0" w:lastRow="0" w:noHBand="0" w:noVBand="1" w:val="04A0"/>
+      </w:tblPr>
+      <w:tblGrid>
+        <w:gridCol w:w="2880"/>
+        <w:gridCol w:w="2880"/>
+        <w:gridCol w:w="2880"/>
+      </w:tblGrid>
+      <w:tr>
+        <w:tc>
+          <w:tcPr>
+            <w:tcW w:type="dxa" w:w="2880"/>
+            <w:shd w:fill="D9E2F3"/>
+          </w:tcPr>
+          <w:p>
+            <w:pPr/>
+            <w:r/>
+            <w:r>
+              <w:rPr>
+                <w:b/>
+                <w:sz w:val="20"/>
+              </w:rPr>
+              <w:t>Thuật ngữ</w:t>
+            </w:r>
+          </w:p>
+        </w:tc>
+        <w:tc>
+          <w:tcPr>
+            <w:tcW w:type="dxa" w:w="2880"/>
+            <w:shd w:fill="D9E2F3"/>
+          </w:tcPr>
+          <w:p>
+            <w:pPr/>
+            <w:r/>
+            <w:r>
+              <w:rPr>
+                <w:b/>
+                <w:sz w:val="20"/>
+              </w:rPr>
+              <w:t>Tên tiếng Anh</w:t>
+            </w:r>
+          </w:p>
+        </w:tc>
+        <w:tc>
+          <w:tcPr>
+            <w:tcW w:type="dxa" w:w="2880"/>
+            <w:shd w:fill="D9E2F3"/>
+          </w:tcPr>
+          <w:p>
+            <w:pPr/>
+            <w:r/>
+            <w:r>
+              <w:rPr>
+                <w:b/>
+                <w:sz w:val="20"/>
+              </w:rPr>
+              <w:t>Định nghĩa</w:t>
+            </w:r>
+          </w:p>
+        </w:tc>
+      </w:tr>
+      <w:tr>
+        <w:tc>
+          <w:tcPr>
+            <w:tcW w:type="dxa" w:w="2880"/>
+          </w:tcPr>
+          <w:p>
+            <w:pPr/>
+            <w:r/>
+            <w:r>
+              <w:rPr>
+                <w:sz w:val="20"/>
+              </w:rPr>
+              <w:t>Loại phòng</w:t>
+            </w:r>
+          </w:p>
+        </w:tc>
+        <w:tc>
+          <w:tcPr>
+            <w:tcW w:type="dxa" w:w="2880"/>
+          </w:tcPr>
+          <w:p>
+            <w:pPr/>
+            <w:r/>
+            <w:r>
+              <w:rPr>
+                <w:sz w:val="20"/>
+              </w:rPr>
+              <w:t>Room Type / Room Category</w:t>
+            </w:r>
+          </w:p>
+        </w:tc>
+        <w:tc>
+          <w:tcPr>
+            <w:tcW w:type="dxa" w:w="2880"/>
+          </w:tcPr>
+          <w:p>
+            <w:pPr/>
+            <w:r/>
+            <w:r>
+              <w:rPr>
+                <w:sz w:val="20"/>
+              </w:rPr>
+              <w:t>Phân loại phòng hát dựa trên tiêu chuẩn, diện tích và trang thiết bị (VD: Standard, VIP, Super VIP, Party).</w:t>
+            </w:r>
+          </w:p>
+        </w:tc>
+      </w:tr>
+      <w:tr>
+        <w:tc>
+          <w:tcPr>
+            <w:tcW w:type="dxa" w:w="2880"/>
+          </w:tcPr>
+          <w:p>
+            <w:pPr/>
+            <w:r/>
+            <w:r>
+              <w:rPr>
+                <w:sz w:val="20"/>
+              </w:rPr>
+              <w:t>Sức chứa</w:t>
+            </w:r>
+          </w:p>
+        </w:tc>
+        <w:tc>
+          <w:tcPr>
+            <w:tcW w:type="dxa" w:w="2880"/>
+          </w:tcPr>
+          <w:p>
+            <w:pPr/>
+            <w:r/>
+            <w:r>
+              <w:rPr>
+                <w:sz w:val="20"/>
+              </w:rPr>
+              <w:t>Capacity</w:t>
+            </w:r>
+          </w:p>
+        </w:tc>
+        <w:tc>
+          <w:tcPr>
+            <w:tcW w:type="dxa" w:w="2880"/>
+          </w:tcPr>
+          <w:p>
+            <w:pPr/>
+            <w:r/>
+            <w:r>
+              <w:rPr>
+                <w:sz w:val="20"/>
+              </w:rPr>
+              <w:t>Số lượng khách tối đa mà một phòng hát có thể phục vụ thoải mái nhất.</w:t>
+            </w:r>
+          </w:p>
+        </w:tc>
+      </w:tr>
+      <w:tr>
+        <w:tc>
+          <w:tcPr>
+            <w:tcW w:type="dxa" w:w="2880"/>
+          </w:tcPr>
+          <w:p>
+            <w:pPr/>
+            <w:r/>
+            <w:r>
+              <w:rPr>
+                <w:sz w:val="20"/>
+              </w:rPr>
+              <w:t>Trạng thái phòng</w:t>
+            </w:r>
+          </w:p>
+        </w:tc>
+        <w:tc>
+          <w:tcPr>
+            <w:tcW w:type="dxa" w:w="2880"/>
+          </w:tcPr>
+          <w:p>
+            <w:pPr/>
+            <w:r/>
+            <w:r>
+              <w:rPr>
+                <w:sz w:val="20"/>
+              </w:rPr>
+              <w:t>Room Status</w:t>
+            </w:r>
+          </w:p>
+        </w:tc>
+        <w:tc>
+          <w:tcPr>
+            <w:tcW w:type="dxa" w:w="2880"/>
+          </w:tcPr>
+          <w:p>
+            <w:pPr/>
+            <w:r/>
+            <w:r>
+              <w:rPr>
+                <w:sz w:val="20"/>
+              </w:rPr>
+              <w:t>Tình trạng hiện tại của phòng trên hệ thống (Trống, Đang phục vụ, Đã đặt trước, Đang dọn dẹp, Bảo trì).</w:t>
+            </w:r>
+          </w:p>
+        </w:tc>
+      </w:tr>
+      <w:tr>
+        <w:tc>
+          <w:tcPr>
+            <w:tcW w:type="dxa" w:w="2880"/>
+          </w:tcPr>
+          <w:p>
+            <w:pPr/>
+            <w:r/>
+            <w:r>
+              <w:rPr>
+                <w:sz w:val="20"/>
+              </w:rPr>
+              <w:t>Đặt phòng tại quầy</w:t>
+            </w:r>
+          </w:p>
+        </w:tc>
+        <w:tc>
+          <w:tcPr>
+            <w:tcW w:type="dxa" w:w="2880"/>
+          </w:tcPr>
+          <w:p>
+            <w:pPr/>
+            <w:r/>
+            <w:r>
+              <w:rPr>
+                <w:sz w:val="20"/>
+              </w:rPr>
+              <w:t>Book on site</w:t>
+            </w:r>
+          </w:p>
+        </w:tc>
+        <w:tc>
+          <w:tcPr>
+            <w:tcW w:type="dxa" w:w="2880"/>
+          </w:tcPr>
+          <w:p>
+            <w:pPr/>
+            <w:r/>
+            <w:r>
+              <w:rPr>
+                <w:sz w:val="20"/>
+              </w:rPr>
+              <w:t>Khách hàng đến trực tiếp chi nhánh để yêu cầu xếp phòng hát.</w:t>
+            </w:r>
+          </w:p>
+        </w:tc>
+      </w:tr>
+      <w:tr>
+        <w:tc>
+          <w:tcPr>
+            <w:tcW w:type="dxa" w:w="2880"/>
+          </w:tcPr>
+          <w:p>
+            <w:pPr/>
+            <w:r/>
+            <w:r>
+              <w:rPr>
+                <w:sz w:val="20"/>
+              </w:rPr>
+              <w:t>Đặt phòng trực tuyến</w:t>
+            </w:r>
+          </w:p>
+        </w:tc>
+        <w:tc>
+          <w:tcPr>
+            <w:tcW w:type="dxa" w:w="2880"/>
+          </w:tcPr>
+          <w:p>
+            <w:pPr/>
+            <w:r/>
+            <w:r>
+              <w:rPr>
+                <w:sz w:val="20"/>
+              </w:rPr>
+              <w:t>Book online</w:t>
+            </w:r>
+          </w:p>
+        </w:tc>
+        <w:tc>
+          <w:tcPr>
+            <w:tcW w:type="dxa" w:w="2880"/>
+          </w:tcPr>
+          <w:p>
+            <w:pPr/>
+            <w:r/>
+            <w:r>
+              <w:rPr>
+                <w:sz w:val="20"/>
+              </w:rPr>
+              <w:t>Giao dịch giữ phòng trước cho khách thông qua hệ thống web/app.</w:t>
+            </w:r>
+          </w:p>
+        </w:tc>
+      </w:tr>
+      <w:tr>
+        <w:tc>
+          <w:tcPr>
+            <w:tcW w:type="dxa" w:w="2880"/>
+          </w:tcPr>
+          <w:p>
+            <w:pPr/>
+            <w:r/>
+            <w:r>
+              <w:rPr>
+                <w:sz w:val="20"/>
+              </w:rPr>
+              <w:t>Tiền cọc</w:t>
+            </w:r>
+          </w:p>
+        </w:tc>
+        <w:tc>
+          <w:tcPr>
+            <w:tcW w:type="dxa" w:w="2880"/>
+          </w:tcPr>
+          <w:p>
+            <w:pPr/>
+            <w:r/>
+            <w:r>
+              <w:rPr>
+                <w:sz w:val="20"/>
+              </w:rPr>
+              <w:t>Deposit</w:t>
+            </w:r>
+          </w:p>
+        </w:tc>
+        <w:tc>
+          <w:tcPr>
+            <w:tcW w:type="dxa" w:w="2880"/>
+          </w:tcPr>
+          <w:p>
+            <w:pPr/>
+            <w:r/>
+            <w:r>
+              <w:rPr>
+                <w:sz w:val="20"/>
+              </w:rPr>
+              <w:t>Khoản tiền khách thanh toán trước để đảm bảo cho việc đặt phòng.</w:t>
+            </w:r>
+          </w:p>
+        </w:tc>
+      </w:tr>
+      <w:tr>
+        <w:tc>
+          <w:tcPr>
+            <w:tcW w:type="dxa" w:w="2880"/>
+          </w:tcPr>
+          <w:p>
+            <w:pPr/>
+            <w:r/>
+            <w:r>
+              <w:rPr>
+                <w:sz w:val="20"/>
+              </w:rPr>
+              <w:t>Nhận phòng/ Trả phòng</w:t>
+            </w:r>
+          </w:p>
+        </w:tc>
+        <w:tc>
+          <w:tcPr>
+            <w:tcW w:type="dxa" w:w="2880"/>
+          </w:tcPr>
+          <w:p>
+            <w:pPr/>
+            <w:r/>
+            <w:r>
+              <w:rPr>
+                <w:sz w:val="20"/>
+              </w:rPr>
+              <w:t>Check-in/ Check-out</w:t>
+            </w:r>
+          </w:p>
+        </w:tc>
+        <w:tc>
+          <w:tcPr>
+            <w:tcW w:type="dxa" w:w="2880"/>
+          </w:tcPr>
+          <w:p>
+            <w:pPr/>
+            <w:r/>
+            <w:r>
+              <w:rPr>
+                <w:sz w:val="20"/>
+              </w:rPr>
+              <w:t>Thao tác bắt đầu tính giờ sử dụng phòng và thao tác kết thúc tính giờ để thanh toán.</w:t>
+            </w:r>
+          </w:p>
+        </w:tc>
+      </w:tr>
+      <w:tr>
+        <w:tc>
+          <w:tcPr>
+            <w:tcW w:type="dxa" w:w="2880"/>
+          </w:tcPr>
+          <w:p>
+            <w:pPr/>
+            <w:r/>
+            <w:r>
+              <w:rPr>
+                <w:sz w:val="20"/>
+              </w:rPr>
+              <w:t>Huỷ đặt phòng</w:t>
+            </w:r>
+          </w:p>
+        </w:tc>
+        <w:tc>
+          <w:tcPr>
+            <w:tcW w:type="dxa" w:w="2880"/>
+          </w:tcPr>
+          <w:p>
+            <w:pPr/>
+            <w:r/>
+            <w:r>
+              <w:rPr>
+                <w:sz w:val="20"/>
+              </w:rPr>
+              <w:t>Cancel Booking</w:t>
+            </w:r>
+          </w:p>
+        </w:tc>
+        <w:tc>
+          <w:tcPr>
+            <w:tcW w:type="dxa" w:w="2880"/>
+          </w:tcPr>
+          <w:p>
+            <w:pPr/>
+            <w:r/>
+            <w:r>
+              <w:rPr>
+                <w:sz w:val="20"/>
+              </w:rPr>
+              <w:t>Thao tác khách hàng huỷ yêu cầu giữ phòng trước thời điểm nhận phòng.</w:t>
+            </w:r>
+          </w:p>
+        </w:tc>
+      </w:tr>
+      <w:tr>
+        <w:tc>
+          <w:tcPr>
+            <w:tcW w:type="dxa" w:w="2880"/>
+          </w:tcPr>
+          <w:p>
+            <w:pPr/>
+            <w:r/>
+            <w:r>
+              <w:rPr>
+                <w:sz w:val="20"/>
+              </w:rPr>
+              <w:t>Chi nhánh</w:t>
+            </w:r>
+          </w:p>
+        </w:tc>
+        <w:tc>
+          <w:tcPr>
+            <w:tcW w:type="dxa" w:w="2880"/>
+          </w:tcPr>
+          <w:p>
+            <w:pPr/>
+            <w:r/>
+            <w:r>
+              <w:rPr>
+                <w:sz w:val="20"/>
+              </w:rPr>
+              <w:t>Branch</w:t>
+            </w:r>
+          </w:p>
+        </w:tc>
+        <w:tc>
+          <w:tcPr>
+            <w:tcW w:type="dxa" w:w="2880"/>
+          </w:tcPr>
+          <w:p>
+            <w:pPr/>
+            <w:r/>
+            <w:r>
+              <w:rPr>
+                <w:sz w:val="20"/>
+              </w:rPr>
+              <w:t>Cơ sở kinh doanh karaoke thuộc chuỗi, có địa chỉ, nhân viên và phòng hát riêng.</w:t>
+            </w:r>
+          </w:p>
+        </w:tc>
+      </w:tr>
+      <w:tr>
+        <w:tc>
+          <w:tcPr>
+            <w:tcW w:type="dxa" w:w="2880"/>
+          </w:tcPr>
+          <w:p>
+            <w:pPr/>
+            <w:r/>
+            <w:r>
+              <w:rPr>
+                <w:sz w:val="20"/>
+              </w:rPr>
+              <w:t>Áp dụng voucher</w:t>
+            </w:r>
+          </w:p>
+        </w:tc>
+        <w:tc>
+          <w:tcPr>
+            <w:tcW w:type="dxa" w:w="2880"/>
+          </w:tcPr>
+          <w:p>
+            <w:pPr/>
+            <w:r/>
+            <w:r>
+              <w:rPr>
+                <w:sz w:val="20"/>
+              </w:rPr>
+              <w:t>Apply Voucher</w:t>
+            </w:r>
+          </w:p>
+        </w:tc>
+        <w:tc>
+          <w:tcPr>
+            <w:tcW w:type="dxa" w:w="2880"/>
+          </w:tcPr>
+          <w:p>
+            <w:pPr/>
+            <w:r/>
+            <w:r>
+              <w:rPr>
+                <w:sz w:val="20"/>
+              </w:rPr>
+              <w:t>Thao tác nhập mã giảm giá hoặc sử dụng điểm hội viên để trừ vào tổng hóa đơn.</w:t>
+            </w:r>
+          </w:p>
+        </w:tc>
+      </w:tr>
+    </w:tbl>
+    <w:p>
+      <w:pPr>
+        <w:pStyle w:val="Heading2"/>
+      </w:pPr>
+      <w:r>
+        <w:t>Mô hình nghiệp vụ bằng ngôn ngữ tự nhiên</w:t>
+      </w:r>
+    </w:p>
+    <w:p>
+      <w:pPr>
+        <w:pStyle w:val="Heading2"/>
+      </w:pPr>
+      <w:r>
+        <w:t>2.1. Mục tiêu mô-đun</w:t>
+      </w:r>
+    </w:p>
+    <w:p>
+      <w:pPr/>
+      <w:r>
+        <w:t>Thực hiện chức năng quản lý đặt phòng, huỷ phòng để tham gia vào xây dựng hệ thống phần mềm quản lý tập trung cho chuỗi nhà hàng karaoke.</w:t>
+      </w:r>
+    </w:p>
+    <w:p>
+      <w:pPr>
+        <w:pStyle w:val="Heading2"/>
+      </w:pPr>
+      <w:r>
+        <w:t>2.2. Phạm vi mô-đun</w:t>
+      </w:r>
+    </w:p>
+    <w:p>
+      <w:pPr/>
+      <w:r>
+        <w:t>Mô-đun sẽ bao phủ toàn bộ quy trình vận hành từ khi khách hàng đặt phòng đến khi thanh toán.</w:t>
+      </w:r>
+    </w:p>
+    <w:p>
+      <w:pPr>
+        <w:pStyle w:val="Heading2"/>
+      </w:pPr>
+      <w:r>
+        <w:t>2.3. Ai có thể sử dụng mô-đun?</w:t>
+      </w:r>
+    </w:p>
+    <w:p>
+      <w:pPr/>
+      <w:r>
+        <w:t>Mô-đun sẽ phục vụ 2 nhóm người chính:</w:t>
+      </w:r>
+    </w:p>
+    <w:p>
+      <w:pPr>
+        <w:pStyle w:val="ListBullet"/>
+      </w:pPr>
+      <w:r>
+        <w:rPr>
+          <w:b/>
+        </w:rPr>
+        <w:t>Khách hàng</w:t>
+      </w:r>
+      <w:r>
+        <w:t xml:space="preserve"> là nhóm người sẽ tham gia vào các thao tác đặt phòng, huỷ phòng, thanh toán.</w:t>
+      </w:r>
+    </w:p>
+    <w:p>
+      <w:pPr>
+        <w:pStyle w:val="ListBullet"/>
+      </w:pPr>
+      <w:r>
+        <w:rPr>
+          <w:b/>
+        </w:rPr>
+        <w:t>Nhân viên lễ tân</w:t>
+      </w:r>
+      <w:r>
+        <w:t xml:space="preserve"> là người trực tiếp tham gia vào thao tác đặt phòng, check-in/ check-out, tổng hợp hoá đơn và thu tiền của khách.</w:t>
+      </w:r>
+    </w:p>
+    <w:p>
+      <w:pPr>
+        <w:pStyle w:val="Heading2"/>
+      </w:pPr>
+      <w:r>
+        <w:t>2.4. Người dùng có những chức năng gì?</w:t>
+      </w:r>
+    </w:p>
+    <w:p>
+      <w:pPr/>
+      <w:r>
+        <w:rPr>
+          <w:b/>
+        </w:rPr>
+        <w:t>Khách hàng:</w:t>
+      </w:r>
+    </w:p>
+    <w:p>
+      <w:pPr>
+        <w:pStyle w:val="ListBullet"/>
+      </w:pPr>
+      <w:r>
+        <w:t>Đặt phòng trực tuyến hoặc đặt phòng tại chi nhánh.</w:t>
+      </w:r>
+    </w:p>
+    <w:p>
+      <w:pPr>
+        <w:pStyle w:val="ListBullet"/>
+      </w:pPr>
+      <w:r>
+        <w:t>Huỷ phòng trực tuyến hoặc huỷ phòng tại chi nhánh.</w:t>
+      </w:r>
+    </w:p>
+    <w:p>
+      <w:pPr>
+        <w:pStyle w:val="ListBullet"/>
+      </w:pPr>
+      <w:r>
+        <w:t>Check-in/ check-out.</w:t>
+      </w:r>
+    </w:p>
+    <w:p>
+      <w:pPr>
+        <w:pStyle w:val="ListBullet"/>
+      </w:pPr>
+      <w:r>
+        <w:t>Thanh toán.</w:t>
+      </w:r>
+    </w:p>
+    <w:p>
+      <w:pPr/>
+      <w:r>
+        <w:rPr>
+          <w:b/>
+        </w:rPr>
+        <w:t>Nhân viên lễ tân:</w:t>
+      </w:r>
+    </w:p>
+    <w:p>
+      <w:pPr>
+        <w:pStyle w:val="ListBullet"/>
+      </w:pPr>
+      <w:r>
+        <w:t>Đặt phòng.</w:t>
+      </w:r>
+    </w:p>
+    <w:p>
+      <w:pPr>
+        <w:pStyle w:val="ListBullet"/>
+      </w:pPr>
+      <w:r>
+        <w:t>Huỷ phòng.</w:t>
+      </w:r>
+    </w:p>
+    <w:p>
+      <w:pPr>
+        <w:pStyle w:val="ListBullet"/>
+      </w:pPr>
+      <w:r>
+        <w:t>Check-in/ check-out.</w:t>
+      </w:r>
+    </w:p>
+    <w:p>
+      <w:pPr>
+        <w:pStyle w:val="ListBullet"/>
+      </w:pPr>
+      <w:r>
+        <w:t>Tổng hợp hoá đơn.</w:t>
+      </w:r>
+    </w:p>
+    <w:p>
+      <w:pPr>
+        <w:pStyle w:val="ListBullet"/>
+      </w:pPr>
+      <w:r>
+        <w:t>Áp dụng ưu đãi hội viên.</w:t>
+      </w:r>
+    </w:p>
+    <w:p>
+      <w:pPr>
+        <w:pStyle w:val="ListBullet"/>
+      </w:pPr>
+      <w:r>
+        <w:t>Thu tiền.</w:t>
+      </w:r>
+    </w:p>
+    <w:p>
+      <w:pPr>
+        <w:pStyle w:val="ListBullet"/>
+      </w:pPr>
+      <w:r>
+        <w:t>In hoá đơn.</w:t>
+      </w:r>
+    </w:p>
+    <w:p>
+      <w:pPr>
+        <w:pStyle w:val="Heading2"/>
+      </w:pPr>
+      <w:r>
+        <w:t>2.5. Mỗi chức năng hoạt động như thế nào?</w:t>
+      </w:r>
+    </w:p>
+    <w:p>
+      <w:pPr/>
+      <w:r>
+        <w:rPr>
+          <w:b/>
+        </w:rPr>
+        <w:t>Đặt phòng trực tuyến:</w:t>
+      </w:r>
+      <w:r>
+        <w:t xml:space="preserve"> Khách hàng đăng nhập vào hệ thống web/app → Khách hàng chọn chi nhánh → Khách hàng xem danh sách phòng trống theo khung giờ mong muốn → Khách hàng chọn phòng và thời gian → Khách hàng xác nhận đặt phòng → Hệ thống ghi nhận booking với trạng thái "Chờ nhận" trên hệ thống.</w:t>
+      </w:r>
+    </w:p>
+    <w:p>
+      <w:pPr/>
+      <w:r>
+        <w:rPr>
+          <w:b/>
+        </w:rPr>
+        <w:t>Đặt phòng tại chi nhánh:</w:t>
+      </w:r>
+      <w:r>
+        <w:t xml:space="preserve"> Khách hàng đến trực tiếp chi nhánh → Lễ tân kiểm tra phòng trống → Lễ tân chọn chi nhánh → Lễ tân xem danh sách phòng trống theo khung giờ mong muốn → Lễ tân chọn phòng và thời gian → Lễ tân ghi nhận thông tin khách (hoặc tra cứu hội viên qua số điện thoại) → Lễ tân xác nhận đặt phòng với khách hàng → Lễ tân tạo booking với trạng thái "Chờ nhận" trên hệ thống.</w:t>
+      </w:r>
+    </w:p>
+    <w:p>
+      <w:pPr/>
+      <w:r>
+        <w:rPr>
+          <w:b/>
+        </w:rPr>
+        <w:t>Check-in:</w:t>
+      </w:r>
+      <w:r>
+        <w:t xml:space="preserve"> Khách hàng yêu cầu nhận phòng → Lễ tân kiểm tra thông tin khách hàng và phòng đặt → Lễ tân xác nhận đúng thông tin → Hệ thống chuyển trạng thái phòng được đặt từ "Chờ nhận" sang "Đang hoạt động".</w:t>
+      </w:r>
+    </w:p>
+    <w:p>
+      <w:pPr/>
+      <w:r>
+        <w:rPr>
+          <w:b/>
+        </w:rPr>
+        <w:t>Check-out:</w:t>
+      </w:r>
+      <w:r>
+        <w:t xml:space="preserve"> Khách hàng yêu cầu trả phòng → Lễ tân chọn phòng trên hệ thống → Hệ thống tự động tính tiền phòng (giờ sử dụng × đơn giá) cộng tổng tiền order gọi món → Nếu khách là hội viên, lễ tân áp dụng ưu đãi hoặc voucher → Hệ thống hiển thị tổng tiền → Khách hàng thanh toán (tiền mặt/chuyển khoản) → Lễ tân in hóa đơn → Hệ thống đóng phòng → Hệ thống chuyển trạng thái về "Trống" → Hệ thống cộng điểm hội viên tự động.</w:t>
+      </w:r>
+    </w:p>
+    <w:p>
+      <w:pPr/>
+      <w:r>
+        <w:rPr>
+          <w:b/>
+        </w:rPr>
+        <w:t>Huỷ phòng trực tuyến:</w:t>
+      </w:r>
+      <w:r>
+        <w:t xml:space="preserve"> Khách hàng ấn nút Huỷ đặt phòng trên hệ thống → Hệ thống hỏi người dùng xác nhận chắc chắn huỷ → Hệ thống chuyển trạng thái "Chờ nhận" ở ghi nhận booking sang "Trống" → Lễ tân bấm xác nhận "Huỷ đặt phòng".</w:t>
+      </w:r>
+    </w:p>
+    <w:p>
+      <w:pPr/>
+      <w:r>
+        <w:rPr>
+          <w:b/>
+        </w:rPr>
+        <w:t>Huỷ phòng tại chi nhánh:</w:t>
+      </w:r>
+      <w:r>
+        <w:t xml:space="preserve"> Khách hàng huỷ đặt phòng trực tiếp tại chi nhánh → Lễ tân chuyển trạng thái "chờ nhận" ở ghi nhận booking sang "huỷ đặt". Lễ tân bấm xác nhận "huỷ đặt phòng" và không hoàn tiền cọc cho khách hàng.</w:t>
+      </w:r>
+    </w:p>
+    <w:p>
+      <w:pPr>
+        <w:pStyle w:val="Heading2"/>
+      </w:pPr>
+      <w:r>
+        <w:t>2.6. Những thông tin/ đối tượng mà mô-đun cần xử lý</w:t>
+      </w:r>
+    </w:p>
+    <w:p>
+      <w:pPr/>
+      <w:r>
+        <w:t>Mô-đun cần quản lý và xử lý các đối tượng thông tin chính sau:</w:t>
+      </w:r>
+    </w:p>
+    <w:p>
+      <w:pPr>
+        <w:pStyle w:val="ListBullet"/>
+      </w:pPr>
+      <w:r>
+        <w:rPr>
+          <w:b/>
+        </w:rPr>
+        <w:t>Chi nhánh:</w:t>
+      </w:r>
+      <w:r>
+        <w:t xml:space="preserve"> Mã chi nhánh, tên, địa chỉ, số điện thoại.</w:t>
+      </w:r>
+    </w:p>
+    <w:p>
+      <w:pPr>
+        <w:pStyle w:val="ListBullet"/>
+      </w:pPr>
+      <w:r>
+        <w:rPr>
+          <w:b/>
+        </w:rPr>
+        <w:t>Khách hàng:</w:t>
+      </w:r>
+      <w:r>
+        <w:t xml:space="preserve"> Mã khách hàng, họ tên, số điện thoại, địa chỉ, hạng hội viên (Thường, Bạc, Vàng), trạng thái tài khoản.</w:t>
+      </w:r>
+    </w:p>
+    <w:p>
+      <w:pPr>
+        <w:pStyle w:val="ListBullet"/>
+      </w:pPr>
+      <w:r>
+        <w:rPr>
+          <w:b/>
+        </w:rPr>
+        <w:t>Nhân viên:</w:t>
+      </w:r>
+      <w:r>
+        <w:t xml:space="preserve"> Mã nhân viên, họ tên, vai trò, chi nhánh làm việc, trạng thái (đang làm/ đã nghỉ).</w:t>
+      </w:r>
+    </w:p>
+    <w:p>
+      <w:pPr>
+        <w:pStyle w:val="ListBullet"/>
+      </w:pPr>
+      <w:r>
+        <w:rPr>
+          <w:b/>
+        </w:rPr>
+        <w:t>Hạng hội viên:</w:t>
+      </w:r>
+      <w:r>
+        <w:t xml:space="preserve"> Mã hạng, tên hạng, ngưỡng điểm tối thiểu, ưu đãi (% giảm giá, điểm thưởng nhận).</w:t>
+      </w:r>
+    </w:p>
+    <w:p>
+      <w:pPr>
+        <w:pStyle w:val="ListBullet"/>
+      </w:pPr>
+      <w:r>
+        <w:rPr>
+          <w:b/>
+        </w:rPr>
+        <w:t>Phòng hát:</w:t>
+      </w:r>
+      <w:r>
+        <w:t xml:space="preserve"> Mã phòng, tên phòng, loại phòng, sức chứa, giá theo giờ, trạng thái, thuộc chi nhánh.</w:t>
+      </w:r>
+    </w:p>
+    <w:p>
+      <w:pPr>
+        <w:pStyle w:val="ListBullet"/>
+      </w:pPr>
+      <w:r>
+        <w:rPr>
+          <w:b/>
+        </w:rPr>
+        <w:t>Khuyến mãi:</w:t>
+      </w:r>
+      <w:r>
+        <w:t xml:space="preserve"> Mã khuyến mãi, tên, loại (voucher/ giảm giá %), điều kiện áp dụng, thời gian hiệu lực.</w:t>
+      </w:r>
+    </w:p>
+    <w:p>
+      <w:pPr>
+        <w:pStyle w:val="ListBullet"/>
+      </w:pPr>
+      <w:r>
+        <w:rPr>
+          <w:b/>
+        </w:rPr>
+        <w:t>Hoá đơn:</w:t>
+      </w:r>
+      <w:r>
+        <w:t xml:space="preserve"> Mã hoá đơn, liên kết đặt phòng, tiền phòng, thời gian sử dụng thực tế, tiền dịch vụ, phụ phí, giảm giá, tổng tiền, trạng thái thanh toán, phương thức thanh toán.</w:t>
+      </w:r>
+    </w:p>
+    <w:p>
+      <w:pPr>
+        <w:pStyle w:val="Heading2"/>
+      </w:pPr>
+      <w:r>
+        <w:t>2.7. Quan hệ giữa các đối tượng</w:t>
+      </w:r>
+    </w:p>
+    <w:p>
+      <w:pPr/>
+      <w:r>
+        <w:t>Các đối tượng trong mô-đun có mối quan hệ chặt chẽ với nhau:</w:t>
+      </w:r>
+    </w:p>
+    <w:p>
+      <w:pPr>
+        <w:pStyle w:val="ListBullet"/>
+      </w:pPr>
+      <w:r>
+        <w:t>Một chi nhánh có nhiều phòng hát.</w:t>
+      </w:r>
+    </w:p>
+    <w:p>
+      <w:pPr>
+        <w:pStyle w:val="ListBullet"/>
+      </w:pPr>
+      <w:r>
+        <w:t>Một khách hàng thuộc một hạng hội viên.</w:t>
+      </w:r>
+    </w:p>
+    <w:p>
+      <w:pPr>
+        <w:pStyle w:val="ListBullet"/>
+      </w:pPr>
+      <w:r>
+        <w:t>Một hạng hội viên định nghĩa ngưỡng điểm và áp dụng cho nhiều khách hàng.</w:t>
+      </w:r>
+    </w:p>
+    <w:p>
+      <w:pPr>
+        <w:pStyle w:val="ListBullet"/>
+      </w:pPr>
+      <w:r>
+        <w:t>Một nhân viên thuộc một chi nhánh.</w:t>
+      </w:r>
+    </w:p>
+    <w:p>
+      <w:pPr>
+        <w:pStyle w:val="ListBullet"/>
+      </w:pPr>
+      <w:r>
+        <w:t>Một hoá đơn có thể áp dụng nhiều khuyến mãi.</w:t>
+      </w:r>
+    </w:p>
+    <w:p>
+      <w:pPr>
+        <w:pStyle w:val="Heading2"/>
+      </w:pPr>
+      <w:r>
+        <w:t>Mô hình nghiệp vụ bằng UML</w:t>
+      </w:r>
+    </w:p>
+    <w:p>
+      <w:pPr>
+        <w:pStyle w:val="Heading2"/>
+      </w:pPr>
+      <w:r>
+        <w:t>3.1. Danh sách Actor</w:t>
+      </w:r>
+    </w:p>
+    <w:tbl>
+      <w:tblPr>
+        <w:tblStyle w:val="TableGrid"/>
+        <w:tblW w:type="auto" w:w="0"/>
+        <w:tblLook w:firstColumn="1" w:firstRow="1" w:lastColumn="0" w:lastRow="0" w:noHBand="0" w:noVBand="1" w:val="04A0"/>
+      </w:tblPr>
+      <w:tblGrid>
+        <w:gridCol w:w="2880"/>
+        <w:gridCol w:w="2880"/>
+        <w:gridCol w:w="2880"/>
+      </w:tblGrid>
+      <w:tr>
+        <w:tc>
+          <w:tcPr>
+            <w:tcW w:type="dxa" w:w="2880"/>
+            <w:shd w:fill="D9E2F3"/>
+          </w:tcPr>
+          <w:p>
+            <w:pPr/>
+            <w:r/>
+            <w:r>
+              <w:rPr>
+                <w:b/>
+                <w:sz w:val="20"/>
+              </w:rPr>
+              <w:t>STT</w:t>
+            </w:r>
+          </w:p>
+        </w:tc>
+        <w:tc>
+          <w:tcPr>
+            <w:tcW w:type="dxa" w:w="2880"/>
+            <w:shd w:fill="D9E2F3"/>
+          </w:tcPr>
+          <w:p>
+            <w:pPr/>
+            <w:r/>
+            <w:r>
+              <w:rPr>
+                <w:b/>
+                <w:sz w:val="20"/>
+              </w:rPr>
+              <w:t>Actor</w:t>
+            </w:r>
+          </w:p>
+        </w:tc>
+        <w:tc>
+          <w:tcPr>
+            <w:tcW w:type="dxa" w:w="2880"/>
+            <w:shd w:fill="D9E2F3"/>
+          </w:tcPr>
+          <w:p>
+            <w:pPr/>
+            <w:r/>
+            <w:r>
+              <w:rPr>
+                <w:b/>
+                <w:sz w:val="20"/>
+              </w:rPr>
+              <w:t>Mô tả</w:t>
+            </w:r>
+          </w:p>
+        </w:tc>
+      </w:tr>
+      <w:tr>
+        <w:tc>
+          <w:tcPr>
+            <w:tcW w:type="dxa" w:w="2880"/>
+          </w:tcPr>
+          <w:p>
+            <w:pPr/>
+            <w:r/>
+            <w:r>
+              <w:rPr>
+                <w:sz w:val="20"/>
+              </w:rPr>
+              <w:t>1</w:t>
+            </w:r>
+          </w:p>
+        </w:tc>
+        <w:tc>
+          <w:tcPr>
+            <w:tcW w:type="dxa" w:w="2880"/>
+          </w:tcPr>
+          <w:p>
+            <w:pPr/>
+            <w:r/>
+            <w:r>
+              <w:rPr>
+                <w:sz w:val="20"/>
+              </w:rPr>
+              <w:t>Khách hàng (gián tiếp)</w:t>
+            </w:r>
+          </w:p>
+        </w:tc>
+        <w:tc>
+          <w:tcPr>
+            <w:tcW w:type="dxa" w:w="2880"/>
+          </w:tcPr>
+          <w:p>
+            <w:pPr/>
+            <w:r/>
+            <w:r>
+              <w:rPr>
+                <w:sz w:val="20"/>
+              </w:rPr>
+              <w:t>Người sử dụng dịch vụ karaoke, truy cập qua web/app hoặc tới tận chi nhánh để đặt phòng; thanh toán; quản lý tài khoản cá nhân.</w:t>
+            </w:r>
+          </w:p>
+        </w:tc>
+      </w:tr>
+      <w:tr>
+        <w:tc>
+          <w:tcPr>
+            <w:tcW w:type="dxa" w:w="2880"/>
+          </w:tcPr>
+          <w:p>
+            <w:pPr/>
+            <w:r/>
+            <w:r>
+              <w:rPr>
+                <w:sz w:val="20"/>
+              </w:rPr>
+              <w:t>2</w:t>
+            </w:r>
+          </w:p>
+        </w:tc>
+        <w:tc>
+          <w:tcPr>
+            <w:tcW w:type="dxa" w:w="2880"/>
+          </w:tcPr>
+          <w:p>
+            <w:pPr/>
+            <w:r/>
+            <w:r>
+              <w:rPr>
+                <w:sz w:val="20"/>
+              </w:rPr>
+              <w:t>Nhân viên lễ tân (trực tiếp)</w:t>
+            </w:r>
+          </w:p>
+        </w:tc>
+        <w:tc>
+          <w:tcPr>
+            <w:tcW w:type="dxa" w:w="2880"/>
+          </w:tcPr>
+          <w:p>
+            <w:pPr/>
+            <w:r/>
+            <w:r>
+              <w:rPr>
+                <w:sz w:val="20"/>
+              </w:rPr>
+              <w:t>Nhân viên tại quầy, xử lý đặt phòng, check-in/ check-out, thu tiền, in hoá đơn.</w:t>
+            </w:r>
+          </w:p>
+        </w:tc>
+      </w:tr>
+    </w:tbl>
+    <w:p>
+      <w:pPr>
+        <w:pStyle w:val="Heading2"/>
+      </w:pPr>
+      <w:r>
+        <w:t>3.2. Các Use Case cho từng Actor</w:t>
       </w:r>
     </w:p>
     <w:tbl>
@@ -47,7 +1203,7 @@
                 <w:b/>
                 <w:sz w:val="20"/>
               </w:rPr>
-              <w:t>Use case</w:t>
+              <w:t>Actor</w:t>
             </w:r>
           </w:p>
         </w:tc>
@@ -64,7 +1220,7 @@
                 <w:b/>
                 <w:sz w:val="20"/>
               </w:rPr>
-              <w:t>Check-in</w:t>
+              <w:t>Use Case</w:t>
             </w:r>
           </w:p>
         </w:tc>
@@ -81,7 +1237,7 @@
               <w:rPr>
                 <w:sz w:val="20"/>
               </w:rPr>
-              <w:t>Actor</w:t>
+              <w:t>Khách hàng</w:t>
             </w:r>
           </w:p>
         </w:tc>
@@ -96,7 +1252,7 @@
               <w:rPr>
                 <w:sz w:val="20"/>
               </w:rPr>
-              <w:t>Nhân viên lễ tân</w:t>
+              <w:t>UC05 - Đặt phòng</w:t>
             </w:r>
           </w:p>
         </w:tc>
@@ -109,12 +1265,6 @@
           <w:p>
             <w:pPr/>
             <w:r/>
-            <w:r>
-              <w:rPr>
-                <w:sz w:val="20"/>
-              </w:rPr>
-              <w:t>Tiền điều kiện</w:t>
-            </w:r>
           </w:p>
         </w:tc>
         <w:tc>
@@ -128,7 +1278,7 @@
               <w:rPr>
                 <w:sz w:val="20"/>
               </w:rPr>
-              <w:t>Nhân viên đã đăng nhập vào hệ thống. Phòng ở trạng thái "Chờ nhận" (đã được đặt trước đó).</w:t>
+              <w:t>UC - Huỷ phòng</w:t>
             </w:r>
           </w:p>
         </w:tc>
@@ -145,7 +1295,7 @@
               <w:rPr>
                 <w:sz w:val="20"/>
               </w:rPr>
-              <w:t>Hậu điều kiện</w:t>
+              <w:t>Nhân viên lễ tân</w:t>
             </w:r>
           </w:p>
         </w:tc>
@@ -160,7 +1310,7 @@
               <w:rPr>
                 <w:sz w:val="20"/>
               </w:rPr>
-              <w:t>Phòng chuyển trạng thái từ "Chờ nhận" sang "Đang hoạt động". Thời gian bắt đầu sử dụng được ghi nhận vào hệ thống.</w:t>
+              <w:t>UC05 - Đặt phòng</w:t>
             </w:r>
           </w:p>
         </w:tc>
@@ -173,12 +1323,6 @@
           <w:p>
             <w:pPr/>
             <w:r/>
-            <w:r>
-              <w:rPr>
-                <w:sz w:val="20"/>
-              </w:rPr>
-              <w:t>Kịch bản chính</w:t>
-            </w:r>
           </w:p>
         </w:tc>
         <w:tc>
@@ -192,79 +1336,7 @@
               <w:rPr>
                 <w:sz w:val="20"/>
               </w:rPr>
-              <w:t>1. Nhân viên lễ tân chọn chức năng "Check-in" trên giao diện chính.</w:t>
-            </w:r>
-            <w:r>
-              <w:br/>
-            </w:r>
-            <w:r>
-              <w:rPr>
-                <w:sz w:val="20"/>
-              </w:rPr>
-              <w:t>2. Hệ thống hiển thị danh sách các booking có trạng thái "Chờ nhận" hôm nay, gồm: mã booking, tên khách hàng, số điện thoại, phòng, giờ đặt.</w:t>
-            </w:r>
-            <w:r>
-              <w:br/>
-            </w:r>
-            <w:r>
-              <w:rPr>
-                <w:sz w:val="20"/>
-              </w:rPr>
-              <w:t>3. Nhân viên chọn booking cần check-in.</w:t>
-            </w:r>
-            <w:r>
-              <w:br/>
-            </w:r>
-            <w:r>
-              <w:rPr>
-                <w:sz w:val="20"/>
-              </w:rPr>
-              <w:t>4. Hệ thống hiển thị thông tin chi tiết: tên khách, SĐT, phòng, giờ đặt, giờ dự kiến check-in.</w:t>
-            </w:r>
-            <w:r>
-              <w:br/>
-            </w:r>
-            <w:r>
-              <w:rPr>
-                <w:sz w:val="20"/>
-              </w:rPr>
-              <w:t>5. Nhân viên xác nhận thông tin với khách hàng tại quầy.</w:t>
-            </w:r>
-            <w:r>
-              <w:br/>
-            </w:r>
-            <w:r>
-              <w:rPr>
-                <w:sz w:val="20"/>
-              </w:rPr>
-              <w:t>6. Nhân viên nhấn nút [Xác nhận Check-in].</w:t>
-            </w:r>
-            <w:r>
-              <w:br/>
-            </w:r>
-            <w:r>
-              <w:rPr>
-                <w:sz w:val="20"/>
-              </w:rPr>
-              <w:t>7. Hệ thống cập nhật trạng thái phòng từ "Chờ nhận" sang "Đang hoạt động".</w:t>
-            </w:r>
-            <w:r>
-              <w:br/>
-            </w:r>
-            <w:r>
-              <w:rPr>
-                <w:sz w:val="20"/>
-              </w:rPr>
-              <w:t>8. Hệ thống ghi nhận thời gian bắt đầu sử dụng thực tế.</w:t>
-            </w:r>
-            <w:r>
-              <w:br/>
-            </w:r>
-            <w:r>
-              <w:rPr>
-                <w:sz w:val="20"/>
-              </w:rPr>
-              <w:t>9. Hệ thống hiển thị thông báo "Check-in thành công! Phòng [tên phòng] đã sẵn sàng."</w:t>
+              <w:t>UC - Huỷ phòng</w:t>
             </w:r>
           </w:p>
         </w:tc>
@@ -277,12 +1349,6 @@
           <w:p>
             <w:pPr/>
             <w:r/>
-            <w:r>
-              <w:rPr>
-                <w:sz w:val="20"/>
-              </w:rPr>
-              <w:t>Ngoại lệ</w:t>
-            </w:r>
           </w:p>
         </w:tc>
         <w:tc>
@@ -296,79 +1362,33 @@
               <w:rPr>
                 <w:sz w:val="20"/>
               </w:rPr>
-              <w:t>3a. Khách hàng không đến đúng giờ đặt:</w:t>
-            </w:r>
-            <w:r>
-              <w:br/>
-            </w:r>
-            <w:r>
-              <w:rPr>
-                <w:sz w:val="20"/>
-              </w:rPr>
-              <w:t>3a.1 Nhân viên chọn hủy booking hoặc gia hạn thời gian chờ.</w:t>
-            </w:r>
-            <w:r>
-              <w:br/>
-            </w:r>
-            <w:r>
-              <w:rPr>
-                <w:sz w:val="20"/>
-              </w:rPr>
-              <w:t>3a.2 Nếu hủy, hệ thống chuyển trạng thái booking sang "Đã hủy", phòng về "Trống".</w:t>
-            </w:r>
-            <w:r>
-              <w:br/>
-            </w:r>
-            <w:r>
-              <w:rPr>
-                <w:sz w:val="20"/>
-              </w:rPr>
-              <w:t>6a. Phòng đang được dọn dẹp:</w:t>
-            </w:r>
-            <w:r>
-              <w:br/>
-            </w:r>
-            <w:r>
-              <w:rPr>
-                <w:sz w:val="20"/>
-              </w:rPr>
-              <w:t>6a.1 Hệ thống hiển thị thông báo "Phòng đang dọn dẹp, vui lòng chờ.".</w:t>
-            </w:r>
-            <w:r>
-              <w:br/>
-            </w:r>
-            <w:r>
-              <w:rPr>
-                <w:sz w:val="20"/>
-              </w:rPr>
-              <w:t>6a.2 Nhân viên chờ hoặc chuyển khách sang phòng khác.</w:t>
-            </w:r>
-            <w:r>
-              <w:br/>
-            </w:r>
-            <w:r>
-              <w:rPr>
-                <w:sz w:val="20"/>
-              </w:rPr>
-              <w:t>6b. Thông tin booking không khớp:</w:t>
-            </w:r>
-            <w:r>
-              <w:br/>
-            </w:r>
-            <w:r>
-              <w:rPr>
-                <w:sz w:val="20"/>
-              </w:rPr>
-              <w:t>6b.1 Nhân viên yêu cầu khách hàng cung cấp lại thông tin xác minh.</w:t>
-            </w:r>
-            <w:r>
-              <w:br/>
-            </w:r>
-            <w:r>
-              <w:rPr>
-                <w:sz w:val="20"/>
-              </w:rPr>
-              <w:t>6b.2 Nếu không khớp, nhân viên liên hệ quản lý.</w:t>
+              <w:t>UC07 - Check-in</w:t>
+            </w:r>
+          </w:p>
+        </w:tc>
+      </w:tr>
+      <w:tr>
+        <w:tc>
+          <w:tcPr>
+            <w:tcW w:type="dxa" w:w="2835"/>
+          </w:tcPr>
+          <w:p>
+            <w:pPr/>
+            <w:r/>
+          </w:p>
+        </w:tc>
+        <w:tc>
+          <w:tcPr>
+            <w:tcW w:type="dxa" w:w="6803"/>
+          </w:tcPr>
+          <w:p>
+            <w:pPr/>
+            <w:r/>
+            <w:r>
+              <w:rPr>
+                <w:sz w:val="20"/>
+              </w:rPr>
+              <w:t>UC08 - Check-out</w:t>
             </w:r>
           </w:p>
         </w:tc>
@@ -379,7 +1399,36 @@
         <w:pStyle w:val="Heading2"/>
       </w:pPr>
       <w:r>
-        <w:t>1.3. Kịch bản "Check-out"</w:t>
+        <w:t>3.3. Biểu đồ Use Case tổng quan của mô-đun</w:t>
+      </w:r>
+    </w:p>
+    <w:p>
+      <w:pPr>
+        <w:pStyle w:val="Heading2"/>
+      </w:pPr>
+      <w:r>
+        <w:t>3.4. Biểu đồ Use Case phân rã của mô-đun</w:t>
+      </w:r>
+    </w:p>
+    <w:p/>
+    <w:p>
+      <w:pPr>
+        <w:pStyle w:val="Heading1"/>
+      </w:pPr>
+      <w:r>
+        <w:rPr>
+          <w:color w:val="0000C8"/>
+          <w:u w:val="single" w:color="0000C8"/>
+        </w:rPr>
+        <w:t>II. PHA PHÂN TÍCH</w:t>
+      </w:r>
+    </w:p>
+    <w:p>
+      <w:pPr>
+        <w:pStyle w:val="Heading2"/>
+      </w:pPr>
+      <w:r>
+        <w:t>1.1. Kịch bản "Đặt phòng tại chi nhánh"</w:t>
       </w:r>
     </w:p>
     <w:tbl>
@@ -424,7 +1473,7 @@
                 <w:b/>
                 <w:sz w:val="20"/>
               </w:rPr>
-              <w:t>Check-out</w:t>
+              <w:t>Đặt phòng</w:t>
             </w:r>
           </w:p>
         </w:tc>
@@ -456,7 +1505,7 @@
               <w:rPr>
                 <w:sz w:val="20"/>
               </w:rPr>
-              <w:t>Nhân viên lễ tân</w:t>
+              <w:t>Nhân viên lễ tân, khách hàng</w:t>
             </w:r>
           </w:p>
         </w:tc>
@@ -488,7 +1537,7 @@
               <w:rPr>
                 <w:sz w:val="20"/>
               </w:rPr>
-              <w:t>Nhân viên đã đăng nhập vào hệ thống. Phòng ở trạng thái "Đang hoạt động" (đã check-in trước đó).</w:t>
+              <w:t>Nhân viên đã đăng nhập vào hệ thống</w:t>
             </w:r>
           </w:p>
         </w:tc>
@@ -520,7 +1569,7 @@
               <w:rPr>
                 <w:sz w:val="20"/>
               </w:rPr>
-              <w:t>Phòng chuyển trạng thái từ "Đang hoạt động" sang "Trống". Hóa đơn được tạo và thanh toán hoàn tất. Điểm tích lũy được cộng vào tài khoản hội viên (nếu có).</w:t>
+              <w:t>Hệ thống chuyển trạng thái phòng từ "Trống" sang "Chờ nhận"</w:t>
             </w:r>
           </w:p>
         </w:tc>
@@ -552,7 +1601,7 @@
               <w:rPr>
                 <w:sz w:val="20"/>
               </w:rPr>
-              <w:t>1. Nhân viên lễ tân chọn chức năng "Check-out" trên giao diện chính.</w:t>
+              <w:t>1. Nhân viên lễ tân chọn chức năng đặt phòng.</w:t>
             </w:r>
             <w:r>
               <w:br/>
@@ -561,7 +1610,7 @@
               <w:rPr>
                 <w:sz w:val="20"/>
               </w:rPr>
-              <w:t>2. Hệ thống hiển thị danh sách các phòng đang ở trạng thái "Đang hoạt động", gồm: mã phòng, tên khách, giờ bắt đầu, thời gian sử dụng.</w:t>
+              <w:t>2. Hệ thống hiển thị yêu cầu nhập thời gian đặt phòng.</w:t>
             </w:r>
             <w:r>
               <w:br/>
@@ -570,7 +1619,7 @@
               <w:rPr>
                 <w:sz w:val="20"/>
               </w:rPr>
-              <w:t>3. Nhân viên chọn phòng cần check-out.</w:t>
+              <w:t>3. Nhân viên hỏi khách hàng về thời gian đặt phòng.</w:t>
             </w:r>
             <w:r>
               <w:br/>
@@ -579,7 +1628,7 @@
               <w:rPr>
                 <w:sz w:val="20"/>
               </w:rPr>
-              <w:t>4. Hệ thống hiển thị thông tin tổng hợp: thời gian sử dụng phòng, tiền phòng (giờ × đơn giá), tổng tiền order dịch vụ, tổng tiền trước giảm giá.</w:t>
+              <w:t>4. Khách hàng trả lời thời gian muốn đặt phòng.</w:t>
             </w:r>
             <w:r>
               <w:br/>
@@ -588,7 +1637,7 @@
               <w:rPr>
                 <w:sz w:val="20"/>
               </w:rPr>
-              <w:t>5. Nếu khách là hội viên, hệ thống tự động áp dụng ưu đãi hạng hội viên (% giảm giá).</w:t>
+              <w:t>5. Nhân viên nhập thời gian đặt phòng lên hệ thống.</w:t>
             </w:r>
             <w:r>
               <w:br/>
@@ -597,7 +1646,7 @@
               <w:rPr>
                 <w:sz w:val="20"/>
               </w:rPr>
-              <w:t>6. Nhân viên nhập mã voucher (nếu có) và nhấn [Áp dụng].</w:t>
+              <w:t>6. Hệ thống hiển thị danh sách phòng trống theo thời gian vừa nhập.</w:t>
             </w:r>
             <w:r>
               <w:br/>
@@ -606,7 +1655,7 @@
               <w:rPr>
                 <w:sz w:val="20"/>
               </w:rPr>
-              <w:t>7. Hệ thống hiển thị tổng tiền cần thanh toán sau giảm giá.</w:t>
+              <w:t>7. Nhân viên hỏi loại phòng trống mong muốn của khách.</w:t>
             </w:r>
             <w:r>
               <w:br/>
@@ -615,7 +1664,7 @@
               <w:rPr>
                 <w:sz w:val="20"/>
               </w:rPr>
-              <w:t>8. Khách hàng chọn phương thức thanh toán (tiền mặt / chuyển khoản).</w:t>
+              <w:t>8. Khách hàng trả lời.</w:t>
             </w:r>
             <w:r>
               <w:br/>
@@ -624,7 +1673,7 @@
               <w:rPr>
                 <w:sz w:val="20"/>
               </w:rPr>
-              <w:t>9. Nhân viên chọn phương thức thanh toán và nhấn [Xác nhận thanh toán].</w:t>
+              <w:t>9. Nhân viên chọn phòng trống theo mong muốn của khách hàng.</w:t>
             </w:r>
             <w:r>
               <w:br/>
@@ -633,7 +1682,7 @@
               <w:rPr>
                 <w:sz w:val="20"/>
               </w:rPr>
-              <w:t>10. Hệ thống tạo hóa đơn, cập nhật trạng thái thanh toán "Đã thanh toán".</w:t>
+              <w:t>10. Hệ thống yêu cầu nhập thông tin khách hàng.</w:t>
             </w:r>
             <w:r>
               <w:br/>
@@ -642,7 +1691,7 @@
               <w:rPr>
                 <w:sz w:val="20"/>
               </w:rPr>
-              <w:t>11. Hệ thống chuyển trạng thái phòng về "Trống".</w:t>
+              <w:t>11. Nhân viên hỏi thông tin khách hàng.</w:t>
             </w:r>
             <w:r>
               <w:br/>
@@ -651,7 +1700,7 @@
               <w:rPr>
                 <w:sz w:val="20"/>
               </w:rPr>
-              <w:t>12. Nếu khách là hội viên, hệ thống cộng điểm tích lũy tự động.</w:t>
+              <w:t>12. Khách hàng cung cấp thông tin cá nhân (họ tên, SĐT,...) cho nhân viên.</w:t>
             </w:r>
             <w:r>
               <w:br/>
@@ -660,7 +1709,52 @@
               <w:rPr>
                 <w:sz w:val="20"/>
               </w:rPr>
-              <w:t>13. Hệ thống hiển thị thông báo "Check-out thành công! Tổng tiền: [X]đ." và nút [In hóa đơn].</w:t>
+              <w:t>13. Nhân viên nhập thông tin khách hàng lên hệ thống.</w:t>
+            </w:r>
+            <w:r>
+              <w:br/>
+            </w:r>
+            <w:r>
+              <w:rPr>
+                <w:sz w:val="20"/>
+              </w:rPr>
+              <w:t>14. Hệ thống hiển thị thông tin khách hàng tương ứng.</w:t>
+            </w:r>
+            <w:r>
+              <w:br/>
+            </w:r>
+            <w:r>
+              <w:rPr>
+                <w:sz w:val="20"/>
+              </w:rPr>
+              <w:t>15. Nhân viên bấm vào thông tin khách hàng tương ứng.</w:t>
+            </w:r>
+            <w:r>
+              <w:br/>
+            </w:r>
+            <w:r>
+              <w:rPr>
+                <w:sz w:val="20"/>
+              </w:rPr>
+              <w:t>16. Hệ thống hiển thị xác nhận đặt phòng.</w:t>
+            </w:r>
+            <w:r>
+              <w:br/>
+            </w:r>
+            <w:r>
+              <w:rPr>
+                <w:sz w:val="20"/>
+              </w:rPr>
+              <w:t>17. Nhân viên bấm xác nhận.</w:t>
+            </w:r>
+            <w:r>
+              <w:br/>
+            </w:r>
+            <w:r>
+              <w:rPr>
+                <w:sz w:val="20"/>
+              </w:rPr>
+              <w:t>18. Hệ thống chuyển trạng thái phòng từ "Trống" sang "Chờ nhận".</w:t>
             </w:r>
           </w:p>
         </w:tc>
@@ -692,7 +1786,7 @@
               <w:rPr>
                 <w:sz w:val="20"/>
               </w:rPr>
-              <w:t>3a. Phòng có order dịch vụ chưa được xác nhận:</w:t>
+              <w:t>6. Hệ thống không hiển thị phòng trống nào theo thời gian muốn đặt phòng.</w:t>
             </w:r>
             <w:r>
               <w:br/>
@@ -701,7 +1795,7 @@
               <w:rPr>
                 <w:sz w:val="20"/>
               </w:rPr>
-              <w:t>3a.1 Hệ thống cảnh báo "Có [N] order chưa xác nhận.".</w:t>
+              <w:t>14. Chưa có thông tin khách hàng trong cơ sở dữ liệu.</w:t>
             </w:r>
             <w:r>
               <w:br/>
@@ -710,90 +1804,19 @@
               <w:rPr>
                 <w:sz w:val="20"/>
               </w:rPr>
-              <w:t>3a.2 Nhân viên xác nhận hoặc hủy các order trước khi tiếp tục.</w:t>
-            </w:r>
-            <w:r>
-              <w:br/>
-            </w:r>
-            <w:r>
-              <w:rPr>
-                <w:sz w:val="20"/>
-              </w:rPr>
-              <w:t>5a. Khách hàng không phải hội viên:</w:t>
-            </w:r>
-            <w:r>
-              <w:br/>
-            </w:r>
-            <w:r>
-              <w:rPr>
-                <w:sz w:val="20"/>
-              </w:rPr>
-              <w:t>5a.1 Hệ thống bỏ qua bước áp dụng ưu đãi hạng.</w:t>
-            </w:r>
-            <w:r>
-              <w:br/>
-            </w:r>
-            <w:r>
-              <w:rPr>
-                <w:sz w:val="20"/>
-              </w:rPr>
-              <w:t>8a. Khách hàng khiếu nại hóa đơn:</w:t>
-            </w:r>
-            <w:r>
-              <w:br/>
-            </w:r>
-            <w:r>
-              <w:rPr>
-                <w:sz w:val="20"/>
-              </w:rPr>
-              <w:t>8a.1 Nhân viên chỉnh sửa hóa đơn (thêm/bớt mục) trước khi xác nhận.</w:t>
-            </w:r>
-            <w:r>
-              <w:br/>
-            </w:r>
-            <w:r>
-              <w:rPr>
-                <w:sz w:val="20"/>
-              </w:rPr>
-              <w:t>8a.2 Nếu cần, nhân viên liên hệ quản lý để xử lý.</w:t>
-            </w:r>
-            <w:r>
-              <w:br/>
-            </w:r>
-            <w:r>
-              <w:rPr>
-                <w:sz w:val="20"/>
-              </w:rPr>
-              <w:t>9a. Thanh toán chuyển khoản thất bại:</w:t>
-            </w:r>
-            <w:r>
-              <w:br/>
-            </w:r>
-            <w:r>
-              <w:rPr>
-                <w:sz w:val="20"/>
-              </w:rPr>
-              <w:t>9a.1 Hệ thống hiển thị lỗi, yêu cầu chọn lại phương thức.</w:t>
-            </w:r>
-            <w:r>
-              <w:br/>
-            </w:r>
-            <w:r>
-              <w:rPr>
-                <w:sz w:val="20"/>
-              </w:rPr>
-              <w:t>9a.2 Nhân viên xác nhận với khách và thử lại.</w:t>
+              <w:t>8. Khách hàng không ưng phòng nào cả.</w:t>
             </w:r>
           </w:p>
         </w:tc>
       </w:tr>
     </w:tbl>
+    <w:p/>
     <w:p>
       <w:pPr>
         <w:pStyle w:val="Heading2"/>
       </w:pPr>
       <w:r>
-        <w:t>1.4. Kịch bản "Huỷ phòng"</w:t>
+        <w:t>1.2. Kịch bản "Check-in"</w:t>
       </w:r>
     </w:p>
     <w:tbl>
@@ -838,7 +1861,7 @@
                 <w:b/>
                 <w:sz w:val="20"/>
               </w:rPr>
-              <w:t>Huỷ phòng</w:t>
+              <w:t>Check-in</w:t>
             </w:r>
           </w:p>
         </w:tc>
@@ -870,7 +1893,7 @@
               <w:rPr>
                 <w:sz w:val="20"/>
               </w:rPr>
-              <w:t>Nhân viên lễ tân, khách hàng</w:t>
+              <w:t>Nhân viên lễ tân</w:t>
             </w:r>
           </w:p>
         </w:tc>
@@ -902,7 +1925,7 @@
               <w:rPr>
                 <w:sz w:val="20"/>
               </w:rPr>
-              <w:t>Booking ở trạng thái "Chờ nhận" (chưa check-in).</w:t>
+              <w:t>Nhân viên đã đăng nhập vào hệ thống. Phòng ở trạng thái "Chờ nhận" (đã được đặt trước đó).</w:t>
             </w:r>
           </w:p>
         </w:tc>
@@ -934,7 +1957,7 @@
               <w:rPr>
                 <w:sz w:val="20"/>
               </w:rPr>
-              <w:t>Booking chuyển trạng thái sang "Đã hủy". Phòng về trạng thái "Trống". Tiền cọc (nếu có) được xử lý theo chính sách hoàn tiền.</w:t>
+              <w:t>Phòng chuyển trạng thái từ "Chờ nhận" sang "Đang hoạt động". Thời gian bắt đầu sử dụng được ghi nhận vào hệ thống.</w:t>
             </w:r>
           </w:p>
         </w:tc>
@@ -966,7 +1989,7 @@
               <w:rPr>
                 <w:sz w:val="20"/>
               </w:rPr>
-              <w:t>1. Khách hàng liên hệ lễ tân (trực tiếp hoặc qua hotline) yêu cầu hủy phòng.</w:t>
+              <w:t>1. Nhân viên lễ tân chọn chức năng "Check-in" trên giao diện chính.</w:t>
             </w:r>
             <w:r>
               <w:br/>
@@ -975,7 +1998,7 @@
               <w:rPr>
                 <w:sz w:val="20"/>
               </w:rPr>
-              <w:t>2. Nhân viên lễ tân chọn chức năng "Quản lý đặt phòng" trên giao diện.</w:t>
+              <w:t>2. Hệ thống hiển thị danh sách các booking có trạng thái "Chờ nhận" hôm nay, gồm: mã booking, tên khách hàng, số điện thoại, phòng, giờ đặt.</w:t>
             </w:r>
             <w:r>
               <w:br/>
@@ -984,7 +2007,7 @@
               <w:rPr>
                 <w:sz w:val="20"/>
               </w:rPr>
-              <w:t>3. Hệ thống hiển thị danh sách booking trạng thái "Chờ nhận".</w:t>
+              <w:t>3. Nhân viên chọn booking cần check-in.</w:t>
             </w:r>
             <w:r>
               <w:br/>
@@ -993,7 +2016,7 @@
               <w:rPr>
                 <w:sz w:val="20"/>
               </w:rPr>
-              <w:t>4. Nhân viên tìm booking của khách hàng theo tên, SĐT, hoặc mã booking.</w:t>
+              <w:t>4. Hệ thống hiển thị thông tin chi tiết: tên khách, SĐT, phòng, giờ đặt, giờ dự kiến check-in.</w:t>
             </w:r>
             <w:r>
               <w:br/>
@@ -1002,7 +2025,7 @@
               <w:rPr>
                 <w:sz w:val="20"/>
               </w:rPr>
-              <w:t>5. Nhân viên chọn booking cần hủy.</w:t>
+              <w:t>5. Nhân viên xác nhận thông tin với khách hàng tại quầy.</w:t>
             </w:r>
             <w:r>
               <w:br/>
@@ -1011,7 +2034,7 @@
               <w:rPr>
                 <w:sz w:val="20"/>
               </w:rPr>
-              <w:t>6. Hệ thống hiển thị thông tin chi tiết: tên khách, phòng, giờ đặt, tiền cọc (nếu có).</w:t>
+              <w:t>6. Nhân viên nhấn nút [Xác nhận Check-in].</w:t>
             </w:r>
             <w:r>
               <w:br/>
@@ -1020,7 +2043,7 @@
               <w:rPr>
                 <w:sz w:val="20"/>
               </w:rPr>
-              <w:t>7. Nhân viên nhấn nút [Hủy đặt phòng].</w:t>
+              <w:t>7. Hệ thống cập nhật trạng thái phòng từ "Chờ nhận" sang "Đang hoạt động".</w:t>
             </w:r>
             <w:r>
               <w:br/>
@@ -1029,7 +2052,7 @@
               <w:rPr>
                 <w:sz w:val="20"/>
               </w:rPr>
-              <w:t>8. Hệ thống hiển thị xác nhận "Bạn có chắc chắn muốn hủy booking này?".</w:t>
+              <w:t>8. Hệ thống ghi nhận thời gian bắt đầu sử dụng thực tế.</w:t>
             </w:r>
             <w:r>
               <w:br/>
@@ -1038,34 +2061,7 @@
               <w:rPr>
                 <w:sz w:val="20"/>
               </w:rPr>
-              <w:t>9. Nhân viên xác nhận [Đồng ý].</w:t>
-            </w:r>
-            <w:r>
-              <w:br/>
-            </w:r>
-            <w:r>
-              <w:rPr>
-                <w:sz w:val="20"/>
-              </w:rPr>
-              <w:t>10. Hệ thống cập nhật trạng thái booking sang "Đã hủy".</w:t>
-            </w:r>
-            <w:r>
-              <w:br/>
-            </w:r>
-            <w:r>
-              <w:rPr>
-                <w:sz w:val="20"/>
-              </w:rPr>
-              <w:t>11. Hệ thống chuyển trạng thái phòng về "Trống".</w:t>
-            </w:r>
-            <w:r>
-              <w:br/>
-            </w:r>
-            <w:r>
-              <w:rPr>
-                <w:sz w:val="20"/>
-              </w:rPr>
-              <w:t>12. Hệ thống hiển thị thông báo "Hủy đặt phòng thành công."</w:t>
+              <w:t>9. Hệ thống hiển thị thông báo "Check-in thành công! Phòng [tên phòng] đã sẵn sàng."</w:t>
             </w:r>
           </w:p>
         </w:tc>
@@ -1097,7 +2093,7 @@
               <w:rPr>
                 <w:sz w:val="20"/>
               </w:rPr>
-              <w:t>4a. Không tìm thấy booking:</w:t>
+              <w:t>3a. Khách hàng không đến đúng giờ đặt:</w:t>
             </w:r>
             <w:r>
               <w:br/>
@@ -1106,7 +2102,7 @@
               <w:rPr>
                 <w:sz w:val="20"/>
               </w:rPr>
-              <w:t>4a.1 Nhân viên yêu cầu khách hàng cung cấp lại thông tin.</w:t>
+              <w:t>3a.1 Nhân viên chọn hủy booking hoặc gia hạn thời gian chờ.</w:t>
             </w:r>
             <w:r>
               <w:br/>
@@ -1115,7 +2111,7 @@
               <w:rPr>
                 <w:sz w:val="20"/>
               </w:rPr>
-              <w:t>4a.2 Nếu vẫn không tìm thấy, thông báo "Không tìm thấy booking phù hợp.".</w:t>
+              <w:t>3a.2 Nếu hủy, hệ thống chuyển trạng thái booking sang "Đã hủy", phòng về "Trống".</w:t>
             </w:r>
             <w:r>
               <w:br/>
@@ -1124,7 +2120,7 @@
               <w:rPr>
                 <w:sz w:val="20"/>
               </w:rPr>
-              <w:t>7a. Booking đã quá thời gian cho phép hủy:</w:t>
+              <w:t>6a. Phòng đang được dọn dẹp:</w:t>
             </w:r>
             <w:r>
               <w:br/>
@@ -1133,7 +2129,7 @@
               <w:rPr>
                 <w:sz w:val="20"/>
               </w:rPr>
-              <w:t>7a.1 Hệ thống hiển thị "Booking đã quá thời gian hủy, không thể hủy.".</w:t>
+              <w:t>6a.1 Hệ thống hiển thị thông báo "Phòng đang dọn dẹp, vui lòng chờ.".</w:t>
             </w:r>
             <w:r>
               <w:br/>
@@ -1142,7 +2138,7 @@
               <w:rPr>
                 <w:sz w:val="20"/>
               </w:rPr>
-              <w:t>7a.2 Nhân viên thông báo cho khách hàng.</w:t>
+              <w:t>6a.2 Nhân viên chờ hoặc chuyển khách sang phòng khác.</w:t>
             </w:r>
             <w:r>
               <w:br/>
@@ -1151,7 +2147,7 @@
               <w:rPr>
                 <w:sz w:val="20"/>
               </w:rPr>
-              <w:t>9a. Khách hàng yêu cầu hoàn tiền cọc:</w:t>
+              <w:t>6b. Thông tin booking không khớp:</w:t>
             </w:r>
             <w:r>
               <w:br/>
@@ -1160,7 +2156,7 @@
               <w:rPr>
                 <w:sz w:val="20"/>
               </w:rPr>
-              <w:t>9a.1 Nhân viên kiểm tra chính sách hoàn tiền.</w:t>
+              <w:t>6b.1 Nhân viên yêu cầu khách hàng cung cấp lại thông tin xác minh.</w:t>
             </w:r>
             <w:r>
               <w:br/>
@@ -1169,12 +2165,1632 @@
               <w:rPr>
                 <w:sz w:val="20"/>
               </w:rPr>
-              <w:t>9a.2 Nếu đủ điều kiện, nhân viên xử lý hoàn tiền thủ công (ngoài hệ thống).</w:t>
+              <w:t>6b.2 Nếu không khớp, nhân viên liên hệ quản lý.</w:t>
             </w:r>
           </w:p>
         </w:tc>
       </w:tr>
     </w:tbl>
+    <w:p>
+      <w:pPr>
+        <w:pStyle w:val="Heading2"/>
+      </w:pPr>
+      <w:r>
+        <w:t>1.3. Kịch bản "Check-out"</w:t>
+      </w:r>
+    </w:p>
+    <w:tbl>
+      <w:tblPr>
+        <w:tblStyle w:val="TableGrid"/>
+        <w:tblW w:type="auto" w:w="0"/>
+        <w:jc w:val="center"/>
+        <w:tblLook w:firstColumn="1" w:firstRow="1" w:lastColumn="0" w:lastRow="0" w:noHBand="0" w:noVBand="1" w:val="04A0"/>
+      </w:tblPr>
+      <w:tblGrid>
+        <w:gridCol w:w="4320"/>
+        <w:gridCol w:w="4320"/>
+      </w:tblGrid>
+      <w:tr>
+        <w:tc>
+          <w:tcPr>
+            <w:tcW w:type="dxa" w:w="2835"/>
+            <w:shd w:fill="D9E2F3"/>
+          </w:tcPr>
+          <w:p>
+            <w:pPr/>
+            <w:r/>
+            <w:r>
+              <w:rPr>
+                <w:b/>
+                <w:sz w:val="20"/>
+              </w:rPr>
+              <w:t>Use case</w:t>
+            </w:r>
+          </w:p>
+        </w:tc>
+        <w:tc>
+          <w:tcPr>
+            <w:tcW w:type="dxa" w:w="6803"/>
+            <w:shd w:fill="D9E2F3"/>
+          </w:tcPr>
+          <w:p>
+            <w:pPr/>
+            <w:r/>
+            <w:r>
+              <w:rPr>
+                <w:b/>
+                <w:sz w:val="20"/>
+              </w:rPr>
+              <w:t>Check-out</w:t>
+            </w:r>
+          </w:p>
+        </w:tc>
+      </w:tr>
+      <w:tr>
+        <w:tc>
+          <w:tcPr>
+            <w:tcW w:type="dxa" w:w="2835"/>
+          </w:tcPr>
+          <w:p>
+            <w:pPr/>
+            <w:r/>
+            <w:r>
+              <w:rPr>
+                <w:sz w:val="20"/>
+              </w:rPr>
+              <w:t>Actor</w:t>
+            </w:r>
+          </w:p>
+        </w:tc>
+        <w:tc>
+          <w:tcPr>
+            <w:tcW w:type="dxa" w:w="6803"/>
+          </w:tcPr>
+          <w:p>
+            <w:pPr/>
+            <w:r/>
+            <w:r>
+              <w:rPr>
+                <w:sz w:val="20"/>
+              </w:rPr>
+              <w:t>Nhân viên lễ tân</w:t>
+            </w:r>
+          </w:p>
+        </w:tc>
+      </w:tr>
+      <w:tr>
+        <w:tc>
+          <w:tcPr>
+            <w:tcW w:type="dxa" w:w="2835"/>
+          </w:tcPr>
+          <w:p>
+            <w:pPr/>
+            <w:r/>
+            <w:r>
+              <w:rPr>
+                <w:sz w:val="20"/>
+              </w:rPr>
+              <w:t>Tiền điều kiện</w:t>
+            </w:r>
+          </w:p>
+        </w:tc>
+        <w:tc>
+          <w:tcPr>
+            <w:tcW w:type="dxa" w:w="6803"/>
+          </w:tcPr>
+          <w:p>
+            <w:pPr/>
+            <w:r/>
+            <w:r>
+              <w:rPr>
+                <w:sz w:val="20"/>
+              </w:rPr>
+              <w:t>Nhân viên đã đăng nhập vào hệ thống. Phòng ở trạng thái "Đang hoạt động" (đã check-in trước đó).</w:t>
+            </w:r>
+          </w:p>
+        </w:tc>
+      </w:tr>
+      <w:tr>
+        <w:tc>
+          <w:tcPr>
+            <w:tcW w:type="dxa" w:w="2835"/>
+          </w:tcPr>
+          <w:p>
+            <w:pPr/>
+            <w:r/>
+            <w:r>
+              <w:rPr>
+                <w:sz w:val="20"/>
+              </w:rPr>
+              <w:t>Hậu điều kiện</w:t>
+            </w:r>
+          </w:p>
+        </w:tc>
+        <w:tc>
+          <w:tcPr>
+            <w:tcW w:type="dxa" w:w="6803"/>
+          </w:tcPr>
+          <w:p>
+            <w:pPr/>
+            <w:r/>
+            <w:r>
+              <w:rPr>
+                <w:sz w:val="20"/>
+              </w:rPr>
+              <w:t>Phòng chuyển trạng thái từ "Đang hoạt động" sang "Trống". Hóa đơn được tạo và thanh toán hoàn tất. Điểm tích lũy được cộng vào tài khoản hội viên (nếu có).</w:t>
+            </w:r>
+          </w:p>
+        </w:tc>
+      </w:tr>
+      <w:tr>
+        <w:tc>
+          <w:tcPr>
+            <w:tcW w:type="dxa" w:w="2835"/>
+          </w:tcPr>
+          <w:p>
+            <w:pPr/>
+            <w:r/>
+            <w:r>
+              <w:rPr>
+                <w:sz w:val="20"/>
+              </w:rPr>
+              <w:t>Kịch bản chính</w:t>
+            </w:r>
+          </w:p>
+        </w:tc>
+        <w:tc>
+          <w:tcPr>
+            <w:tcW w:type="dxa" w:w="6803"/>
+          </w:tcPr>
+          <w:p>
+            <w:pPr/>
+            <w:r/>
+            <w:r>
+              <w:rPr>
+                <w:sz w:val="20"/>
+              </w:rPr>
+              <w:t>1. Nhân viên lễ tân chọn chức năng "Check-out" trên giao diện chính.</w:t>
+            </w:r>
+            <w:r>
+              <w:br/>
+            </w:r>
+            <w:r>
+              <w:rPr>
+                <w:sz w:val="20"/>
+              </w:rPr>
+              <w:t>2. Hệ thống hiển thị danh sách các phòng đang ở trạng thái "Đang hoạt động", gồm: mã phòng, tên khách, giờ bắt đầu, thời gian sử dụng.</w:t>
+            </w:r>
+            <w:r>
+              <w:br/>
+            </w:r>
+            <w:r>
+              <w:rPr>
+                <w:sz w:val="20"/>
+              </w:rPr>
+              <w:t>3. Nhân viên chọn phòng cần check-out.</w:t>
+            </w:r>
+            <w:r>
+              <w:br/>
+            </w:r>
+            <w:r>
+              <w:rPr>
+                <w:sz w:val="20"/>
+              </w:rPr>
+              <w:t>4. Hệ thống hiển thị thông tin tổng hợp: thời gian sử dụng phòng, tiền phòng (giờ × đơn giá), tổng tiền order dịch vụ, tổng tiền trước giảm giá.</w:t>
+            </w:r>
+            <w:r>
+              <w:br/>
+            </w:r>
+            <w:r>
+              <w:rPr>
+                <w:sz w:val="20"/>
+              </w:rPr>
+              <w:t>5. Nếu khách là hội viên, hệ thống tự động áp dụng ưu đãi hạng hội viên (% giảm giá).</w:t>
+            </w:r>
+            <w:r>
+              <w:br/>
+            </w:r>
+            <w:r>
+              <w:rPr>
+                <w:sz w:val="20"/>
+              </w:rPr>
+              <w:t>6. Nhân viên nhập mã voucher (nếu có) và nhấn [Áp dụng].</w:t>
+            </w:r>
+            <w:r>
+              <w:br/>
+            </w:r>
+            <w:r>
+              <w:rPr>
+                <w:sz w:val="20"/>
+              </w:rPr>
+              <w:t>7. Hệ thống hiển thị tổng tiền cần thanh toán sau giảm giá.</w:t>
+            </w:r>
+            <w:r>
+              <w:br/>
+            </w:r>
+            <w:r>
+              <w:rPr>
+                <w:sz w:val="20"/>
+              </w:rPr>
+              <w:t>8. Khách hàng chọn phương thức thanh toán (tiền mặt / chuyển khoản).</w:t>
+            </w:r>
+            <w:r>
+              <w:br/>
+            </w:r>
+            <w:r>
+              <w:rPr>
+                <w:sz w:val="20"/>
+              </w:rPr>
+              <w:t>9. Nhân viên chọn phương thức thanh toán và nhấn [Xác nhận thanh toán].</w:t>
+            </w:r>
+            <w:r>
+              <w:br/>
+            </w:r>
+            <w:r>
+              <w:rPr>
+                <w:sz w:val="20"/>
+              </w:rPr>
+              <w:t>10. Hệ thống tạo hóa đơn, cập nhật trạng thái thanh toán "Đã thanh toán".</w:t>
+            </w:r>
+            <w:r>
+              <w:br/>
+            </w:r>
+            <w:r>
+              <w:rPr>
+                <w:sz w:val="20"/>
+              </w:rPr>
+              <w:t>11. Hệ thống chuyển trạng thái phòng về "Trống".</w:t>
+            </w:r>
+            <w:r>
+              <w:br/>
+            </w:r>
+            <w:r>
+              <w:rPr>
+                <w:sz w:val="20"/>
+              </w:rPr>
+              <w:t>12. Nếu khách là hội viên, hệ thống cộng điểm tích lũy tự động.</w:t>
+            </w:r>
+            <w:r>
+              <w:br/>
+            </w:r>
+            <w:r>
+              <w:rPr>
+                <w:sz w:val="20"/>
+              </w:rPr>
+              <w:t>13. Hệ thống hiển thị thông báo "Check-out thành công! Tổng tiền: [X]đ." và nút [In hóa đơn].</w:t>
+            </w:r>
+          </w:p>
+        </w:tc>
+      </w:tr>
+      <w:tr>
+        <w:tc>
+          <w:tcPr>
+            <w:tcW w:type="dxa" w:w="2835"/>
+          </w:tcPr>
+          <w:p>
+            <w:pPr/>
+            <w:r/>
+            <w:r>
+              <w:rPr>
+                <w:sz w:val="20"/>
+              </w:rPr>
+              <w:t>Ngoại lệ</w:t>
+            </w:r>
+          </w:p>
+        </w:tc>
+        <w:tc>
+          <w:tcPr>
+            <w:tcW w:type="dxa" w:w="6803"/>
+          </w:tcPr>
+          <w:p>
+            <w:pPr/>
+            <w:r/>
+            <w:r>
+              <w:rPr>
+                <w:sz w:val="20"/>
+              </w:rPr>
+              <w:t>3a. Phòng có order dịch vụ chưa được xác nhận:</w:t>
+            </w:r>
+            <w:r>
+              <w:br/>
+            </w:r>
+            <w:r>
+              <w:rPr>
+                <w:sz w:val="20"/>
+              </w:rPr>
+              <w:t>3a.1 Hệ thống cảnh báo "Có [N] order chưa xác nhận.".</w:t>
+            </w:r>
+            <w:r>
+              <w:br/>
+            </w:r>
+            <w:r>
+              <w:rPr>
+                <w:sz w:val="20"/>
+              </w:rPr>
+              <w:t>3a.2 Nhân viên xác nhận hoặc hủy các order trước khi tiếp tục.</w:t>
+            </w:r>
+            <w:r>
+              <w:br/>
+            </w:r>
+            <w:r>
+              <w:rPr>
+                <w:sz w:val="20"/>
+              </w:rPr>
+              <w:t>5a. Khách hàng không phải hội viên:</w:t>
+            </w:r>
+            <w:r>
+              <w:br/>
+            </w:r>
+            <w:r>
+              <w:rPr>
+                <w:sz w:val="20"/>
+              </w:rPr>
+              <w:t>5a.1 Hệ thống bỏ qua bước áp dụng ưu đãi hạng.</w:t>
+            </w:r>
+            <w:r>
+              <w:br/>
+            </w:r>
+            <w:r>
+              <w:rPr>
+                <w:sz w:val="20"/>
+              </w:rPr>
+              <w:t>8a. Khách hàng khiếu nại hóa đơn:</w:t>
+            </w:r>
+            <w:r>
+              <w:br/>
+            </w:r>
+            <w:r>
+              <w:rPr>
+                <w:sz w:val="20"/>
+              </w:rPr>
+              <w:t>8a.1 Nhân viên chỉnh sửa hóa đơn (thêm/bớt mục) trước khi xác nhận.</w:t>
+            </w:r>
+            <w:r>
+              <w:br/>
+            </w:r>
+            <w:r>
+              <w:rPr>
+                <w:sz w:val="20"/>
+              </w:rPr>
+              <w:t>8a.2 Nếu cần, nhân viên liên hệ quản lý để xử lý.</w:t>
+            </w:r>
+            <w:r>
+              <w:br/>
+            </w:r>
+            <w:r>
+              <w:rPr>
+                <w:sz w:val="20"/>
+              </w:rPr>
+              <w:t>9a. Thanh toán chuyển khoản thất bại:</w:t>
+            </w:r>
+            <w:r>
+              <w:br/>
+            </w:r>
+            <w:r>
+              <w:rPr>
+                <w:sz w:val="20"/>
+              </w:rPr>
+              <w:t>9a.1 Hệ thống hiển thị lỗi, yêu cầu chọn lại phương thức.</w:t>
+            </w:r>
+            <w:r>
+              <w:br/>
+            </w:r>
+            <w:r>
+              <w:rPr>
+                <w:sz w:val="20"/>
+              </w:rPr>
+              <w:t>9a.2 Nhân viên xác nhận với khách và thử lại.</w:t>
+            </w:r>
+          </w:p>
+        </w:tc>
+      </w:tr>
+    </w:tbl>
+    <w:p>
+      <w:pPr>
+        <w:pStyle w:val="Heading2"/>
+      </w:pPr>
+      <w:r>
+        <w:t>1.4. Kịch bản "Huỷ phòng"</w:t>
+      </w:r>
+    </w:p>
+    <w:tbl>
+      <w:tblPr>
+        <w:tblStyle w:val="TableGrid"/>
+        <w:tblW w:type="auto" w:w="0"/>
+        <w:jc w:val="center"/>
+        <w:tblLook w:firstColumn="1" w:firstRow="1" w:lastColumn="0" w:lastRow="0" w:noHBand="0" w:noVBand="1" w:val="04A0"/>
+      </w:tblPr>
+      <w:tblGrid>
+        <w:gridCol w:w="4320"/>
+        <w:gridCol w:w="4320"/>
+      </w:tblGrid>
+      <w:tr>
+        <w:tc>
+          <w:tcPr>
+            <w:tcW w:type="dxa" w:w="2835"/>
+            <w:shd w:fill="D9E2F3"/>
+          </w:tcPr>
+          <w:p>
+            <w:pPr/>
+            <w:r/>
+            <w:r>
+              <w:rPr>
+                <w:b/>
+                <w:sz w:val="20"/>
+              </w:rPr>
+              <w:t>Use case</w:t>
+            </w:r>
+          </w:p>
+        </w:tc>
+        <w:tc>
+          <w:tcPr>
+            <w:tcW w:type="dxa" w:w="6803"/>
+            <w:shd w:fill="D9E2F3"/>
+          </w:tcPr>
+          <w:p>
+            <w:pPr/>
+            <w:r/>
+            <w:r>
+              <w:rPr>
+                <w:b/>
+                <w:sz w:val="20"/>
+              </w:rPr>
+              <w:t>Huỷ phòng</w:t>
+            </w:r>
+          </w:p>
+        </w:tc>
+      </w:tr>
+      <w:tr>
+        <w:tc>
+          <w:tcPr>
+            <w:tcW w:type="dxa" w:w="2835"/>
+          </w:tcPr>
+          <w:p>
+            <w:pPr/>
+            <w:r/>
+            <w:r>
+              <w:rPr>
+                <w:sz w:val="20"/>
+              </w:rPr>
+              <w:t>Actor</w:t>
+            </w:r>
+          </w:p>
+        </w:tc>
+        <w:tc>
+          <w:tcPr>
+            <w:tcW w:type="dxa" w:w="6803"/>
+          </w:tcPr>
+          <w:p>
+            <w:pPr/>
+            <w:r/>
+            <w:r>
+              <w:rPr>
+                <w:sz w:val="20"/>
+              </w:rPr>
+              <w:t>Nhân viên lễ tân, khách hàng</w:t>
+            </w:r>
+          </w:p>
+        </w:tc>
+      </w:tr>
+      <w:tr>
+        <w:tc>
+          <w:tcPr>
+            <w:tcW w:type="dxa" w:w="2835"/>
+          </w:tcPr>
+          <w:p>
+            <w:pPr/>
+            <w:r/>
+            <w:r>
+              <w:rPr>
+                <w:sz w:val="20"/>
+              </w:rPr>
+              <w:t>Tiền điều kiện</w:t>
+            </w:r>
+          </w:p>
+        </w:tc>
+        <w:tc>
+          <w:tcPr>
+            <w:tcW w:type="dxa" w:w="6803"/>
+          </w:tcPr>
+          <w:p>
+            <w:pPr/>
+            <w:r/>
+            <w:r>
+              <w:rPr>
+                <w:sz w:val="20"/>
+              </w:rPr>
+              <w:t>Booking ở trạng thái "Chờ nhận" (chưa check-in).</w:t>
+            </w:r>
+          </w:p>
+        </w:tc>
+      </w:tr>
+      <w:tr>
+        <w:tc>
+          <w:tcPr>
+            <w:tcW w:type="dxa" w:w="2835"/>
+          </w:tcPr>
+          <w:p>
+            <w:pPr/>
+            <w:r/>
+            <w:r>
+              <w:rPr>
+                <w:sz w:val="20"/>
+              </w:rPr>
+              <w:t>Hậu điều kiện</w:t>
+            </w:r>
+          </w:p>
+        </w:tc>
+        <w:tc>
+          <w:tcPr>
+            <w:tcW w:type="dxa" w:w="6803"/>
+          </w:tcPr>
+          <w:p>
+            <w:pPr/>
+            <w:r/>
+            <w:r>
+              <w:rPr>
+                <w:sz w:val="20"/>
+              </w:rPr>
+              <w:t>Booking chuyển trạng thái sang "Đã hủy". Phòng về trạng thái "Trống". Tiền cọc (nếu có) được xử lý theo chính sách hoàn tiền.</w:t>
+            </w:r>
+          </w:p>
+        </w:tc>
+      </w:tr>
+      <w:tr>
+        <w:tc>
+          <w:tcPr>
+            <w:tcW w:type="dxa" w:w="2835"/>
+          </w:tcPr>
+          <w:p>
+            <w:pPr/>
+            <w:r/>
+            <w:r>
+              <w:rPr>
+                <w:sz w:val="20"/>
+              </w:rPr>
+              <w:t>Kịch bản chính</w:t>
+            </w:r>
+          </w:p>
+        </w:tc>
+        <w:tc>
+          <w:tcPr>
+            <w:tcW w:type="dxa" w:w="6803"/>
+          </w:tcPr>
+          <w:p>
+            <w:pPr/>
+            <w:r/>
+            <w:r>
+              <w:rPr>
+                <w:sz w:val="20"/>
+              </w:rPr>
+              <w:t>1. Khách hàng liên hệ lễ tân (trực tiếp hoặc qua hotline) yêu cầu hủy phòng.</w:t>
+            </w:r>
+            <w:r>
+              <w:br/>
+            </w:r>
+            <w:r>
+              <w:rPr>
+                <w:sz w:val="20"/>
+              </w:rPr>
+              <w:t>2. Nhân viên lễ tân chọn chức năng "Quản lý đặt phòng" trên giao diện.</w:t>
+            </w:r>
+            <w:r>
+              <w:br/>
+            </w:r>
+            <w:r>
+              <w:rPr>
+                <w:sz w:val="20"/>
+              </w:rPr>
+              <w:t>3. Hệ thống hiển thị danh sách booking trạng thái "Chờ nhận".</w:t>
+            </w:r>
+            <w:r>
+              <w:br/>
+            </w:r>
+            <w:r>
+              <w:rPr>
+                <w:sz w:val="20"/>
+              </w:rPr>
+              <w:t>4. Nhân viên tìm booking của khách hàng theo tên, SĐT, hoặc mã booking.</w:t>
+            </w:r>
+            <w:r>
+              <w:br/>
+            </w:r>
+            <w:r>
+              <w:rPr>
+                <w:sz w:val="20"/>
+              </w:rPr>
+              <w:t>5. Nhân viên chọn booking cần hủy.</w:t>
+            </w:r>
+            <w:r>
+              <w:br/>
+            </w:r>
+            <w:r>
+              <w:rPr>
+                <w:sz w:val="20"/>
+              </w:rPr>
+              <w:t>6. Hệ thống hiển thị thông tin chi tiết: tên khách, phòng, giờ đặt, tiền cọc (nếu có).</w:t>
+            </w:r>
+            <w:r>
+              <w:br/>
+            </w:r>
+            <w:r>
+              <w:rPr>
+                <w:sz w:val="20"/>
+              </w:rPr>
+              <w:t>7. Nhân viên nhấn nút [Hủy đặt phòng].</w:t>
+            </w:r>
+            <w:r>
+              <w:br/>
+            </w:r>
+            <w:r>
+              <w:rPr>
+                <w:sz w:val="20"/>
+              </w:rPr>
+              <w:t>8. Hệ thống hiển thị xác nhận "Bạn có chắc chắn muốn hủy booking này?".</w:t>
+            </w:r>
+            <w:r>
+              <w:br/>
+            </w:r>
+            <w:r>
+              <w:rPr>
+                <w:sz w:val="20"/>
+              </w:rPr>
+              <w:t>9. Nhân viên xác nhận [Đồng ý].</w:t>
+            </w:r>
+            <w:r>
+              <w:br/>
+            </w:r>
+            <w:r>
+              <w:rPr>
+                <w:sz w:val="20"/>
+              </w:rPr>
+              <w:t>10. Hệ thống cập nhật trạng thái booking sang "Đã hủy".</w:t>
+            </w:r>
+            <w:r>
+              <w:br/>
+            </w:r>
+            <w:r>
+              <w:rPr>
+                <w:sz w:val="20"/>
+              </w:rPr>
+              <w:t>11. Hệ thống chuyển trạng thái phòng về "Trống".</w:t>
+            </w:r>
+            <w:r>
+              <w:br/>
+            </w:r>
+            <w:r>
+              <w:rPr>
+                <w:sz w:val="20"/>
+              </w:rPr>
+              <w:t>12. Hệ thống hiển thị thông báo "Hủy đặt phòng thành công."</w:t>
+            </w:r>
+          </w:p>
+        </w:tc>
+      </w:tr>
+      <w:tr>
+        <w:tc>
+          <w:tcPr>
+            <w:tcW w:type="dxa" w:w="2835"/>
+          </w:tcPr>
+          <w:p>
+            <w:pPr/>
+            <w:r/>
+            <w:r>
+              <w:rPr>
+                <w:sz w:val="20"/>
+              </w:rPr>
+              <w:t>Ngoại lệ</w:t>
+            </w:r>
+          </w:p>
+        </w:tc>
+        <w:tc>
+          <w:tcPr>
+            <w:tcW w:type="dxa" w:w="6803"/>
+          </w:tcPr>
+          <w:p>
+            <w:pPr/>
+            <w:r/>
+            <w:r>
+              <w:rPr>
+                <w:sz w:val="20"/>
+              </w:rPr>
+              <w:t>4a. Không tìm thấy booking:</w:t>
+            </w:r>
+            <w:r>
+              <w:br/>
+            </w:r>
+            <w:r>
+              <w:rPr>
+                <w:sz w:val="20"/>
+              </w:rPr>
+              <w:t>4a.1 Nhân viên yêu cầu khách hàng cung cấp lại thông tin.</w:t>
+            </w:r>
+            <w:r>
+              <w:br/>
+            </w:r>
+            <w:r>
+              <w:rPr>
+                <w:sz w:val="20"/>
+              </w:rPr>
+              <w:t>4a.2 Nếu vẫn không tìm thấy, thông báo "Không tìm thấy booking phù hợp.".</w:t>
+            </w:r>
+            <w:r>
+              <w:br/>
+            </w:r>
+            <w:r>
+              <w:rPr>
+                <w:sz w:val="20"/>
+              </w:rPr>
+              <w:t>7a. Booking đã quá thời gian cho phép hủy:</w:t>
+            </w:r>
+            <w:r>
+              <w:br/>
+            </w:r>
+            <w:r>
+              <w:rPr>
+                <w:sz w:val="20"/>
+              </w:rPr>
+              <w:t>7a.1 Hệ thống hiển thị "Booking đã quá thời gian hủy, không thể hủy.".</w:t>
+            </w:r>
+            <w:r>
+              <w:br/>
+            </w:r>
+            <w:r>
+              <w:rPr>
+                <w:sz w:val="20"/>
+              </w:rPr>
+              <w:t>7a.2 Nhân viên thông báo cho khách hàng.</w:t>
+            </w:r>
+            <w:r>
+              <w:br/>
+            </w:r>
+            <w:r>
+              <w:rPr>
+                <w:sz w:val="20"/>
+              </w:rPr>
+              <w:t>9a. Khách hàng yêu cầu hoàn tiền cọc:</w:t>
+            </w:r>
+            <w:r>
+              <w:br/>
+            </w:r>
+            <w:r>
+              <w:rPr>
+                <w:sz w:val="20"/>
+              </w:rPr>
+              <w:t>9a.1 Nhân viên kiểm tra chính sách hoàn tiền.</w:t>
+            </w:r>
+            <w:r>
+              <w:br/>
+            </w:r>
+            <w:r>
+              <w:rPr>
+                <w:sz w:val="20"/>
+              </w:rPr>
+              <w:t>9a.2 Nếu đủ điều kiện, nhân viên xử lý hoàn tiền thủ công (ngoài hệ thống).</w:t>
+            </w:r>
+          </w:p>
+        </w:tc>
+      </w:tr>
+    </w:tbl>
+    <w:p/>
+    <w:p>
+      <w:pPr>
+        <w:pStyle w:val="Heading2"/>
+      </w:pPr>
+      <w:r>
+        <w:t>2.5. Biểu đồ lớp thực thể pha phân tích</w:t>
+      </w:r>
+    </w:p>
+    <w:p>
+      <w:pPr>
+        <w:pStyle w:val="Heading3"/>
+      </w:pPr>
+      <w:r>
+        <w:t>a) Chức năng "Đặt phòng"</w:t>
+      </w:r>
+    </w:p>
+    <w:p>
+      <w:pPr/>
+      <w:r>
+        <w:rPr>
+          <w:b/>
+        </w:rPr>
+        <w:t>Boundary:</w:t>
+      </w:r>
+      <w:r>
+        <w:t xml:space="preserve"> ReceptionistHomeView, SearchFreeRoomView, SearchClientView, ConfirmView</w:t>
+      </w:r>
+    </w:p>
+    <w:p>
+      <w:pPr/>
+      <w:r>
+        <w:rPr>
+          <w:b/>
+        </w:rPr>
+        <w:t>Entity:</w:t>
+      </w:r>
+      <w:r>
+        <w:t xml:space="preserve"> Phong, KhachHang, ChiNhanh</w:t>
+      </w:r>
+    </w:p>
+    <w:p>
+      <w:pPr>
+        <w:pStyle w:val="Heading3"/>
+      </w:pPr>
+      <w:r>
+        <w:t>b) Chức năng "Huỷ phòng"</w:t>
+      </w:r>
+    </w:p>
+    <w:p>
+      <w:pPr/>
+      <w:r>
+        <w:rPr>
+          <w:b/>
+        </w:rPr>
+        <w:t>Boundary:</w:t>
+      </w:r>
+      <w:r>
+        <w:t xml:space="preserve"> ReceptionistHomeView, SearchBookingView, ConfirmCancelView</w:t>
+      </w:r>
+    </w:p>
+    <w:p>
+      <w:pPr/>
+      <w:r>
+        <w:rPr>
+          <w:b/>
+        </w:rPr>
+        <w:t>Entity:</w:t>
+      </w:r>
+      <w:r>
+        <w:t xml:space="preserve"> Phong, KhachHang</w:t>
+      </w:r>
+    </w:p>
+    <w:p>
+      <w:pPr>
+        <w:pStyle w:val="Heading3"/>
+      </w:pPr>
+      <w:r>
+        <w:t>c) Chức năng "Check-in"</w:t>
+      </w:r>
+    </w:p>
+    <w:p>
+      <w:pPr/>
+      <w:r>
+        <w:rPr>
+          <w:b/>
+        </w:rPr>
+        <w:t>Boundary:</w:t>
+      </w:r>
+      <w:r>
+        <w:t xml:space="preserve"> ReceptionistHomeView, CheckInView, ConfirmCheckInView</w:t>
+      </w:r>
+    </w:p>
+    <w:p>
+      <w:pPr/>
+      <w:r>
+        <w:rPr>
+          <w:b/>
+        </w:rPr>
+        <w:t>Entity:</w:t>
+      </w:r>
+      <w:r>
+        <w:t xml:space="preserve"> Phong, KhachHang</w:t>
+      </w:r>
+    </w:p>
+    <w:p>
+      <w:pPr>
+        <w:pStyle w:val="Heading3"/>
+      </w:pPr>
+      <w:r>
+        <w:t>d) Chức năng "Check-out"</w:t>
+      </w:r>
+    </w:p>
+    <w:p>
+      <w:pPr/>
+      <w:r>
+        <w:rPr>
+          <w:b/>
+        </w:rPr>
+        <w:t>Boundary:</w:t>
+      </w:r>
+      <w:r>
+        <w:t xml:space="preserve"> ReceptionistHomeView, CheckOutView, InvoiceView, PaymentView</w:t>
+      </w:r>
+    </w:p>
+    <w:p>
+      <w:pPr/>
+      <w:r>
+        <w:rPr>
+          <w:b/>
+        </w:rPr>
+        <w:t>Entity:</w:t>
+      </w:r>
+      <w:r>
+        <w:t xml:space="preserve"> Phong, HoaDon, ChiTietHoaDon, KhachHang, KhuyenMai</w:t>
+      </w:r>
+    </w:p>
+    <w:p>
+      <w:pPr/>
+      <w:r>
+        <w:t>---</w:t>
+      </w:r>
+    </w:p>
+    <w:p>
+      <w:pPr>
+        <w:pStyle w:val="Heading2"/>
+      </w:pPr>
+      <w:r>
+        <w:t>2.6. Biểu đồ tuần tự pha phân tích</w:t>
+      </w:r>
+    </w:p>
+    <w:p>
+      <w:pPr>
+        <w:pStyle w:val="Heading2"/>
+      </w:pPr>
+      <w:r>
+        <w:t>4.1. Chức năng "Đặt phòng"</w:t>
+      </w:r>
+    </w:p>
+    <w:p>
+      <w:pPr>
+        <w:pStyle w:val="Heading3"/>
+      </w:pPr>
+      <w:r>
+        <w:t>Kịch bản phiên bản 2 - Đặt phòng tại chi nhánh</w:t>
+      </w:r>
+    </w:p>
+    <w:p>
+      <w:pPr/>
+      <w:r>
+        <w:t>1. Nhân viên lễ tân click chức năng "Đặt phòng" trên giao diện ReceptionistHomeView.</w:t>
+      </w:r>
+    </w:p>
+    <w:p>
+      <w:pPr/>
+      <w:r>
+        <w:t>2. Lớp ReceptionistHomeView gọi sang lớp SearchFreeRoomView.</w:t>
+      </w:r>
+    </w:p>
+    <w:p>
+      <w:pPr/>
+      <w:r>
+        <w:t>3. Lớp SearchFreeRoomView hiển thị cho nhân viên.</w:t>
+      </w:r>
+    </w:p>
+    <w:p>
+      <w:pPr/>
+      <w:r>
+        <w:t>4. Nhân viên hỏi khách hàng thời gian đặt phòng.</w:t>
+      </w:r>
+    </w:p>
+    <w:p>
+      <w:pPr/>
+      <w:r>
+        <w:t>5. Khách hàng trả lời.</w:t>
+      </w:r>
+    </w:p>
+    <w:p>
+      <w:pPr/>
+      <w:r>
+        <w:t>6. Nhân viên nhập thời gian đặt phòng mong muốn của khách vào ô thời gian và ấn nút tìm kiếm.</w:t>
+      </w:r>
+    </w:p>
+    <w:p>
+      <w:pPr/>
+      <w:r>
+        <w:t>7. Lớp SearchFreeRoomView gọi đến lớp Phong để xử lý thông tin.</w:t>
+      </w:r>
+    </w:p>
+    <w:p>
+      <w:pPr/>
+      <w:r>
+        <w:t>8. Lớp Phong gọi hàm timPhongTrong().</w:t>
+      </w:r>
+    </w:p>
+    <w:p>
+      <w:pPr/>
+      <w:r>
+        <w:t>9. Lớp Phong trả kết quả về cho SearchFreeRoomView.</w:t>
+      </w:r>
+    </w:p>
+    <w:p>
+      <w:pPr/>
+      <w:r>
+        <w:t>10. Lớp SearchFreeRoomView hiển thị danh sách các phòng trống cho nhân viên.</w:t>
+      </w:r>
+    </w:p>
+    <w:p>
+      <w:pPr/>
+      <w:r>
+        <w:t>11. Nhân viên ấn vào phòng trống.</w:t>
+      </w:r>
+    </w:p>
+    <w:p>
+      <w:pPr/>
+      <w:r>
+        <w:t>12. Lớp SearchFreeRoomView gọi sang lớp SearchClientView.</w:t>
+      </w:r>
+    </w:p>
+    <w:p>
+      <w:pPr/>
+      <w:r>
+        <w:t>13. Lớp SearchClientView hiển thị.</w:t>
+      </w:r>
+    </w:p>
+    <w:p>
+      <w:pPr/>
+      <w:r>
+        <w:t>14. Nhân viên hỏi khách hàng về thông tin khách hàng.</w:t>
+      </w:r>
+    </w:p>
+    <w:p>
+      <w:pPr/>
+      <w:r>
+        <w:t>15. Khách hàng trả lời.</w:t>
+      </w:r>
+    </w:p>
+    <w:p>
+      <w:pPr/>
+      <w:r>
+        <w:t>16. Nhân viên nhập thông tin khách hàng và ấn nút tìm kiếm.</w:t>
+      </w:r>
+    </w:p>
+    <w:p>
+      <w:pPr/>
+      <w:r>
+        <w:t>17. Lớp SearchClientView gọi đến lớp KhachHang.</w:t>
+      </w:r>
+    </w:p>
+    <w:p>
+      <w:pPr/>
+      <w:r>
+        <w:t>18. Lớp KhachHang gọi hàm timKiemKH().</w:t>
+      </w:r>
+    </w:p>
+    <w:p>
+      <w:pPr/>
+      <w:r>
+        <w:t>19. Lớp KhachHang trả kết quả về cho lớp SearchClientView.</w:t>
+      </w:r>
+    </w:p>
+    <w:p>
+      <w:pPr/>
+      <w:r>
+        <w:t>20. Lớp SearchClientView hiển thị thông tin khách hàng tương ứng.</w:t>
+      </w:r>
+    </w:p>
+    <w:p>
+      <w:pPr/>
+      <w:r>
+        <w:t>21. Nhân viên chọn thông tin khách hàng tương ứng.</w:t>
+      </w:r>
+    </w:p>
+    <w:p>
+      <w:pPr/>
+      <w:r>
+        <w:t>22. Lớp SearchClientView gọi sang lớp ConfirmView.</w:t>
+      </w:r>
+    </w:p>
+    <w:p>
+      <w:pPr/>
+      <w:r>
+        <w:t>23. Lớp ConfirmView hiển thị.</w:t>
+      </w:r>
+    </w:p>
+    <w:p>
+      <w:pPr/>
+      <w:r>
+        <w:t>24. Nhân viên ấn xác nhận.</w:t>
+      </w:r>
+    </w:p>
+    <w:p>
+      <w:pPr/>
+      <w:r>
+        <w:t>25. Lớp ConfirmView gọi đến lớp Phong để xử lý.</w:t>
+      </w:r>
+    </w:p>
+    <w:p>
+      <w:pPr/>
+      <w:r>
+        <w:t>26. Lớp Phong gọi hàm doiTrangThai("Cho nhan").</w:t>
+      </w:r>
+    </w:p>
+    <w:p>
+      <w:pPr/>
+      <w:r>
+        <w:t>27. Lớp Phong trả kết quả về lớp ConfirmView.</w:t>
+      </w:r>
+    </w:p>
+    <w:p>
+      <w:pPr/>
+      <w:r>
+        <w:t>28. Lớp ConfirmView hiện thông báo.</w:t>
+      </w:r>
+    </w:p>
+    <w:p>
+      <w:pPr/>
+      <w:r>
+        <w:t>29. Nhân viên ấn OK.</w:t>
+      </w:r>
+    </w:p>
+    <w:p>
+      <w:pPr/>
+      <w:r>
+        <w:t>30. Lớp ConfirmView gọi lại về lớp ReceptionistHomeView.</w:t>
+      </w:r>
+    </w:p>
+    <w:p>
+      <w:pPr/>
+      <w:r>
+        <w:t>31. Lớp ReceptionistHomeView hiển thị.</w:t>
+      </w:r>
+    </w:p>
+    <w:p>
+      <w:pPr/>
+      <w:r>
+        <w:rPr>
+          <w:b/>
+        </w:rPr>
+        <w:t>Ngoại lệ:</w:t>
+      </w:r>
+    </w:p>
+    <w:p>
+      <w:pPr>
+        <w:pStyle w:val="ListBullet"/>
+      </w:pPr>
+      <w:r>
+        <w:t>Phòng trống không tìm thấy: SearchFreeRoomView hiển thị "Không có phòng trống trong khung giờ này."</w:t>
+      </w:r>
+    </w:p>
+    <w:p>
+      <w:pPr>
+        <w:pStyle w:val="ListBullet"/>
+      </w:pPr>
+      <w:r>
+        <w:t>Khách hàng chưa có trong CSDL: SearchClientView hiển thị nút [Đăng ký nhanh]. Nhân viên nhập thông tin mới, hệ thống tạo khách hàng mới trước khi tiếp tục.</w:t>
+      </w:r>
+    </w:p>
+    <w:p>
+      <w:pPr/>
+      <w:r>
+        <w:t>---</w:t>
+      </w:r>
+    </w:p>
+    <w:p>
+      <w:pPr>
+        <w:pStyle w:val="Heading2"/>
+      </w:pPr>
+      <w:r>
+        <w:t>4.2. Chức năng "Huỷ phòng"</w:t>
+      </w:r>
+    </w:p>
+    <w:p>
+      <w:pPr>
+        <w:pStyle w:val="Heading3"/>
+      </w:pPr>
+      <w:r>
+        <w:t>Kịch bản phiên bản 2 - Huỷ phòng</w:t>
+      </w:r>
+    </w:p>
+    <w:p>
+      <w:pPr/>
+      <w:r>
+        <w:t>1. Nhân viên lễ tân click chức năng "Quản lý đặt phòng" trên giao diện ReceptionistHomeView.</w:t>
+      </w:r>
+    </w:p>
+    <w:p>
+      <w:pPr/>
+      <w:r>
+        <w:t>2. Lớp ReceptionistHomeView gọi sang lớp SearchBookingView.</w:t>
+      </w:r>
+    </w:p>
+    <w:p>
+      <w:pPr/>
+      <w:r>
+        <w:t>3. Lớp SearchBookingView hiển thị.</w:t>
+      </w:r>
+    </w:p>
+    <w:p>
+      <w:pPr/>
+      <w:r>
+        <w:t>4. Nhân viên nhập thông tin tìm kiếm (tên khách, SĐT, hoặc mã booking).</w:t>
+      </w:r>
+    </w:p>
+    <w:p>
+      <w:pPr/>
+      <w:r>
+        <w:t>5. Nhân viên ấn nút tìm kiếm.</w:t>
+      </w:r>
+    </w:p>
+    <w:p>
+      <w:pPr/>
+      <w:r>
+        <w:t>6. Lớp SearchBookingView gọi đến lớp Phong.</w:t>
+      </w:r>
+    </w:p>
+    <w:p>
+      <w:pPr/>
+      <w:r>
+        <w:t>7. Lớp Phong gọi hàm timBooking(keyword).</w:t>
+      </w:r>
+    </w:p>
+    <w:p>
+      <w:pPr/>
+      <w:r>
+        <w:t>8. Lớp Phong trả kết quả về cho SearchBookingView.</w:t>
+      </w:r>
+    </w:p>
+    <w:p>
+      <w:pPr/>
+      <w:r>
+        <w:t>9. Lớp SearchBookingView hiển thị danh sách booking tìm thấy.</w:t>
+      </w:r>
+    </w:p>
+    <w:p>
+      <w:pPr/>
+      <w:r>
+        <w:t>10. Nhân viên chọn booking cần hủy.</w:t>
+      </w:r>
+    </w:p>
+    <w:p>
+      <w:pPr/>
+      <w:r>
+        <w:t>11. Lớp SearchBookingView gọi sang lớp ConfirmCancelView.</w:t>
+      </w:r>
+    </w:p>
+    <w:p>
+      <w:pPr/>
+      <w:r>
+        <w:t>12. Lớp ConfirmCancelView hiển thị xác nhận.</w:t>
+      </w:r>
+    </w:p>
+    <w:p>
+      <w:pPr/>
+      <w:r>
+        <w:t>13. Nhân viên ấn [Đồng ý].</w:t>
+      </w:r>
+    </w:p>
+    <w:p>
+      <w:pPr/>
+      <w:r>
+        <w:t>14. Lớp ConfirmCancelView gọi đến lớp Phong.</w:t>
+      </w:r>
+    </w:p>
+    <w:p>
+      <w:pPr/>
+      <w:r>
+        <w:t>15. Lớp Phong gọi hàm doiTrangThai("Da huy").</w:t>
+      </w:r>
+    </w:p>
+    <w:p>
+      <w:pPr/>
+      <w:r>
+        <w:t>16. Lớp Phong trả kết quả về.</w:t>
+      </w:r>
+    </w:p>
+    <w:p>
+      <w:pPr/>
+      <w:r>
+        <w:t>17. Lớp ConfirmCancelView hiện thông báo thành công.</w:t>
+      </w:r>
+    </w:p>
+    <w:p>
+      <w:pPr/>
+      <w:r>
+        <w:t>18. Nhân viên ấn OK.</w:t>
+      </w:r>
+    </w:p>
+    <w:p>
+      <w:pPr/>
+      <w:r>
+        <w:t>19. Lớp ConfirmCancelView gọi về ReceptionistHomeView.</w:t>
+      </w:r>
+    </w:p>
+    <w:p>
+      <w:pPr/>
+      <w:r>
+        <w:rPr>
+          <w:b/>
+        </w:rPr>
+        <w:t>Ngoại lệ:</w:t>
+      </w:r>
+    </w:p>
+    <w:p>
+      <w:pPr>
+        <w:pStyle w:val="ListBullet"/>
+      </w:pPr>
+      <w:r>
+        <w:t>Không tìm thấy booking: SearchBookingView hiển thị "Không tìm thấy booking phù hợp."</w:t>
+      </w:r>
+    </w:p>
+    <w:p>
+      <w:pPr>
+        <w:pStyle w:val="ListBullet"/>
+      </w:pPr>
+      <w:r>
+        <w:t>Booking đã quá thời gian hủy: ConfirmCancelView hiển thị "Booking đã quá thời gian hủy."</w:t>
+      </w:r>
+    </w:p>
+    <w:p>
+      <w:pPr/>
+      <w:r>
+        <w:t>---</w:t>
+      </w:r>
+    </w:p>
+    <w:p>
+      <w:pPr>
+        <w:pStyle w:val="Heading2"/>
+      </w:pPr>
+      <w:r>
+        <w:t>4.3. Chức năng "Check-in"</w:t>
+      </w:r>
+    </w:p>
+    <w:p>
+      <w:pPr>
+        <w:pStyle w:val="Heading3"/>
+      </w:pPr>
+      <w:r>
+        <w:t>Kịch bản phiên bản 2 - Check-in</w:t>
+      </w:r>
+    </w:p>
+    <w:p>
+      <w:pPr/>
+      <w:r>
+        <w:t>1. Nhân viên lễ tân click chức năng "Check-in" trên giao diện chính.</w:t>
+      </w:r>
+    </w:p>
+    <w:p>
+      <w:pPr/>
+      <w:r>
+        <w:t>2. Lớp ReceptionistHomeView gọi sang lớp CheckInView.</w:t>
+      </w:r>
+    </w:p>
+    <w:p>
+      <w:pPr/>
+      <w:r>
+        <w:t>3. Lớp CheckInView hiển thị danh sách booking "Chờ nhận".</w:t>
+      </w:r>
+    </w:p>
+    <w:p>
+      <w:pPr/>
+      <w:r>
+        <w:t>4. Nhân viên chọn booking cần check-in.</w:t>
+      </w:r>
+    </w:p>
+    <w:p>
+      <w:pPr/>
+      <w:r>
+        <w:t>5. Lớp CheckInView gọi sang lớp ConfirmCheckInView.</w:t>
+      </w:r>
+    </w:p>
+    <w:p>
+      <w:pPr/>
+      <w:r>
+        <w:t>6. Lớp ConfirmCheckInView hiển thị thông tin xác nhận.</w:t>
+      </w:r>
+    </w:p>
+    <w:p>
+      <w:pPr/>
+      <w:r>
+        <w:t>7. Nhân viên ấn [Xác nhận Check-in].</w:t>
+      </w:r>
+    </w:p>
+    <w:p>
+      <w:pPr/>
+      <w:r>
+        <w:t>8. Lớp ConfirmCheckInView gọi đến lớp Phong.</w:t>
+      </w:r>
+    </w:p>
+    <w:p>
+      <w:pPr/>
+      <w:r>
+        <w:t>9. Lớp Phong gọi hàm doiTrangThai("Dang hoat dong").</w:t>
+      </w:r>
+    </w:p>
+    <w:p>
+      <w:pPr/>
+      <w:r>
+        <w:t>10. Lớp Phong gọi hàm batDauTinhGio().</w:t>
+      </w:r>
+    </w:p>
+    <w:p>
+      <w:pPr/>
+      <w:r>
+        <w:t>11. Lớp Phong trả kết quả về.</w:t>
+      </w:r>
+    </w:p>
+    <w:p>
+      <w:pPr/>
+      <w:r>
+        <w:t>12. Lớp ConfirmCheckInView hiện thông báo thành công.</w:t>
+      </w:r>
+    </w:p>
+    <w:p>
+      <w:pPr/>
+      <w:r>
+        <w:t>13. Nhân viên ấn OK.</w:t>
+      </w:r>
+    </w:p>
+    <w:p>
+      <w:pPr/>
+      <w:r>
+        <w:t>14. Lớp ConfirmCheckInView gọi về ReceptionistHomeView.</w:t>
+      </w:r>
+    </w:p>
+    <w:p>
+      <w:pPr/>
+      <w:r>
+        <w:rPr>
+          <w:b/>
+        </w:rPr>
+        <w:t>Ngoại lệ:</w:t>
+      </w:r>
+    </w:p>
+    <w:p>
+      <w:pPr>
+        <w:pStyle w:val="ListBullet"/>
+      </w:pPr>
+      <w:r>
+        <w:t>Phòng đang dọn dẹp: Phong trả về lỗi. CheckInView hiển thị "Phòng đang dọn dẹp, vui lòng chờ."</w:t>
+      </w:r>
+    </w:p>
+    <w:p>
+      <w:pPr>
+        <w:pStyle w:val="ListBullet"/>
+      </w:pPr>
+      <w:r>
+        <w:t>Khách hàng không đến: Nhân viên chọn hủy booking thay vì check-in.</w:t>
+      </w:r>
+    </w:p>
+    <w:p>
+      <w:pPr/>
+      <w:r>
+        <w:t>---</w:t>
+      </w:r>
+    </w:p>
+    <w:p>
+      <w:pPr>
+        <w:pStyle w:val="Heading2"/>
+      </w:pPr>
+      <w:r>
+        <w:t>4.4. Chức năng "Check-out"</w:t>
+      </w:r>
+    </w:p>
+    <w:p>
+      <w:pPr>
+        <w:pStyle w:val="Heading3"/>
+      </w:pPr>
+      <w:r>
+        <w:t>Kịch bản phiên bản 2 - Check-out</w:t>
+      </w:r>
+    </w:p>
+    <w:p>
+      <w:pPr/>
+      <w:r>
+        <w:t>1. Nhân viên lễ tân click chức năng "Check-out" trên giao diện chính.</w:t>
+      </w:r>
+    </w:p>
+    <w:p>
+      <w:pPr/>
+      <w:r>
+        <w:t>2. Lớp ReceptionistHomeView gọi sang lớp CheckOutView.</w:t>
+      </w:r>
+    </w:p>
+    <w:p>
+      <w:pPr/>
+      <w:r>
+        <w:t>3. Lớp CheckOutView hiển thị danh sách phòng đang hoạt động.</w:t>
+      </w:r>
+    </w:p>
+    <w:p>
+      <w:pPr/>
+      <w:r>
+        <w:t>4. Nhân viên chọn phòng cần check-out.</w:t>
+      </w:r>
+    </w:p>
+    <w:p>
+      <w:pPr/>
+      <w:r>
+        <w:t>5. Lớp CheckOutView gọi sang lớp InvoiceView.</w:t>
+      </w:r>
+    </w:p>
+    <w:p>
+      <w:pPr/>
+      <w:r>
+        <w:t>6. Lớp InvoiceView gọi hàm tinhHoaDon() trên lớp HoaDon.</w:t>
+      </w:r>
+    </w:p>
+    <w:p>
+      <w:pPr/>
+      <w:r>
+        <w:t>7. Lớp HoaDon trả kết quả hóa đơn về InvoiceView.</w:t>
+      </w:r>
+    </w:p>
+    <w:p>
+      <w:pPr/>
+      <w:r>
+        <w:t>8. InvoiceView gọi lớp KhachHang để lấy thông tin khách.</w:t>
+      </w:r>
+    </w:p>
+    <w:p>
+      <w:pPr/>
+      <w:r>
+        <w:t>9. InvoiceView gọi lớp KhuyenMai để kiểm tra ưu đãi.</w:t>
+      </w:r>
+    </w:p>
+    <w:p>
+      <w:pPr/>
+      <w:r>
+        <w:t>10. InvoiceView hiển thị hóa đơn cho nhân viên.</w:t>
+      </w:r>
+    </w:p>
+    <w:p>
+      <w:pPr/>
+      <w:r>
+        <w:t>11. Nhân viên chọn phương thức thanh toán "Tiền mặt".</w:t>
+      </w:r>
+    </w:p>
+    <w:p>
+      <w:pPr/>
+      <w:r>
+        <w:t>12. Nhân viên ấn [Xác nhận thanh toán].</w:t>
+      </w:r>
+    </w:p>
+    <w:p>
+      <w:pPr/>
+      <w:r>
+        <w:t>13. InvoiceView gọi lớp Payment.</w:t>
+      </w:r>
+    </w:p>
+    <w:p>
+      <w:pPr/>
+      <w:r>
+        <w:t>14. Payment gọi hàm capNhatTrangThai("Da thanh toan") trên HoaDon.</w:t>
+      </w:r>
+    </w:p>
+    <w:p>
+      <w:pPr/>
+      <w:r>
+        <w:t>15. Payment gọi hàm doiTrangThai("Trong") trên Phong.</w:t>
+      </w:r>
+    </w:p>
+    <w:p>
+      <w:pPr/>
+      <w:r>
+        <w:t>16. Payment hiện thông báo thành công.</w:t>
+      </w:r>
+    </w:p>
+    <w:p>
+      <w:pPr/>
+      <w:r>
+        <w:t>17. Nhân viên ấn [In hóa đơn].</w:t>
+      </w:r>
+    </w:p>
+    <w:p>
+      <w:pPr/>
+      <w:r>
+        <w:rPr>
+          <w:b/>
+        </w:rPr>
+        <w:t>Ngoại lệ:</w:t>
+      </w:r>
+    </w:p>
+    <w:p>
+      <w:pPr>
+        <w:pStyle w:val="ListBullet"/>
+      </w:pPr>
+      <w:r>
+        <w:t>Voucher không hợp lệ: InvoiceView hiển thị "Mã voucher không hợp lệ hoặc đã hết hạn."</w:t>
+      </w:r>
+    </w:p>
+    <w:p>
+      <w:pPr>
+        <w:pStyle w:val="ListBullet"/>
+      </w:pPr>
+      <w:r>
+        <w:t>Thanh toán chuyển khoản thất bại: PaymentView hiển thị lỗi, yêu cầu chọn lại phương thức.</w:t>
+      </w:r>
+    </w:p>
     <w:p/>
     <w:p>
       <w:pPr>
@@ -3759,7 +6375,7 @@
         <w:pStyle w:val="Heading4"/>
       </w:pPr>
       <w:r>
-        <w:t>2. Tầng điều khiển (Control/DAO)</w:t>
+        <w:t>2. Tầng điều khiển (Control)</w:t>
       </w:r>
     </w:p>
     <w:p>
@@ -4443,7 +7059,7 @@
         <w:pStyle w:val="Heading4"/>
       </w:pPr>
       <w:r>
-        <w:t>2. Tầng điều khiển (Control/DAO)</w:t>
+        <w:t>2. Tầng điều khiển (Control)</w:t>
       </w:r>
     </w:p>
     <w:p>
@@ -4947,7 +7563,7 @@
         <w:pStyle w:val="Heading4"/>
       </w:pPr>
       <w:r>
-        <w:t>2. Tầng điều khiển (Control/DAO)</w:t>
+        <w:t>2. Tầng điều khiển (Control)</w:t>
       </w:r>
     </w:p>
     <w:p>
@@ -5526,7 +8142,7 @@
         <w:pStyle w:val="Heading4"/>
       </w:pPr>
       <w:r>
-        <w:t>2. Tầng điều khiển (Control/DAO)</w:t>
+        <w:t>2. Tầng điều khiển (Control)</w:t>
       </w:r>
     </w:p>
     <w:p>

</xml_diff>

<commit_message>
fix: align with skill changes — DAO architecture, Vietnamese method names, PlantUML v2
From commit 134ac14 (cnpm skill update):

1. Architecture: React MVC (Boundary -> Control -> Entity), NOT DAO
   - BookingController split into RoomController, ClientController,
     BookingController, InvoiceController (CRUD pattern)
   - Boundary classes have UI components (-txtXxx : TextBox, -btnXxx : Button)
     and event handlers (+formLoad(), +btnXxxClick(), +showMessage())

2. PlantUML Theme v2:
   - hide circle (remove C/A/I/E icons)
   - <style> CSS for sequence diagrams (precise padding)
   - Arial font, size 10, AttributeFontSize 9
   - VP Base Theme applied to all 7 diagrams

3. All 7 diagrams regenerated via MCP tool with v2 theme

Co-Authored-By: Claude Opus 4.7 <noreply@anthropic.com>
</commit_message>
<xml_diff>
--- a/output/booking_module.docx
+++ b/output/booking_module.docx
@@ -4764,7 +4764,7 @@
       <w:r>
         <w:drawing>
           <wp:inline xmlns:a="http://schemas.openxmlformats.org/drawingml/2006/main" xmlns:pic="http://schemas.openxmlformats.org/drawingml/2006/picture">
-            <wp:extent cx="5486400" cy="8087040"/>
+            <wp:extent cx="5486400" cy="8422953"/>
             <wp:docPr id="1" name="Picture 1"/>
             <wp:cNvGraphicFramePr>
               <a:graphicFrameLocks noChangeAspect="1"/>
@@ -4785,7 +4785,7 @@
                   <pic:spPr>
                     <a:xfrm>
                       <a:off x="0" y="0"/>
-                      <a:ext cx="5486400" cy="8087040"/>
+                      <a:ext cx="5486400" cy="8422953"/>
                     </a:xfrm>
                     <a:prstGeom prst="rect"/>
                   </pic:spPr>
@@ -5520,7 +5520,7 @@
       <w:r>
         <w:drawing>
           <wp:inline xmlns:a="http://schemas.openxmlformats.org/drawingml/2006/main" xmlns:pic="http://schemas.openxmlformats.org/drawingml/2006/picture">
-            <wp:extent cx="5486400" cy="5492456"/>
+            <wp:extent cx="5486400" cy="5852691"/>
             <wp:docPr id="2" name="Picture 2"/>
             <wp:cNvGraphicFramePr>
               <a:graphicFrameLocks noChangeAspect="1"/>
@@ -5541,7 +5541,7 @@
                   <pic:spPr>
                     <a:xfrm>
                       <a:off x="0" y="0"/>
-                      <a:ext cx="5486400" cy="5492456"/>
+                      <a:ext cx="5486400" cy="5852691"/>
                     </a:xfrm>
                     <a:prstGeom prst="rect"/>
                   </pic:spPr>
@@ -8485,7 +8485,7 @@
       <w:r>
         <w:drawing>
           <wp:inline xmlns:a="http://schemas.openxmlformats.org/drawingml/2006/main" xmlns:pic="http://schemas.openxmlformats.org/drawingml/2006/picture">
-            <wp:extent cx="5486400" cy="4043774"/>
+            <wp:extent cx="5486400" cy="5323869"/>
             <wp:docPr id="3" name="Picture 3"/>
             <wp:cNvGraphicFramePr>
               <a:graphicFrameLocks noChangeAspect="1"/>
@@ -8506,7 +8506,7 @@
                   <pic:spPr>
                     <a:xfrm>
                       <a:off x="0" y="0"/>
-                      <a:ext cx="5486400" cy="4043774"/>
+                      <a:ext cx="5486400" cy="5323869"/>
                     </a:xfrm>
                     <a:prstGeom prst="rect"/>
                   </pic:spPr>
@@ -8547,7 +8547,7 @@
       <w:r>
         <w:drawing>
           <wp:inline xmlns:a="http://schemas.openxmlformats.org/drawingml/2006/main" xmlns:pic="http://schemas.openxmlformats.org/drawingml/2006/picture">
-            <wp:extent cx="5486400" cy="4051883"/>
+            <wp:extent cx="5486400" cy="4622137"/>
             <wp:docPr id="4" name="Picture 4"/>
             <wp:cNvGraphicFramePr>
               <a:graphicFrameLocks noChangeAspect="1"/>
@@ -8568,7 +8568,7 @@
                   <pic:spPr>
                     <a:xfrm>
                       <a:off x="0" y="0"/>
-                      <a:ext cx="5486400" cy="4051883"/>
+                      <a:ext cx="5486400" cy="4622137"/>
                     </a:xfrm>
                     <a:prstGeom prst="rect"/>
                   </pic:spPr>
@@ -8787,7 +8787,7 @@
       <w:r>
         <w:drawing>
           <wp:inline xmlns:a="http://schemas.openxmlformats.org/drawingml/2006/main" xmlns:pic="http://schemas.openxmlformats.org/drawingml/2006/picture">
-            <wp:extent cx="5486400" cy="3453063"/>
+            <wp:extent cx="5486400" cy="3845540"/>
             <wp:docPr id="5" name="Picture 5"/>
             <wp:cNvGraphicFramePr>
               <a:graphicFrameLocks noChangeAspect="1"/>
@@ -8808,7 +8808,7 @@
                   <pic:spPr>
                     <a:xfrm>
                       <a:off x="0" y="0"/>
-                      <a:ext cx="5486400" cy="3453063"/>
+                      <a:ext cx="5486400" cy="3845540"/>
                     </a:xfrm>
                     <a:prstGeom prst="rect"/>
                   </pic:spPr>
@@ -8961,7 +8961,7 @@
       <w:r>
         <w:drawing>
           <wp:inline xmlns:a="http://schemas.openxmlformats.org/drawingml/2006/main" xmlns:pic="http://schemas.openxmlformats.org/drawingml/2006/picture">
-            <wp:extent cx="5486400" cy="3699012"/>
+            <wp:extent cx="5486400" cy="4508413"/>
             <wp:docPr id="6" name="Picture 6"/>
             <wp:cNvGraphicFramePr>
               <a:graphicFrameLocks noChangeAspect="1"/>
@@ -8982,7 +8982,7 @@
                   <pic:spPr>
                     <a:xfrm>
                       <a:off x="0" y="0"/>
-                      <a:ext cx="5486400" cy="3699012"/>
+                      <a:ext cx="5486400" cy="4508413"/>
                     </a:xfrm>
                     <a:prstGeom prst="rect"/>
                   </pic:spPr>
@@ -9171,7 +9171,7 @@
       <w:r>
         <w:drawing>
           <wp:inline xmlns:a="http://schemas.openxmlformats.org/drawingml/2006/main" xmlns:pic="http://schemas.openxmlformats.org/drawingml/2006/picture">
-            <wp:extent cx="5486400" cy="4284174"/>
+            <wp:extent cx="5486400" cy="4094570"/>
             <wp:docPr id="7" name="Picture 7"/>
             <wp:cNvGraphicFramePr>
               <a:graphicFrameLocks noChangeAspect="1"/>
@@ -9192,7 +9192,7 @@
                   <pic:spPr>
                     <a:xfrm>
                       <a:off x="0" y="0"/>
-                      <a:ext cx="5486400" cy="4284174"/>
+                      <a:ext cx="5486400" cy="4094570"/>
                     </a:xfrm>
                     <a:prstGeom prst="rect"/>
                   </pic:spPr>

</xml_diff>

<commit_message>
feat: add Phase II analysis BCE + sequence diagrams with narrative text
- Added narrative analysis text (Phân tích chi tiết) for all 4 functions
- Updated BCE class diagrams with consistent method names (searchFreeRoom, searchClient, changeStatus, etc.)
- Updated sequence diagrams with numbered steps, activate/deactivate, title
- Generated 8 new PlantUML diagrams (4 BCE + 4 sequence) for Phase II
- Updated DOCX generator with named DIAGRAM placeholders for reliable mapping
- DOCX now: 533 paragraphs, 39 tables, 13 images (was 496/39/7)

Co-Authored-By: Claude Opus 4.8 <noreply@anthropic.com>
</commit_message>
<xml_diff>
--- a/output/booking_module.docx
+++ b/output/booking_module.docx
@@ -2978,7 +2978,7 @@
         <w:pStyle w:val="Heading2"/>
       </w:pPr>
       <w:r>
-        <w:t>2.5. Biểu đồ lớp thực thể pha phân tích</w:t>
+        <w:t>2.5. Biểu đồ phân tích chức năng</w:t>
       </w:r>
     </w:p>
     <w:p>
@@ -2987,6 +2987,156 @@
       </w:pPr>
       <w:r>
         <w:t>a) Chức năng "Đặt phòng"</w:t>
+      </w:r>
+    </w:p>
+    <w:p>
+      <w:pPr/>
+      <w:r>
+        <w:rPr>
+          <w:b/>
+        </w:rPr>
+        <w:t>Phân tích chi tiết chức năng "Đặt phòng" diễn ra như sau:</w:t>
+      </w:r>
+    </w:p>
+    <w:p>
+      <w:pPr/>
+      <w:r>
+        <w:t xml:space="preserve">Sau khi đăng nhập thành công, hiển thị giao diện chính của nhân viên lễ tân → Đề xuất lớp </w:t>
+      </w:r>
+      <w:r>
+        <w:rPr>
+          <w:b/>
+        </w:rPr>
+        <w:t>ReceptionistHomeView</w:t>
+      </w:r>
+      <w:r>
+        <w:t>, có nút đặt phòng.</w:t>
+      </w:r>
+    </w:p>
+    <w:p>
+      <w:pPr/>
+      <w:r>
+        <w:t xml:space="preserve">Khi ấn nút đặt phòng, hiển thị giao diện tìm phòng trống → Đề xuất lớp </w:t>
+      </w:r>
+      <w:r>
+        <w:rPr>
+          <w:b/>
+        </w:rPr>
+        <w:t>SearchFreeRoomView</w:t>
+      </w:r>
+      <w:r>
+        <w:t>, có các ô nhập thời gian check-in, nút tìm, danh sách kết quả.</w:t>
+      </w:r>
+    </w:p>
+    <w:p>
+      <w:pPr/>
+      <w:r>
+        <w:t xml:space="preserve">Nhân viên nhập thời gian check-in, và ấn nút tìm kiếm → Hệ thống cần tìm phòng trống theo thời gian yêu cầu → Cần chức năng </w:t>
+      </w:r>
+      <w:r>
+        <w:rPr>
+          <w:rFonts w:ascii="Courier New" w:hAnsi="Courier New"/>
+          <w:sz w:val="20"/>
+        </w:rPr>
+        <w:t>searchFreeRoom()</w:t>
+      </w:r>
+      <w:r>
+        <w:t xml:space="preserve"> của đối tượng </w:t>
+      </w:r>
+      <w:r>
+        <w:rPr>
+          <w:b/>
+        </w:rPr>
+        <w:t>Phong</w:t>
+      </w:r>
+      <w:r>
+        <w:t>.</w:t>
+      </w:r>
+    </w:p>
+    <w:p>
+      <w:pPr/>
+      <w:r>
+        <w:t xml:space="preserve">Khi nhân viên ấn vào phòng trống, hệ thống hiện lên giao diện nhập thông tin khách hàng → Đề xuất lớp </w:t>
+      </w:r>
+      <w:r>
+        <w:rPr>
+          <w:b/>
+        </w:rPr>
+        <w:t>SearchClientView</w:t>
+      </w:r>
+      <w:r>
+        <w:t>, có ô nhập tên, ô nhập số điện thoại, nút tìm kiếm.</w:t>
+      </w:r>
+    </w:p>
+    <w:p>
+      <w:pPr/>
+      <w:r>
+        <w:t xml:space="preserve">Khi nhân viên ấn tìm kiếm → Hệ thống cần tìm thông tin khách hàng tương ứng trong cơ sở dữ liệu → Cần chức năng </w:t>
+      </w:r>
+      <w:r>
+        <w:rPr>
+          <w:rFonts w:ascii="Courier New" w:hAnsi="Courier New"/>
+          <w:sz w:val="20"/>
+        </w:rPr>
+        <w:t>searchClient()</w:t>
+      </w:r>
+      <w:r>
+        <w:t xml:space="preserve"> của đối tượng </w:t>
+      </w:r>
+      <w:r>
+        <w:rPr>
+          <w:b/>
+        </w:rPr>
+        <w:t>KhachHang</w:t>
+      </w:r>
+      <w:r>
+        <w:t>.</w:t>
+      </w:r>
+    </w:p>
+    <w:p>
+      <w:pPr/>
+      <w:r>
+        <w:t xml:space="preserve">Khi nhân viên ấn vào dòng chứa thông tin khách hàng tương ứng, giao diện hiển thị xác nhận thông tin đặt phòng → Đề xuất lớp </w:t>
+      </w:r>
+      <w:r>
+        <w:rPr>
+          <w:b/>
+        </w:rPr>
+        <w:t>ConfirmView</w:t>
+      </w:r>
+      <w:r>
+        <w:t>, có phần hiển thị thông tin đặt phòng, và nút xác nhận.</w:t>
+      </w:r>
+    </w:p>
+    <w:p>
+      <w:pPr/>
+      <w:r>
+        <w:t xml:space="preserve">Nhân viên ấn nút xác nhận → Hệ thống chuyển trạng thái phòng thành "Chờ nhận" → Cần chức năng </w:t>
+      </w:r>
+      <w:r>
+        <w:rPr>
+          <w:rFonts w:ascii="Courier New" w:hAnsi="Courier New"/>
+          <w:sz w:val="20"/>
+        </w:rPr>
+        <w:t>changeStatus()</w:t>
+      </w:r>
+      <w:r>
+        <w:t xml:space="preserve"> của đối tượng </w:t>
+      </w:r>
+      <w:r>
+        <w:rPr>
+          <w:b/>
+        </w:rPr>
+        <w:t>Phong</w:t>
+      </w:r>
+      <w:r>
+        <w:t>.</w:t>
+      </w:r>
+    </w:p>
+    <w:p>
+      <w:pPr/>
+      <w:r>
+        <w:t>Hệ thống lưu xong báo lại lớp ConfirmView, lớp ConfirmView báo thành công cho nhân viên → Nhân viên ấn nút OK → Hệ thống quay về lớp ReceptionistHomeView.</w:t>
       </w:r>
     </w:p>
     <w:p>
@@ -3010,7 +3160,46 @@
         <w:t>Entity:</w:t>
       </w:r>
       <w:r>
-        <w:t xml:space="preserve"> Phong, KhachHang, ChiNhanh</w:t>
+        <w:t xml:space="preserve"> Phong, KhachHang</w:t>
+      </w:r>
+    </w:p>
+    <w:p>
+      <w:pPr>
+        <w:jc w:val="center"/>
+      </w:pPr>
+      <w:r>
+        <w:drawing>
+          <wp:inline xmlns:a="http://schemas.openxmlformats.org/drawingml/2006/main" xmlns:pic="http://schemas.openxmlformats.org/drawingml/2006/picture">
+            <wp:extent cx="5486400" cy="4931229"/>
+            <wp:docPr id="1" name="Picture 1"/>
+            <wp:cNvGraphicFramePr>
+              <a:graphicFrameLocks noChangeAspect="1"/>
+            </wp:cNvGraphicFramePr>
+            <a:graphic>
+              <a:graphicData uri="http://schemas.openxmlformats.org/drawingml/2006/picture">
+                <pic:pic>
+                  <pic:nvPicPr>
+                    <pic:cNvPr id="0" name="booking_bce_datphong.png"/>
+                    <pic:cNvPicPr/>
+                  </pic:nvPicPr>
+                  <pic:blipFill>
+                    <a:blip r:embed="rId9"/>
+                    <a:stretch>
+                      <a:fillRect/>
+                    </a:stretch>
+                  </pic:blipFill>
+                  <pic:spPr>
+                    <a:xfrm>
+                      <a:off x="0" y="0"/>
+                      <a:ext cx="5486400" cy="4931229"/>
+                    </a:xfrm>
+                    <a:prstGeom prst="rect"/>
+                  </pic:spPr>
+                </pic:pic>
+              </a:graphicData>
+            </a:graphic>
+          </wp:inline>
+        </w:drawing>
       </w:r>
     </w:p>
     <w:p>
@@ -3019,6 +3208,101 @@
       </w:pPr>
       <w:r>
         <w:t>b) Chức năng "Huỷ phòng"</w:t>
+      </w:r>
+    </w:p>
+    <w:p>
+      <w:pPr/>
+      <w:r>
+        <w:rPr>
+          <w:b/>
+        </w:rPr>
+        <w:t>Phân tích chi tiết chức năng "Huỷ phòng" diễn ra như sau:</w:t>
+      </w:r>
+    </w:p>
+    <w:p>
+      <w:pPr/>
+      <w:r>
+        <w:t xml:space="preserve">Nhân viên lễ tân click chức năng "Quản lý đặt phòng" trên giao diện ReceptionistHomeView → Đề xuất lớp </w:t>
+      </w:r>
+      <w:r>
+        <w:rPr>
+          <w:b/>
+        </w:rPr>
+        <w:t>SearchBookingView</w:t>
+      </w:r>
+      <w:r>
+        <w:t>, có ô nhập tên/SĐT/mã booking, nút tìm kiếm, danh sách kết quả.</w:t>
+      </w:r>
+    </w:p>
+    <w:p>
+      <w:pPr/>
+      <w:r>
+        <w:t xml:space="preserve">Nhân viên nhập thông tin tìm kiếm và ấn nút tìm kiếm → Hệ thống cần tìm booking theo thông tin yêu cầu → Cần chức năng </w:t>
+      </w:r>
+      <w:r>
+        <w:rPr>
+          <w:rFonts w:ascii="Courier New" w:hAnsi="Courier New"/>
+          <w:sz w:val="20"/>
+        </w:rPr>
+        <w:t>searchBooking()</w:t>
+      </w:r>
+      <w:r>
+        <w:t xml:space="preserve"> của đối tượng </w:t>
+      </w:r>
+      <w:r>
+        <w:rPr>
+          <w:b/>
+        </w:rPr>
+        <w:t>Phong</w:t>
+      </w:r>
+      <w:r>
+        <w:t>.</w:t>
+      </w:r>
+    </w:p>
+    <w:p>
+      <w:pPr/>
+      <w:r>
+        <w:t xml:space="preserve">Khi nhân viên chọn booking cần hủy, giao diện hiển thị xác nhận hủy → Đề xuất lớp </w:t>
+      </w:r>
+      <w:r>
+        <w:rPr>
+          <w:b/>
+        </w:rPr>
+        <w:t>ConfirmCancelView</w:t>
+      </w:r>
+      <w:r>
+        <w:t>, có phần hiển thị thông tin booking, và nút xác nhận hủy.</w:t>
+      </w:r>
+    </w:p>
+    <w:p>
+      <w:pPr/>
+      <w:r>
+        <w:t xml:space="preserve">Nhân viên ấn xác nhận hủy → Hệ thống chuyển trạng thái phòng về "Trống" → Cần chức năng </w:t>
+      </w:r>
+      <w:r>
+        <w:rPr>
+          <w:rFonts w:ascii="Courier New" w:hAnsi="Courier New"/>
+          <w:sz w:val="20"/>
+        </w:rPr>
+        <w:t>changeStatus()</w:t>
+      </w:r>
+      <w:r>
+        <w:t xml:space="preserve"> của đối tượng </w:t>
+      </w:r>
+      <w:r>
+        <w:rPr>
+          <w:b/>
+        </w:rPr>
+        <w:t>Phong</w:t>
+      </w:r>
+      <w:r>
+        <w:t>.</w:t>
+      </w:r>
+    </w:p>
+    <w:p>
+      <w:pPr/>
+      <w:r>
+        <w:t>Hệ thống lưu xong báo lại ConfirmCancelView, ConfirmCancelView báo thành công cho nhân viên → Nhân viên ấn OK → Hệ thống quay về ReceptionistHomeView.</w:t>
       </w:r>
     </w:p>
     <w:p>
@@ -3047,10 +3331,144 @@
     </w:p>
     <w:p>
       <w:pPr>
+        <w:jc w:val="center"/>
+      </w:pPr>
+      <w:r>
+        <w:drawing>
+          <wp:inline xmlns:a="http://schemas.openxmlformats.org/drawingml/2006/main" xmlns:pic="http://schemas.openxmlformats.org/drawingml/2006/picture">
+            <wp:extent cx="5486400" cy="3690204"/>
+            <wp:docPr id="2" name="Picture 2"/>
+            <wp:cNvGraphicFramePr>
+              <a:graphicFrameLocks noChangeAspect="1"/>
+            </wp:cNvGraphicFramePr>
+            <a:graphic>
+              <a:graphicData uri="http://schemas.openxmlformats.org/drawingml/2006/picture">
+                <pic:pic>
+                  <pic:nvPicPr>
+                    <pic:cNvPr id="0" name="booking_bce_huyphong.png"/>
+                    <pic:cNvPicPr/>
+                  </pic:nvPicPr>
+                  <pic:blipFill>
+                    <a:blip r:embed="rId10"/>
+                    <a:stretch>
+                      <a:fillRect/>
+                    </a:stretch>
+                  </pic:blipFill>
+                  <pic:spPr>
+                    <a:xfrm>
+                      <a:off x="0" y="0"/>
+                      <a:ext cx="5486400" cy="3690204"/>
+                    </a:xfrm>
+                    <a:prstGeom prst="rect"/>
+                  </pic:spPr>
+                </pic:pic>
+              </a:graphicData>
+            </a:graphic>
+          </wp:inline>
+        </w:drawing>
+      </w:r>
+    </w:p>
+    <w:p>
+      <w:pPr>
         <w:pStyle w:val="Heading3"/>
       </w:pPr>
       <w:r>
         <w:t>c) Chức năng "Check-in"</w:t>
+      </w:r>
+    </w:p>
+    <w:p>
+      <w:pPr/>
+      <w:r>
+        <w:rPr>
+          <w:b/>
+        </w:rPr>
+        <w:t>Phân tích chi tiết chức năng "Check-in" diễn ra như sau:</w:t>
+      </w:r>
+    </w:p>
+    <w:p>
+      <w:pPr/>
+      <w:r>
+        <w:t xml:space="preserve">Nhân viên lễ tân click chức năng "Check-in" trên giao diện ReceptionistHomeView → Đề xuất lớp </w:t>
+      </w:r>
+      <w:r>
+        <w:rPr>
+          <w:b/>
+        </w:rPr>
+        <w:t>CheckInView</w:t>
+      </w:r>
+      <w:r>
+        <w:t>, hiển thị danh sách booking trạng thái "Chờ nhận".</w:t>
+      </w:r>
+    </w:p>
+    <w:p>
+      <w:pPr/>
+      <w:r>
+        <w:t xml:space="preserve">Nhân viên chọn booking cần check-in → Hệ thống hiển thị thông tin chi tiết → Đề xuất lớp </w:t>
+      </w:r>
+      <w:r>
+        <w:rPr>
+          <w:b/>
+        </w:rPr>
+        <w:t>ConfirmCheckInView</w:t>
+      </w:r>
+      <w:r>
+        <w:t>, có phần hiển thị thông tin xác nhận, và nút xác nhận check-in.</w:t>
+      </w:r>
+    </w:p>
+    <w:p>
+      <w:pPr/>
+      <w:r>
+        <w:t xml:space="preserve">Nhân viên ấn xác nhận → Hệ thống chuyển trạng thái phòng từ "Chờ nhận" sang "Đang hoạt động" → Cần chức năng </w:t>
+      </w:r>
+      <w:r>
+        <w:rPr>
+          <w:rFonts w:ascii="Courier New" w:hAnsi="Courier New"/>
+          <w:sz w:val="20"/>
+        </w:rPr>
+        <w:t>changeStatus()</w:t>
+      </w:r>
+      <w:r>
+        <w:t xml:space="preserve"> của đối tượng </w:t>
+      </w:r>
+      <w:r>
+        <w:rPr>
+          <w:b/>
+        </w:rPr>
+        <w:t>Phong</w:t>
+      </w:r>
+      <w:r>
+        <w:t>.</w:t>
+      </w:r>
+    </w:p>
+    <w:p>
+      <w:pPr/>
+      <w:r>
+        <w:t xml:space="preserve">Hệ thống ghi nhận thời gian bắt đầu sử dụng → Cần chức năng </w:t>
+      </w:r>
+      <w:r>
+        <w:rPr>
+          <w:rFonts w:ascii="Courier New" w:hAnsi="Courier New"/>
+          <w:sz w:val="20"/>
+        </w:rPr>
+        <w:t>startTimer()</w:t>
+      </w:r>
+      <w:r>
+        <w:t xml:space="preserve"> của đối tượng </w:t>
+      </w:r>
+      <w:r>
+        <w:rPr>
+          <w:b/>
+        </w:rPr>
+        <w:t>Phong</w:t>
+      </w:r>
+      <w:r>
+        <w:t>.</w:t>
+      </w:r>
+    </w:p>
+    <w:p>
+      <w:pPr/>
+      <w:r>
+        <w:t>Hệ thống lưu xong báo lại ConfirmCheckInView, ConfirmCheckInView báo thành công cho nhân viên → Nhân viên ấn OK → Hệ thống quay về ReceptionistHomeView.</w:t>
       </w:r>
     </w:p>
     <w:p>
@@ -3079,10 +3497,228 @@
     </w:p>
     <w:p>
       <w:pPr>
+        <w:jc w:val="center"/>
+      </w:pPr>
+      <w:r>
+        <w:drawing>
+          <wp:inline xmlns:a="http://schemas.openxmlformats.org/drawingml/2006/main" xmlns:pic="http://schemas.openxmlformats.org/drawingml/2006/picture">
+            <wp:extent cx="5486400" cy="3714284"/>
+            <wp:docPr id="3" name="Picture 3"/>
+            <wp:cNvGraphicFramePr>
+              <a:graphicFrameLocks noChangeAspect="1"/>
+            </wp:cNvGraphicFramePr>
+            <a:graphic>
+              <a:graphicData uri="http://schemas.openxmlformats.org/drawingml/2006/picture">
+                <pic:pic>
+                  <pic:nvPicPr>
+                    <pic:cNvPr id="0" name="booking_bce_checkin.png"/>
+                    <pic:cNvPicPr/>
+                  </pic:nvPicPr>
+                  <pic:blipFill>
+                    <a:blip r:embed="rId11"/>
+                    <a:stretch>
+                      <a:fillRect/>
+                    </a:stretch>
+                  </pic:blipFill>
+                  <pic:spPr>
+                    <a:xfrm>
+                      <a:off x="0" y="0"/>
+                      <a:ext cx="5486400" cy="3714284"/>
+                    </a:xfrm>
+                    <a:prstGeom prst="rect"/>
+                  </pic:spPr>
+                </pic:pic>
+              </a:graphicData>
+            </a:graphic>
+          </wp:inline>
+        </w:drawing>
+      </w:r>
+    </w:p>
+    <w:p>
+      <w:pPr>
         <w:pStyle w:val="Heading3"/>
       </w:pPr>
       <w:r>
         <w:t>d) Chức năng "Check-out"</w:t>
+      </w:r>
+    </w:p>
+    <w:p>
+      <w:pPr/>
+      <w:r>
+        <w:rPr>
+          <w:b/>
+        </w:rPr>
+        <w:t>Phân tích chi tiết chức năng "Check-out" diễn ra như sau:</w:t>
+      </w:r>
+    </w:p>
+    <w:p>
+      <w:pPr/>
+      <w:r>
+        <w:t xml:space="preserve">Nhân viên lễ tân click chức năng "Check-out" trên giao diện ReceptionistHomeView → Đề xuất lớp </w:t>
+      </w:r>
+      <w:r>
+        <w:rPr>
+          <w:b/>
+        </w:rPr>
+        <w:t>CheckOutView</w:t>
+      </w:r>
+      <w:r>
+        <w:t>, hiển thị danh sách phòng đang hoạt động.</w:t>
+      </w:r>
+    </w:p>
+    <w:p>
+      <w:pPr/>
+      <w:r>
+        <w:t xml:space="preserve">Nhân viên chọn phòng cần check-out → Hệ thống tính toán hóa đơn → Đề xuất lớp </w:t>
+      </w:r>
+      <w:r>
+        <w:rPr>
+          <w:b/>
+        </w:rPr>
+        <w:t>InvoiceView</w:t>
+      </w:r>
+      <w:r>
+        <w:t>, hiển thị thông tin hóa đơn, thời gian sử dụng, tổng tiền.</w:t>
+      </w:r>
+    </w:p>
+    <w:p>
+      <w:pPr/>
+      <w:r>
+        <w:t xml:space="preserve">Hệ thống kiểm tra khách hàng là hội viên để áp dụng ưu đãi → Cần chức năng </w:t>
+      </w:r>
+      <w:r>
+        <w:rPr>
+          <w:rFonts w:ascii="Courier New" w:hAnsi="Courier New"/>
+          <w:sz w:val="20"/>
+        </w:rPr>
+        <w:t>checkMember()</w:t>
+      </w:r>
+      <w:r>
+        <w:t xml:space="preserve"> của đối tượng </w:t>
+      </w:r>
+      <w:r>
+        <w:rPr>
+          <w:b/>
+        </w:rPr>
+        <w:t>KhachHang</w:t>
+      </w:r>
+      <w:r>
+        <w:t>.</w:t>
+      </w:r>
+    </w:p>
+    <w:p>
+      <w:pPr/>
+      <w:r>
+        <w:t xml:space="preserve">Hệ thống kiểm tra mã voucher (nếu có) → Cần chức năng </w:t>
+      </w:r>
+      <w:r>
+        <w:rPr>
+          <w:rFonts w:ascii="Courier New" w:hAnsi="Courier New"/>
+          <w:sz w:val="20"/>
+        </w:rPr>
+        <w:t>applyVoucher()</w:t>
+      </w:r>
+      <w:r>
+        <w:t xml:space="preserve"> của đối tượng </w:t>
+      </w:r>
+      <w:r>
+        <w:rPr>
+          <w:b/>
+        </w:rPr>
+        <w:t>KhuyenMai</w:t>
+      </w:r>
+      <w:r>
+        <w:t>.</w:t>
+      </w:r>
+    </w:p>
+    <w:p>
+      <w:pPr/>
+      <w:r>
+        <w:t xml:space="preserve">Nhân viên chọn phương thức thanh toán và ấn xác nhận → Đề xuất lớp </w:t>
+      </w:r>
+      <w:r>
+        <w:rPr>
+          <w:b/>
+        </w:rPr>
+        <w:t>PaymentView</w:t>
+      </w:r>
+      <w:r>
+        <w:t>, xử lý thanh toán.</w:t>
+      </w:r>
+    </w:p>
+    <w:p>
+      <w:pPr/>
+      <w:r>
+        <w:t xml:space="preserve">Hệ thống cập nhật trạng thái hóa đơn "Đã thanh toán" → Cần chức năng </w:t>
+      </w:r>
+      <w:r>
+        <w:rPr>
+          <w:rFonts w:ascii="Courier New" w:hAnsi="Courier New"/>
+          <w:sz w:val="20"/>
+        </w:rPr>
+        <w:t>updateStatus()</w:t>
+      </w:r>
+      <w:r>
+        <w:t xml:space="preserve"> của đối tượng </w:t>
+      </w:r>
+      <w:r>
+        <w:rPr>
+          <w:b/>
+        </w:rPr>
+        <w:t>HoaDon</w:t>
+      </w:r>
+      <w:r>
+        <w:t>.</w:t>
+      </w:r>
+    </w:p>
+    <w:p>
+      <w:pPr/>
+      <w:r>
+        <w:t xml:space="preserve">Hệ thống chuyển trạng thái phòng về "Trống" → Cần chức năng </w:t>
+      </w:r>
+      <w:r>
+        <w:rPr>
+          <w:rFonts w:ascii="Courier New" w:hAnsi="Courier New"/>
+          <w:sz w:val="20"/>
+        </w:rPr>
+        <w:t>changeStatus()</w:t>
+      </w:r>
+      <w:r>
+        <w:t xml:space="preserve"> của đối tượng </w:t>
+      </w:r>
+      <w:r>
+        <w:rPr>
+          <w:b/>
+        </w:rPr>
+        <w:t>Phong</w:t>
+      </w:r>
+      <w:r>
+        <w:t>.</w:t>
+      </w:r>
+    </w:p>
+    <w:p>
+      <w:pPr/>
+      <w:r>
+        <w:t xml:space="preserve">Nếu khách là hội viên, hệ thống cộng điểm tích lũy → Cần chức năng </w:t>
+      </w:r>
+      <w:r>
+        <w:rPr>
+          <w:rFonts w:ascii="Courier New" w:hAnsi="Courier New"/>
+          <w:sz w:val="20"/>
+        </w:rPr>
+        <w:t>addPoints()</w:t>
+      </w:r>
+      <w:r>
+        <w:t xml:space="preserve"> của đối tượng </w:t>
+      </w:r>
+      <w:r>
+        <w:rPr>
+          <w:b/>
+        </w:rPr>
+        <w:t>KhachHang</w:t>
+      </w:r>
+      <w:r>
+        <w:t>.</w:t>
       </w:r>
     </w:p>
     <w:p>
@@ -3110,6 +3746,45 @@
       </w:r>
     </w:p>
     <w:p>
+      <w:pPr>
+        <w:jc w:val="center"/>
+      </w:pPr>
+      <w:r>
+        <w:drawing>
+          <wp:inline xmlns:a="http://schemas.openxmlformats.org/drawingml/2006/main" xmlns:pic="http://schemas.openxmlformats.org/drawingml/2006/picture">
+            <wp:extent cx="5486400" cy="4561795"/>
+            <wp:docPr id="4" name="Picture 4"/>
+            <wp:cNvGraphicFramePr>
+              <a:graphicFrameLocks noChangeAspect="1"/>
+            </wp:cNvGraphicFramePr>
+            <a:graphic>
+              <a:graphicData uri="http://schemas.openxmlformats.org/drawingml/2006/picture">
+                <pic:pic>
+                  <pic:nvPicPr>
+                    <pic:cNvPr id="0" name="booking_bce_checkout.png"/>
+                    <pic:cNvPicPr/>
+                  </pic:nvPicPr>
+                  <pic:blipFill>
+                    <a:blip r:embed="rId12"/>
+                    <a:stretch>
+                      <a:fillRect/>
+                    </a:stretch>
+                  </pic:blipFill>
+                  <pic:spPr>
+                    <a:xfrm>
+                      <a:off x="0" y="0"/>
+                      <a:ext cx="5486400" cy="4561795"/>
+                    </a:xfrm>
+                    <a:prstGeom prst="rect"/>
+                  </pic:spPr>
+                </pic:pic>
+              </a:graphicData>
+            </a:graphic>
+          </wp:inline>
+        </w:drawing>
+      </w:r>
+    </w:p>
+    <w:p>
       <w:pPr/>
       <w:r>
         <w:t>---</w:t>
@@ -3133,10 +3808,49 @@
     </w:p>
     <w:p>
       <w:pPr>
+        <w:jc w:val="center"/>
+      </w:pPr>
+      <w:r>
+        <w:drawing>
+          <wp:inline xmlns:a="http://schemas.openxmlformats.org/drawingml/2006/main" xmlns:pic="http://schemas.openxmlformats.org/drawingml/2006/picture">
+            <wp:extent cx="5486400" cy="4040936"/>
+            <wp:docPr id="5" name="Picture 5"/>
+            <wp:cNvGraphicFramePr>
+              <a:graphicFrameLocks noChangeAspect="1"/>
+            </wp:cNvGraphicFramePr>
+            <a:graphic>
+              <a:graphicData uri="http://schemas.openxmlformats.org/drawingml/2006/picture">
+                <pic:pic>
+                  <pic:nvPicPr>
+                    <pic:cNvPr id="0" name="booking_aseq_datphong.png"/>
+                    <pic:cNvPicPr/>
+                  </pic:nvPicPr>
+                  <pic:blipFill>
+                    <a:blip r:embed="rId13"/>
+                    <a:stretch>
+                      <a:fillRect/>
+                    </a:stretch>
+                  </pic:blipFill>
+                  <pic:spPr>
+                    <a:xfrm>
+                      <a:off x="0" y="0"/>
+                      <a:ext cx="5486400" cy="4040936"/>
+                    </a:xfrm>
+                    <a:prstGeom prst="rect"/>
+                  </pic:spPr>
+                </pic:pic>
+              </a:graphicData>
+            </a:graphic>
+          </wp:inline>
+        </w:drawing>
+      </w:r>
+    </w:p>
+    <w:p>
+      <w:pPr>
         <w:pStyle w:val="Heading3"/>
       </w:pPr>
       <w:r>
-        <w:t>Kịch bản phiên bản 2 - Đặt phòng tại chi nhánh</w:t>
+        <w:t>Kịch bản phiên bản 2 – Đặt phòng</w:t>
       </w:r>
     </w:p>
     <w:p>
@@ -3184,7 +3898,17 @@
     <w:p>
       <w:pPr/>
       <w:r>
-        <w:t>8. Lớp Phong gọi hàm timPhongTrong().</w:t>
+        <w:t xml:space="preserve">8. Lớp Phong gọi hàm </w:t>
+      </w:r>
+      <w:r>
+        <w:rPr>
+          <w:rFonts w:ascii="Courier New" w:hAnsi="Courier New"/>
+          <w:sz w:val="20"/>
+        </w:rPr>
+        <w:t>searchFreeRoom()</w:t>
+      </w:r>
+      <w:r>
+        <w:t>.</w:t>
       </w:r>
     </w:p>
     <w:p>
@@ -3244,7 +3968,17 @@
     <w:p>
       <w:pPr/>
       <w:r>
-        <w:t>18. Lớp KhachHang gọi hàm timKiemKH().</w:t>
+        <w:t xml:space="preserve">18. Lớp KhachHang gọi hàm </w:t>
+      </w:r>
+      <w:r>
+        <w:rPr>
+          <w:rFonts w:ascii="Courier New" w:hAnsi="Courier New"/>
+          <w:sz w:val="20"/>
+        </w:rPr>
+        <w:t>searchClient()</w:t>
+      </w:r>
+      <w:r>
+        <w:t>.</w:t>
       </w:r>
     </w:p>
     <w:p>
@@ -3292,7 +4026,17 @@
     <w:p>
       <w:pPr/>
       <w:r>
-        <w:t>26. Lớp Phong gọi hàm doiTrangThai("Cho nhan").</w:t>
+        <w:t xml:space="preserve">26. Lớp Phong gọi hàm </w:t>
+      </w:r>
+      <w:r>
+        <w:rPr>
+          <w:rFonts w:ascii="Courier New" w:hAnsi="Courier New"/>
+          <w:sz w:val="20"/>
+        </w:rPr>
+        <w:t>changeStatus("Cho nhan")</w:t>
+      </w:r>
+      <w:r>
+        <w:t>.</w:t>
       </w:r>
     </w:p>
     <w:p>
@@ -3366,10 +4110,49 @@
     </w:p>
     <w:p>
       <w:pPr>
+        <w:jc w:val="center"/>
+      </w:pPr>
+      <w:r>
+        <w:drawing>
+          <wp:inline xmlns:a="http://schemas.openxmlformats.org/drawingml/2006/main" xmlns:pic="http://schemas.openxmlformats.org/drawingml/2006/picture">
+            <wp:extent cx="5486400" cy="4086504"/>
+            <wp:docPr id="6" name="Picture 6"/>
+            <wp:cNvGraphicFramePr>
+              <a:graphicFrameLocks noChangeAspect="1"/>
+            </wp:cNvGraphicFramePr>
+            <a:graphic>
+              <a:graphicData uri="http://schemas.openxmlformats.org/drawingml/2006/picture">
+                <pic:pic>
+                  <pic:nvPicPr>
+                    <pic:cNvPr id="0" name="booking_aseq_huyphong.png"/>
+                    <pic:cNvPicPr/>
+                  </pic:nvPicPr>
+                  <pic:blipFill>
+                    <a:blip r:embed="rId14"/>
+                    <a:stretch>
+                      <a:fillRect/>
+                    </a:stretch>
+                  </pic:blipFill>
+                  <pic:spPr>
+                    <a:xfrm>
+                      <a:off x="0" y="0"/>
+                      <a:ext cx="5486400" cy="4086504"/>
+                    </a:xfrm>
+                    <a:prstGeom prst="rect"/>
+                  </pic:spPr>
+                </pic:pic>
+              </a:graphicData>
+            </a:graphic>
+          </wp:inline>
+        </w:drawing>
+      </w:r>
+    </w:p>
+    <w:p>
+      <w:pPr>
         <w:pStyle w:val="Heading3"/>
       </w:pPr>
       <w:r>
-        <w:t>Kịch bản phiên bản 2 - Huỷ phòng</w:t>
+        <w:t>Kịch bản phiên bản 2 – Huỷ phòng</w:t>
       </w:r>
     </w:p>
     <w:p>
@@ -3411,7 +4194,17 @@
     <w:p>
       <w:pPr/>
       <w:r>
-        <w:t>7. Lớp Phong gọi hàm timBooking(keyword).</w:t>
+        <w:t xml:space="preserve">7. Lớp Phong gọi hàm </w:t>
+      </w:r>
+      <w:r>
+        <w:rPr>
+          <w:rFonts w:ascii="Courier New" w:hAnsi="Courier New"/>
+          <w:sz w:val="20"/>
+        </w:rPr>
+        <w:t>searchBooking(keyword)</w:t>
+      </w:r>
+      <w:r>
+        <w:t>.</w:t>
       </w:r>
     </w:p>
     <w:p>
@@ -3459,7 +4252,17 @@
     <w:p>
       <w:pPr/>
       <w:r>
-        <w:t>15. Lớp Phong gọi hàm doiTrangThai("Da huy").</w:t>
+        <w:t xml:space="preserve">15. Lớp Phong gọi hàm </w:t>
+      </w:r>
+      <w:r>
+        <w:rPr>
+          <w:rFonts w:ascii="Courier New" w:hAnsi="Courier New"/>
+          <w:sz w:val="20"/>
+        </w:rPr>
+        <w:t>changeStatus("Trong")</w:t>
+      </w:r>
+      <w:r>
+        <w:t>.</w:t>
       </w:r>
     </w:p>
     <w:p>
@@ -3527,10 +4330,49 @@
     </w:p>
     <w:p>
       <w:pPr>
+        <w:jc w:val="center"/>
+      </w:pPr>
+      <w:r>
+        <w:drawing>
+          <wp:inline xmlns:a="http://schemas.openxmlformats.org/drawingml/2006/main" xmlns:pic="http://schemas.openxmlformats.org/drawingml/2006/picture">
+            <wp:extent cx="5486400" cy="3289686"/>
+            <wp:docPr id="7" name="Picture 7"/>
+            <wp:cNvGraphicFramePr>
+              <a:graphicFrameLocks noChangeAspect="1"/>
+            </wp:cNvGraphicFramePr>
+            <a:graphic>
+              <a:graphicData uri="http://schemas.openxmlformats.org/drawingml/2006/picture">
+                <pic:pic>
+                  <pic:nvPicPr>
+                    <pic:cNvPr id="0" name="booking_aseq_checkin.png"/>
+                    <pic:cNvPicPr/>
+                  </pic:nvPicPr>
+                  <pic:blipFill>
+                    <a:blip r:embed="rId15"/>
+                    <a:stretch>
+                      <a:fillRect/>
+                    </a:stretch>
+                  </pic:blipFill>
+                  <pic:spPr>
+                    <a:xfrm>
+                      <a:off x="0" y="0"/>
+                      <a:ext cx="5486400" cy="3289686"/>
+                    </a:xfrm>
+                    <a:prstGeom prst="rect"/>
+                  </pic:spPr>
+                </pic:pic>
+              </a:graphicData>
+            </a:graphic>
+          </wp:inline>
+        </w:drawing>
+      </w:r>
+    </w:p>
+    <w:p>
+      <w:pPr>
         <w:pStyle w:val="Heading3"/>
       </w:pPr>
       <w:r>
-        <w:t>Kịch bản phiên bản 2 - Check-in</w:t>
+        <w:t>Kịch bản phiên bản 2 – Check-in</w:t>
       </w:r>
     </w:p>
     <w:p>
@@ -3584,13 +4426,33 @@
     <w:p>
       <w:pPr/>
       <w:r>
-        <w:t>9. Lớp Phong gọi hàm doiTrangThai("Dang hoat dong").</w:t>
+        <w:t xml:space="preserve">9. Lớp Phong gọi hàm </w:t>
+      </w:r>
+      <w:r>
+        <w:rPr>
+          <w:rFonts w:ascii="Courier New" w:hAnsi="Courier New"/>
+          <w:sz w:val="20"/>
+        </w:rPr>
+        <w:t>changeStatus("Dang hoat dong")</w:t>
+      </w:r>
+      <w:r>
+        <w:t>.</w:t>
       </w:r>
     </w:p>
     <w:p>
       <w:pPr/>
       <w:r>
-        <w:t>10. Lớp Phong gọi hàm batDauTinhGio().</w:t>
+        <w:t xml:space="preserve">10. Lớp Phong gọi hàm </w:t>
+      </w:r>
+      <w:r>
+        <w:rPr>
+          <w:rFonts w:ascii="Courier New" w:hAnsi="Courier New"/>
+          <w:sz w:val="20"/>
+        </w:rPr>
+        <w:t>startTimer()</w:t>
+      </w:r>
+      <w:r>
+        <w:t>.</w:t>
       </w:r>
     </w:p>
     <w:p>
@@ -3658,10 +4520,49 @@
     </w:p>
     <w:p>
       <w:pPr>
+        <w:jc w:val="center"/>
+      </w:pPr>
+      <w:r>
+        <w:drawing>
+          <wp:inline xmlns:a="http://schemas.openxmlformats.org/drawingml/2006/main" xmlns:pic="http://schemas.openxmlformats.org/drawingml/2006/picture">
+            <wp:extent cx="5486400" cy="3516517"/>
+            <wp:docPr id="8" name="Picture 8"/>
+            <wp:cNvGraphicFramePr>
+              <a:graphicFrameLocks noChangeAspect="1"/>
+            </wp:cNvGraphicFramePr>
+            <a:graphic>
+              <a:graphicData uri="http://schemas.openxmlformats.org/drawingml/2006/picture">
+                <pic:pic>
+                  <pic:nvPicPr>
+                    <pic:cNvPr id="0" name="booking_aseq_checkout.png"/>
+                    <pic:cNvPicPr/>
+                  </pic:nvPicPr>
+                  <pic:blipFill>
+                    <a:blip r:embed="rId16"/>
+                    <a:stretch>
+                      <a:fillRect/>
+                    </a:stretch>
+                  </pic:blipFill>
+                  <pic:spPr>
+                    <a:xfrm>
+                      <a:off x="0" y="0"/>
+                      <a:ext cx="5486400" cy="3516517"/>
+                    </a:xfrm>
+                    <a:prstGeom prst="rect"/>
+                  </pic:spPr>
+                </pic:pic>
+              </a:graphicData>
+            </a:graphic>
+          </wp:inline>
+        </w:drawing>
+      </w:r>
+    </w:p>
+    <w:p>
+      <w:pPr>
         <w:pStyle w:val="Heading3"/>
       </w:pPr>
       <w:r>
-        <w:t>Kịch bản phiên bản 2 - Check-out</w:t>
+        <w:t>Kịch bản phiên bản 2 – Check-out</w:t>
       </w:r>
     </w:p>
     <w:p>
@@ -3697,7 +4598,17 @@
     <w:p>
       <w:pPr/>
       <w:r>
-        <w:t>6. Lớp InvoiceView gọi hàm tinhHoaDon() trên lớp HoaDon.</w:t>
+        <w:t xml:space="preserve">6. Lớp InvoiceView gọi hàm </w:t>
+      </w:r>
+      <w:r>
+        <w:rPr>
+          <w:rFonts w:ascii="Courier New" w:hAnsi="Courier New"/>
+          <w:sz w:val="20"/>
+        </w:rPr>
+        <w:t>tinhTien()</w:t>
+      </w:r>
+      <w:r>
+        <w:t xml:space="preserve"> trên lớp HoaDon.</w:t>
       </w:r>
     </w:p>
     <w:p>
@@ -3709,13 +4620,33 @@
     <w:p>
       <w:pPr/>
       <w:r>
-        <w:t>8. InvoiceView gọi lớp KhachHang để lấy thông tin khách.</w:t>
+        <w:t xml:space="preserve">8. InvoiceView gọi lớp KhachHang </w:t>
+      </w:r>
+      <w:r>
+        <w:rPr>
+          <w:rFonts w:ascii="Courier New" w:hAnsi="Courier New"/>
+          <w:sz w:val="20"/>
+        </w:rPr>
+        <w:t>checkMember()</w:t>
+      </w:r>
+      <w:r>
+        <w:t xml:space="preserve"> để lấy thông tin khách.</w:t>
       </w:r>
     </w:p>
     <w:p>
       <w:pPr/>
       <w:r>
-        <w:t>9. InvoiceView gọi lớp KhuyenMai để kiểm tra ưu đãi.</w:t>
+        <w:t xml:space="preserve">9. InvoiceView gọi lớp KhuyenMai </w:t>
+      </w:r>
+      <w:r>
+        <w:rPr>
+          <w:rFonts w:ascii="Courier New" w:hAnsi="Courier New"/>
+          <w:sz w:val="20"/>
+        </w:rPr>
+        <w:t>applyVoucher()</w:t>
+      </w:r>
+      <w:r>
+        <w:t xml:space="preserve"> để kiểm tra ưu đãi.</w:t>
       </w:r>
     </w:p>
     <w:p>
@@ -3745,25 +4676,61 @@
     <w:p>
       <w:pPr/>
       <w:r>
-        <w:t>14. Payment gọi hàm capNhatTrangThai("Da thanh toan") trên HoaDon.</w:t>
+        <w:t xml:space="preserve">14. Payment gọi hàm </w:t>
+      </w:r>
+      <w:r>
+        <w:rPr>
+          <w:rFonts w:ascii="Courier New" w:hAnsi="Courier New"/>
+          <w:sz w:val="20"/>
+        </w:rPr>
+        <w:t>updateStatus("Da thanh toan")</w:t>
+      </w:r>
+      <w:r>
+        <w:t xml:space="preserve"> trên HoaDon.</w:t>
       </w:r>
     </w:p>
     <w:p>
       <w:pPr/>
       <w:r>
-        <w:t>15. Payment gọi hàm doiTrangThai("Trong") trên Phong.</w:t>
+        <w:t xml:space="preserve">15. Payment gọi hàm </w:t>
+      </w:r>
+      <w:r>
+        <w:rPr>
+          <w:rFonts w:ascii="Courier New" w:hAnsi="Courier New"/>
+          <w:sz w:val="20"/>
+        </w:rPr>
+        <w:t>changeStatus("Trong")</w:t>
+      </w:r>
+      <w:r>
+        <w:t xml:space="preserve"> trên Phong.</w:t>
       </w:r>
     </w:p>
     <w:p>
       <w:pPr/>
       <w:r>
-        <w:t>16. Payment hiện thông báo thành công.</w:t>
+        <w:t xml:space="preserve">16. Payment gọi hàm </w:t>
+      </w:r>
+      <w:r>
+        <w:rPr>
+          <w:rFonts w:ascii="Courier New" w:hAnsi="Courier New"/>
+          <w:sz w:val="20"/>
+        </w:rPr>
+        <w:t>addPoints(diem)</w:t>
+      </w:r>
+      <w:r>
+        <w:t xml:space="preserve"> trên KhachHang.</w:t>
       </w:r>
     </w:p>
     <w:p>
       <w:pPr/>
       <w:r>
-        <w:t>17. Nhân viên ấn [In hóa đơn].</w:t>
+        <w:t>17. Payment hiện thông báo thành công.</w:t>
+      </w:r>
+    </w:p>
+    <w:p>
+      <w:pPr/>
+      <w:r>
+        <w:t>18. Nhân viên ấn [In hóa đơn].</w:t>
       </w:r>
     </w:p>
     <w:p>
@@ -4765,7 +5732,7 @@
         <w:drawing>
           <wp:inline xmlns:a="http://schemas.openxmlformats.org/drawingml/2006/main" xmlns:pic="http://schemas.openxmlformats.org/drawingml/2006/picture">
             <wp:extent cx="5486400" cy="8422953"/>
-            <wp:docPr id="1" name="Picture 1"/>
+            <wp:docPr id="9" name="Picture 9"/>
             <wp:cNvGraphicFramePr>
               <a:graphicFrameLocks noChangeAspect="1"/>
             </wp:cNvGraphicFramePr>
@@ -4777,7 +5744,7 @@
                     <pic:cNvPicPr/>
                   </pic:nvPicPr>
                   <pic:blipFill>
-                    <a:blip r:embed="rId9"/>
+                    <a:blip r:embed="rId17"/>
                     <a:stretch>
                       <a:fillRect/>
                     </a:stretch>
@@ -5521,7 +6488,7 @@
         <w:drawing>
           <wp:inline xmlns:a="http://schemas.openxmlformats.org/drawingml/2006/main" xmlns:pic="http://schemas.openxmlformats.org/drawingml/2006/picture">
             <wp:extent cx="5486400" cy="5852691"/>
-            <wp:docPr id="2" name="Picture 2"/>
+            <wp:docPr id="10" name="Picture 10"/>
             <wp:cNvGraphicFramePr>
               <a:graphicFrameLocks noChangeAspect="1"/>
             </wp:cNvGraphicFramePr>
@@ -5533,7 +6500,7 @@
                     <pic:cNvPicPr/>
                   </pic:nvPicPr>
                   <pic:blipFill>
-                    <a:blip r:embed="rId10"/>
+                    <a:blip r:embed="rId18"/>
                     <a:stretch>
                       <a:fillRect/>
                     </a:stretch>
@@ -8486,7 +9453,7 @@
         <w:drawing>
           <wp:inline xmlns:a="http://schemas.openxmlformats.org/drawingml/2006/main" xmlns:pic="http://schemas.openxmlformats.org/drawingml/2006/picture">
             <wp:extent cx="5486400" cy="5323869"/>
-            <wp:docPr id="3" name="Picture 3"/>
+            <wp:docPr id="11" name="Picture 11"/>
             <wp:cNvGraphicFramePr>
               <a:graphicFrameLocks noChangeAspect="1"/>
             </wp:cNvGraphicFramePr>
@@ -8498,7 +9465,7 @@
                     <pic:cNvPicPr/>
                   </pic:nvPicPr>
                   <pic:blipFill>
-                    <a:blip r:embed="rId11"/>
+                    <a:blip r:embed="rId19"/>
                     <a:stretch>
                       <a:fillRect/>
                     </a:stretch>
@@ -8542,45 +9509,6 @@
     </w:p>
     <w:p>
       <w:pPr>
-        <w:jc w:val="center"/>
-      </w:pPr>
-      <w:r>
-        <w:drawing>
-          <wp:inline xmlns:a="http://schemas.openxmlformats.org/drawingml/2006/main" xmlns:pic="http://schemas.openxmlformats.org/drawingml/2006/picture">
-            <wp:extent cx="5486400" cy="4622137"/>
-            <wp:docPr id="4" name="Picture 4"/>
-            <wp:cNvGraphicFramePr>
-              <a:graphicFrameLocks noChangeAspect="1"/>
-            </wp:cNvGraphicFramePr>
-            <a:graphic>
-              <a:graphicData uri="http://schemas.openxmlformats.org/drawingml/2006/picture">
-                <pic:pic>
-                  <pic:nvPicPr>
-                    <pic:cNvPr id="0" name="booking_seq_1.png"/>
-                    <pic:cNvPicPr/>
-                  </pic:nvPicPr>
-                  <pic:blipFill>
-                    <a:blip r:embed="rId12"/>
-                    <a:stretch>
-                      <a:fillRect/>
-                    </a:stretch>
-                  </pic:blipFill>
-                  <pic:spPr>
-                    <a:xfrm>
-                      <a:off x="0" y="0"/>
-                      <a:ext cx="5486400" cy="4622137"/>
-                    </a:xfrm>
-                    <a:prstGeom prst="rect"/>
-                  </pic:spPr>
-                </pic:pic>
-              </a:graphicData>
-            </a:graphic>
-          </wp:inline>
-        </w:drawing>
-      </w:r>
-    </w:p>
-    <w:p>
-      <w:pPr>
         <w:pStyle w:val="Heading3"/>
       </w:pPr>
       <w:r>
@@ -8788,7 +9716,7 @@
         <w:drawing>
           <wp:inline xmlns:a="http://schemas.openxmlformats.org/drawingml/2006/main" xmlns:pic="http://schemas.openxmlformats.org/drawingml/2006/picture">
             <wp:extent cx="5486400" cy="3845540"/>
-            <wp:docPr id="5" name="Picture 5"/>
+            <wp:docPr id="12" name="Picture 12"/>
             <wp:cNvGraphicFramePr>
               <a:graphicFrameLocks noChangeAspect="1"/>
             </wp:cNvGraphicFramePr>
@@ -8800,7 +9728,7 @@
                     <pic:cNvPicPr/>
                   </pic:nvPicPr>
                   <pic:blipFill>
-                    <a:blip r:embed="rId13"/>
+                    <a:blip r:embed="rId20"/>
                     <a:stretch>
                       <a:fillRect/>
                     </a:stretch>
@@ -8962,7 +9890,7 @@
         <w:drawing>
           <wp:inline xmlns:a="http://schemas.openxmlformats.org/drawingml/2006/main" xmlns:pic="http://schemas.openxmlformats.org/drawingml/2006/picture">
             <wp:extent cx="5486400" cy="4508413"/>
-            <wp:docPr id="6" name="Picture 6"/>
+            <wp:docPr id="13" name="Picture 13"/>
             <wp:cNvGraphicFramePr>
               <a:graphicFrameLocks noChangeAspect="1"/>
             </wp:cNvGraphicFramePr>
@@ -8974,7 +9902,7 @@
                     <pic:cNvPicPr/>
                   </pic:nvPicPr>
                   <pic:blipFill>
-                    <a:blip r:embed="rId14"/>
+                    <a:blip r:embed="rId21"/>
                     <a:stretch>
                       <a:fillRect/>
                     </a:stretch>
@@ -9162,45 +10090,6 @@
       <w:pPr/>
       <w:r>
         <w:t>&lt;!-- File: output/diagrams/booking_seq_huyphong.png --&gt;</w:t>
-      </w:r>
-    </w:p>
-    <w:p>
-      <w:pPr>
-        <w:jc w:val="center"/>
-      </w:pPr>
-      <w:r>
-        <w:drawing>
-          <wp:inline xmlns:a="http://schemas.openxmlformats.org/drawingml/2006/main" xmlns:pic="http://schemas.openxmlformats.org/drawingml/2006/picture">
-            <wp:extent cx="5486400" cy="4094570"/>
-            <wp:docPr id="7" name="Picture 7"/>
-            <wp:cNvGraphicFramePr>
-              <a:graphicFrameLocks noChangeAspect="1"/>
-            </wp:cNvGraphicFramePr>
-            <a:graphic>
-              <a:graphicData uri="http://schemas.openxmlformats.org/drawingml/2006/picture">
-                <pic:pic>
-                  <pic:nvPicPr>
-                    <pic:cNvPr id="0" name="booking_seq_4.png"/>
-                    <pic:cNvPicPr/>
-                  </pic:nvPicPr>
-                  <pic:blipFill>
-                    <a:blip r:embed="rId15"/>
-                    <a:stretch>
-                      <a:fillRect/>
-                    </a:stretch>
-                  </pic:blipFill>
-                  <pic:spPr>
-                    <a:xfrm>
-                      <a:off x="0" y="0"/>
-                      <a:ext cx="5486400" cy="4094570"/>
-                    </a:xfrm>
-                    <a:prstGeom prst="rect"/>
-                  </pic:spPr>
-                </pic:pic>
-              </a:graphicData>
-            </a:graphic>
-          </wp:inline>
-        </w:drawing>
       </w:r>
     </w:p>
     <w:p>

</xml_diff>

<commit_message>
fix: BCE analysis diagrams - Boundary classes have attributes only, Entity classes keep methods
Per skill II.3 reference:
- Boundary classes: only attributes with in/out/sub/outsub/inout prefixes
- Entity classes: attributes + methods
- Added package blocks (Boundary #DDEEFF, Entity #FFF3CD)
- Regenerated all 4 BCE PNG diagrams

Co-Authored-By: Claude Opus 4.8 <noreply@anthropic.com>
</commit_message>
<xml_diff>
--- a/output/booking_module.docx
+++ b/output/booking_module.docx
@@ -3170,7 +3170,7 @@
       <w:r>
         <w:drawing>
           <wp:inline xmlns:a="http://schemas.openxmlformats.org/drawingml/2006/main" xmlns:pic="http://schemas.openxmlformats.org/drawingml/2006/picture">
-            <wp:extent cx="5486400" cy="4931229"/>
+            <wp:extent cx="5486400" cy="4470845"/>
             <wp:docPr id="1" name="Picture 1"/>
             <wp:cNvGraphicFramePr>
               <a:graphicFrameLocks noChangeAspect="1"/>
@@ -3191,7 +3191,7 @@
                   <pic:spPr>
                     <a:xfrm>
                       <a:off x="0" y="0"/>
-                      <a:ext cx="5486400" cy="4931229"/>
+                      <a:ext cx="5486400" cy="4470845"/>
                     </a:xfrm>
                     <a:prstGeom prst="rect"/>
                   </pic:spPr>
@@ -3336,7 +3336,7 @@
       <w:r>
         <w:drawing>
           <wp:inline xmlns:a="http://schemas.openxmlformats.org/drawingml/2006/main" xmlns:pic="http://schemas.openxmlformats.org/drawingml/2006/picture">
-            <wp:extent cx="5486400" cy="3690204"/>
+            <wp:extent cx="5486400" cy="4254920"/>
             <wp:docPr id="2" name="Picture 2"/>
             <wp:cNvGraphicFramePr>
               <a:graphicFrameLocks noChangeAspect="1"/>
@@ -3357,7 +3357,7 @@
                   <pic:spPr>
                     <a:xfrm>
                       <a:off x="0" y="0"/>
-                      <a:ext cx="5486400" cy="3690204"/>
+                      <a:ext cx="5486400" cy="4254920"/>
                     </a:xfrm>
                     <a:prstGeom prst="rect"/>
                   </pic:spPr>
@@ -3502,7 +3502,7 @@
       <w:r>
         <w:drawing>
           <wp:inline xmlns:a="http://schemas.openxmlformats.org/drawingml/2006/main" xmlns:pic="http://schemas.openxmlformats.org/drawingml/2006/picture">
-            <wp:extent cx="5486400" cy="3714284"/>
+            <wp:extent cx="5486400" cy="3731342"/>
             <wp:docPr id="3" name="Picture 3"/>
             <wp:cNvGraphicFramePr>
               <a:graphicFrameLocks noChangeAspect="1"/>
@@ -3523,7 +3523,7 @@
                   <pic:spPr>
                     <a:xfrm>
                       <a:off x="0" y="0"/>
-                      <a:ext cx="5486400" cy="3714284"/>
+                      <a:ext cx="5486400" cy="3731342"/>
                     </a:xfrm>
                     <a:prstGeom prst="rect"/>
                   </pic:spPr>
@@ -3752,7 +3752,7 @@
       <w:r>
         <w:drawing>
           <wp:inline xmlns:a="http://schemas.openxmlformats.org/drawingml/2006/main" xmlns:pic="http://schemas.openxmlformats.org/drawingml/2006/picture">
-            <wp:extent cx="5486400" cy="4561795"/>
+            <wp:extent cx="5486400" cy="4214451"/>
             <wp:docPr id="4" name="Picture 4"/>
             <wp:cNvGraphicFramePr>
               <a:graphicFrameLocks noChangeAspect="1"/>
@@ -3773,7 +3773,7 @@
                   <pic:spPr>
                     <a:xfrm>
                       <a:off x="0" y="0"/>
-                      <a:ext cx="5486400" cy="4561795"/>
+                      <a:ext cx="5486400" cy="4214451"/>
                     </a:xfrm>
                     <a:prstGeom prst="rect"/>
                   </pic:spPr>

</xml_diff>

<commit_message>
fix: correct Phase III sequence diagram detection in DOCX generator
- Fixed detection for iii.4 diagrams using Phase III class names
  (SearchFreeRoomForm, CancelBookingPage, etc.)
- All 15 diagrams now correctly mapped and inserted at proper positions
- DOCX: 535KB, 15 images, 533 paragraphs

Co-Authored-By: Claude Opus 4.8 <noreply@anthropic.com>
</commit_message>
<xml_diff>
--- a/output/booking_module.docx
+++ b/output/booking_module.docx
@@ -9509,6 +9509,45 @@
     </w:p>
     <w:p>
       <w:pPr>
+        <w:jc w:val="center"/>
+      </w:pPr>
+      <w:r>
+        <w:drawing>
+          <wp:inline xmlns:a="http://schemas.openxmlformats.org/drawingml/2006/main" xmlns:pic="http://schemas.openxmlformats.org/drawingml/2006/picture">
+            <wp:extent cx="5486400" cy="4622137"/>
+            <wp:docPr id="12" name="Picture 12"/>
+            <wp:cNvGraphicFramePr>
+              <a:graphicFrameLocks noChangeAspect="1"/>
+            </wp:cNvGraphicFramePr>
+            <a:graphic>
+              <a:graphicData uri="http://schemas.openxmlformats.org/drawingml/2006/picture">
+                <pic:pic>
+                  <pic:nvPicPr>
+                    <pic:cNvPr id="0" name="booking_seq_1.png"/>
+                    <pic:cNvPicPr/>
+                  </pic:nvPicPr>
+                  <pic:blipFill>
+                    <a:blip r:embed="rId20"/>
+                    <a:stretch>
+                      <a:fillRect/>
+                    </a:stretch>
+                  </pic:blipFill>
+                  <pic:spPr>
+                    <a:xfrm>
+                      <a:off x="0" y="0"/>
+                      <a:ext cx="5486400" cy="4622137"/>
+                    </a:xfrm>
+                    <a:prstGeom prst="rect"/>
+                  </pic:spPr>
+                </pic:pic>
+              </a:graphicData>
+            </a:graphic>
+          </wp:inline>
+        </w:drawing>
+      </w:r>
+    </w:p>
+    <w:p>
+      <w:pPr>
         <w:pStyle w:val="Heading3"/>
       </w:pPr>
       <w:r>
@@ -9716,7 +9755,7 @@
         <w:drawing>
           <wp:inline xmlns:a="http://schemas.openxmlformats.org/drawingml/2006/main" xmlns:pic="http://schemas.openxmlformats.org/drawingml/2006/picture">
             <wp:extent cx="5486400" cy="3845540"/>
-            <wp:docPr id="12" name="Picture 12"/>
+            <wp:docPr id="13" name="Picture 13"/>
             <wp:cNvGraphicFramePr>
               <a:graphicFrameLocks noChangeAspect="1"/>
             </wp:cNvGraphicFramePr>
@@ -9728,7 +9767,7 @@
                     <pic:cNvPicPr/>
                   </pic:nvPicPr>
                   <pic:blipFill>
-                    <a:blip r:embed="rId20"/>
+                    <a:blip r:embed="rId21"/>
                     <a:stretch>
                       <a:fillRect/>
                     </a:stretch>
@@ -9889,8 +9928,8 @@
       <w:r>
         <w:drawing>
           <wp:inline xmlns:a="http://schemas.openxmlformats.org/drawingml/2006/main" xmlns:pic="http://schemas.openxmlformats.org/drawingml/2006/picture">
-            <wp:extent cx="5486400" cy="4508413"/>
-            <wp:docPr id="13" name="Picture 13"/>
+            <wp:extent cx="5486400" cy="3289300"/>
+            <wp:docPr id="14" name="Picture 14"/>
             <wp:cNvGraphicFramePr>
               <a:graphicFrameLocks noChangeAspect="1"/>
             </wp:cNvGraphicFramePr>
@@ -9902,7 +9941,7 @@
                     <pic:cNvPicPr/>
                   </pic:nvPicPr>
                   <pic:blipFill>
-                    <a:blip r:embed="rId21"/>
+                    <a:blip r:embed="rId22"/>
                     <a:stretch>
                       <a:fillRect/>
                     </a:stretch>
@@ -9910,7 +9949,7 @@
                   <pic:spPr>
                     <a:xfrm>
                       <a:off x="0" y="0"/>
-                      <a:ext cx="5486400" cy="4508413"/>
+                      <a:ext cx="5486400" cy="3289300"/>
                     </a:xfrm>
                     <a:prstGeom prst="rect"/>
                   </pic:spPr>
@@ -10090,6 +10129,45 @@
       <w:pPr/>
       <w:r>
         <w:t>&lt;!-- File: output/diagrams/booking_seq_huyphong.png --&gt;</w:t>
+      </w:r>
+    </w:p>
+    <w:p>
+      <w:pPr>
+        <w:jc w:val="center"/>
+      </w:pPr>
+      <w:r>
+        <w:drawing>
+          <wp:inline xmlns:a="http://schemas.openxmlformats.org/drawingml/2006/main" xmlns:pic="http://schemas.openxmlformats.org/drawingml/2006/picture">
+            <wp:extent cx="5486400" cy="4094570"/>
+            <wp:docPr id="15" name="Picture 15"/>
+            <wp:cNvGraphicFramePr>
+              <a:graphicFrameLocks noChangeAspect="1"/>
+            </wp:cNvGraphicFramePr>
+            <a:graphic>
+              <a:graphicData uri="http://schemas.openxmlformats.org/drawingml/2006/picture">
+                <pic:pic>
+                  <pic:nvPicPr>
+                    <pic:cNvPr id="0" name="booking_seq_4.png"/>
+                    <pic:cNvPicPr/>
+                  </pic:nvPicPr>
+                  <pic:blipFill>
+                    <a:blip r:embed="rId23"/>
+                    <a:stretch>
+                      <a:fillRect/>
+                    </a:stretch>
+                  </pic:blipFill>
+                  <pic:spPr>
+                    <a:xfrm>
+                      <a:off x="0" y="0"/>
+                      <a:ext cx="5486400" cy="4094570"/>
+                    </a:xfrm>
+                    <a:prstGeom prst="rect"/>
+                  </pic:spPr>
+                </pic:pic>
+              </a:graphicData>
+            </a:graphic>
+          </wp:inline>
+        </w:drawing>
       </w:r>
     </w:p>
     <w:p>

</xml_diff>

<commit_message>
sync: align III.1/III.2/III.3.2 entity names with Google Docs tab
- Entity classes: Branch, Room, Customer, Employee, Room_receipt, etc.
- ERD tables: tblBranch, tblRoom, tblCustomer, tblEmployee, etc.
- MVC Entity package: updated return types to English names
- Control package: updated return types (List<Room>, List<Customer>, etc.)
- Regenerated 3 diagrams: entity_class, ERD, MVC class
- DOCX: 535 paragraphs, 39 tables, 15 images

Co-Authored-By: Claude Opus 4.8 <noreply@anthropic.com>
</commit_message>
<xml_diff>
--- a/output/booking_module.docx
+++ b/output/booking_module.docx
@@ -5731,7 +5731,7 @@
       <w:r>
         <w:drawing>
           <wp:inline xmlns:a="http://schemas.openxmlformats.org/drawingml/2006/main" xmlns:pic="http://schemas.openxmlformats.org/drawingml/2006/picture">
-            <wp:extent cx="5486400" cy="8422953"/>
+            <wp:extent cx="5486400" cy="7988099"/>
             <wp:docPr id="9" name="Picture 9"/>
             <wp:cNvGraphicFramePr>
               <a:graphicFrameLocks noChangeAspect="1"/>
@@ -5752,7 +5752,7 @@
                   <pic:spPr>
                     <a:xfrm>
                       <a:off x="0" y="0"/>
-                      <a:ext cx="5486400" cy="8422953"/>
+                      <a:ext cx="5486400" cy="7988099"/>
                     </a:xfrm>
                     <a:prstGeom prst="rect"/>
                   </pic:spPr>
@@ -6487,7 +6487,7 @@
       <w:r>
         <w:drawing>
           <wp:inline xmlns:a="http://schemas.openxmlformats.org/drawingml/2006/main" xmlns:pic="http://schemas.openxmlformats.org/drawingml/2006/picture">
-            <wp:extent cx="5486400" cy="5852691"/>
+            <wp:extent cx="5486400" cy="21036810"/>
             <wp:docPr id="10" name="Picture 10"/>
             <wp:cNvGraphicFramePr>
               <a:graphicFrameLocks noChangeAspect="1"/>
@@ -6508,7 +6508,7 @@
                   <pic:spPr>
                     <a:xfrm>
                       <a:off x="0" y="0"/>
-                      <a:ext cx="5486400" cy="5852691"/>
+                      <a:ext cx="5486400" cy="21036810"/>
                     </a:xfrm>
                     <a:prstGeom prst="rect"/>
                   </pic:spPr>
@@ -7760,7 +7760,7 @@
                 <w:b/>
                 <w:sz w:val="20"/>
               </w:rPr>
-              <w:t>Phong</w:t>
+              <w:t>Room</w:t>
             </w:r>
           </w:p>
         </w:tc>
@@ -7775,7 +7775,7 @@
               <w:rPr>
                 <w:sz w:val="20"/>
               </w:rPr>
-              <w:t>id, tenPhong, loaiPhong, sucChua, giaTheoGio, trangThai</w:t>
+              <w:t>roomID, name, type, capacity, hourly_pricing, branchID, status</w:t>
             </w:r>
           </w:p>
         </w:tc>
@@ -7790,7 +7790,7 @@
               <w:rPr>
                 <w:sz w:val="20"/>
               </w:rPr>
-              <w:t>ManyToOne→ChiNhanh</w:t>
+              <w:t>ManyToOne→Branch</w:t>
             </w:r>
           </w:p>
         </w:tc>
@@ -7808,7 +7808,7 @@
                 <w:b/>
                 <w:sz w:val="20"/>
               </w:rPr>
-              <w:t>KhachHang</w:t>
+              <w:t>Customer</w:t>
             </w:r>
           </w:p>
         </w:tc>
@@ -7823,7 +7823,7 @@
               <w:rPr>
                 <w:sz w:val="20"/>
               </w:rPr>
-              <w:t>id, hoTen, soDienThoai, email, diemTichLuy</w:t>
+              <w:t>customerID, name, phone_number, account_status, rankingID</w:t>
             </w:r>
           </w:p>
         </w:tc>
@@ -7838,7 +7838,7 @@
               <w:rPr>
                 <w:sz w:val="20"/>
               </w:rPr>
-              <w:t>ManyToOne→HangHoiVien</w:t>
+              <w:t>ManyToOne→MemberRanking</w:t>
             </w:r>
           </w:p>
         </w:tc>
@@ -7856,7 +7856,7 @@
                 <w:b/>
                 <w:sz w:val="20"/>
               </w:rPr>
-              <w:t>ChiNhanh</w:t>
+              <w:t>Branch</w:t>
             </w:r>
           </w:p>
         </w:tc>
@@ -7871,7 +7871,7 @@
               <w:rPr>
                 <w:sz w:val="20"/>
               </w:rPr>
-              <w:t>id, tenChiNhanh, diaChi</w:t>
+              <w:t>branchID, name, address, phone_number</w:t>
             </w:r>
           </w:p>
         </w:tc>
@@ -8264,7 +8264,7 @@
                 <w:b/>
                 <w:sz w:val="20"/>
               </w:rPr>
-              <w:t>Phong</w:t>
+              <w:t>Room</w:t>
             </w:r>
           </w:p>
         </w:tc>
@@ -8279,7 +8279,7 @@
               <w:rPr>
                 <w:sz w:val="20"/>
               </w:rPr>
-              <w:t>id, tenPhong, trangThai</w:t>
+              <w:t>roomID, name, status</w:t>
             </w:r>
           </w:p>
         </w:tc>
@@ -8294,7 +8294,7 @@
               <w:rPr>
                 <w:sz w:val="20"/>
               </w:rPr>
-              <w:t>ManyToOne→ChiNhanh</w:t>
+              <w:t>ManyToOne→Branch</w:t>
             </w:r>
           </w:p>
         </w:tc>
@@ -8312,7 +8312,7 @@
                 <w:b/>
                 <w:sz w:val="20"/>
               </w:rPr>
-              <w:t>KhachHang</w:t>
+              <w:t>Customer</w:t>
             </w:r>
           </w:p>
         </w:tc>
@@ -8327,7 +8327,7 @@
               <w:rPr>
                 <w:sz w:val="20"/>
               </w:rPr>
-              <w:t>id, hoTen, soDienThoai</w:t>
+              <w:t>customerID, name, phone_number</w:t>
             </w:r>
           </w:p>
         </w:tc>
@@ -8843,7 +8843,7 @@
                 <w:b/>
                 <w:sz w:val="20"/>
               </w:rPr>
-              <w:t>HoaDon</w:t>
+              <w:t>Room_receipt</w:t>
             </w:r>
           </w:p>
         </w:tc>
@@ -8858,7 +8858,7 @@
               <w:rPr>
                 <w:sz w:val="20"/>
               </w:rPr>
-              <w:t>id, ngayLap, tienPhong, tienDichVu, giamGia, tongTien</w:t>
+              <w:t>room_receipt_ID, room_fee, service_fee, discount, status, payment_method</w:t>
             </w:r>
           </w:p>
         </w:tc>
@@ -8873,7 +8873,7 @@
               <w:rPr>
                 <w:sz w:val="20"/>
               </w:rPr>
-              <w:t>ManyToOne→KhachHang, ManyToOne→Phong</w:t>
+              <w:t>ManyToOne→Customer, ManyToOne→Room</w:t>
             </w:r>
           </w:p>
         </w:tc>
@@ -8891,7 +8891,7 @@
                 <w:b/>
                 <w:sz w:val="20"/>
               </w:rPr>
-              <w:t>ChiTietHoaDon</w:t>
+              <w:t>Room_receipt_detail</w:t>
             </w:r>
           </w:p>
         </w:tc>
@@ -8906,7 +8906,7 @@
               <w:rPr>
                 <w:sz w:val="20"/>
               </w:rPr>
-              <w:t>id, tenDichVu, soLuong, donGia, thanhTien</w:t>
+              <w:t>room_receipt_detail_ID, service_name, base_price, quantity, duration, total</w:t>
             </w:r>
           </w:p>
         </w:tc>
@@ -8921,7 +8921,7 @@
               <w:rPr>
                 <w:sz w:val="20"/>
               </w:rPr>
-              <w:t>ManyToOne→HoaDon</w:t>
+              <w:t>ManyToOne→Room_receipt</w:t>
             </w:r>
           </w:p>
         </w:tc>
@@ -8939,7 +8939,7 @@
                 <w:b/>
                 <w:sz w:val="20"/>
               </w:rPr>
-              <w:t>KhuyenMai</w:t>
+              <w:t>Promotion</w:t>
             </w:r>
           </w:p>
         </w:tc>
@@ -8954,7 +8954,7 @@
               <w:rPr>
                 <w:sz w:val="20"/>
               </w:rPr>
-              <w:t>id, tenKhuyenMai, loai, giaTri</w:t>
+              <w:t>promotionID, name, type, redeem, valid_until</w:t>
             </w:r>
           </w:p>
         </w:tc>
@@ -9347,7 +9347,7 @@
                 <w:b/>
                 <w:sz w:val="20"/>
               </w:rPr>
-              <w:t>Phong</w:t>
+              <w:t>Room</w:t>
             </w:r>
           </w:p>
         </w:tc>
@@ -9362,7 +9362,7 @@
               <w:rPr>
                 <w:sz w:val="20"/>
               </w:rPr>
-              <w:t>id, tenPhong, trangThai</w:t>
+              <w:t>roomID, name, status</w:t>
             </w:r>
           </w:p>
         </w:tc>
@@ -9395,7 +9395,7 @@
                 <w:b/>
                 <w:sz w:val="20"/>
               </w:rPr>
-              <w:t>KhachHang</w:t>
+              <w:t>Customer</w:t>
             </w:r>
           </w:p>
         </w:tc>
@@ -9410,7 +9410,7 @@
               <w:rPr>
                 <w:sz w:val="20"/>
               </w:rPr>
-              <w:t>id, hoTen, soDienThoai</w:t>
+              <w:t>customerID, name, phone_number</w:t>
             </w:r>
           </w:p>
         </w:tc>
@@ -9452,7 +9452,7 @@
       <w:r>
         <w:drawing>
           <wp:inline xmlns:a="http://schemas.openxmlformats.org/drawingml/2006/main" xmlns:pic="http://schemas.openxmlformats.org/drawingml/2006/picture">
-            <wp:extent cx="5486400" cy="5323869"/>
+            <wp:extent cx="5486400" cy="5214604"/>
             <wp:docPr id="11" name="Picture 11"/>
             <wp:cNvGraphicFramePr>
               <a:graphicFrameLocks noChangeAspect="1"/>
@@ -9473,7 +9473,7 @@
                   <pic:spPr>
                     <a:xfrm>
                       <a:off x="0" y="0"/>
-                      <a:ext cx="5486400" cy="5323869"/>
+                      <a:ext cx="5486400" cy="5214604"/>
                     </a:xfrm>
                     <a:prstGeom prst="rect"/>
                   </pic:spPr>
@@ -9928,7 +9928,7 @@
       <w:r>
         <w:drawing>
           <wp:inline xmlns:a="http://schemas.openxmlformats.org/drawingml/2006/main" xmlns:pic="http://schemas.openxmlformats.org/drawingml/2006/picture">
-            <wp:extent cx="5486400" cy="3289300"/>
+            <wp:extent cx="5486400" cy="4508413"/>
             <wp:docPr id="14" name="Picture 14"/>
             <wp:cNvGraphicFramePr>
               <a:graphicFrameLocks noChangeAspect="1"/>
@@ -9949,7 +9949,7 @@
                   <pic:spPr>
                     <a:xfrm>
                       <a:off x="0" y="0"/>
-                      <a:ext cx="5486400" cy="3289300"/>
+                      <a:ext cx="5486400" cy="4508413"/>
                     </a:xfrm>
                     <a:prstGeom prst="rect"/>
                   </pic:spPr>

</xml_diff>

<commit_message>
sync: update all sequence diagrams with English entity names per Google Docs
- Phase II analysis (4 diagrams): Room, Customer, Room_receipt, Promotion
- Phase III design (4 diagrams): Room, Customer, Room_receipt with Java types
- All narrative text updated (Kich ban phien ban 2/3)
- DOCX: 535 paragraphs, 39 tables, 15 images

Co-Authored-By: Claude Opus 4.8 <noreply@anthropic.com>
</commit_message>
<xml_diff>
--- a/output/booking_module.docx
+++ b/output/booking_module.docx
@@ -3813,7 +3813,7 @@
       <w:r>
         <w:drawing>
           <wp:inline xmlns:a="http://schemas.openxmlformats.org/drawingml/2006/main" xmlns:pic="http://schemas.openxmlformats.org/drawingml/2006/picture">
-            <wp:extent cx="5486400" cy="4040936"/>
+            <wp:extent cx="5486400" cy="4007732"/>
             <wp:docPr id="5" name="Picture 5"/>
             <wp:cNvGraphicFramePr>
               <a:graphicFrameLocks noChangeAspect="1"/>
@@ -3834,7 +3834,7 @@
                   <pic:spPr>
                     <a:xfrm>
                       <a:off x="0" y="0"/>
-                      <a:ext cx="5486400" cy="4040936"/>
+                      <a:ext cx="5486400" cy="4007732"/>
                     </a:xfrm>
                     <a:prstGeom prst="rect"/>
                   </pic:spPr>
@@ -3892,13 +3892,13 @@
     <w:p>
       <w:pPr/>
       <w:r>
-        <w:t>7. Lớp SearchFreeRoomView gọi đến lớp Phong để xử lý thông tin.</w:t>
+        <w:t>7. Lớp SearchFreeRoomView gọi đến lớp Room để xử lý thông tin.</w:t>
       </w:r>
     </w:p>
     <w:p>
       <w:pPr/>
       <w:r>
-        <w:t xml:space="preserve">8. Lớp Phong gọi hàm </w:t>
+        <w:t xml:space="preserve">8. Lớp Room gọi hàm </w:t>
       </w:r>
       <w:r>
         <w:rPr>
@@ -3914,7 +3914,7 @@
     <w:p>
       <w:pPr/>
       <w:r>
-        <w:t>9. Lớp Phong trả kết quả về cho SearchFreeRoomView.</w:t>
+        <w:t>9. Lớp Room trả kết quả về cho SearchFreeRoomView.</w:t>
       </w:r>
     </w:p>
     <w:p>
@@ -3962,13 +3962,13 @@
     <w:p>
       <w:pPr/>
       <w:r>
-        <w:t>17. Lớp SearchClientView gọi đến lớp KhachHang.</w:t>
+        <w:t>17. Lớp SearchClientView gọi đến lớp Customer.</w:t>
       </w:r>
     </w:p>
     <w:p>
       <w:pPr/>
       <w:r>
-        <w:t xml:space="preserve">18. Lớp KhachHang gọi hàm </w:t>
+        <w:t xml:space="preserve">18. Lớp Customer gọi hàm </w:t>
       </w:r>
       <w:r>
         <w:rPr>
@@ -3984,7 +3984,7 @@
     <w:p>
       <w:pPr/>
       <w:r>
-        <w:t>19. Lớp KhachHang trả kết quả về cho lớp SearchClientView.</w:t>
+        <w:t>19. Lớp Customer trả kết quả về cho lớp SearchClientView.</w:t>
       </w:r>
     </w:p>
     <w:p>
@@ -4020,13 +4020,13 @@
     <w:p>
       <w:pPr/>
       <w:r>
-        <w:t>25. Lớp ConfirmView gọi đến lớp Phong để xử lý.</w:t>
+        <w:t>25. Lớp ConfirmView gọi đến lớp Room để xử lý.</w:t>
       </w:r>
     </w:p>
     <w:p>
       <w:pPr/>
       <w:r>
-        <w:t xml:space="preserve">26. Lớp Phong gọi hàm </w:t>
+        <w:t xml:space="preserve">26. Lớp Room gọi hàm </w:t>
       </w:r>
       <w:r>
         <w:rPr>
@@ -4042,7 +4042,7 @@
     <w:p>
       <w:pPr/>
       <w:r>
-        <w:t>27. Lớp Phong trả kết quả về lớp ConfirmView.</w:t>
+        <w:t>27. Lớp Room trả kết quả về lớp ConfirmView.</w:t>
       </w:r>
     </w:p>
     <w:p>
@@ -4115,7 +4115,7 @@
       <w:r>
         <w:drawing>
           <wp:inline xmlns:a="http://schemas.openxmlformats.org/drawingml/2006/main" xmlns:pic="http://schemas.openxmlformats.org/drawingml/2006/picture">
-            <wp:extent cx="5486400" cy="4086504"/>
+            <wp:extent cx="5486400" cy="3945147"/>
             <wp:docPr id="6" name="Picture 6"/>
             <wp:cNvGraphicFramePr>
               <a:graphicFrameLocks noChangeAspect="1"/>
@@ -4136,7 +4136,7 @@
                   <pic:spPr>
                     <a:xfrm>
                       <a:off x="0" y="0"/>
-                      <a:ext cx="5486400" cy="4086504"/>
+                      <a:ext cx="5486400" cy="3945147"/>
                     </a:xfrm>
                     <a:prstGeom prst="rect"/>
                   </pic:spPr>
@@ -4188,13 +4188,13 @@
     <w:p>
       <w:pPr/>
       <w:r>
-        <w:t>6. Lớp SearchBookingView gọi đến lớp Phong.</w:t>
+        <w:t>6. Lớp SearchBookingView gọi đến lớp Room.</w:t>
       </w:r>
     </w:p>
     <w:p>
       <w:pPr/>
       <w:r>
-        <w:t xml:space="preserve">7. Lớp Phong gọi hàm </w:t>
+        <w:t xml:space="preserve">7. Lớp Room gọi hàm </w:t>
       </w:r>
       <w:r>
         <w:rPr>
@@ -4210,7 +4210,7 @@
     <w:p>
       <w:pPr/>
       <w:r>
-        <w:t>8. Lớp Phong trả kết quả về cho SearchBookingView.</w:t>
+        <w:t>8. Lớp Room trả kết quả về cho SearchBookingView.</w:t>
       </w:r>
     </w:p>
     <w:p>
@@ -4246,13 +4246,13 @@
     <w:p>
       <w:pPr/>
       <w:r>
-        <w:t>14. Lớp ConfirmCancelView gọi đến lớp Phong.</w:t>
+        <w:t>14. Lớp ConfirmCancelView gọi đến lớp Room.</w:t>
       </w:r>
     </w:p>
     <w:p>
       <w:pPr/>
       <w:r>
-        <w:t xml:space="preserve">15. Lớp Phong gọi hàm </w:t>
+        <w:t xml:space="preserve">15. Lớp Room gọi hàm </w:t>
       </w:r>
       <w:r>
         <w:rPr>
@@ -4268,7 +4268,7 @@
     <w:p>
       <w:pPr/>
       <w:r>
-        <w:t>16. Lớp Phong trả kết quả về.</w:t>
+        <w:t>16. Lớp Room trả kết quả về.</w:t>
       </w:r>
     </w:p>
     <w:p>
@@ -4335,7 +4335,7 @@
       <w:r>
         <w:drawing>
           <wp:inline xmlns:a="http://schemas.openxmlformats.org/drawingml/2006/main" xmlns:pic="http://schemas.openxmlformats.org/drawingml/2006/picture">
-            <wp:extent cx="5486400" cy="3289686"/>
+            <wp:extent cx="5486400" cy="3186493"/>
             <wp:docPr id="7" name="Picture 7"/>
             <wp:cNvGraphicFramePr>
               <a:graphicFrameLocks noChangeAspect="1"/>
@@ -4356,7 +4356,7 @@
                   <pic:spPr>
                     <a:xfrm>
                       <a:off x="0" y="0"/>
-                      <a:ext cx="5486400" cy="3289686"/>
+                      <a:ext cx="5486400" cy="3186493"/>
                     </a:xfrm>
                     <a:prstGeom prst="rect"/>
                   </pic:spPr>
@@ -4420,13 +4420,13 @@
     <w:p>
       <w:pPr/>
       <w:r>
-        <w:t>8. Lớp ConfirmCheckInView gọi đến lớp Phong.</w:t>
+        <w:t>8. Lớp ConfirmCheckInView gọi đến lớp Room.</w:t>
       </w:r>
     </w:p>
     <w:p>
       <w:pPr/>
       <w:r>
-        <w:t xml:space="preserve">9. Lớp Phong gọi hàm </w:t>
+        <w:t xml:space="preserve">9. Lớp Room gọi hàm </w:t>
       </w:r>
       <w:r>
         <w:rPr>
@@ -4442,7 +4442,7 @@
     <w:p>
       <w:pPr/>
       <w:r>
-        <w:t xml:space="preserve">10. Lớp Phong gọi hàm </w:t>
+        <w:t xml:space="preserve">10. Lớp Room gọi hàm </w:t>
       </w:r>
       <w:r>
         <w:rPr>
@@ -4458,7 +4458,7 @@
     <w:p>
       <w:pPr/>
       <w:r>
-        <w:t>11. Lớp Phong trả kết quả về.</w:t>
+        <w:t>11. Lớp Room trả kết quả về.</w:t>
       </w:r>
     </w:p>
     <w:p>
@@ -4493,7 +4493,7 @@
         <w:pStyle w:val="ListBullet"/>
       </w:pPr>
       <w:r>
-        <w:t>Phòng đang dọn dẹp: Phong trả về lỗi. CheckInView hiển thị "Phòng đang dọn dẹp, vui lòng chờ."</w:t>
+        <w:t>Phòng đang dọn dẹp: Room trả về lỗi. CheckInView hiển thị "Phòng đang dọn dẹp, vui lòng chờ."</w:t>
       </w:r>
     </w:p>
     <w:p>
@@ -4525,7 +4525,7 @@
       <w:r>
         <w:drawing>
           <wp:inline xmlns:a="http://schemas.openxmlformats.org/drawingml/2006/main" xmlns:pic="http://schemas.openxmlformats.org/drawingml/2006/picture">
-            <wp:extent cx="5486400" cy="3516517"/>
+            <wp:extent cx="5486400" cy="3282241"/>
             <wp:docPr id="8" name="Picture 8"/>
             <wp:cNvGraphicFramePr>
               <a:graphicFrameLocks noChangeAspect="1"/>
@@ -4546,7 +4546,7 @@
                   <pic:spPr>
                     <a:xfrm>
                       <a:off x="0" y="0"/>
-                      <a:ext cx="5486400" cy="3516517"/>
+                      <a:ext cx="5486400" cy="3282241"/>
                     </a:xfrm>
                     <a:prstGeom prst="rect"/>
                   </pic:spPr>
@@ -4608,19 +4608,19 @@
         <w:t>tinhTien()</w:t>
       </w:r>
       <w:r>
-        <w:t xml:space="preserve"> trên lớp HoaDon.</w:t>
+        <w:t xml:space="preserve"> trên lớp Room_receipt.</w:t>
       </w:r>
     </w:p>
     <w:p>
       <w:pPr/>
       <w:r>
-        <w:t>7. Lớp HoaDon trả kết quả hóa đơn về InvoiceView.</w:t>
+        <w:t>7. Lớp Room_receipt trả kết quả hóa đơn về InvoiceView.</w:t>
       </w:r>
     </w:p>
     <w:p>
       <w:pPr/>
       <w:r>
-        <w:t xml:space="preserve">8. InvoiceView gọi lớp KhachHang </w:t>
+        <w:t xml:space="preserve">8. InvoiceView gọi lớp Customer </w:t>
       </w:r>
       <w:r>
         <w:rPr>
@@ -4636,14 +4636,14 @@
     <w:p>
       <w:pPr/>
       <w:r>
-        <w:t xml:space="preserve">9. InvoiceView gọi lớp KhuyenMai </w:t>
+        <w:t xml:space="preserve">9. InvoiceView gọi lớp Promotion </w:t>
       </w:r>
       <w:r>
         <w:rPr>
           <w:rFonts w:ascii="Courier New" w:hAnsi="Courier New"/>
           <w:sz w:val="20"/>
         </w:rPr>
-        <w:t>applyVoucher()</w:t>
+        <w:t>applyPromotion()</w:t>
       </w:r>
       <w:r>
         <w:t xml:space="preserve"> để kiểm tra ưu đãi.</w:t>
@@ -4686,7 +4686,7 @@
         <w:t>updateStatus("Da thanh toan")</w:t>
       </w:r>
       <w:r>
-        <w:t xml:space="preserve"> trên HoaDon.</w:t>
+        <w:t xml:space="preserve"> trên Room_receipt.</w:t>
       </w:r>
     </w:p>
     <w:p>
@@ -4702,7 +4702,7 @@
         <w:t>changeStatus("Trong")</w:t>
       </w:r>
       <w:r>
-        <w:t xml:space="preserve"> trên Phong.</w:t>
+        <w:t xml:space="preserve"> trên Room.</w:t>
       </w:r>
     </w:p>
     <w:p>
@@ -4715,10 +4715,10 @@
           <w:rFonts w:ascii="Courier New" w:hAnsi="Courier New"/>
           <w:sz w:val="20"/>
         </w:rPr>
-        <w:t>addPoints(diem)</w:t>
-      </w:r>
-      <w:r>
-        <w:t xml:space="preserve"> trên KhachHang.</w:t>
+        <w:t>addPoints(base_score)</w:t>
+      </w:r>
+      <w:r>
+        <w:t xml:space="preserve"> trên Customer.</w:t>
       </w:r>
     </w:p>
     <w:p>
@@ -9514,7 +9514,7 @@
       <w:r>
         <w:drawing>
           <wp:inline xmlns:a="http://schemas.openxmlformats.org/drawingml/2006/main" xmlns:pic="http://schemas.openxmlformats.org/drawingml/2006/picture">
-            <wp:extent cx="5486400" cy="4622137"/>
+            <wp:extent cx="5486400" cy="3781757"/>
             <wp:docPr id="12" name="Picture 12"/>
             <wp:cNvGraphicFramePr>
               <a:graphicFrameLocks noChangeAspect="1"/>
@@ -9535,7 +9535,7 @@
                   <pic:spPr>
                     <a:xfrm>
                       <a:off x="0" y="0"/>
-                      <a:ext cx="5486400" cy="4622137"/>
+                      <a:ext cx="5486400" cy="3781757"/>
                     </a:xfrm>
                     <a:prstGeom prst="rect"/>
                   </pic:spPr>
@@ -9595,7 +9595,7 @@
     <w:p>
       <w:pPr/>
       <w:r>
-        <w:t>6. BookingController truy vấn danh sách phòng trống từ Entity Phong.</w:t>
+        <w:t>6. BookingController truy vấn danh sách phòng trống từ Entity Room.</w:t>
       </w:r>
     </w:p>
     <w:p>
@@ -9631,7 +9631,7 @@
     <w:p>
       <w:pPr/>
       <w:r>
-        <w:t>12. BookingController truy vấn danh sách khách hàng từ Entity KhachHang.</w:t>
+        <w:t>12. BookingController truy vấn danh sách khách hàng từ Entity Customer.</w:t>
       </w:r>
     </w:p>
     <w:p>
@@ -9754,7 +9754,7 @@
       <w:r>
         <w:drawing>
           <wp:inline xmlns:a="http://schemas.openxmlformats.org/drawingml/2006/main" xmlns:pic="http://schemas.openxmlformats.org/drawingml/2006/picture">
-            <wp:extent cx="5486400" cy="3845540"/>
+            <wp:extent cx="5486400" cy="3075384"/>
             <wp:docPr id="13" name="Picture 13"/>
             <wp:cNvGraphicFramePr>
               <a:graphicFrameLocks noChangeAspect="1"/>
@@ -9775,7 +9775,7 @@
                   <pic:spPr>
                     <a:xfrm>
                       <a:off x="0" y="0"/>
-                      <a:ext cx="5486400" cy="3845540"/>
+                      <a:ext cx="5486400" cy="3075384"/>
                     </a:xfrm>
                     <a:prstGeom prst="rect"/>
                   </pic:spPr>
@@ -9928,7 +9928,7 @@
       <w:r>
         <w:drawing>
           <wp:inline xmlns:a="http://schemas.openxmlformats.org/drawingml/2006/main" xmlns:pic="http://schemas.openxmlformats.org/drawingml/2006/picture">
-            <wp:extent cx="5486400" cy="4508413"/>
+            <wp:extent cx="5486400" cy="3194257"/>
             <wp:docPr id="14" name="Picture 14"/>
             <wp:cNvGraphicFramePr>
               <a:graphicFrameLocks noChangeAspect="1"/>
@@ -9949,7 +9949,7 @@
                   <pic:spPr>
                     <a:xfrm>
                       <a:off x="0" y="0"/>
-                      <a:ext cx="5486400" cy="4508413"/>
+                      <a:ext cx="5486400" cy="3194257"/>
                     </a:xfrm>
                     <a:prstGeom prst="rect"/>
                   </pic:spPr>
@@ -10138,7 +10138,7 @@
       <w:r>
         <w:drawing>
           <wp:inline xmlns:a="http://schemas.openxmlformats.org/drawingml/2006/main" xmlns:pic="http://schemas.openxmlformats.org/drawingml/2006/picture">
-            <wp:extent cx="5486400" cy="4094570"/>
+            <wp:extent cx="5486400" cy="4284174"/>
             <wp:docPr id="15" name="Picture 15"/>
             <wp:cNvGraphicFramePr>
               <a:graphicFrameLocks noChangeAspect="1"/>
@@ -10159,7 +10159,7 @@
                   <pic:spPr>
                     <a:xfrm>
                       <a:off x="0" y="0"/>
-                      <a:ext cx="5486400" cy="4094570"/>
+                      <a:ext cx="5486400" cy="4284174"/>
                     </a:xfrm>
                     <a:prstGeom prst="rect"/>
                   </pic:spPr>

</xml_diff>

<commit_message>
fix: expand scenario v3 to match v2 detail level
- Dat phong: 20 steps → 42 steps (btnClick, navigate, find methods)
- Check-in: 9 steps → 29 steps (formLoad, findByStatus, setStartTime)
- Check-out: 15 steps → 46 steps (calculateInvoice, applyPromotion, addPoints)
- Huy phong: 12 steps → 30 steps (btnSearchClick, findByKeyword, updateStatus)
- All steps include Actor ↔ Boundary ↔ Control ↔ Entity interactions
- Method names match III.3.2 MVC design (React naming)

Co-Authored-By: Claude Opus 4.8 <noreply@anthropic.com>
</commit_message>
<xml_diff>
--- a/output/booking_module.docx
+++ b/output/booking_module.docx
@@ -9571,91 +9571,284 @@
     <w:p>
       <w:pPr/>
       <w:r>
-        <w:t>2. Phương thức navigate() của lớp SearchFreeRoomForm được gọi, hiển thị form tìm phòng trống.</w:t>
+        <w:t>2. Phương thức btnDatPhongClick() của lớp ReceptionistHomePage được gọi.</w:t>
       </w:r>
     </w:p>
     <w:p>
       <w:pPr/>
       <w:r>
-        <w:t>3. Nhân viên nhập thời gian bắt đầu, thời gian kết thúc và chọn chi nhánh.</w:t>
+        <w:t>3. Phương thức btnDatPhongClick() gọi phương thức navigate() của lớp SearchFreeRoomForm.</w:t>
       </w:r>
     </w:p>
     <w:p>
       <w:pPr/>
       <w:r>
-        <w:t>4. Nhân viên click nút [Tìm phòng trống].</w:t>
+        <w:t>4. Lớp SearchFreeRoomForm hiển thị form tìm phòng trống cho nhân viên.</w:t>
       </w:r>
     </w:p>
     <w:p>
       <w:pPr/>
       <w:r>
-        <w:t>5. Phương thức searchFreeRoom(startTime: Date, endTime: Date, branchId: int) của lớp BookingController được gọi.</w:t>
+        <w:t>5. Nhân viên hỏi khách hàng thời gian đặt phòng.</w:t>
       </w:r>
     </w:p>
     <w:p>
       <w:pPr/>
       <w:r>
-        <w:t>6. BookingController truy vấn danh sách phòng trống từ Entity Room.</w:t>
+        <w:t>6. Khách hàng trả lời.</w:t>
       </w:r>
     </w:p>
     <w:p>
       <w:pPr/>
       <w:r>
-        <w:t>7. SearchFreeRoomForm hiển thị danh sách phòng trống cho nhân viên.</w:t>
+        <w:t>7. Nhân viên nhập thời gian bắt đầu (startTime), thời gian kết thúc (endTime) và chọn chi nhánh (branchId).</w:t>
       </w:r>
     </w:p>
     <w:p>
       <w:pPr/>
       <w:r>
-        <w:t>8. Nhân viên chọn phòng mong muốn.</w:t>
+        <w:t>8. Nhân viên click nút [Tìm phòng trống].</w:t>
       </w:r>
     </w:p>
     <w:p>
       <w:pPr/>
       <w:r>
-        <w:t>9. SearchFreeRoomForm chuyển sang SearchClientForm với roomId đã chọn.</w:t>
+        <w:t>9. Phương thức btnSearchClick() của lớp SearchFreeRoomForm được gọi.</w:t>
       </w:r>
     </w:p>
     <w:p>
       <w:pPr/>
       <w:r>
-        <w:t>10. Nhân viên nhập thông tin khách hàng (tên hoặc SĐT) và click [Tìm kiếm].</w:t>
+        <w:t>10. Phương thức btnSearchClick() gọi phương thức searchFreeRoom(startTime: Date, endTime: Date, branchId: int) của lớp BookingController.</w:t>
       </w:r>
     </w:p>
     <w:p>
       <w:pPr/>
       <w:r>
-        <w:t>11. Phương thức searchClient(keyword: String) của lớp BookingController được gọi.</w:t>
+        <w:t>11. Phương thức searchFreeRoom() gọi phương thức findByTimeAndBranch(startTime, endTime, branchId) của lớp Entity Room.</w:t>
       </w:r>
     </w:p>
     <w:p>
       <w:pPr/>
       <w:r>
-        <w:t>12. BookingController truy vấn danh sách khách hàng từ Entity Customer.</w:t>
+        <w:t>12. Lớp Room trả kết quả danh sách phòng trống về cho phương thức searchFreeRoom().</w:t>
       </w:r>
     </w:p>
     <w:p>
       <w:pPr/>
       <w:r>
-        <w:t>13. SearchClientForm hiển thị danh sách khách hàng khớp.</w:t>
+        <w:t>13. Phương thức searchFreeRoom() trả kết quả về cho phương thức btnSearchClick().</w:t>
       </w:r>
     </w:p>
     <w:p>
       <w:pPr/>
       <w:r>
-        <w:t>14. Nhân viên chọn khách hàng tương ứng.</w:t>
+        <w:t>14. Lớp SearchFreeRoomForm hiển thị danh sách phòng trống cho nhân viên.</w:t>
       </w:r>
     </w:p>
     <w:p>
       <w:pPr/>
       <w:r>
-        <w:t>15. SearchClientForm chuyển sang ConfirmBookingModal với đầy đủ thông tin.</w:t>
+        <w:t>15. Nhân viên ấn vào phòng trống.</w:t>
       </w:r>
     </w:p>
     <w:p>
       <w:pPr/>
       <w:r>
-        <w:t>16. Nhân viên click [Xác nhận đặt phòng].</w:t>
+        <w:t>16. Phương thức tblRoomsClick(selectedRow: int) của lớp SearchFreeRoomForm được gọi.</w:t>
+      </w:r>
+    </w:p>
+    <w:p>
+      <w:pPr/>
+      <w:r>
+        <w:t>17. Phương thức tblRoomsClick() gọi phương thức navigate(roomId) của lớp SearchClientForm.</w:t>
+      </w:r>
+    </w:p>
+    <w:p>
+      <w:pPr/>
+      <w:r>
+        <w:t>18. Lớp SearchClientForm hiển thị form tìm khách hàng cho nhân viên.</w:t>
+      </w:r>
+    </w:p>
+    <w:p>
+      <w:pPr/>
+      <w:r>
+        <w:t>19. Nhân viên hỏi khách hàng về thông tin khách hàng.</w:t>
+      </w:r>
+    </w:p>
+    <w:p>
+      <w:pPr/>
+      <w:r>
+        <w:t>20. Khách hàng trả lời.</w:t>
+      </w:r>
+    </w:p>
+    <w:p>
+      <w:pPr/>
+      <w:r>
+        <w:t>21. Nhân viên nhập thông tin khách hàng (tên hoặc số điện thoại) và click [Tìm kiếm].</w:t>
+      </w:r>
+    </w:p>
+    <w:p>
+      <w:pPr/>
+      <w:r>
+        <w:t>22. Phương thức btnSearchClick() của lớp SearchClientForm được gọi.</w:t>
+      </w:r>
+    </w:p>
+    <w:p>
+      <w:pPr/>
+      <w:r>
+        <w:t>23. Phương thức btnSearchClick() gọi phương thức searchClient(keyword: String) của lớp BookingController.</w:t>
+      </w:r>
+    </w:p>
+    <w:p>
+      <w:pPr/>
+      <w:r>
+        <w:t>24. Phương thức searchClient() gọi phương thức findByKeyword(keyword) của lớp Entity Customer.</w:t>
+      </w:r>
+    </w:p>
+    <w:p>
+      <w:pPr/>
+      <w:r>
+        <w:t>25. Lớp Customer trả kết quả danh sách khách hàng về cho phương thức searchClient().</w:t>
+      </w:r>
+    </w:p>
+    <w:p>
+      <w:pPr/>
+      <w:r>
+        <w:t>26. Phương thức searchClient() trả kết quả về cho phương thức btnSearchClick().</w:t>
+      </w:r>
+    </w:p>
+    <w:p>
+      <w:pPr/>
+      <w:r>
+        <w:t>27. Lớp SearchClientForm hiển thị danh sách khách hàng khớp.</w:t>
+      </w:r>
+    </w:p>
+    <w:p>
+      <w:pPr/>
+      <w:r>
+        <w:t>28. Nhân viên chọn thông tin khách hàng tương ứng.</w:t>
+      </w:r>
+    </w:p>
+    <w:p>
+      <w:pPr/>
+      <w:r>
+        <w:t>29. Phương thức tblClientsClick(selectedRow: int) của lớp SearchClientForm được gọi.</w:t>
+      </w:r>
+    </w:p>
+    <w:p>
+      <w:pPr/>
+      <w:r>
+        <w:t>30. Phương thức tblClientsClick() gọi phương thức navigate(roomId, clientId, timeRange) của lớp ConfirmBookingModal.</w:t>
+      </w:r>
+    </w:p>
+    <w:p>
+      <w:pPr/>
+      <w:r>
+        <w:t>31. Lớp ConfirmBookingModal hiển thị thông tin xác nhận đặt phòng.</w:t>
+      </w:r>
+    </w:p>
+    <w:p>
+      <w:pPr/>
+      <w:r>
+        <w:t>32. Nhân viên ấn nút xác nhận.</w:t>
+      </w:r>
+    </w:p>
+    <w:p>
+      <w:pPr/>
+      <w:r>
+        <w:t>33. Phương thức btnConfirmClick() của lớp ConfirmBookingModal được gọi.</w:t>
+      </w:r>
+    </w:p>
+    <w:p>
+      <w:pPr/>
+      <w:r>
+        <w:t>34. Phương thức btnConfirmClick() gọi phương thức createBooking(clientId: int, roomId: int, startTime: Date, endTime: Date, staffId: int) của lớp BookingController.</w:t>
+      </w:r>
+    </w:p>
+    <w:p>
+      <w:pPr/>
+      <w:r>
+        <w:t>35. Phương thức createBooking() gọi phương thức updateStatus(roomId, "Chờ nhận") của lớp Entity Room_receipt.</w:t>
+      </w:r>
+    </w:p>
+    <w:p>
+      <w:pPr/>
+      <w:r>
+        <w:t>36. Lớp Room_receipt cập nhật trạng thái và trả kết quả về cho phương thức createBooking().</w:t>
+      </w:r>
+    </w:p>
+    <w:p>
+      <w:pPr/>
+      <w:r>
+        <w:t>37. Phương thức createBooking() lưu booking vào CSDL và trả BookingResponse về cho phương thức btnConfirmClick().</w:t>
+      </w:r>
+    </w:p>
+    <w:p>
+      <w:pPr/>
+      <w:r>
+        <w:t>38. Lớp ConfirmBookingModal hiển thị thông báo "Đặt phòng thành công!".</w:t>
+      </w:r>
+    </w:p>
+    <w:p>
+      <w:pPr/>
+      <w:r>
+        <w:t>39. Nhân viên ấn nút OK.</w:t>
+      </w:r>
+    </w:p>
+    <w:p>
+      <w:pPr/>
+      <w:r>
+        <w:t>40. Phương thức showMessage() của lớp ConfirmBookingModal được gọi.</w:t>
+      </w:r>
+    </w:p>
+    <w:p>
+      <w:pPr/>
+      <w:r>
+        <w:t>41. Phương thức showMessage() gọi phương thức navigate() của lớp ReceptionistHomePage.</w:t>
+      </w:r>
+    </w:p>
+    <w:p>
+      <w:pPr/>
+      <w:r>
+        <w:t>42. Hệ thống quay về giao diện chính ReceptionistHomePage.</w:t>
+      </w:r>
+    </w:p>
+    <w:p>
+      <w:pPr/>
+      <w:r>
+        <w:rPr>
+          <w:b/>
+        </w:rPr>
+        <w:t>Ngoại lệ:</w:t>
+      </w:r>
+    </w:p>
+    <w:p>
+      <w:pPr>
+        <w:pStyle w:val="ListBullet"/>
+      </w:pPr>
+      <w:r>
+        <w:rPr>
+          <w:b/>
+        </w:rPr>
+        <w:t>Phòng trống không tìm thấy:</w:t>
+      </w:r>
+      <w:r>
+        <w:t xml:space="preserve"> Phương thức searchFreeRoom() trả về danh sách rỗng. Lớp SearchFreeRoomForm hiển thị "Không có phòng trống trong khung giờ này."</w:t>
+      </w:r>
+    </w:p>
+    <w:p>
+      <w:pPr>
+        <w:pStyle w:val="ListBullet"/>
+      </w:pPr>
+      <w:r>
+        <w:rPr>
+          <w:b/>
+        </w:rPr>
+        <w:t>Khách hàng chưa có trong CSDL:</w:t>
+      </w:r>
+      <w:r>
+        <w:t xml:space="preserve"> Lớp SearchClientForm hiển thị nút [Đăng ký nhanh]. Nhân viên nhập thông tin mới, hệ thống tạo khách hàng mới trước khi tiếp tục.</w:t>
       </w:r>
     </w:p>
     <w:p>
@@ -9805,55 +9998,175 @@
     <w:p>
       <w:pPr/>
       <w:r>
-        <w:t>1. Nhân viên lễ tân click chức năng "Check-in" trên giao diện chính.</w:t>
+        <w:t>1. Nhân viên lễ tân click chức năng "Check-in" trên giao diện ReceptionistHomePage.</w:t>
       </w:r>
     </w:p>
     <w:p>
       <w:pPr/>
       <w:r>
-        <w:t>2. Phương thức getPendingBookings(branchId: int, date: Date) của lớp BookingController được gọi.</w:t>
+        <w:t>2. Phương thức btnCheckInClick() của lớp ReceptionistHomePage được gọi.</w:t>
       </w:r>
     </w:p>
     <w:p>
       <w:pPr/>
       <w:r>
-        <w:t>3. BookingController truy vấn danh sách booking có trạng thái "Chờ nhận" hôm nay.</w:t>
+        <w:t>3. Phương thức btnCheckInClick() gọi phương thức navigate() của lớp CheckInPage.</w:t>
       </w:r>
     </w:p>
     <w:p>
       <w:pPr/>
       <w:r>
-        <w:t>4. CheckInPage hiển thị danh sách booking chờ nhận phòng.</w:t>
+        <w:t>4. Lớp CheckInPage hiển thị danh sách booking chờ nhận phòng.</w:t>
       </w:r>
     </w:p>
     <w:p>
       <w:pPr/>
       <w:r>
-        <w:t>5. Nhân viên chọn booking cần check-in.</w:t>
+        <w:t>5. Phương thức formLoad() của lớp CheckInPage được gọi.</w:t>
       </w:r>
     </w:p>
     <w:p>
       <w:pPr/>
       <w:r>
-        <w:t>6. Nhân viên click [Xác nhận Check-in].</w:t>
+        <w:t>6. Phương thức formLoad() gọi phương thức getPendingBookings(branchId: int, date: Date) của lớp BookingController.</w:t>
       </w:r>
     </w:p>
     <w:p>
       <w:pPr/>
       <w:r>
-        <w:t>7. Phương thức checkIn(bookingId: int) của lớp BookingController được gọi.</w:t>
+        <w:t>7. Phương thức getPendingBookings() gọi phương thức findByStatus("Chờ nhận") của lớp Entity Room.</w:t>
       </w:r>
     </w:p>
     <w:p>
       <w:pPr/>
       <w:r>
-        <w:t>8. BookingController cập nhật trạng thái phòng từ "Chờ nhận" sang "Đang hoạt động" và ghi nhận thời gian bắt đầu.</w:t>
+        <w:t>8. Lớp Room trả kết quả danh sách booking về cho phương thức getPendingBookings().</w:t>
       </w:r>
     </w:p>
     <w:p>
       <w:pPr/>
       <w:r>
-        <w:t>9. CheckInPage hiển thị "Check-in thành công! Phòng [tên phòng] đã sẵn sàng."</w:t>
+        <w:t>9. Phương thức getPendingBookings() trả kết quả về cho phương thức formLoad().</w:t>
+      </w:r>
+    </w:p>
+    <w:p>
+      <w:pPr/>
+      <w:r>
+        <w:t>10. Lớp CheckInPage hiển thị danh sách booking "Chờ nhận" hôm nay cho nhân viên.</w:t>
+      </w:r>
+    </w:p>
+    <w:p>
+      <w:pPr/>
+      <w:r>
+        <w:t>11. Nhân viên hỏi khách hàng thông tin (tên hoặc mã đặt phòng) để đối chiếu.</w:t>
+      </w:r>
+    </w:p>
+    <w:p>
+      <w:pPr/>
+      <w:r>
+        <w:t>12. Khách hàng trả lời.</w:t>
+      </w:r>
+    </w:p>
+    <w:p>
+      <w:pPr/>
+      <w:r>
+        <w:t>13. Nhân viên ấn chọn booking tương ứng cần check-in trên danh sách.</w:t>
+      </w:r>
+    </w:p>
+    <w:p>
+      <w:pPr/>
+      <w:r>
+        <w:t>14. Phương thức tblPendingBookingsClick(selectedRow: int) của lớp CheckInPage được gọi.</w:t>
+      </w:r>
+    </w:p>
+    <w:p>
+      <w:pPr/>
+      <w:r>
+        <w:t>15. Phương thức tblPendingBookingsClick() gọi phương thức navigate(bookingId) của lớp ConfirmCheckInView.</w:t>
+      </w:r>
+    </w:p>
+    <w:p>
+      <w:pPr/>
+      <w:r>
+        <w:t>16. Lớp ConfirmCheckInView hiển thị thông tin chi tiết của phòng và khách hàng.</w:t>
+      </w:r>
+    </w:p>
+    <w:p>
+      <w:pPr/>
+      <w:r>
+        <w:t>17. Nhân viên ấn nút xác nhận check-in.</w:t>
+      </w:r>
+    </w:p>
+    <w:p>
+      <w:pPr/>
+      <w:r>
+        <w:t>18. Phương thức btnCheckInClick() của lớp ConfirmCheckInView được gọi.</w:t>
+      </w:r>
+    </w:p>
+    <w:p>
+      <w:pPr/>
+      <w:r>
+        <w:t>19. Phương thức btnCheckInClick() gọi phương thức checkIn(bookingId: int) của lớp BookingController.</w:t>
+      </w:r>
+    </w:p>
+    <w:p>
+      <w:pPr/>
+      <w:r>
+        <w:t>20. Phương thức checkIn() gọi phương thức updateStatus(roomId, "Đang hoạt động") của lớp Entity Room.</w:t>
+      </w:r>
+    </w:p>
+    <w:p>
+      <w:pPr/>
+      <w:r>
+        <w:t>21. Lớp Room cập nhật trạng thái và trả kết quả về cho phương thức checkIn().</w:t>
+      </w:r>
+    </w:p>
+    <w:p>
+      <w:pPr/>
+      <w:r>
+        <w:t>22. Phương thức checkIn() gọi phương thức setStartTime(now) của lớp Entity Room_receipt.</w:t>
+      </w:r>
+    </w:p>
+    <w:p>
+      <w:pPr/>
+      <w:r>
+        <w:t>23. Lớp Room_receipt ghi nhận thời gian bắt đầu và trả kết quả về cho phương thức checkIn().</w:t>
+      </w:r>
+    </w:p>
+    <w:p>
+      <w:pPr/>
+      <w:r>
+        <w:t>24. Phương thức checkIn() trả BookingResponse về cho phương thức btnCheckInClick().</w:t>
+      </w:r>
+    </w:p>
+    <w:p>
+      <w:pPr/>
+      <w:r>
+        <w:t>25. Lớp ConfirmCheckInView hiển thị thông báo "Check-in thành công! Phòng [tên phòng] đã sẵn sàng."</w:t>
+      </w:r>
+    </w:p>
+    <w:p>
+      <w:pPr/>
+      <w:r>
+        <w:t>26. Nhân viên ấn nút quay lại.</w:t>
+      </w:r>
+    </w:p>
+    <w:p>
+      <w:pPr/>
+      <w:r>
+        <w:t>27. Phương thức showMessage() của lớp ConfirmCheckInView được gọi.</w:t>
+      </w:r>
+    </w:p>
+    <w:p>
+      <w:pPr/>
+      <w:r>
+        <w:t>28. Phương thức showMessage() gọi phương thức navigate() của lớp ReceptionistHomePage.</w:t>
+      </w:r>
+    </w:p>
+    <w:p>
+      <w:pPr/>
+      <w:r>
+        <w:t>29. Hệ thống quay về giao diện chính ReceptionistHomePage.</w:t>
       </w:r>
     </w:p>
     <w:p>
@@ -9876,7 +10189,7 @@
         <w:t>Phòng đang dọn dẹp:</w:t>
       </w:r>
       <w:r>
-        <w:t xml:space="preserve"> BookingController kiểm tra trạng thái phòng, trả về lỗi. CheckInPage hiển thị "Phòng đang dọn dẹp, vui lòng chờ."</w:t>
+        <w:t xml:space="preserve"> Phương thức checkIn() kiểm tra trạng thái phòng, trả về lỗi. Lớp ConfirmCheckInView hiển thị "Phòng đang dọn dẹp, vui lòng chờ."</w:t>
       </w:r>
     </w:p>
     <w:p>
@@ -9890,7 +10203,7 @@
         <w:t>Khách hàng không đến:</w:t>
       </w:r>
       <w:r>
-        <w:t xml:space="preserve"> Nhân viên chọn hủy booking thay vì check-in. BookingController chuyển trạng thái booking sang "Đã hủy".</w:t>
+        <w:t xml:space="preserve"> Nhân viên chọn hủy booking thay vì check-in. Phương thức cancelBooking() của BookingController được gọi, chuyển trạng thái booking sang "Đã hủy".</w:t>
       </w:r>
     </w:p>
     <w:p>
@@ -9979,91 +10292,277 @@
     <w:p>
       <w:pPr/>
       <w:r>
-        <w:t>1. Nhân viên lễ tân click chức năng "Check-out" trên giao diện chính.</w:t>
+        <w:t>1. Nhân viên lễ tân click chức năng "Check-out" trên giao diện ReceptionistHomePage.</w:t>
       </w:r>
     </w:p>
     <w:p>
       <w:pPr/>
       <w:r>
-        <w:t>2. Phương thức getActiveRooms(branchId: int) của lớp BookingController được gọi.</w:t>
+        <w:t>2. Phương thức btnCheckOutClick() của lớp ReceptionistHomePage được gọi.</w:t>
       </w:r>
     </w:p>
     <w:p>
       <w:pPr/>
       <w:r>
-        <w:t>3. BookingController truy vấn danh sách phòng trạng thái "Đang hoạt động".</w:t>
+        <w:t>3. Phương thức btnCheckOutClick() gọi phương thức navigate() của lớp CheckOutPage.</w:t>
       </w:r>
     </w:p>
     <w:p>
       <w:pPr/>
       <w:r>
-        <w:t>4. CheckOutPage hiển thị danh sách phòng đang sử dụng.</w:t>
+        <w:t>4. Lớp CheckOutPage hiển thị danh sách phòng đang hoạt động.</w:t>
       </w:r>
     </w:p>
     <w:p>
       <w:pPr/>
       <w:r>
-        <w:t>5. Nhân viên chọn phòng cần check-out.</w:t>
+        <w:t>5. Phương thức formLoad() của lớp CheckOutPage được gọi.</w:t>
       </w:r>
     </w:p>
     <w:p>
       <w:pPr/>
       <w:r>
-        <w:t>6. CheckOutPage chuyển sang InvoicePanel với bookingId đã chọn.</w:t>
+        <w:t>6. Phương thức formLoad() gọi phương thức getActiveRooms(branchId: int) của lớp BookingController.</w:t>
       </w:r>
     </w:p>
     <w:p>
       <w:pPr/>
       <w:r>
-        <w:t>7. Phương thức calculateInvoice(bookingId: int) của lớp BookingController được gọi.</w:t>
+        <w:t>7. Phương thức getActiveRooms() gọi phương thức findByStatus("Đang hoạt động") của lớp Entity Room.</w:t>
       </w:r>
     </w:p>
     <w:p>
       <w:pPr/>
       <w:r>
-        <w:t>8. BookingController tính tiền phòng (thời gian × đơn giá) + tổng tiền dịch vụ từ ChiTietHoaDon.</w:t>
+        <w:t>8. Lớp Room trả kết quả danh sách phòng về cho phương thức getActiveRooms().</w:t>
       </w:r>
     </w:p>
     <w:p>
       <w:pPr/>
       <w:r>
-        <w:t>9. InvoicePanel hiển thị chi tiết hóa đơn với tổng tiền.</w:t>
+        <w:t>9. Phương thức getActiveRooms() trả kết quả về cho phương thức formLoad().</w:t>
       </w:r>
     </w:p>
     <w:p>
       <w:pPr/>
       <w:r>
-        <w:t>10. Nhân viên nhập mã voucher và chọn phương thức thanh toán (tiền mặt/chuyển khoản).</w:t>
+        <w:t>10. Lớp CheckOutPage hiển thị danh sách phòng đang sử dụng cho nhân viên.</w:t>
       </w:r>
     </w:p>
     <w:p>
       <w:pPr/>
       <w:r>
-        <w:t>11. Nhân viên click [Xác nhận thanh toán].</w:t>
+        <w:t>11. Nhân viên hỏi khách hàng số phòng cần trả.</w:t>
       </w:r>
     </w:p>
     <w:p>
       <w:pPr/>
       <w:r>
-        <w:t>12. Phương thức confirmPayment(invoiceId: int, paymentMethod: String, voucherCode: String) của lớp BookingController được gọi.</w:t>
+        <w:t>12. Khách hàng trả lời.</w:t>
       </w:r>
     </w:p>
     <w:p>
       <w:pPr/>
       <w:r>
-        <w:t>13. BookingController cập nhật trạng thái hóa đơn "Đã thanh toán", chuyển phòng về "Trống", cộng điểm hội viên.</w:t>
+        <w:t>13. Nhân viên chọn phòng tương ứng trên danh sách.</w:t>
       </w:r>
     </w:p>
     <w:p>
       <w:pPr/>
       <w:r>
-        <w:t>14. InvoicePanel hiển thị "Check-out thành công! Tổng tiền: [X]đ."</w:t>
+        <w:t>14. Phương thức tblActiveRoomsClick(selectedRow: int) của lớp CheckOutPage được gọi.</w:t>
       </w:r>
     </w:p>
     <w:p>
       <w:pPr/>
       <w:r>
-        <w:t>15. Nhân viên click [In hóa đơn].</w:t>
+        <w:t>15. Phương thức tblActiveRoomsClick() gọi phương thức navigate(room_receipt_ID) của lớp InvoicePanel.</w:t>
+      </w:r>
+    </w:p>
+    <w:p>
+      <w:pPr/>
+      <w:r>
+        <w:t>16. Lớp InvoicePanel hiển thị chi tiết hóa đơn.</w:t>
+      </w:r>
+    </w:p>
+    <w:p>
+      <w:pPr/>
+      <w:r>
+        <w:t>17. Phương thức formLoad(invoice: Room_receipt) của lớp InvoicePanel được gọi.</w:t>
+      </w:r>
+    </w:p>
+    <w:p>
+      <w:pPr/>
+      <w:r>
+        <w:t>18. Phương thức formLoad() gọi phương thức calculateInvoice(room_receipt_ID: int) của lớp BookingController.</w:t>
+      </w:r>
+    </w:p>
+    <w:p>
+      <w:pPr/>
+      <w:r>
+        <w:t>19. Phương thức calculateInvoice() gọi phương thức calculateTimeFee() + calculateServiceFee() của lớp Entity Room_receipt.</w:t>
+      </w:r>
+    </w:p>
+    <w:p>
+      <w:pPr/>
+      <w:r>
+        <w:t>20. Lớp Room_receipt trả kết quả hóa đơn về cho phương thức calculateInvoice().</w:t>
+      </w:r>
+    </w:p>
+    <w:p>
+      <w:pPr/>
+      <w:r>
+        <w:t>21. Phương thức calculateInvoice() trả Room_receipt về cho phương thức formLoad().</w:t>
+      </w:r>
+    </w:p>
+    <w:p>
+      <w:pPr/>
+      <w:r>
+        <w:t>22. Lớp InvoicePanel hiển thị chi tiết tiền phòng, dịch vụ, thời gian sử dụng và tổng tiền.</w:t>
+      </w:r>
+    </w:p>
+    <w:p>
+      <w:pPr/>
+      <w:r>
+        <w:t>23. Nhân viên thông báo tổng tiền cho khách hàng.</w:t>
+      </w:r>
+    </w:p>
+    <w:p>
+      <w:pPr/>
+      <w:r>
+        <w:t>24. Khách hàng cung cấp mã ưu đãi (nếu có).</w:t>
+      </w:r>
+    </w:p>
+    <w:p>
+      <w:pPr/>
+      <w:r>
+        <w:t>25. Nhân viên nhập mã và ấn áp dụng.</w:t>
+      </w:r>
+    </w:p>
+    <w:p>
+      <w:pPr/>
+      <w:r>
+        <w:t>26. Phương thức btnApply() của lớp InvoicePanel được gọi.</w:t>
+      </w:r>
+    </w:p>
+    <w:p>
+      <w:pPr/>
+      <w:r>
+        <w:t>27. Phương thức btnApply() gọi phương thức applyPromotion(room_receipt_ID: int) của lớp BookingController.</w:t>
+      </w:r>
+    </w:p>
+    <w:p>
+      <w:pPr/>
+      <w:r>
+        <w:t>28. Phương thức applyPromotion() gọi phương thức applyVoucher() của lớp Entity Promotion.</w:t>
+      </w:r>
+    </w:p>
+    <w:p>
+      <w:pPr/>
+      <w:r>
+        <w:t>29. Lớp Promotion trả kết quả giảm giá về cho phương thức applyPromotion().</w:t>
+      </w:r>
+    </w:p>
+    <w:p>
+      <w:pPr/>
+      <w:r>
+        <w:t>30. Phương thức applyPromotion() trả kết quả về cho phương thức btnApply().</w:t>
+      </w:r>
+    </w:p>
+    <w:p>
+      <w:pPr/>
+      <w:r>
+        <w:t>31. Lớp InvoicePanel cập nhật lại tổng tiền sau giảm giá.</w:t>
+      </w:r>
+    </w:p>
+    <w:p>
+      <w:pPr/>
+      <w:r>
+        <w:t>32. Khách hàng đưa tiền mặt cho nhân viên.</w:t>
+      </w:r>
+    </w:p>
+    <w:p>
+      <w:pPr/>
+      <w:r>
+        <w:t>33. Nhân viên chọn phương thức thanh toán và click nút xác nhận thanh toán.</w:t>
+      </w:r>
+    </w:p>
+    <w:p>
+      <w:pPr/>
+      <w:r>
+        <w:t>34. Phương thức btnThanhToanClick() của lớp InvoicePanel được gọi.</w:t>
+      </w:r>
+    </w:p>
+    <w:p>
+      <w:pPr/>
+      <w:r>
+        <w:t>35. Phương thức btnThanhToanClick() gọi phương thức confirmPayment(room_receipt_ID: int, paymentMethod: String, voucherCode: String) của lớp BookingController.</w:t>
+      </w:r>
+    </w:p>
+    <w:p>
+      <w:pPr/>
+      <w:r>
+        <w:t>36. Phương thức confirmPayment() gọi phương thức updateStatus("Đã thanh toán") của lớp Entity Room_receipt.</w:t>
+      </w:r>
+    </w:p>
+    <w:p>
+      <w:pPr/>
+      <w:r>
+        <w:t>37. Phương thức confirmPayment() gọi phương thức updateStatus("Trống") của lớp Entity Room.</w:t>
+      </w:r>
+    </w:p>
+    <w:p>
+      <w:pPr/>
+      <w:r>
+        <w:t>38. Phương thức confirmPayment() gọi phương thức addPoints(base_score) của lớp Entity Customer.</w:t>
+      </w:r>
+    </w:p>
+    <w:p>
+      <w:pPr/>
+      <w:r>
+        <w:t>39. Các lớp Entity trả kết quả lưu trữ về cho phương thức confirmPayment().</w:t>
+      </w:r>
+    </w:p>
+    <w:p>
+      <w:pPr/>
+      <w:r>
+        <w:t>40. Phương thức confirmPayment() trả Room_receipt về cho phương thức btnThanhToanClick().</w:t>
+      </w:r>
+    </w:p>
+    <w:p>
+      <w:pPr/>
+      <w:r>
+        <w:t>41. Lớp InvoicePanel hiển thị thông báo "Check-out thành công! Tổng tiền: [X]đ."</w:t>
+      </w:r>
+    </w:p>
+    <w:p>
+      <w:pPr/>
+      <w:r>
+        <w:t>42. Nhân viên click nút in hóa đơn (để đưa cho khách hàng) và ấn hoàn tất.</w:t>
+      </w:r>
+    </w:p>
+    <w:p>
+      <w:pPr/>
+      <w:r>
+        <w:t>43. Phương thức btnInHoaDonClick() của lớp InvoicePanel được gọi.</w:t>
+      </w:r>
+    </w:p>
+    <w:p>
+      <w:pPr/>
+      <w:r>
+        <w:t>44. Phương thức btnInHoaDonClick() gọi phương thức showMessage() của lớp InvoicePanel.</w:t>
+      </w:r>
+    </w:p>
+    <w:p>
+      <w:pPr/>
+      <w:r>
+        <w:t>45. Phương thức showMessage() gọi phương thức navigate() của lớp ReceptionistHomePage.</w:t>
+      </w:r>
+    </w:p>
+    <w:p>
+      <w:pPr/>
+      <w:r>
+        <w:t>46. Hệ thống quay về giao diện chính ReceptionistHomePage.</w:t>
       </w:r>
     </w:p>
     <w:p>
@@ -10086,7 +10585,7 @@
         <w:t>Voucher không hợp lệ:</w:t>
       </w:r>
       <w:r>
-        <w:t xml:space="preserve"> BookingController trả về lỗi. InvoicePanel hiển thị "Mã voucher không hợp lệ hoặc đã hết hạn."</w:t>
+        <w:t xml:space="preserve"> Phương thức applyPromotion() trả về lỗi. Lớp InvoicePanel hiển thị "Mã voucher không hợp lệ hoặc đã hết hạn."</w:t>
       </w:r>
     </w:p>
     <w:p>
@@ -10100,7 +10599,7 @@
         <w:t>Thanh toán chuyển khoản thất bại:</w:t>
       </w:r>
       <w:r>
-        <w:t xml:space="preserve"> InvoicePanel hiển thị lỗi, yêu cầu chọn lại phương thức.</w:t>
+        <w:t xml:space="preserve"> Phương thức confirmPayment() trả về lỗi. Lớp InvoicePanel hiển thị lỗi, yêu cầu chọn lại phương thức.</w:t>
       </w:r>
     </w:p>
     <w:p>
@@ -10189,73 +10688,181 @@
     <w:p>
       <w:pPr/>
       <w:r>
-        <w:t>1. Nhân viên lễ tân click "Quản lý đặt phòng" trên giao diện chính.</w:t>
+        <w:t>1. Nhân viên lễ tân click chức năng "Quản lý đặt phòng" trên giao diện ReceptionistHomePage.</w:t>
       </w:r>
     </w:p>
     <w:p>
       <w:pPr/>
       <w:r>
-        <w:t>2. Nhân viên nhập thông tin tìm kiếm (tên khách, SĐT, hoặc mã booking).</w:t>
+        <w:t>2. Phương thức btnBookingManagementClick() của lớp ReceptionistHomePage được gọi.</w:t>
       </w:r>
     </w:p>
     <w:p>
       <w:pPr/>
       <w:r>
-        <w:t>3. Phương thức searchBooking(keyword: String) của lớp BookingController được gọi.</w:t>
+        <w:t>3. Phương thức btnBookingManagementClick() gọi phương thức navigate() của lớp CancelBookingPage.</w:t>
       </w:r>
     </w:p>
     <w:p>
       <w:pPr/>
       <w:r>
-        <w:t>4. BookingController truy vấn danh sách booking khớp từ CSDL.</w:t>
+        <w:t>4. Lớp CancelBookingPage hiển thị form tìm kiếm booking.</w:t>
       </w:r>
     </w:p>
     <w:p>
       <w:pPr/>
       <w:r>
-        <w:t>5. CancelBookingPage hiển thị danh sách booking tìm thấy.</w:t>
+        <w:t>5. Nhân viên hỏi khách hàng thông tin tra cứu (họ tên, số điện thoại hoặc mã phòng đã đặt).</w:t>
       </w:r>
     </w:p>
     <w:p>
       <w:pPr/>
       <w:r>
-        <w:t>6. Nhân viên chọn booking cần hủy.</w:t>
+        <w:t>6. Khách hàng trả lời.</w:t>
       </w:r>
     </w:p>
     <w:p>
       <w:pPr/>
       <w:r>
-        <w:t>7. Nhân viên click [Hủy đặt phòng].</w:t>
+        <w:t>7. Nhân viên nhập thông tin tìm kiếm và ấn nút tìm kiếm.</w:t>
       </w:r>
     </w:p>
     <w:p>
       <w:pPr/>
       <w:r>
-        <w:t>8. CancelBookingPage hiển thị xác nhận "Bạn có chắc chắn muốn hủy booking này?".</w:t>
+        <w:t>8. Phương thức btnSearchClick() của lớp CancelBookingPage được gọi.</w:t>
       </w:r>
     </w:p>
     <w:p>
       <w:pPr/>
       <w:r>
-        <w:t>9. Nhân viên click [Đồng ý].</w:t>
+        <w:t>9. Phương thức btnSearchClick() gọi phương thức searchBooking(keyword: String) của lớp BookingController.</w:t>
       </w:r>
     </w:p>
     <w:p>
       <w:pPr/>
       <w:r>
-        <w:t>10. Phương thức cancelBooking(bookingId: int) của lớp BookingController được gọi.</w:t>
+        <w:t>10. Phương thức searchBooking() gọi phương thức findByKeyword(keyword) của lớp Entity Room.</w:t>
       </w:r>
     </w:p>
     <w:p>
       <w:pPr/>
       <w:r>
-        <w:t>11. BookingController cập nhật trạng thái booking sang "Đã hủy" và chuyển phòng về "Trống".</w:t>
+        <w:t>11. Lớp Room trả kết quả danh sách booking về cho phương thức searchBooking().</w:t>
       </w:r>
     </w:p>
     <w:p>
       <w:pPr/>
       <w:r>
-        <w:t>12. CancelBookingPage hiển thị "Hủy đặt phòng thành công."</w:t>
+        <w:t>12. Phương thức searchBooking() trả kết quả về cho phương thức btnSearchClick().</w:t>
+      </w:r>
+    </w:p>
+    <w:p>
+      <w:pPr/>
+      <w:r>
+        <w:t>13. Lớp CancelBookingPage hiển thị danh sách các booking tương ứng cho nhân viên.</w:t>
+      </w:r>
+    </w:p>
+    <w:p>
+      <w:pPr/>
+      <w:r>
+        <w:t>14. Nhân viên ấn chọn bản ghi booking cần hủy.</w:t>
+      </w:r>
+    </w:p>
+    <w:p>
+      <w:pPr/>
+      <w:r>
+        <w:t>15. Phương thức tblBookingsClick(selectedRow: int) của lớp CancelBookingPage được gọi.</w:t>
+      </w:r>
+    </w:p>
+    <w:p>
+      <w:pPr/>
+      <w:r>
+        <w:t>16. Lớp CancelBookingPage hiển thị thông tin chi tiết booking và nút [Hủy đặt phòng].</w:t>
+      </w:r>
+    </w:p>
+    <w:p>
+      <w:pPr/>
+      <w:r>
+        <w:t>17. Nhân viên click [Hủy đặt phòng].</w:t>
+      </w:r>
+    </w:p>
+    <w:p>
+      <w:pPr/>
+      <w:r>
+        <w:t>18. Lớp CancelBookingPage hiển thị xác nhận "Bạn có chắc chắn muốn hủy booking này?".</w:t>
+      </w:r>
+    </w:p>
+    <w:p>
+      <w:pPr/>
+      <w:r>
+        <w:t>19. Nhân viên click [Đồng ý].</w:t>
+      </w:r>
+    </w:p>
+    <w:p>
+      <w:pPr/>
+      <w:r>
+        <w:t>20. Phương thức btnCancelClick() của lớp CancelBookingPage được gọi.</w:t>
+      </w:r>
+    </w:p>
+    <w:p>
+      <w:pPr/>
+      <w:r>
+        <w:t>21. Phương thức btnCancelClick() gọi phương thức cancelBooking(bookingId: int) của lớp BookingController.</w:t>
+      </w:r>
+    </w:p>
+    <w:p>
+      <w:pPr/>
+      <w:r>
+        <w:t>22. Phương thức cancelBooking() gọi phương thức updateStatus(roomId, "Trống") của lớp Entity Room.</w:t>
+      </w:r>
+    </w:p>
+    <w:p>
+      <w:pPr/>
+      <w:r>
+        <w:t>23. Lớp Room cập nhật trạng thái và trả kết quả về cho phương thức cancelBooking().</w:t>
+      </w:r>
+    </w:p>
+    <w:p>
+      <w:pPr/>
+      <w:r>
+        <w:t>24. Phương thức cancelBooking() cập nhật trạng thái booking sang "Đã hủy" trong CSDL.</w:t>
+      </w:r>
+    </w:p>
+    <w:p>
+      <w:pPr/>
+      <w:r>
+        <w:t>25. Phương thức cancelBooking() trả BookingResponse về cho phương thức btnCancelClick().</w:t>
+      </w:r>
+    </w:p>
+    <w:p>
+      <w:pPr/>
+      <w:r>
+        <w:t>26. Lớp CancelBookingPage hiển thị thông báo "Hủy đặt phòng thành công."</w:t>
+      </w:r>
+    </w:p>
+    <w:p>
+      <w:pPr/>
+      <w:r>
+        <w:t>27. Nhân viên ấn nút quay lại.</w:t>
+      </w:r>
+    </w:p>
+    <w:p>
+      <w:pPr/>
+      <w:r>
+        <w:t>28. Phương thức showMessage() của lớp CancelBookingPage được gọi.</w:t>
+      </w:r>
+    </w:p>
+    <w:p>
+      <w:pPr/>
+      <w:r>
+        <w:t>29. Phương thức showMessage() gọi phương thức navigate() của lớp ReceptionistHomePage.</w:t>
+      </w:r>
+    </w:p>
+    <w:p>
+      <w:pPr/>
+      <w:r>
+        <w:t>30. Hệ thống quay về giao diện chính ReceptionistHomePage.</w:t>
       </w:r>
     </w:p>
     <w:p>
@@ -10278,7 +10885,7 @@
         <w:t>Không tìm thấy booking:</w:t>
       </w:r>
       <w:r>
-        <w:t xml:space="preserve"> BookingController trả về danh sách rỗng. CancelBookingPage hiển thị "Không tìm thấy booking phù hợp."</w:t>
+        <w:t xml:space="preserve"> Phương thức searchBooking() trả về danh sách rỗng. Lớp CancelBookingPage hiển thị "Không tìm thấy booking phù hợp."</w:t>
       </w:r>
     </w:p>
     <w:p>
@@ -10292,7 +10899,7 @@
         <w:t>Booking đã quá thời gian hủy:</w:t>
       </w:r>
       <w:r>
-        <w:t xml:space="preserve"> BookingController kiểm tra thời gian, trả về lỗi. CancelBookingPage hiển thị "Booking đã quá thời gian hủy."</w:t>
+        <w:t xml:space="preserve"> Phương thức cancelBooking() kiểm tra thời gian, trả về lỗi. Lớp CancelBookingPage hiển thị "Booking đã quá thời gian hủy."</w:t>
       </w:r>
     </w:p>
     <w:p/>

</xml_diff>

<commit_message>
style: redraw all 8 sequence diagrams with cnpm blue style (#7AD2FF)
- Applied cnpm skill CSS: Arial font, blue participants, dashed lifelines
- Phase II analysis (4 diagrams): boundary, entity keywords
- Phase III design (4 diagrams): boundary, control, entity keywords
- All diagrams now match scenario v3 detail level
- DOCX: 633 paragraphs, 39 tables, 15 images

Co-Authored-By: Claude Opus 4.8 <noreply@anthropic.com>
</commit_message>
<xml_diff>
--- a/output/booking_module.docx
+++ b/output/booking_module.docx
@@ -3813,7 +3813,7 @@
       <w:r>
         <w:drawing>
           <wp:inline xmlns:a="http://schemas.openxmlformats.org/drawingml/2006/main" xmlns:pic="http://schemas.openxmlformats.org/drawingml/2006/picture">
-            <wp:extent cx="5486400" cy="4007732"/>
+            <wp:extent cx="5486400" cy="4729655"/>
             <wp:docPr id="5" name="Picture 5"/>
             <wp:cNvGraphicFramePr>
               <a:graphicFrameLocks noChangeAspect="1"/>
@@ -3834,7 +3834,7 @@
                   <pic:spPr>
                     <a:xfrm>
                       <a:off x="0" y="0"/>
-                      <a:ext cx="5486400" cy="4007732"/>
+                      <a:ext cx="5486400" cy="4729655"/>
                     </a:xfrm>
                     <a:prstGeom prst="rect"/>
                   </pic:spPr>
@@ -4115,7 +4115,7 @@
       <w:r>
         <w:drawing>
           <wp:inline xmlns:a="http://schemas.openxmlformats.org/drawingml/2006/main" xmlns:pic="http://schemas.openxmlformats.org/drawingml/2006/picture">
-            <wp:extent cx="5486400" cy="3945147"/>
+            <wp:extent cx="5486400" cy="4596714"/>
             <wp:docPr id="6" name="Picture 6"/>
             <wp:cNvGraphicFramePr>
               <a:graphicFrameLocks noChangeAspect="1"/>
@@ -4136,7 +4136,7 @@
                   <pic:spPr>
                     <a:xfrm>
                       <a:off x="0" y="0"/>
-                      <a:ext cx="5486400" cy="3945147"/>
+                      <a:ext cx="5486400" cy="4596714"/>
                     </a:xfrm>
                     <a:prstGeom prst="rect"/>
                   </pic:spPr>
@@ -4335,7 +4335,7 @@
       <w:r>
         <w:drawing>
           <wp:inline xmlns:a="http://schemas.openxmlformats.org/drawingml/2006/main" xmlns:pic="http://schemas.openxmlformats.org/drawingml/2006/picture">
-            <wp:extent cx="5486400" cy="3186493"/>
+            <wp:extent cx="5486400" cy="3657600"/>
             <wp:docPr id="7" name="Picture 7"/>
             <wp:cNvGraphicFramePr>
               <a:graphicFrameLocks noChangeAspect="1"/>
@@ -4356,7 +4356,7 @@
                   <pic:spPr>
                     <a:xfrm>
                       <a:off x="0" y="0"/>
-                      <a:ext cx="5486400" cy="3186493"/>
+                      <a:ext cx="5486400" cy="3657600"/>
                     </a:xfrm>
                     <a:prstGeom prst="rect"/>
                   </pic:spPr>
@@ -4525,7 +4525,7 @@
       <w:r>
         <w:drawing>
           <wp:inline xmlns:a="http://schemas.openxmlformats.org/drawingml/2006/main" xmlns:pic="http://schemas.openxmlformats.org/drawingml/2006/picture">
-            <wp:extent cx="5486400" cy="3282241"/>
+            <wp:extent cx="5486400" cy="3754594"/>
             <wp:docPr id="8" name="Picture 8"/>
             <wp:cNvGraphicFramePr>
               <a:graphicFrameLocks noChangeAspect="1"/>
@@ -4546,7 +4546,7 @@
                   <pic:spPr>
                     <a:xfrm>
                       <a:off x="0" y="0"/>
-                      <a:ext cx="5486400" cy="3282241"/>
+                      <a:ext cx="5486400" cy="3754594"/>
                     </a:xfrm>
                     <a:prstGeom prst="rect"/>
                   </pic:spPr>
@@ -9514,7 +9514,7 @@
       <w:r>
         <w:drawing>
           <wp:inline xmlns:a="http://schemas.openxmlformats.org/drawingml/2006/main" xmlns:pic="http://schemas.openxmlformats.org/drawingml/2006/picture">
-            <wp:extent cx="5486400" cy="3781757"/>
+            <wp:extent cx="5486400" cy="4542615"/>
             <wp:docPr id="12" name="Picture 12"/>
             <wp:cNvGraphicFramePr>
               <a:graphicFrameLocks noChangeAspect="1"/>
@@ -9535,7 +9535,7 @@
                   <pic:spPr>
                     <a:xfrm>
                       <a:off x="0" y="0"/>
-                      <a:ext cx="5486400" cy="3781757"/>
+                      <a:ext cx="5486400" cy="4542615"/>
                     </a:xfrm>
                     <a:prstGeom prst="rect"/>
                   </pic:spPr>
@@ -9947,7 +9947,7 @@
       <w:r>
         <w:drawing>
           <wp:inline xmlns:a="http://schemas.openxmlformats.org/drawingml/2006/main" xmlns:pic="http://schemas.openxmlformats.org/drawingml/2006/picture">
-            <wp:extent cx="5486400" cy="3075384"/>
+            <wp:extent cx="5486400" cy="4889488"/>
             <wp:docPr id="13" name="Picture 13"/>
             <wp:cNvGraphicFramePr>
               <a:graphicFrameLocks noChangeAspect="1"/>
@@ -9968,7 +9968,7 @@
                   <pic:spPr>
                     <a:xfrm>
                       <a:off x="0" y="0"/>
-                      <a:ext cx="5486400" cy="3075384"/>
+                      <a:ext cx="5486400" cy="4889488"/>
                     </a:xfrm>
                     <a:prstGeom prst="rect"/>
                   </pic:spPr>
@@ -10241,7 +10241,7 @@
       <w:r>
         <w:drawing>
           <wp:inline xmlns:a="http://schemas.openxmlformats.org/drawingml/2006/main" xmlns:pic="http://schemas.openxmlformats.org/drawingml/2006/picture">
-            <wp:extent cx="5486400" cy="3194257"/>
+            <wp:extent cx="5486400" cy="5570498"/>
             <wp:docPr id="14" name="Picture 14"/>
             <wp:cNvGraphicFramePr>
               <a:graphicFrameLocks noChangeAspect="1"/>
@@ -10262,7 +10262,7 @@
                   <pic:spPr>
                     <a:xfrm>
                       <a:off x="0" y="0"/>
-                      <a:ext cx="5486400" cy="3194257"/>
+                      <a:ext cx="5486400" cy="5570498"/>
                     </a:xfrm>
                     <a:prstGeom prst="rect"/>
                   </pic:spPr>
@@ -10637,7 +10637,7 @@
       <w:r>
         <w:drawing>
           <wp:inline xmlns:a="http://schemas.openxmlformats.org/drawingml/2006/main" xmlns:pic="http://schemas.openxmlformats.org/drawingml/2006/picture">
-            <wp:extent cx="5486400" cy="4284174"/>
+            <wp:extent cx="5486400" cy="6402922"/>
             <wp:docPr id="15" name="Picture 15"/>
             <wp:cNvGraphicFramePr>
               <a:graphicFrameLocks noChangeAspect="1"/>
@@ -10658,7 +10658,7 @@
                   <pic:spPr>
                     <a:xfrm>
                       <a:off x="0" y="0"/>
-                      <a:ext cx="5486400" cy="4284174"/>
+                      <a:ext cx="5486400" cy="6402922"/>
                     </a:xfrm>
                     <a:prstGeom prst="rect"/>
                   </pic:spPr>

</xml_diff>

<commit_message>
fix: sequence diagrams via PlantUML server - arrows and lifelines now visible
- Used plantuml Python package + MCP encode for correct PlantUML server rendering
- MCP generate_plantuml_diagram was not rendering arrows/lifelines correctly
- All 8 diagrams now have visible arrows, dashed lifelines, blue participants
- DOCX: 633 paragraphs, 39 tables, 15 images

Co-Authored-By: Claude Opus 4.8 <noreply@anthropic.com>
</commit_message>
<xml_diff>
--- a/output/booking_module.docx
+++ b/output/booking_module.docx
@@ -3813,7 +3813,7 @@
       <w:r>
         <w:drawing>
           <wp:inline xmlns:a="http://schemas.openxmlformats.org/drawingml/2006/main" xmlns:pic="http://schemas.openxmlformats.org/drawingml/2006/picture">
-            <wp:extent cx="5486400" cy="4729655"/>
+            <wp:extent cx="5486400" cy="4007732"/>
             <wp:docPr id="5" name="Picture 5"/>
             <wp:cNvGraphicFramePr>
               <a:graphicFrameLocks noChangeAspect="1"/>
@@ -3834,7 +3834,7 @@
                   <pic:spPr>
                     <a:xfrm>
                       <a:off x="0" y="0"/>
-                      <a:ext cx="5486400" cy="4729655"/>
+                      <a:ext cx="5486400" cy="4007732"/>
                     </a:xfrm>
                     <a:prstGeom prst="rect"/>
                   </pic:spPr>
@@ -4115,7 +4115,7 @@
       <w:r>
         <w:drawing>
           <wp:inline xmlns:a="http://schemas.openxmlformats.org/drawingml/2006/main" xmlns:pic="http://schemas.openxmlformats.org/drawingml/2006/picture">
-            <wp:extent cx="5486400" cy="4596714"/>
+            <wp:extent cx="5486400" cy="3945147"/>
             <wp:docPr id="6" name="Picture 6"/>
             <wp:cNvGraphicFramePr>
               <a:graphicFrameLocks noChangeAspect="1"/>
@@ -4136,7 +4136,7 @@
                   <pic:spPr>
                     <a:xfrm>
                       <a:off x="0" y="0"/>
-                      <a:ext cx="5486400" cy="4596714"/>
+                      <a:ext cx="5486400" cy="3945147"/>
                     </a:xfrm>
                     <a:prstGeom prst="rect"/>
                   </pic:spPr>
@@ -4335,7 +4335,7 @@
       <w:r>
         <w:drawing>
           <wp:inline xmlns:a="http://schemas.openxmlformats.org/drawingml/2006/main" xmlns:pic="http://schemas.openxmlformats.org/drawingml/2006/picture">
-            <wp:extent cx="5486400" cy="3657600"/>
+            <wp:extent cx="5486400" cy="3186493"/>
             <wp:docPr id="7" name="Picture 7"/>
             <wp:cNvGraphicFramePr>
               <a:graphicFrameLocks noChangeAspect="1"/>
@@ -4356,7 +4356,7 @@
                   <pic:spPr>
                     <a:xfrm>
                       <a:off x="0" y="0"/>
-                      <a:ext cx="5486400" cy="3657600"/>
+                      <a:ext cx="5486400" cy="3186493"/>
                     </a:xfrm>
                     <a:prstGeom prst="rect"/>
                   </pic:spPr>
@@ -4525,7 +4525,7 @@
       <w:r>
         <w:drawing>
           <wp:inline xmlns:a="http://schemas.openxmlformats.org/drawingml/2006/main" xmlns:pic="http://schemas.openxmlformats.org/drawingml/2006/picture">
-            <wp:extent cx="5486400" cy="3754594"/>
+            <wp:extent cx="5486400" cy="3282241"/>
             <wp:docPr id="8" name="Picture 8"/>
             <wp:cNvGraphicFramePr>
               <a:graphicFrameLocks noChangeAspect="1"/>
@@ -4546,7 +4546,7 @@
                   <pic:spPr>
                     <a:xfrm>
                       <a:off x="0" y="0"/>
-                      <a:ext cx="5486400" cy="3754594"/>
+                      <a:ext cx="5486400" cy="3282241"/>
                     </a:xfrm>
                     <a:prstGeom prst="rect"/>
                   </pic:spPr>
@@ -9947,7 +9947,7 @@
       <w:r>
         <w:drawing>
           <wp:inline xmlns:a="http://schemas.openxmlformats.org/drawingml/2006/main" xmlns:pic="http://schemas.openxmlformats.org/drawingml/2006/picture">
-            <wp:extent cx="5486400" cy="4889488"/>
+            <wp:extent cx="5486400" cy="3075384"/>
             <wp:docPr id="13" name="Picture 13"/>
             <wp:cNvGraphicFramePr>
               <a:graphicFrameLocks noChangeAspect="1"/>
@@ -9968,7 +9968,7 @@
                   <pic:spPr>
                     <a:xfrm>
                       <a:off x="0" y="0"/>
-                      <a:ext cx="5486400" cy="4889488"/>
+                      <a:ext cx="5486400" cy="3075384"/>
                     </a:xfrm>
                     <a:prstGeom prst="rect"/>
                   </pic:spPr>
@@ -10241,7 +10241,7 @@
       <w:r>
         <w:drawing>
           <wp:inline xmlns:a="http://schemas.openxmlformats.org/drawingml/2006/main" xmlns:pic="http://schemas.openxmlformats.org/drawingml/2006/picture">
-            <wp:extent cx="5486400" cy="5570498"/>
+            <wp:extent cx="5486400" cy="3699012"/>
             <wp:docPr id="14" name="Picture 14"/>
             <wp:cNvGraphicFramePr>
               <a:graphicFrameLocks noChangeAspect="1"/>
@@ -10262,7 +10262,7 @@
                   <pic:spPr>
                     <a:xfrm>
                       <a:off x="0" y="0"/>
-                      <a:ext cx="5486400" cy="5570498"/>
+                      <a:ext cx="5486400" cy="3699012"/>
                     </a:xfrm>
                     <a:prstGeom prst="rect"/>
                   </pic:spPr>
@@ -10637,7 +10637,7 @@
       <w:r>
         <w:drawing>
           <wp:inline xmlns:a="http://schemas.openxmlformats.org/drawingml/2006/main" xmlns:pic="http://schemas.openxmlformats.org/drawingml/2006/picture">
-            <wp:extent cx="5486400" cy="6402922"/>
+            <wp:extent cx="5486400" cy="4284174"/>
             <wp:docPr id="15" name="Picture 15"/>
             <wp:cNvGraphicFramePr>
               <a:graphicFrameLocks noChangeAspect="1"/>
@@ -10658,7 +10658,7 @@
                   <pic:spPr>
                     <a:xfrm>
                       <a:off x="0" y="0"/>
-                      <a:ext cx="5486400" cy="6402922"/>
+                      <a:ext cx="5486400" cy="4284174"/>
                     </a:xfrm>
                     <a:prstGeom prst="rect"/>
                   </pic:spPr>

</xml_diff>

<commit_message>
fix: update all 8 sequence diagrams with cnpm skill style
- Added skinparam: shadowing false, SequenceArrowThickness 2
- Added ParticipantBackgroundColor #7AD2FF, ParticipantBorderColor black
- Added Boundary/Control/Entity backgroundColor/borderColor
- Removed invalid 'left to right direction' from block 0
- All diagrams now have visible arrows, dashed lifelines, blue participants
- DOCX: 634KB, 15 images

Co-Authored-By: Claude Opus 4.8 <noreply@anthropic.com>
</commit_message>
<xml_diff>
--- a/output/booking_module.docx
+++ b/output/booking_module.docx
@@ -3813,7 +3813,7 @@
       <w:r>
         <w:drawing>
           <wp:inline xmlns:a="http://schemas.openxmlformats.org/drawingml/2006/main" xmlns:pic="http://schemas.openxmlformats.org/drawingml/2006/picture">
-            <wp:extent cx="5486400" cy="4007732"/>
+            <wp:extent cx="5486400" cy="3952520"/>
             <wp:docPr id="5" name="Picture 5"/>
             <wp:cNvGraphicFramePr>
               <a:graphicFrameLocks noChangeAspect="1"/>
@@ -3834,7 +3834,7 @@
                   <pic:spPr>
                     <a:xfrm>
                       <a:off x="0" y="0"/>
-                      <a:ext cx="5486400" cy="4007732"/>
+                      <a:ext cx="5486400" cy="3952520"/>
                     </a:xfrm>
                     <a:prstGeom prst="rect"/>
                   </pic:spPr>
@@ -4115,7 +4115,7 @@
       <w:r>
         <w:drawing>
           <wp:inline xmlns:a="http://schemas.openxmlformats.org/drawingml/2006/main" xmlns:pic="http://schemas.openxmlformats.org/drawingml/2006/picture">
-            <wp:extent cx="5486400" cy="3945147"/>
+            <wp:extent cx="5486400" cy="3908277"/>
             <wp:docPr id="6" name="Picture 6"/>
             <wp:cNvGraphicFramePr>
               <a:graphicFrameLocks noChangeAspect="1"/>
@@ -4136,7 +4136,7 @@
                   <pic:spPr>
                     <a:xfrm>
                       <a:off x="0" y="0"/>
-                      <a:ext cx="5486400" cy="3945147"/>
+                      <a:ext cx="5486400" cy="3908277"/>
                     </a:xfrm>
                     <a:prstGeom prst="rect"/>
                   </pic:spPr>
@@ -4335,7 +4335,7 @@
       <w:r>
         <w:drawing>
           <wp:inline xmlns:a="http://schemas.openxmlformats.org/drawingml/2006/main" xmlns:pic="http://schemas.openxmlformats.org/drawingml/2006/picture">
-            <wp:extent cx="5486400" cy="3186493"/>
+            <wp:extent cx="5486400" cy="3171419"/>
             <wp:docPr id="7" name="Picture 7"/>
             <wp:cNvGraphicFramePr>
               <a:graphicFrameLocks noChangeAspect="1"/>
@@ -4356,7 +4356,7 @@
                   <pic:spPr>
                     <a:xfrm>
                       <a:off x="0" y="0"/>
-                      <a:ext cx="5486400" cy="3186493"/>
+                      <a:ext cx="5486400" cy="3171419"/>
                     </a:xfrm>
                     <a:prstGeom prst="rect"/>
                   </pic:spPr>
@@ -4525,7 +4525,7 @@
       <w:r>
         <w:drawing>
           <wp:inline xmlns:a="http://schemas.openxmlformats.org/drawingml/2006/main" xmlns:pic="http://schemas.openxmlformats.org/drawingml/2006/picture">
-            <wp:extent cx="5486400" cy="3282241"/>
+            <wp:extent cx="5486400" cy="3200400"/>
             <wp:docPr id="8" name="Picture 8"/>
             <wp:cNvGraphicFramePr>
               <a:graphicFrameLocks noChangeAspect="1"/>
@@ -4546,7 +4546,7 @@
                   <pic:spPr>
                     <a:xfrm>
                       <a:off x="0" y="0"/>
-                      <a:ext cx="5486400" cy="3282241"/>
+                      <a:ext cx="5486400" cy="3200400"/>
                     </a:xfrm>
                     <a:prstGeom prst="rect"/>
                   </pic:spPr>
@@ -9514,7 +9514,7 @@
       <w:r>
         <w:drawing>
           <wp:inline xmlns:a="http://schemas.openxmlformats.org/drawingml/2006/main" xmlns:pic="http://schemas.openxmlformats.org/drawingml/2006/picture">
-            <wp:extent cx="5486400" cy="4542615"/>
+            <wp:extent cx="5486400" cy="4709079"/>
             <wp:docPr id="12" name="Picture 12"/>
             <wp:cNvGraphicFramePr>
               <a:graphicFrameLocks noChangeAspect="1"/>
@@ -9535,7 +9535,7 @@
                   <pic:spPr>
                     <a:xfrm>
                       <a:off x="0" y="0"/>
-                      <a:ext cx="5486400" cy="4542615"/>
+                      <a:ext cx="5486400" cy="4709079"/>
                     </a:xfrm>
                     <a:prstGeom prst="rect"/>
                   </pic:spPr>
@@ -9947,7 +9947,7 @@
       <w:r>
         <w:drawing>
           <wp:inline xmlns:a="http://schemas.openxmlformats.org/drawingml/2006/main" xmlns:pic="http://schemas.openxmlformats.org/drawingml/2006/picture">
-            <wp:extent cx="5486400" cy="3075384"/>
+            <wp:extent cx="5486400" cy="4204703"/>
             <wp:docPr id="13" name="Picture 13"/>
             <wp:cNvGraphicFramePr>
               <a:graphicFrameLocks noChangeAspect="1"/>
@@ -9968,7 +9968,7 @@
                   <pic:spPr>
                     <a:xfrm>
                       <a:off x="0" y="0"/>
-                      <a:ext cx="5486400" cy="3075384"/>
+                      <a:ext cx="5486400" cy="4204703"/>
                     </a:xfrm>
                     <a:prstGeom prst="rect"/>
                   </pic:spPr>
@@ -10241,7 +10241,7 @@
       <w:r>
         <w:drawing>
           <wp:inline xmlns:a="http://schemas.openxmlformats.org/drawingml/2006/main" xmlns:pic="http://schemas.openxmlformats.org/drawingml/2006/picture">
-            <wp:extent cx="5486400" cy="3699012"/>
+            <wp:extent cx="5486400" cy="4762885"/>
             <wp:docPr id="14" name="Picture 14"/>
             <wp:cNvGraphicFramePr>
               <a:graphicFrameLocks noChangeAspect="1"/>
@@ -10262,7 +10262,7 @@
                   <pic:spPr>
                     <a:xfrm>
                       <a:off x="0" y="0"/>
-                      <a:ext cx="5486400" cy="3699012"/>
+                      <a:ext cx="5486400" cy="4762885"/>
                     </a:xfrm>
                     <a:prstGeom prst="rect"/>
                   </pic:spPr>
@@ -10637,7 +10637,7 @@
       <w:r>
         <w:drawing>
           <wp:inline xmlns:a="http://schemas.openxmlformats.org/drawingml/2006/main" xmlns:pic="http://schemas.openxmlformats.org/drawingml/2006/picture">
-            <wp:extent cx="5486400" cy="4284174"/>
+            <wp:extent cx="5486400" cy="5576587"/>
             <wp:docPr id="15" name="Picture 15"/>
             <wp:cNvGraphicFramePr>
               <a:graphicFrameLocks noChangeAspect="1"/>
@@ -10658,7 +10658,7 @@
                   <pic:spPr>
                     <a:xfrm>
                       <a:off x="0" y="0"/>
-                      <a:ext cx="5486400" cy="4284174"/>
+                      <a:ext cx="5486400" cy="5576587"/>
                     </a:xfrm>
                     <a:prstGeom prst="rect"/>
                   </pic:spPr>

</xml_diff>

<commit_message>
fix: sequence diagrams - blue activation bars + boundary/entity circle symbols
- Added skinparam SequenceLifeLineBackgroundColor #7AD2FF (blue activation bars)
- Changed participant to boundary/entity keywords (circle symbols)
- All 8 diagrams now have:
  * Blue activation bars (vertical rectangles)
  * Boundary circle symbols for Boundary classes
  * Entity circle symbols for Entity classes
- DOCX: 638KB, 15 images

Co-Authored-By: Claude Opus 4.8 <noreply@anthropic.com>
</commit_message>
<xml_diff>
--- a/output/booking_module.docx
+++ b/output/booking_module.docx
@@ -3813,7 +3813,7 @@
       <w:r>
         <w:drawing>
           <wp:inline xmlns:a="http://schemas.openxmlformats.org/drawingml/2006/main" xmlns:pic="http://schemas.openxmlformats.org/drawingml/2006/picture">
-            <wp:extent cx="5486400" cy="3952520"/>
+            <wp:extent cx="5486400" cy="4088357"/>
             <wp:docPr id="5" name="Picture 5"/>
             <wp:cNvGraphicFramePr>
               <a:graphicFrameLocks noChangeAspect="1"/>
@@ -3834,7 +3834,7 @@
                   <pic:spPr>
                     <a:xfrm>
                       <a:off x="0" y="0"/>
-                      <a:ext cx="5486400" cy="3952520"/>
+                      <a:ext cx="5486400" cy="4088357"/>
                     </a:xfrm>
                     <a:prstGeom prst="rect"/>
                   </pic:spPr>
@@ -4115,7 +4115,7 @@
       <w:r>
         <w:drawing>
           <wp:inline xmlns:a="http://schemas.openxmlformats.org/drawingml/2006/main" xmlns:pic="http://schemas.openxmlformats.org/drawingml/2006/picture">
-            <wp:extent cx="5486400" cy="3908277"/>
+            <wp:extent cx="5486400" cy="3995404"/>
             <wp:docPr id="6" name="Picture 6"/>
             <wp:cNvGraphicFramePr>
               <a:graphicFrameLocks noChangeAspect="1"/>
@@ -4136,7 +4136,7 @@
                   <pic:spPr>
                     <a:xfrm>
                       <a:off x="0" y="0"/>
-                      <a:ext cx="5486400" cy="3908277"/>
+                      <a:ext cx="5486400" cy="3995404"/>
                     </a:xfrm>
                     <a:prstGeom prst="rect"/>
                   </pic:spPr>
@@ -4335,7 +4335,7 @@
       <w:r>
         <w:drawing>
           <wp:inline xmlns:a="http://schemas.openxmlformats.org/drawingml/2006/main" xmlns:pic="http://schemas.openxmlformats.org/drawingml/2006/picture">
-            <wp:extent cx="5486400" cy="3171419"/>
+            <wp:extent cx="5486400" cy="3183467"/>
             <wp:docPr id="7" name="Picture 7"/>
             <wp:cNvGraphicFramePr>
               <a:graphicFrameLocks noChangeAspect="1"/>
@@ -4356,7 +4356,7 @@
                   <pic:spPr>
                     <a:xfrm>
                       <a:off x="0" y="0"/>
-                      <a:ext cx="5486400" cy="3171419"/>
+                      <a:ext cx="5486400" cy="3183467"/>
                     </a:xfrm>
                     <a:prstGeom prst="rect"/>
                   </pic:spPr>
@@ -4525,7 +4525,7 @@
       <w:r>
         <w:drawing>
           <wp:inline xmlns:a="http://schemas.openxmlformats.org/drawingml/2006/main" xmlns:pic="http://schemas.openxmlformats.org/drawingml/2006/picture">
-            <wp:extent cx="5486400" cy="3200400"/>
+            <wp:extent cx="5486400" cy="3280033"/>
             <wp:docPr id="8" name="Picture 8"/>
             <wp:cNvGraphicFramePr>
               <a:graphicFrameLocks noChangeAspect="1"/>
@@ -4546,7 +4546,7 @@
                   <pic:spPr>
                     <a:xfrm>
                       <a:off x="0" y="0"/>
-                      <a:ext cx="5486400" cy="3200400"/>
+                      <a:ext cx="5486400" cy="3280033"/>
                     </a:xfrm>
                     <a:prstGeom prst="rect"/>
                   </pic:spPr>
@@ -9514,7 +9514,7 @@
       <w:r>
         <w:drawing>
           <wp:inline xmlns:a="http://schemas.openxmlformats.org/drawingml/2006/main" xmlns:pic="http://schemas.openxmlformats.org/drawingml/2006/picture">
-            <wp:extent cx="5486400" cy="4709079"/>
+            <wp:extent cx="5486400" cy="4819581"/>
             <wp:docPr id="12" name="Picture 12"/>
             <wp:cNvGraphicFramePr>
               <a:graphicFrameLocks noChangeAspect="1"/>
@@ -9535,7 +9535,7 @@
                   <pic:spPr>
                     <a:xfrm>
                       <a:off x="0" y="0"/>
-                      <a:ext cx="5486400" cy="4709079"/>
+                      <a:ext cx="5486400" cy="4819581"/>
                     </a:xfrm>
                     <a:prstGeom prst="rect"/>
                   </pic:spPr>
@@ -9947,7 +9947,7 @@
       <w:r>
         <w:drawing>
           <wp:inline xmlns:a="http://schemas.openxmlformats.org/drawingml/2006/main" xmlns:pic="http://schemas.openxmlformats.org/drawingml/2006/picture">
-            <wp:extent cx="5486400" cy="4204703"/>
+            <wp:extent cx="5486400" cy="4294933"/>
             <wp:docPr id="13" name="Picture 13"/>
             <wp:cNvGraphicFramePr>
               <a:graphicFrameLocks noChangeAspect="1"/>
@@ -9968,7 +9968,7 @@
                   <pic:spPr>
                     <a:xfrm>
                       <a:off x="0" y="0"/>
-                      <a:ext cx="5486400" cy="4204703"/>
+                      <a:ext cx="5486400" cy="4294933"/>
                     </a:xfrm>
                     <a:prstGeom prst="rect"/>
                   </pic:spPr>
@@ -10241,7 +10241,7 @@
       <w:r>
         <w:drawing>
           <wp:inline xmlns:a="http://schemas.openxmlformats.org/drawingml/2006/main" xmlns:pic="http://schemas.openxmlformats.org/drawingml/2006/picture">
-            <wp:extent cx="5486400" cy="4762885"/>
+            <wp:extent cx="5486400" cy="4875049"/>
             <wp:docPr id="14" name="Picture 14"/>
             <wp:cNvGraphicFramePr>
               <a:graphicFrameLocks noChangeAspect="1"/>
@@ -10262,7 +10262,7 @@
                   <pic:spPr>
                     <a:xfrm>
                       <a:off x="0" y="0"/>
-                      <a:ext cx="5486400" cy="4762885"/>
+                      <a:ext cx="5486400" cy="4875049"/>
                     </a:xfrm>
                     <a:prstGeom prst="rect"/>
                   </pic:spPr>
@@ -10637,7 +10637,7 @@
       <w:r>
         <w:drawing>
           <wp:inline xmlns:a="http://schemas.openxmlformats.org/drawingml/2006/main" xmlns:pic="http://schemas.openxmlformats.org/drawingml/2006/picture">
-            <wp:extent cx="5486400" cy="5576587"/>
+            <wp:extent cx="5486400" cy="5643589"/>
             <wp:docPr id="15" name="Picture 15"/>
             <wp:cNvGraphicFramePr>
               <a:graphicFrameLocks noChangeAspect="1"/>
@@ -10658,7 +10658,7 @@
                   <pic:spPr>
                     <a:xfrm>
                       <a:off x="0" y="0"/>
-                      <a:ext cx="5486400" cy="5576587"/>
+                      <a:ext cx="5486400" cy="5643589"/>
                     </a:xfrm>
                     <a:prstGeom prst="rect"/>
                   </pic:spPr>

</xml_diff>

<commit_message>
fix: audit entity names to match Google Docs tab
- Customer -> Client (Google Docs uses Client, not Customer)
- III.1: Vietnamese names -> English (Client, Branch, Room, etc.)
- III.2: Vietnamese table names -> English (tblClient, tblBranch, etc.)
- III.3.2: Customer -> Client in Entity package + Control return types
- All 8 sequence diagrams updated with Client
- Entity class, ERD, MVC diagrams regenerated
- DOCX: 707 paragraphs, 68 tables, 15 images

Co-Authored-By: Claude Opus 4.8 <noreply@anthropic.com>
</commit_message>
<xml_diff>
--- a/output/booking_module.docx
+++ b/output/booking_module.docx
@@ -3813,7 +3813,7 @@
       <w:r>
         <w:drawing>
           <wp:inline xmlns:a="http://schemas.openxmlformats.org/drawingml/2006/main" xmlns:pic="http://schemas.openxmlformats.org/drawingml/2006/picture">
-            <wp:extent cx="5486400" cy="4088357"/>
+            <wp:extent cx="5486400" cy="4183027"/>
             <wp:docPr id="5" name="Picture 5"/>
             <wp:cNvGraphicFramePr>
               <a:graphicFrameLocks noChangeAspect="1"/>
@@ -3834,7 +3834,7 @@
                   <pic:spPr>
                     <a:xfrm>
                       <a:off x="0" y="0"/>
-                      <a:ext cx="5486400" cy="4088357"/>
+                      <a:ext cx="5486400" cy="4183027"/>
                     </a:xfrm>
                     <a:prstGeom prst="rect"/>
                   </pic:spPr>
@@ -3962,13 +3962,13 @@
     <w:p>
       <w:pPr/>
       <w:r>
-        <w:t>17. Lớp SearchClientView gọi đến lớp Customer.</w:t>
+        <w:t>17. Lớp SearchClientView gọi đến lớp Client.</w:t>
       </w:r>
     </w:p>
     <w:p>
       <w:pPr/>
       <w:r>
-        <w:t xml:space="preserve">18. Lớp Customer gọi hàm </w:t>
+        <w:t xml:space="preserve">18. Lớp Client gọi hàm </w:t>
       </w:r>
       <w:r>
         <w:rPr>
@@ -3984,7 +3984,7 @@
     <w:p>
       <w:pPr/>
       <w:r>
-        <w:t>19. Lớp Customer trả kết quả về cho lớp SearchClientView.</w:t>
+        <w:t>19. Lớp Client trả kết quả về cho lớp SearchClientView.</w:t>
       </w:r>
     </w:p>
     <w:p>
@@ -4525,7 +4525,7 @@
       <w:r>
         <w:drawing>
           <wp:inline xmlns:a="http://schemas.openxmlformats.org/drawingml/2006/main" xmlns:pic="http://schemas.openxmlformats.org/drawingml/2006/picture">
-            <wp:extent cx="5486400" cy="3280033"/>
+            <wp:extent cx="5486400" cy="3340692"/>
             <wp:docPr id="8" name="Picture 8"/>
             <wp:cNvGraphicFramePr>
               <a:graphicFrameLocks noChangeAspect="1"/>
@@ -4546,7 +4546,7 @@
                   <pic:spPr>
                     <a:xfrm>
                       <a:off x="0" y="0"/>
-                      <a:ext cx="5486400" cy="3280033"/>
+                      <a:ext cx="5486400" cy="3340692"/>
                     </a:xfrm>
                     <a:prstGeom prst="rect"/>
                   </pic:spPr>
@@ -4620,7 +4620,7 @@
     <w:p>
       <w:pPr/>
       <w:r>
-        <w:t xml:space="preserve">8. InvoiceView gọi lớp Customer </w:t>
+        <w:t xml:space="preserve">8. InvoiceView gọi lớp Client </w:t>
       </w:r>
       <w:r>
         <w:rPr>
@@ -4718,7 +4718,7 @@
         <w:t>addPoints(base_score)</w:t>
       </w:r>
       <w:r>
-        <w:t xml:space="preserve"> trên Customer.</w:t>
+        <w:t xml:space="preserve"> trên Client.</w:t>
       </w:r>
     </w:p>
     <w:p>
@@ -4814,7 +4814,7 @@
         <w:pStyle w:val="ListBullet"/>
       </w:pPr>
       <w:r>
-        <w:t xml:space="preserve">KhachHang: </w:t>
+        <w:t xml:space="preserve">Client: </w:t>
       </w:r>
       <w:r>
         <w:rPr>
@@ -4829,7 +4829,7 @@
         <w:pStyle w:val="ListBullet"/>
       </w:pPr>
       <w:r>
-        <w:t xml:space="preserve">ChiNhanh: </w:t>
+        <w:t xml:space="preserve">Branch: </w:t>
       </w:r>
       <w:r>
         <w:rPr>
@@ -4844,7 +4844,7 @@
         <w:pStyle w:val="ListBullet"/>
       </w:pPr>
       <w:r>
-        <w:t xml:space="preserve">Phong: </w:t>
+        <w:t xml:space="preserve">Room: </w:t>
       </w:r>
       <w:r>
         <w:rPr>
@@ -4859,7 +4859,7 @@
         <w:pStyle w:val="ListBullet"/>
       </w:pPr>
       <w:r>
-        <w:t xml:space="preserve">NhanVien: </w:t>
+        <w:t xml:space="preserve">Employee: </w:t>
       </w:r>
       <w:r>
         <w:rPr>
@@ -4874,7 +4874,7 @@
         <w:pStyle w:val="ListBullet"/>
       </w:pPr>
       <w:r>
-        <w:t xml:space="preserve">HoaDon: </w:t>
+        <w:t xml:space="preserve">Room_receipt: </w:t>
       </w:r>
       <w:r>
         <w:rPr>
@@ -4889,7 +4889,7 @@
         <w:pStyle w:val="ListBullet"/>
       </w:pPr>
       <w:r>
-        <w:t xml:space="preserve">ChiTietHoaDon: </w:t>
+        <w:t xml:space="preserve">Room_receipt_detail: </w:t>
       </w:r>
       <w:r>
         <w:rPr>
@@ -4904,7 +4904,7 @@
         <w:pStyle w:val="ListBullet"/>
       </w:pPr>
       <w:r>
-        <w:t xml:space="preserve">HangHoiVien: </w:t>
+        <w:t xml:space="preserve">MemberRanking: </w:t>
       </w:r>
       <w:r>
         <w:rPr>
@@ -4919,7 +4919,7 @@
         <w:pStyle w:val="ListBullet"/>
       </w:pPr>
       <w:r>
-        <w:t xml:space="preserve">KhuyenMai: </w:t>
+        <w:t xml:space="preserve">Promotion: </w:t>
       </w:r>
       <w:r>
         <w:rPr>
@@ -4948,7 +4948,7 @@
         <w:pStyle w:val="ListBullet"/>
       </w:pPr>
       <w:r>
-        <w:t xml:space="preserve">KhachHang: </w:t>
+        <w:t xml:space="preserve">Client: </w:t>
       </w:r>
       <w:r>
         <w:rPr>
@@ -5033,7 +5033,7 @@
         <w:pStyle w:val="ListBullet"/>
       </w:pPr>
       <w:r>
-        <w:t xml:space="preserve">ChiNhanh: </w:t>
+        <w:t xml:space="preserve">Branch: </w:t>
       </w:r>
       <w:r>
         <w:rPr>
@@ -5050,7 +5050,7 @@
           <w:rFonts w:ascii="Courier New" w:hAnsi="Courier New"/>
           <w:sz w:val="20"/>
         </w:rPr>
-        <w:t>tenChiNhanh : String</w:t>
+        <w:t>tenBranch : String</w:t>
       </w:r>
       <w:r>
         <w:t xml:space="preserve">, </w:t>
@@ -5078,7 +5078,7 @@
         <w:pStyle w:val="ListBullet"/>
       </w:pPr>
       <w:r>
-        <w:t xml:space="preserve">Phong: </w:t>
+        <w:t xml:space="preserve">Room: </w:t>
       </w:r>
       <w:r>
         <w:rPr>
@@ -5095,7 +5095,7 @@
           <w:rFonts w:ascii="Courier New" w:hAnsi="Courier New"/>
           <w:sz w:val="20"/>
         </w:rPr>
-        <w:t>tenPhong : String</w:t>
+        <w:t>tenRoom : String</w:t>
       </w:r>
       <w:r>
         <w:t xml:space="preserve">, </w:t>
@@ -5105,7 +5105,7 @@
           <w:rFonts w:ascii="Courier New" w:hAnsi="Courier New"/>
           <w:sz w:val="20"/>
         </w:rPr>
-        <w:t>loaiPhong : String</w:t>
+        <w:t>loaiRoom : String</w:t>
       </w:r>
       <w:r>
         <w:t xml:space="preserve">, </w:t>
@@ -5143,7 +5143,7 @@
         <w:pStyle w:val="ListBullet"/>
       </w:pPr>
       <w:r>
-        <w:t xml:space="preserve">NhanVien: </w:t>
+        <w:t xml:space="preserve">Employee: </w:t>
       </w:r>
       <w:r>
         <w:rPr>
@@ -5188,7 +5188,7 @@
         <w:pStyle w:val="ListBullet"/>
       </w:pPr>
       <w:r>
-        <w:t xml:space="preserve">HoaDon: </w:t>
+        <w:t xml:space="preserve">Room_receipt: </w:t>
       </w:r>
       <w:r>
         <w:rPr>
@@ -5235,7 +5235,7 @@
           <w:rFonts w:ascii="Courier New" w:hAnsi="Courier New"/>
           <w:sz w:val="20"/>
         </w:rPr>
-        <w:t>tienPhong : double</w:t>
+        <w:t>tienRoom : double</w:t>
       </w:r>
       <w:r>
         <w:t xml:space="preserve">, </w:t>
@@ -5293,7 +5293,7 @@
         <w:pStyle w:val="ListBullet"/>
       </w:pPr>
       <w:r>
-        <w:t xml:space="preserve">ChiTietHoaDon: </w:t>
+        <w:t xml:space="preserve">Room_receipt_detail: </w:t>
       </w:r>
       <w:r>
         <w:rPr>
@@ -5348,7 +5348,7 @@
         <w:pStyle w:val="ListBullet"/>
       </w:pPr>
       <w:r>
-        <w:t xml:space="preserve">HangHoiVien: </w:t>
+        <w:t xml:space="preserve">MemberRanking: </w:t>
       </w:r>
       <w:r>
         <w:rPr>
@@ -5403,7 +5403,7 @@
         <w:pStyle w:val="ListBullet"/>
       </w:pPr>
       <w:r>
-        <w:t xml:space="preserve">KhuyenMai: </w:t>
+        <w:t xml:space="preserve">Promotion: </w:t>
       </w:r>
       <w:r>
         <w:rPr>
@@ -5420,7 +5420,7 @@
           <w:rFonts w:ascii="Courier New" w:hAnsi="Courier New"/>
           <w:sz w:val="20"/>
         </w:rPr>
-        <w:t>tenKhuyenMai : String</w:t>
+        <w:t>tenPromotion : String</w:t>
       </w:r>
       <w:r>
         <w:t xml:space="preserve">, </w:t>
@@ -5486,7 +5486,7 @@
         <w:pStyle w:val="ListBullet"/>
       </w:pPr>
       <w:r>
-        <w:t xml:space="preserve">ChiNhanh </w:t>
+        <w:t xml:space="preserve">Branch </w:t>
       </w:r>
       <w:r>
         <w:rPr>
@@ -5496,7 +5496,7 @@
         <w:t>*--</w:t>
       </w:r>
       <w:r>
-        <w:t xml:space="preserve"> Phong: composition (phòng không tồn tại nếu không có chi nhánh)</w:t>
+        <w:t xml:space="preserve"> Room: composition (phòng không tồn tại nếu không có chi nhánh)</w:t>
       </w:r>
     </w:p>
     <w:p>
@@ -5504,7 +5504,7 @@
         <w:pStyle w:val="ListBullet"/>
       </w:pPr>
       <w:r>
-        <w:t xml:space="preserve">ChiNhanh </w:t>
+        <w:t xml:space="preserve">Branch </w:t>
       </w:r>
       <w:r>
         <w:rPr>
@@ -5514,7 +5514,7 @@
         <w:t>o--</w:t>
       </w:r>
       <w:r>
-        <w:t xml:space="preserve"> NhanVien: aggregation (nhân viên tồn tại độc lập)</w:t>
+        <w:t xml:space="preserve"> Employee: aggregation (nhân viên tồn tại độc lập)</w:t>
       </w:r>
     </w:p>
     <w:p>
@@ -5522,7 +5522,7 @@
         <w:pStyle w:val="ListBullet"/>
       </w:pPr>
       <w:r>
-        <w:t xml:space="preserve">KhachHang </w:t>
+        <w:t xml:space="preserve">Client </w:t>
       </w:r>
       <w:r>
         <w:rPr>
@@ -5532,7 +5532,7 @@
         <w:t>o--</w:t>
       </w:r>
       <w:r>
-        <w:t xml:space="preserve"> HangHoiVien: aggregation (hạng hội viên là danh mục độc lập)</w:t>
+        <w:t xml:space="preserve"> MemberRanking: aggregation (hạng hội viên là danh mục độc lập)</w:t>
       </w:r>
     </w:p>
     <w:p>
@@ -5540,7 +5540,7 @@
         <w:pStyle w:val="ListBullet"/>
       </w:pPr>
       <w:r>
-        <w:t xml:space="preserve">HoaDon </w:t>
+        <w:t xml:space="preserve">Room_receipt </w:t>
       </w:r>
       <w:r>
         <w:rPr>
@@ -5550,7 +5550,7 @@
         <w:t>*--</w:t>
       </w:r>
       <w:r>
-        <w:t xml:space="preserve"> ChiTietHoaDon: composition (chi tiết không tồn tại nếu không có hóa đơn)</w:t>
+        <w:t xml:space="preserve"> Room_receipt_detail: composition (chi tiết không tồn tại nếu không có hóa đơn)</w:t>
       </w:r>
     </w:p>
     <w:p>
@@ -5558,7 +5558,7 @@
         <w:pStyle w:val="ListBullet"/>
       </w:pPr>
       <w:r>
-        <w:t xml:space="preserve">Phong </w:t>
+        <w:t xml:space="preserve">Room </w:t>
       </w:r>
       <w:r>
         <w:rPr>
@@ -5568,7 +5568,7 @@
         <w:t>o--</w:t>
       </w:r>
       <w:r>
-        <w:t xml:space="preserve"> HoaDon: aggregation (hóa đơn tồn tại độc lập khỏi phòng)</w:t>
+        <w:t xml:space="preserve"> Room_receipt: aggregation (hóa đơn tồn tại độc lập khỏi phòng)</w:t>
       </w:r>
     </w:p>
     <w:p>
@@ -5576,7 +5576,7 @@
         <w:pStyle w:val="ListBullet"/>
       </w:pPr>
       <w:r>
-        <w:t xml:space="preserve">KhachHang </w:t>
+        <w:t xml:space="preserve">Client </w:t>
       </w:r>
       <w:r>
         <w:rPr>
@@ -5586,7 +5586,7 @@
         <w:t>o--</w:t>
       </w:r>
       <w:r>
-        <w:t xml:space="preserve"> HoaDon: aggregation</w:t>
+        <w:t xml:space="preserve"> Room_receipt: aggregation</w:t>
       </w:r>
     </w:p>
     <w:p>
@@ -5594,7 +5594,7 @@
         <w:pStyle w:val="ListBullet"/>
       </w:pPr>
       <w:r>
-        <w:t xml:space="preserve">NhanVien </w:t>
+        <w:t xml:space="preserve">Employee </w:t>
       </w:r>
       <w:r>
         <w:rPr>
@@ -5604,7 +5604,7 @@
         <w:t>o--</w:t>
       </w:r>
       <w:r>
-        <w:t xml:space="preserve"> HoaDon: aggregation</w:t>
+        <w:t xml:space="preserve"> Room_receipt: aggregation</w:t>
       </w:r>
     </w:p>
     <w:p>
@@ -5620,14 +5620,14 @@
         <w:pStyle w:val="ListBullet"/>
       </w:pPr>
       <w:r>
-        <w:t xml:space="preserve">HoaDon: </w:t>
+        <w:t xml:space="preserve">Room_receipt: </w:t>
       </w:r>
       <w:r>
         <w:rPr>
           <w:rFonts w:ascii="Courier New" w:hAnsi="Courier New"/>
           <w:sz w:val="20"/>
         </w:rPr>
-        <w:t>khachHang : KhachHang</w:t>
+        <w:t>khachHang : Client</w:t>
       </w:r>
       <w:r>
         <w:t xml:space="preserve">, </w:t>
@@ -5637,7 +5637,7 @@
           <w:rFonts w:ascii="Courier New" w:hAnsi="Courier New"/>
           <w:sz w:val="20"/>
         </w:rPr>
-        <w:t>phong : Phong</w:t>
+        <w:t>phong : Room</w:t>
       </w:r>
       <w:r>
         <w:t xml:space="preserve">, </w:t>
@@ -5647,7 +5647,7 @@
           <w:rFonts w:ascii="Courier New" w:hAnsi="Courier New"/>
           <w:sz w:val="20"/>
         </w:rPr>
-        <w:t>nhanVien : NhanVien</w:t>
+        <w:t>nhanVien : Employee</w:t>
       </w:r>
     </w:p>
     <w:p>
@@ -5655,14 +5655,14 @@
         <w:pStyle w:val="ListBullet"/>
       </w:pPr>
       <w:r>
-        <w:t xml:space="preserve">ChiTietHoaDon: </w:t>
+        <w:t xml:space="preserve">Room_receipt_detail: </w:t>
       </w:r>
       <w:r>
         <w:rPr>
           <w:rFonts w:ascii="Courier New" w:hAnsi="Courier New"/>
           <w:sz w:val="20"/>
         </w:rPr>
-        <w:t>hoaDon : HoaDon</w:t>
+        <w:t>hoaDon : Room_receipt</w:t>
       </w:r>
     </w:p>
     <w:p>
@@ -5670,14 +5670,14 @@
         <w:pStyle w:val="ListBullet"/>
       </w:pPr>
       <w:r>
-        <w:t xml:space="preserve">Phong: </w:t>
+        <w:t xml:space="preserve">Room: </w:t>
       </w:r>
       <w:r>
         <w:rPr>
           <w:rFonts w:ascii="Courier New" w:hAnsi="Courier New"/>
           <w:sz w:val="20"/>
         </w:rPr>
-        <w:t>chiNhanh : ChiNhanh</w:t>
+        <w:t>chiNhanh : Branch</w:t>
       </w:r>
     </w:p>
     <w:p>
@@ -5685,14 +5685,14 @@
         <w:pStyle w:val="ListBullet"/>
       </w:pPr>
       <w:r>
-        <w:t xml:space="preserve">NhanVien: </w:t>
+        <w:t xml:space="preserve">Employee: </w:t>
       </w:r>
       <w:r>
         <w:rPr>
           <w:rFonts w:ascii="Courier New" w:hAnsi="Courier New"/>
           <w:sz w:val="20"/>
         </w:rPr>
-        <w:t>chiNhanh : ChiNhanh</w:t>
+        <w:t>chiNhanh : Branch</w:t>
       </w:r>
     </w:p>
     <w:p>
@@ -5700,14 +5700,14 @@
         <w:pStyle w:val="ListBullet"/>
       </w:pPr>
       <w:r>
-        <w:t xml:space="preserve">KhachHang: </w:t>
+        <w:t xml:space="preserve">Client: </w:t>
       </w:r>
       <w:r>
         <w:rPr>
           <w:rFonts w:ascii="Courier New" w:hAnsi="Courier New"/>
           <w:sz w:val="20"/>
         </w:rPr>
-        <w:t>hangHoiVien : HangHoiVien</w:t>
+        <w:t>hangHoiVien : MemberRanking</w:t>
       </w:r>
     </w:p>
     <w:p>
@@ -5731,7 +5731,7 @@
       <w:r>
         <w:drawing>
           <wp:inline xmlns:a="http://schemas.openxmlformats.org/drawingml/2006/main" xmlns:pic="http://schemas.openxmlformats.org/drawingml/2006/picture">
-            <wp:extent cx="5486400" cy="7988099"/>
+            <wp:extent cx="5486400" cy="8460223"/>
             <wp:docPr id="9" name="Picture 9"/>
             <wp:cNvGraphicFramePr>
               <a:graphicFrameLocks noChangeAspect="1"/>
@@ -5752,7 +5752,7 @@
                   <pic:spPr>
                     <a:xfrm>
                       <a:off x="0" y="0"/>
-                      <a:ext cx="5486400" cy="7988099"/>
+                      <a:ext cx="5486400" cy="8460223"/>
                     </a:xfrm>
                     <a:prstGeom prst="rect"/>
                   </pic:spPr>
@@ -5838,7 +5838,7 @@
               <w:rPr>
                 <w:sz w:val="20"/>
               </w:rPr>
-              <w:t>KhachHang</w:t>
+              <w:t>Client</w:t>
             </w:r>
           </w:p>
         </w:tc>
@@ -5853,7 +5853,7 @@
               <w:rPr>
                 <w:sz w:val="20"/>
               </w:rPr>
-              <w:t>tblKhachHang</w:t>
+              <w:t>tblClient</w:t>
             </w:r>
           </w:p>
         </w:tc>
@@ -5870,7 +5870,7 @@
               <w:rPr>
                 <w:sz w:val="20"/>
               </w:rPr>
-              <w:t>ChiNhanh</w:t>
+              <w:t>Branch</w:t>
             </w:r>
           </w:p>
         </w:tc>
@@ -5885,7 +5885,7 @@
               <w:rPr>
                 <w:sz w:val="20"/>
               </w:rPr>
-              <w:t>tblChiNhanh</w:t>
+              <w:t>tblBranch</w:t>
             </w:r>
           </w:p>
         </w:tc>
@@ -5902,7 +5902,7 @@
               <w:rPr>
                 <w:sz w:val="20"/>
               </w:rPr>
-              <w:t>Phong</w:t>
+              <w:t>Room</w:t>
             </w:r>
           </w:p>
         </w:tc>
@@ -5917,7 +5917,7 @@
               <w:rPr>
                 <w:sz w:val="20"/>
               </w:rPr>
-              <w:t>tblPhong</w:t>
+              <w:t>tblRoom</w:t>
             </w:r>
           </w:p>
         </w:tc>
@@ -5934,7 +5934,7 @@
               <w:rPr>
                 <w:sz w:val="20"/>
               </w:rPr>
-              <w:t>NhanVien</w:t>
+              <w:t>Employee</w:t>
             </w:r>
           </w:p>
         </w:tc>
@@ -5949,7 +5949,7 @@
               <w:rPr>
                 <w:sz w:val="20"/>
               </w:rPr>
-              <w:t>tblNhanVien</w:t>
+              <w:t>tblEmployee</w:t>
             </w:r>
           </w:p>
         </w:tc>
@@ -5966,7 +5966,7 @@
               <w:rPr>
                 <w:sz w:val="20"/>
               </w:rPr>
-              <w:t>HoaDon</w:t>
+              <w:t>Room_receipt</w:t>
             </w:r>
           </w:p>
         </w:tc>
@@ -5981,7 +5981,7 @@
               <w:rPr>
                 <w:sz w:val="20"/>
               </w:rPr>
-              <w:t>tblHoaDon</w:t>
+              <w:t>tblRoom_receipt</w:t>
             </w:r>
           </w:p>
         </w:tc>
@@ -5998,7 +5998,7 @@
               <w:rPr>
                 <w:sz w:val="20"/>
               </w:rPr>
-              <w:t>ChiTietHoaDon</w:t>
+              <w:t>Room_receipt_detail</w:t>
             </w:r>
           </w:p>
         </w:tc>
@@ -6013,7 +6013,7 @@
               <w:rPr>
                 <w:sz w:val="20"/>
               </w:rPr>
-              <w:t>tblChiTietHoaDon</w:t>
+              <w:t>tblRoom_receipt_detail</w:t>
             </w:r>
           </w:p>
         </w:tc>
@@ -6030,7 +6030,7 @@
               <w:rPr>
                 <w:sz w:val="20"/>
               </w:rPr>
-              <w:t>HangHoiVien</w:t>
+              <w:t>MemberRanking</w:t>
             </w:r>
           </w:p>
         </w:tc>
@@ -6045,7 +6045,7 @@
               <w:rPr>
                 <w:sz w:val="20"/>
               </w:rPr>
-              <w:t>tblHangHoiVien</w:t>
+              <w:t>tblMemberRanking</w:t>
             </w:r>
           </w:p>
         </w:tc>
@@ -6062,7 +6062,7 @@
               <w:rPr>
                 <w:sz w:val="20"/>
               </w:rPr>
-              <w:t>KhuyenMai</w:t>
+              <w:t>Promotion</w:t>
             </w:r>
           </w:p>
         </w:tc>
@@ -6077,7 +6077,7 @@
               <w:rPr>
                 <w:sz w:val="20"/>
               </w:rPr>
-              <w:t>tblKhuyenMai</w:t>
+              <w:t>tblPromotion</w:t>
             </w:r>
           </w:p>
         </w:tc>
@@ -6279,14 +6279,14 @@
         <w:pStyle w:val="ListBullet"/>
       </w:pPr>
       <w:r>
-        <w:t xml:space="preserve">ChiNhanh – Phong (1-n): Giữ riêng, Phong có FK </w:t>
+        <w:t xml:space="preserve">Branch – Room (1-n): Giữ riêng, Room có FK </w:t>
       </w:r>
       <w:r>
         <w:rPr>
           <w:rFonts w:ascii="Courier New" w:hAnsi="Courier New"/>
           <w:sz w:val="20"/>
         </w:rPr>
-        <w:t>tblChiNhanhMa</w:t>
+        <w:t>tblBranchMa</w:t>
       </w:r>
     </w:p>
     <w:p>
@@ -6294,14 +6294,14 @@
         <w:pStyle w:val="ListBullet"/>
       </w:pPr>
       <w:r>
-        <w:t xml:space="preserve">ChiNhanh – NhanVien (1-n): Giữ riêng, NhanVien có FK </w:t>
+        <w:t xml:space="preserve">Branch – Employee (1-n): Giữ riêng, Employee có FK </w:t>
       </w:r>
       <w:r>
         <w:rPr>
           <w:rFonts w:ascii="Courier New" w:hAnsi="Courier New"/>
           <w:sz w:val="20"/>
         </w:rPr>
-        <w:t>tblChiNhanhMa</w:t>
+        <w:t>tblBranchMa</w:t>
       </w:r>
     </w:p>
     <w:p>
@@ -6309,14 +6309,14 @@
         <w:pStyle w:val="ListBullet"/>
       </w:pPr>
       <w:r>
-        <w:t xml:space="preserve">KhachHang – HangHoiVien (n-1): Giữ riêng, KhachHang có FK </w:t>
+        <w:t xml:space="preserve">Client – MemberRanking (n-1): Giữ riêng, Client có FK </w:t>
       </w:r>
       <w:r>
         <w:rPr>
           <w:rFonts w:ascii="Courier New" w:hAnsi="Courier New"/>
           <w:sz w:val="20"/>
         </w:rPr>
-        <w:t>tblHangHoiVienMa</w:t>
+        <w:t>tblMemberRankingMa</w:t>
       </w:r>
     </w:p>
     <w:p>
@@ -6324,14 +6324,14 @@
         <w:pStyle w:val="ListBullet"/>
       </w:pPr>
       <w:r>
-        <w:t xml:space="preserve">HoaDon – ChiTietHoaDon (1-n): Giữ riêng, ChiTietHoaDon có FK </w:t>
+        <w:t xml:space="preserve">Room_receipt – Room_receipt_detail (1-n): Giữ riêng, Room_receipt_detail có FK </w:t>
       </w:r>
       <w:r>
         <w:rPr>
           <w:rFonts w:ascii="Courier New" w:hAnsi="Courier New"/>
           <w:sz w:val="20"/>
         </w:rPr>
-        <w:t>tblHoaDonMa</w:t>
+        <w:t>tblRoom_receiptMa</w:t>
       </w:r>
     </w:p>
     <w:p>
@@ -6339,14 +6339,14 @@
         <w:pStyle w:val="ListBullet"/>
       </w:pPr>
       <w:r>
-        <w:t xml:space="preserve">HoaDon – KhuyenMai (n-n): Tạo bảng trung gian </w:t>
+        <w:t xml:space="preserve">Room_receipt – Promotion (n-n): Tạo bảng trung gian </w:t>
       </w:r>
       <w:r>
         <w:rPr>
           <w:rFonts w:ascii="Courier New" w:hAnsi="Courier New"/>
           <w:sz w:val="20"/>
         </w:rPr>
-        <w:t>tblApDungKhuyenMai</w:t>
+        <w:t>tblApply_promotion</w:t>
       </w:r>
     </w:p>
     <w:p>
@@ -6354,14 +6354,14 @@
         <w:pStyle w:val="ListBullet"/>
       </w:pPr>
       <w:r>
-        <w:t xml:space="preserve">KhachHang – HoaDon (1-n): HoaDon có FK </w:t>
+        <w:t xml:space="preserve">Client – Room_receipt (1-n): Room_receipt có FK </w:t>
       </w:r>
       <w:r>
         <w:rPr>
           <w:rFonts w:ascii="Courier New" w:hAnsi="Courier New"/>
           <w:sz w:val="20"/>
         </w:rPr>
-        <w:t>tblKhachHangMa</w:t>
+        <w:t>tblClientMa</w:t>
       </w:r>
     </w:p>
     <w:p>
@@ -6369,14 +6369,14 @@
         <w:pStyle w:val="ListBullet"/>
       </w:pPr>
       <w:r>
-        <w:t xml:space="preserve">Phong – HoaDon (1-n): HoaDon có FK </w:t>
+        <w:t xml:space="preserve">Room – Room_receipt (1-n): Room_receipt có FK </w:t>
       </w:r>
       <w:r>
         <w:rPr>
           <w:rFonts w:ascii="Courier New" w:hAnsi="Courier New"/>
           <w:sz w:val="20"/>
         </w:rPr>
-        <w:t>tblPhongMa</w:t>
+        <w:t>tblRoomMa</w:t>
       </w:r>
     </w:p>
     <w:p>
@@ -6384,14 +6384,14 @@
         <w:pStyle w:val="ListBullet"/>
       </w:pPr>
       <w:r>
-        <w:t xml:space="preserve">NhanVien – HoaDon (1-n): HoaDon có FK </w:t>
+        <w:t xml:space="preserve">Employee – Room_receipt (1-n): Room_receipt có FK </w:t>
       </w:r>
       <w:r>
         <w:rPr>
           <w:rFonts w:ascii="Courier New" w:hAnsi="Courier New"/>
           <w:sz w:val="20"/>
         </w:rPr>
-        <w:t>tblNhanVienMa</w:t>
+        <w:t>tblEmployeeMa</w:t>
       </w:r>
     </w:p>
     <w:p>
@@ -6487,7 +6487,7 @@
       <w:r>
         <w:drawing>
           <wp:inline xmlns:a="http://schemas.openxmlformats.org/drawingml/2006/main" xmlns:pic="http://schemas.openxmlformats.org/drawingml/2006/picture">
-            <wp:extent cx="5486400" cy="21036810"/>
+            <wp:extent cx="5486400" cy="5904105"/>
             <wp:docPr id="10" name="Picture 10"/>
             <wp:cNvGraphicFramePr>
               <a:graphicFrameLocks noChangeAspect="1"/>
@@ -6508,7 +6508,7 @@
                   <pic:spPr>
                     <a:xfrm>
                       <a:off x="0" y="0"/>
-                      <a:ext cx="5486400" cy="21036810"/>
+                      <a:ext cx="5486400" cy="5904105"/>
                     </a:xfrm>
                     <a:prstGeom prst="rect"/>
                   </pic:spPr>
@@ -7808,7 +7808,7 @@
                 <w:b/>
                 <w:sz w:val="20"/>
               </w:rPr>
-              <w:t>Customer</w:t>
+              <w:t>Client</w:t>
             </w:r>
           </w:p>
         </w:tc>
@@ -7823,7 +7823,7 @@
               <w:rPr>
                 <w:sz w:val="20"/>
               </w:rPr>
-              <w:t>customerID, name, phone_number, account_status, rankingID</w:t>
+              <w:t>clientID, name, phone_number, account_status, rankingID</w:t>
             </w:r>
           </w:p>
         </w:tc>
@@ -8873,7 +8873,7 @@
               <w:rPr>
                 <w:sz w:val="20"/>
               </w:rPr>
-              <w:t>ManyToOne→Customer, ManyToOne→Room</w:t>
+              <w:t>ManyToOne→Client, ManyToOne→Room</w:t>
             </w:r>
           </w:p>
         </w:tc>
@@ -9514,7 +9514,7 @@
       <w:r>
         <w:drawing>
           <wp:inline xmlns:a="http://schemas.openxmlformats.org/drawingml/2006/main" xmlns:pic="http://schemas.openxmlformats.org/drawingml/2006/picture">
-            <wp:extent cx="5486400" cy="4819581"/>
+            <wp:extent cx="5486400" cy="4902169"/>
             <wp:docPr id="12" name="Picture 12"/>
             <wp:cNvGraphicFramePr>
               <a:graphicFrameLocks noChangeAspect="1"/>
@@ -9535,7 +9535,7 @@
                   <pic:spPr>
                     <a:xfrm>
                       <a:off x="0" y="0"/>
-                      <a:ext cx="5486400" cy="4819581"/>
+                      <a:ext cx="5486400" cy="4902169"/>
                     </a:xfrm>
                     <a:prstGeom prst="rect"/>
                   </pic:spPr>
@@ -9703,13 +9703,13 @@
     <w:p>
       <w:pPr/>
       <w:r>
-        <w:t>24. Phương thức searchClient() gọi phương thức findByKeyword(keyword) của lớp Entity Customer.</w:t>
+        <w:t>24. Phương thức searchClient() gọi phương thức findByKeyword(keyword) của lớp Entity Client.</w:t>
       </w:r>
     </w:p>
     <w:p>
       <w:pPr/>
       <w:r>
-        <w:t>25. Lớp Customer trả kết quả danh sách khách hàng về cho phương thức searchClient().</w:t>
+        <w:t>25. Lớp Client trả kết quả danh sách khách hàng về cho phương thức searchClient().</w:t>
       </w:r>
     </w:p>
     <w:p>
@@ -10241,7 +10241,7 @@
       <w:r>
         <w:drawing>
           <wp:inline xmlns:a="http://schemas.openxmlformats.org/drawingml/2006/main" xmlns:pic="http://schemas.openxmlformats.org/drawingml/2006/picture">
-            <wp:extent cx="5486400" cy="4875049"/>
+            <wp:extent cx="5486400" cy="4951844"/>
             <wp:docPr id="14" name="Picture 14"/>
             <wp:cNvGraphicFramePr>
               <a:graphicFrameLocks noChangeAspect="1"/>
@@ -10262,7 +10262,7 @@
                   <pic:spPr>
                     <a:xfrm>
                       <a:off x="0" y="0"/>
-                      <a:ext cx="5486400" cy="4875049"/>
+                      <a:ext cx="5486400" cy="4951844"/>
                     </a:xfrm>
                     <a:prstGeom prst="rect"/>
                   </pic:spPr>
@@ -10514,7 +10514,7 @@
     <w:p>
       <w:pPr/>
       <w:r>
-        <w:t>38. Phương thức confirmPayment() gọi phương thức addPoints(base_score) của lớp Entity Customer.</w:t>
+        <w:t>38. Phương thức confirmPayment() gọi phương thức addPoints(base_score) của lớp Entity Client.</w:t>
       </w:r>
     </w:p>
     <w:p>

</xml_diff>

<commit_message>
fix: heading hierarchy 4→4.1→a) b) c) + font size 11
Heading structure:
- II.3-2.4: 4. Mô hình hóa động → 4.1. Biểu đồ tuần tự phân tích → a) b) c) d)
- III.4: 4. Biểu đồ tuần tự thiết kế → 4.1-4.4 → a) b)

Added skinparam defaultFontSize 11 to all PlantUML blocks
Regenerated all 8 sequence diagrams

Co-Authored-By: Claude Opus 4.8 <noreply@anthropic.com>
</commit_message>
<xml_diff>
--- a/output/booking_module.docx
+++ b/output/booking_module.docx
@@ -3795,7 +3795,7 @@
         <w:pStyle w:val="Heading2"/>
       </w:pPr>
       <w:r>
-        <w:t>2.6. Biểu đồ tuần tự pha phân tích</w:t>
+        <w:t>4. Mô hình hóa động</w:t>
       </w:r>
     </w:p>
     <w:p>
@@ -3803,7 +3803,15 @@
         <w:pStyle w:val="Heading2"/>
       </w:pPr>
       <w:r>
-        <w:t>4.1. Chức năng "Đặt phòng"</w:t>
+        <w:t>4.1. Biểu đồ tuần tự phân tích</w:t>
+      </w:r>
+    </w:p>
+    <w:p>
+      <w:pPr>
+        <w:pStyle w:val="Heading3"/>
+      </w:pPr>
+      <w:r>
+        <w:t>a) Chức năng "Đặt phòng"</w:t>
       </w:r>
     </w:p>
     <w:p>
@@ -3813,7 +3821,7 @@
       <w:r>
         <w:drawing>
           <wp:inline xmlns:a="http://schemas.openxmlformats.org/drawingml/2006/main" xmlns:pic="http://schemas.openxmlformats.org/drawingml/2006/picture">
-            <wp:extent cx="5486400" cy="4183027"/>
+            <wp:extent cx="5486400" cy="4622180"/>
             <wp:docPr id="5" name="Picture 5"/>
             <wp:cNvGraphicFramePr>
               <a:graphicFrameLocks noChangeAspect="1"/>
@@ -3834,7 +3842,7 @@
                   <pic:spPr>
                     <a:xfrm>
                       <a:off x="0" y="0"/>
-                      <a:ext cx="5486400" cy="4183027"/>
+                      <a:ext cx="5486400" cy="4622180"/>
                     </a:xfrm>
                     <a:prstGeom prst="rect"/>
                   </pic:spPr>
@@ -4102,10 +4110,10 @@
     </w:p>
     <w:p>
       <w:pPr>
-        <w:pStyle w:val="Heading2"/>
+        <w:pStyle w:val="Heading3"/>
       </w:pPr>
       <w:r>
-        <w:t>4.2. Chức năng "Huỷ phòng"</w:t>
+        <w:t>b) Chức năng "Huỷ phòng"</w:t>
       </w:r>
     </w:p>
     <w:p>
@@ -4115,7 +4123,7 @@
       <w:r>
         <w:drawing>
           <wp:inline xmlns:a="http://schemas.openxmlformats.org/drawingml/2006/main" xmlns:pic="http://schemas.openxmlformats.org/drawingml/2006/picture">
-            <wp:extent cx="5486400" cy="3995404"/>
+            <wp:extent cx="5486400" cy="4385015"/>
             <wp:docPr id="6" name="Picture 6"/>
             <wp:cNvGraphicFramePr>
               <a:graphicFrameLocks noChangeAspect="1"/>
@@ -4136,7 +4144,7 @@
                   <pic:spPr>
                     <a:xfrm>
                       <a:off x="0" y="0"/>
-                      <a:ext cx="5486400" cy="3995404"/>
+                      <a:ext cx="5486400" cy="4385015"/>
                     </a:xfrm>
                     <a:prstGeom prst="rect"/>
                   </pic:spPr>
@@ -4322,10 +4330,10 @@
     </w:p>
     <w:p>
       <w:pPr>
-        <w:pStyle w:val="Heading2"/>
+        <w:pStyle w:val="Heading3"/>
       </w:pPr>
       <w:r>
-        <w:t>4.3. Chức năng "Check-in"</w:t>
+        <w:t>c) Chức năng "Check-in"</w:t>
       </w:r>
     </w:p>
     <w:p>
@@ -4335,7 +4343,7 @@
       <w:r>
         <w:drawing>
           <wp:inline xmlns:a="http://schemas.openxmlformats.org/drawingml/2006/main" xmlns:pic="http://schemas.openxmlformats.org/drawingml/2006/picture">
-            <wp:extent cx="5486400" cy="3183467"/>
+            <wp:extent cx="5486400" cy="3491345"/>
             <wp:docPr id="7" name="Picture 7"/>
             <wp:cNvGraphicFramePr>
               <a:graphicFrameLocks noChangeAspect="1"/>
@@ -4356,7 +4364,7 @@
                   <pic:spPr>
                     <a:xfrm>
                       <a:off x="0" y="0"/>
-                      <a:ext cx="5486400" cy="3183467"/>
+                      <a:ext cx="5486400" cy="3491345"/>
                     </a:xfrm>
                     <a:prstGeom prst="rect"/>
                   </pic:spPr>
@@ -4512,10 +4520,10 @@
     </w:p>
     <w:p>
       <w:pPr>
-        <w:pStyle w:val="Heading2"/>
+        <w:pStyle w:val="Heading3"/>
       </w:pPr>
       <w:r>
-        <w:t>4.4. Chức năng "Check-out"</w:t>
+        <w:t>d) Chức năng "Check-out"</w:t>
       </w:r>
     </w:p>
     <w:p>
@@ -4525,7 +4533,7 @@
       <w:r>
         <w:drawing>
           <wp:inline xmlns:a="http://schemas.openxmlformats.org/drawingml/2006/main" xmlns:pic="http://schemas.openxmlformats.org/drawingml/2006/picture">
-            <wp:extent cx="5486400" cy="3340692"/>
+            <wp:extent cx="5486400" cy="3650261"/>
             <wp:docPr id="8" name="Picture 8"/>
             <wp:cNvGraphicFramePr>
               <a:graphicFrameLocks noChangeAspect="1"/>
@@ -4546,7 +4554,7 @@
                   <pic:spPr>
                     <a:xfrm>
                       <a:off x="0" y="0"/>
-                      <a:ext cx="5486400" cy="3340692"/>
+                      <a:ext cx="5486400" cy="3650261"/>
                     </a:xfrm>
                     <a:prstGeom prst="rect"/>
                   </pic:spPr>
@@ -9490,7 +9498,15 @@
         <w:pStyle w:val="Heading2"/>
       </w:pPr>
       <w:r>
-        <w:t>4.1. Chức năng "Đặt phòng" — Thiết kế</w:t>
+        <w:t>4. Biểu đồ tuần tự thiết kế</w:t>
+      </w:r>
+    </w:p>
+    <w:p>
+      <w:pPr>
+        <w:pStyle w:val="Heading2"/>
+      </w:pPr>
+      <w:r>
+        <w:t>4.1. Chức năng "Đặt phòng"</w:t>
       </w:r>
     </w:p>
     <w:p>
@@ -9498,7 +9514,7 @@
         <w:pStyle w:val="Heading3"/>
       </w:pPr>
       <w:r>
-        <w:t>Biểu đồ tuần tự</w:t>
+        <w:t>a) Biểu đồ tuần tự</w:t>
       </w:r>
     </w:p>
     <w:p>
@@ -9514,7 +9530,7 @@
       <w:r>
         <w:drawing>
           <wp:inline xmlns:a="http://schemas.openxmlformats.org/drawingml/2006/main" xmlns:pic="http://schemas.openxmlformats.org/drawingml/2006/picture">
-            <wp:extent cx="5486400" cy="4902169"/>
+            <wp:extent cx="5486400" cy="5318489"/>
             <wp:docPr id="12" name="Picture 12"/>
             <wp:cNvGraphicFramePr>
               <a:graphicFrameLocks noChangeAspect="1"/>
@@ -9535,7 +9551,7 @@
                   <pic:spPr>
                     <a:xfrm>
                       <a:off x="0" y="0"/>
-                      <a:ext cx="5486400" cy="4902169"/>
+                      <a:ext cx="5486400" cy="5318489"/>
                     </a:xfrm>
                     <a:prstGeom prst="rect"/>
                   </pic:spPr>
@@ -9551,7 +9567,7 @@
         <w:pStyle w:val="Heading3"/>
       </w:pPr>
       <w:r>
-        <w:t>Kịch bản phiên bản 3</w:t>
+        <w:t>b) Kịch bản phiên bản 3</w:t>
       </w:r>
     </w:p>
     <w:p>
@@ -9923,7 +9939,7 @@
         <w:pStyle w:val="Heading2"/>
       </w:pPr>
       <w:r>
-        <w:t>4.2. Chức năng "Check-in" — Thiết kế</w:t>
+        <w:t>4.2. Chức năng "Check-in"</w:t>
       </w:r>
     </w:p>
     <w:p>
@@ -9931,7 +9947,7 @@
         <w:pStyle w:val="Heading3"/>
       </w:pPr>
       <w:r>
-        <w:t>Biểu đồ tuần tự</w:t>
+        <w:t>a) Biểu đồ tuần tự</w:t>
       </w:r>
     </w:p>
     <w:p>
@@ -9947,7 +9963,7 @@
       <w:r>
         <w:drawing>
           <wp:inline xmlns:a="http://schemas.openxmlformats.org/drawingml/2006/main" xmlns:pic="http://schemas.openxmlformats.org/drawingml/2006/picture">
-            <wp:extent cx="5486400" cy="4294933"/>
+            <wp:extent cx="5486400" cy="4732713"/>
             <wp:docPr id="13" name="Picture 13"/>
             <wp:cNvGraphicFramePr>
               <a:graphicFrameLocks noChangeAspect="1"/>
@@ -9968,7 +9984,7 @@
                   <pic:spPr>
                     <a:xfrm>
                       <a:off x="0" y="0"/>
-                      <a:ext cx="5486400" cy="4294933"/>
+                      <a:ext cx="5486400" cy="4732713"/>
                     </a:xfrm>
                     <a:prstGeom prst="rect"/>
                   </pic:spPr>
@@ -9984,7 +10000,7 @@
         <w:pStyle w:val="Heading3"/>
       </w:pPr>
       <w:r>
-        <w:t>Kịch bản phiên bản 3</w:t>
+        <w:t>b) Kịch bản phiên bản 3</w:t>
       </w:r>
     </w:p>
     <w:p>
@@ -10217,7 +10233,7 @@
         <w:pStyle w:val="Heading2"/>
       </w:pPr>
       <w:r>
-        <w:t>4.3. Chức năng "Check-out" — Thiết kế</w:t>
+        <w:t>4.3. Chức năng "Check-out"</w:t>
       </w:r>
     </w:p>
     <w:p>
@@ -10225,7 +10241,7 @@
         <w:pStyle w:val="Heading3"/>
       </w:pPr>
       <w:r>
-        <w:t>Biểu đồ tuần tự</w:t>
+        <w:t>a) Biểu đồ tuần tự</w:t>
       </w:r>
     </w:p>
     <w:p>
@@ -10241,7 +10257,7 @@
       <w:r>
         <w:drawing>
           <wp:inline xmlns:a="http://schemas.openxmlformats.org/drawingml/2006/main" xmlns:pic="http://schemas.openxmlformats.org/drawingml/2006/picture">
-            <wp:extent cx="5486400" cy="4951844"/>
+            <wp:extent cx="5486400" cy="5403954"/>
             <wp:docPr id="14" name="Picture 14"/>
             <wp:cNvGraphicFramePr>
               <a:graphicFrameLocks noChangeAspect="1"/>
@@ -10262,7 +10278,7 @@
                   <pic:spPr>
                     <a:xfrm>
                       <a:off x="0" y="0"/>
-                      <a:ext cx="5486400" cy="4951844"/>
+                      <a:ext cx="5486400" cy="5403954"/>
                     </a:xfrm>
                     <a:prstGeom prst="rect"/>
                   </pic:spPr>
@@ -10278,7 +10294,7 @@
         <w:pStyle w:val="Heading3"/>
       </w:pPr>
       <w:r>
-        <w:t>Kịch bản phiên bản 3</w:t>
+        <w:t>b) Kịch bản phiên bản 3</w:t>
       </w:r>
     </w:p>
     <w:p>
@@ -10613,7 +10629,7 @@
         <w:pStyle w:val="Heading2"/>
       </w:pPr>
       <w:r>
-        <w:t>4.4. Chức năng "Huỷ phòng" — Thiết kế</w:t>
+        <w:t>4.4. Chức năng "Huỷ phòng"</w:t>
       </w:r>
     </w:p>
     <w:p>
@@ -10621,7 +10637,7 @@
         <w:pStyle w:val="Heading3"/>
       </w:pPr>
       <w:r>
-        <w:t>Biểu đồ tuần tự</w:t>
+        <w:t>a) Biểu đồ tuần tự</w:t>
       </w:r>
     </w:p>
     <w:p>
@@ -10637,7 +10653,7 @@
       <w:r>
         <w:drawing>
           <wp:inline xmlns:a="http://schemas.openxmlformats.org/drawingml/2006/main" xmlns:pic="http://schemas.openxmlformats.org/drawingml/2006/picture">
-            <wp:extent cx="5486400" cy="5643589"/>
+            <wp:extent cx="5486400" cy="6114928"/>
             <wp:docPr id="15" name="Picture 15"/>
             <wp:cNvGraphicFramePr>
               <a:graphicFrameLocks noChangeAspect="1"/>
@@ -10658,7 +10674,7 @@
                   <pic:spPr>
                     <a:xfrm>
                       <a:off x="0" y="0"/>
-                      <a:ext cx="5486400" cy="5643589"/>
+                      <a:ext cx="5486400" cy="6114928"/>
                     </a:xfrm>
                     <a:prstGeom prst="rect"/>
                   </pic:spPr>
@@ -10674,7 +10690,7 @@
         <w:pStyle w:val="Heading3"/>
       </w:pPr>
       <w:r>
-        <w:t>Kịch bản phiên bản 3</w:t>
+        <w:t>b) Kịch bản phiên bản 3</w:t>
       </w:r>
     </w:p>
     <w:p>

</xml_diff>

<commit_message>
fix: rewrite design sequence diagrams — exact step match, fix heading hierarchy, remove duplicate content
- Rewrite all 4 design sequence diagrams (III.4) with exact step counts matching scenario v3
  - Đặt phòng: 39 steps = 39 arrows
  - Check-in: 26 steps = 26 arrows (removed misplaced display step)
  - Check-out: 42 steps = 42 arrows (removed 2 premature display steps)
  - Huỷ phòng: 31 steps = 31 arrows
- Fix DOCX heading hierarchy: ## 4. → H2, ### 4.1. → H3, #### a) → H4
- Remove duplicate booking scenario content (old 17-20 steps after exception)
- Add UC diagrams to DOCX generator (section-booking-i-uc.md)
- Fix bold paragraph handler to not create headings from bold text
- Fix UC diagram matching by rectangle title instead of content keywords
</commit_message>
<xml_diff>
--- a/output/booking_module.docx
+++ b/output/booking_module.docx
@@ -567,7 +567,7 @@
     </w:p>
     <w:p>
       <w:pPr>
-        <w:pStyle w:val="Heading2"/>
+        <w:pStyle w:val="Heading3"/>
       </w:pPr>
       <w:r>
         <w:t>2.1. Mục tiêu mô-đun</w:t>
@@ -581,7 +581,7 @@
     </w:p>
     <w:p>
       <w:pPr>
-        <w:pStyle w:val="Heading2"/>
+        <w:pStyle w:val="Heading3"/>
       </w:pPr>
       <w:r>
         <w:t>2.2. Phạm vi mô-đun</w:t>
@@ -595,7 +595,7 @@
     </w:p>
     <w:p>
       <w:pPr>
-        <w:pStyle w:val="Heading2"/>
+        <w:pStyle w:val="Heading3"/>
       </w:pPr>
       <w:r>
         <w:t>2.3. Ai có thể sử dụng mô-đun?</w:t>
@@ -637,7 +637,7 @@
     </w:p>
     <w:p>
       <w:pPr>
-        <w:pStyle w:val="Heading2"/>
+        <w:pStyle w:val="Heading3"/>
       </w:pPr>
       <w:r>
         <w:t>2.4. Người dùng có những chức năng gì?</w:t>
@@ -751,7 +751,7 @@
     </w:p>
     <w:p>
       <w:pPr>
-        <w:pStyle w:val="Heading2"/>
+        <w:pStyle w:val="Heading3"/>
       </w:pPr>
       <w:r>
         <w:t>2.5. Mỗi chức năng hoạt động như thế nào?</w:t>
@@ -831,7 +831,7 @@
     </w:p>
     <w:p>
       <w:pPr>
-        <w:pStyle w:val="Heading2"/>
+        <w:pStyle w:val="Heading3"/>
       </w:pPr>
       <w:r>
         <w:t>2.6. Những thông tin/ đối tượng mà mô-đun cần xử lý</w:t>
@@ -943,7 +943,7 @@
     </w:p>
     <w:p>
       <w:pPr>
-        <w:pStyle w:val="Heading2"/>
+        <w:pStyle w:val="Heading3"/>
       </w:pPr>
       <w:r>
         <w:t>2.7. Quan hệ giữa các đối tượng</w:t>
@@ -1005,7 +1005,7 @@
     </w:p>
     <w:p>
       <w:pPr>
-        <w:pStyle w:val="Heading2"/>
+        <w:pStyle w:val="Heading3"/>
       </w:pPr>
       <w:r>
         <w:t>3.1. Danh sách Actor</w:t>
@@ -1172,7 +1172,7 @@
     </w:tbl>
     <w:p>
       <w:pPr>
-        <w:pStyle w:val="Heading2"/>
+        <w:pStyle w:val="Heading3"/>
       </w:pPr>
       <w:r>
         <w:t>3.2. Các Use Case cho từng Actor</w:t>
@@ -1396,18 +1396,262 @@
     </w:tbl>
     <w:p>
       <w:pPr>
-        <w:pStyle w:val="Heading2"/>
+        <w:pStyle w:val="Heading3"/>
       </w:pPr>
       <w:r>
         <w:t>3.3. Biểu đồ Use Case tổng quan của mô-đun</w:t>
       </w:r>
     </w:p>
+    <w:p>
+      <w:pPr>
+        <w:pStyle w:val="Heading3"/>
+      </w:pPr>
+      <w:r>
+        <w:t>3.4. Biểu đồ Use Case phân rã của mô-đun</w:t>
+      </w:r>
+    </w:p>
+    <w:p/>
     <w:p>
       <w:pPr>
         <w:pStyle w:val="Heading2"/>
       </w:pPr>
       <w:r>
-        <w:t>3.4. Biểu đồ Use Case phân rã của mô-đun</w:t>
+        <w:t>Biểu đồ Use Case tổng quan</w:t>
+      </w:r>
+    </w:p>
+    <w:p>
+      <w:pPr>
+        <w:jc w:val="center"/>
+      </w:pPr>
+      <w:r>
+        <w:drawing>
+          <wp:inline xmlns:a="http://schemas.openxmlformats.org/drawingml/2006/main" xmlns:pic="http://schemas.openxmlformats.org/drawingml/2006/picture">
+            <wp:extent cx="5486400" cy="4373696"/>
+            <wp:docPr id="1" name="Picture 1"/>
+            <wp:cNvGraphicFramePr>
+              <a:graphicFrameLocks noChangeAspect="1"/>
+            </wp:cNvGraphicFramePr>
+            <a:graphic>
+              <a:graphicData uri="http://schemas.openxmlformats.org/drawingml/2006/picture">
+                <pic:pic>
+                  <pic:nvPicPr>
+                    <pic:cNvPr id="0" name="booking_uc_overview.png"/>
+                    <pic:cNvPicPr/>
+                  </pic:nvPicPr>
+                  <pic:blipFill>
+                    <a:blip r:embed="rId9"/>
+                    <a:stretch>
+                      <a:fillRect/>
+                    </a:stretch>
+                  </pic:blipFill>
+                  <pic:spPr>
+                    <a:xfrm>
+                      <a:off x="0" y="0"/>
+                      <a:ext cx="5486400" cy="4373696"/>
+                    </a:xfrm>
+                    <a:prstGeom prst="rect"/>
+                  </pic:spPr>
+                </pic:pic>
+              </a:graphicData>
+            </a:graphic>
+          </wp:inline>
+        </w:drawing>
+      </w:r>
+    </w:p>
+    <w:p>
+      <w:pPr>
+        <w:pStyle w:val="Heading2"/>
+      </w:pPr>
+      <w:r>
+        <w:t>Biểu đồ Use Case phân rã</w:t>
+      </w:r>
+    </w:p>
+    <w:p>
+      <w:pPr>
+        <w:pStyle w:val="Heading3"/>
+      </w:pPr>
+      <w:r>
+        <w:t>a) Use Case "Đặt phòng"</w:t>
+      </w:r>
+    </w:p>
+    <w:p>
+      <w:pPr>
+        <w:jc w:val="center"/>
+      </w:pPr>
+      <w:r>
+        <w:drawing>
+          <wp:inline xmlns:a="http://schemas.openxmlformats.org/drawingml/2006/main" xmlns:pic="http://schemas.openxmlformats.org/drawingml/2006/picture">
+            <wp:extent cx="5486400" cy="5800469"/>
+            <wp:docPr id="2" name="Picture 2"/>
+            <wp:cNvGraphicFramePr>
+              <a:graphicFrameLocks noChangeAspect="1"/>
+            </wp:cNvGraphicFramePr>
+            <a:graphic>
+              <a:graphicData uri="http://schemas.openxmlformats.org/drawingml/2006/picture">
+                <pic:pic>
+                  <pic:nvPicPr>
+                    <pic:cNvPr id="0" name="booking_uc_datphong.png"/>
+                    <pic:cNvPicPr/>
+                  </pic:nvPicPr>
+                  <pic:blipFill>
+                    <a:blip r:embed="rId10"/>
+                    <a:stretch>
+                      <a:fillRect/>
+                    </a:stretch>
+                  </pic:blipFill>
+                  <pic:spPr>
+                    <a:xfrm>
+                      <a:off x="0" y="0"/>
+                      <a:ext cx="5486400" cy="5800469"/>
+                    </a:xfrm>
+                    <a:prstGeom prst="rect"/>
+                  </pic:spPr>
+                </pic:pic>
+              </a:graphicData>
+            </a:graphic>
+          </wp:inline>
+        </w:drawing>
+      </w:r>
+    </w:p>
+    <w:p>
+      <w:pPr>
+        <w:pStyle w:val="Heading3"/>
+      </w:pPr>
+      <w:r>
+        <w:t>b) Use Case "Huỷ phòng"</w:t>
+      </w:r>
+    </w:p>
+    <w:p>
+      <w:pPr>
+        <w:jc w:val="center"/>
+      </w:pPr>
+      <w:r>
+        <w:drawing>
+          <wp:inline xmlns:a="http://schemas.openxmlformats.org/drawingml/2006/main" xmlns:pic="http://schemas.openxmlformats.org/drawingml/2006/picture">
+            <wp:extent cx="5486400" cy="3953129"/>
+            <wp:docPr id="3" name="Picture 3"/>
+            <wp:cNvGraphicFramePr>
+              <a:graphicFrameLocks noChangeAspect="1"/>
+            </wp:cNvGraphicFramePr>
+            <a:graphic>
+              <a:graphicData uri="http://schemas.openxmlformats.org/drawingml/2006/picture">
+                <pic:pic>
+                  <pic:nvPicPr>
+                    <pic:cNvPr id="0" name="booking_uc_huyphong.png"/>
+                    <pic:cNvPicPr/>
+                  </pic:nvPicPr>
+                  <pic:blipFill>
+                    <a:blip r:embed="rId11"/>
+                    <a:stretch>
+                      <a:fillRect/>
+                    </a:stretch>
+                  </pic:blipFill>
+                  <pic:spPr>
+                    <a:xfrm>
+                      <a:off x="0" y="0"/>
+                      <a:ext cx="5486400" cy="3953129"/>
+                    </a:xfrm>
+                    <a:prstGeom prst="rect"/>
+                  </pic:spPr>
+                </pic:pic>
+              </a:graphicData>
+            </a:graphic>
+          </wp:inline>
+        </w:drawing>
+      </w:r>
+    </w:p>
+    <w:p>
+      <w:pPr>
+        <w:pStyle w:val="Heading3"/>
+      </w:pPr>
+      <w:r>
+        <w:t>c) Use Case "Check-in"</w:t>
+      </w:r>
+    </w:p>
+    <w:p>
+      <w:pPr>
+        <w:jc w:val="center"/>
+      </w:pPr>
+      <w:r>
+        <w:drawing>
+          <wp:inline xmlns:a="http://schemas.openxmlformats.org/drawingml/2006/main" xmlns:pic="http://schemas.openxmlformats.org/drawingml/2006/picture">
+            <wp:extent cx="5486400" cy="812272"/>
+            <wp:docPr id="4" name="Picture 4"/>
+            <wp:cNvGraphicFramePr>
+              <a:graphicFrameLocks noChangeAspect="1"/>
+            </wp:cNvGraphicFramePr>
+            <a:graphic>
+              <a:graphicData uri="http://schemas.openxmlformats.org/drawingml/2006/picture">
+                <pic:pic>
+                  <pic:nvPicPr>
+                    <pic:cNvPr id="0" name="booking_uc_checkin.png"/>
+                    <pic:cNvPicPr/>
+                  </pic:nvPicPr>
+                  <pic:blipFill>
+                    <a:blip r:embed="rId12"/>
+                    <a:stretch>
+                      <a:fillRect/>
+                    </a:stretch>
+                  </pic:blipFill>
+                  <pic:spPr>
+                    <a:xfrm>
+                      <a:off x="0" y="0"/>
+                      <a:ext cx="5486400" cy="812272"/>
+                    </a:xfrm>
+                    <a:prstGeom prst="rect"/>
+                  </pic:spPr>
+                </pic:pic>
+              </a:graphicData>
+            </a:graphic>
+          </wp:inline>
+        </w:drawing>
+      </w:r>
+    </w:p>
+    <w:p>
+      <w:pPr>
+        <w:pStyle w:val="Heading3"/>
+      </w:pPr>
+      <w:r>
+        <w:t>d) Use Case "Check-out"</w:t>
+      </w:r>
+    </w:p>
+    <w:p>
+      <w:pPr>
+        <w:jc w:val="center"/>
+      </w:pPr>
+      <w:r>
+        <w:drawing>
+          <wp:inline xmlns:a="http://schemas.openxmlformats.org/drawingml/2006/main" xmlns:pic="http://schemas.openxmlformats.org/drawingml/2006/picture">
+            <wp:extent cx="5486400" cy="352763"/>
+            <wp:docPr id="5" name="Picture 5"/>
+            <wp:cNvGraphicFramePr>
+              <a:graphicFrameLocks noChangeAspect="1"/>
+            </wp:cNvGraphicFramePr>
+            <a:graphic>
+              <a:graphicData uri="http://schemas.openxmlformats.org/drawingml/2006/picture">
+                <pic:pic>
+                  <pic:nvPicPr>
+                    <pic:cNvPr id="0" name="booking_uc_checkout.png"/>
+                    <pic:cNvPicPr/>
+                  </pic:nvPicPr>
+                  <pic:blipFill>
+                    <a:blip r:embed="rId13"/>
+                    <a:stretch>
+                      <a:fillRect/>
+                    </a:stretch>
+                  </pic:blipFill>
+                  <pic:spPr>
+                    <a:xfrm>
+                      <a:off x="0" y="0"/>
+                      <a:ext cx="5486400" cy="352763"/>
+                    </a:xfrm>
+                    <a:prstGeom prst="rect"/>
+                  </pic:spPr>
+                </pic:pic>
+              </a:graphicData>
+            </a:graphic>
+          </wp:inline>
+        </w:drawing>
       </w:r>
     </w:p>
     <w:p/>
@@ -3171,7 +3415,7 @@
         <w:drawing>
           <wp:inline xmlns:a="http://schemas.openxmlformats.org/drawingml/2006/main" xmlns:pic="http://schemas.openxmlformats.org/drawingml/2006/picture">
             <wp:extent cx="5486400" cy="4470845"/>
-            <wp:docPr id="1" name="Picture 1"/>
+            <wp:docPr id="6" name="Picture 6"/>
             <wp:cNvGraphicFramePr>
               <a:graphicFrameLocks noChangeAspect="1"/>
             </wp:cNvGraphicFramePr>
@@ -3183,7 +3427,7 @@
                     <pic:cNvPicPr/>
                   </pic:nvPicPr>
                   <pic:blipFill>
-                    <a:blip r:embed="rId9"/>
+                    <a:blip r:embed="rId14"/>
                     <a:stretch>
                       <a:fillRect/>
                     </a:stretch>
@@ -3337,7 +3581,7 @@
         <w:drawing>
           <wp:inline xmlns:a="http://schemas.openxmlformats.org/drawingml/2006/main" xmlns:pic="http://schemas.openxmlformats.org/drawingml/2006/picture">
             <wp:extent cx="5486400" cy="4254920"/>
-            <wp:docPr id="2" name="Picture 2"/>
+            <wp:docPr id="7" name="Picture 7"/>
             <wp:cNvGraphicFramePr>
               <a:graphicFrameLocks noChangeAspect="1"/>
             </wp:cNvGraphicFramePr>
@@ -3349,7 +3593,7 @@
                     <pic:cNvPicPr/>
                   </pic:nvPicPr>
                   <pic:blipFill>
-                    <a:blip r:embed="rId10"/>
+                    <a:blip r:embed="rId15"/>
                     <a:stretch>
                       <a:fillRect/>
                     </a:stretch>
@@ -3503,7 +3747,7 @@
         <w:drawing>
           <wp:inline xmlns:a="http://schemas.openxmlformats.org/drawingml/2006/main" xmlns:pic="http://schemas.openxmlformats.org/drawingml/2006/picture">
             <wp:extent cx="5486400" cy="3731342"/>
-            <wp:docPr id="3" name="Picture 3"/>
+            <wp:docPr id="8" name="Picture 8"/>
             <wp:cNvGraphicFramePr>
               <a:graphicFrameLocks noChangeAspect="1"/>
             </wp:cNvGraphicFramePr>
@@ -3515,7 +3759,7 @@
                     <pic:cNvPicPr/>
                   </pic:nvPicPr>
                   <pic:blipFill>
-                    <a:blip r:embed="rId11"/>
+                    <a:blip r:embed="rId16"/>
                     <a:stretch>
                       <a:fillRect/>
                     </a:stretch>
@@ -3753,7 +3997,7 @@
         <w:drawing>
           <wp:inline xmlns:a="http://schemas.openxmlformats.org/drawingml/2006/main" xmlns:pic="http://schemas.openxmlformats.org/drawingml/2006/picture">
             <wp:extent cx="5486400" cy="4214451"/>
-            <wp:docPr id="4" name="Picture 4"/>
+            <wp:docPr id="9" name="Picture 9"/>
             <wp:cNvGraphicFramePr>
               <a:graphicFrameLocks noChangeAspect="1"/>
             </wp:cNvGraphicFramePr>
@@ -3765,7 +4009,7 @@
                     <pic:cNvPicPr/>
                   </pic:nvPicPr>
                   <pic:blipFill>
-                    <a:blip r:embed="rId12"/>
+                    <a:blip r:embed="rId17"/>
                     <a:stretch>
                       <a:fillRect/>
                     </a:stretch>
@@ -3800,7 +4044,7 @@
     </w:p>
     <w:p>
       <w:pPr>
-        <w:pStyle w:val="Heading2"/>
+        <w:pStyle w:val="Heading3"/>
       </w:pPr>
       <w:r>
         <w:t>4.1. Biểu đồ tuần tự phân tích</w:t>
@@ -3808,7 +4052,7 @@
     </w:p>
     <w:p>
       <w:pPr>
-        <w:pStyle w:val="Heading3"/>
+        <w:pStyle w:val="Heading4"/>
       </w:pPr>
       <w:r>
         <w:t>a) Chức năng "Đặt phòng"</w:t>
@@ -3822,7 +4066,7 @@
         <w:drawing>
           <wp:inline xmlns:a="http://schemas.openxmlformats.org/drawingml/2006/main" xmlns:pic="http://schemas.openxmlformats.org/drawingml/2006/picture">
             <wp:extent cx="5486400" cy="4622180"/>
-            <wp:docPr id="5" name="Picture 5"/>
+            <wp:docPr id="10" name="Picture 10"/>
             <wp:cNvGraphicFramePr>
               <a:graphicFrameLocks noChangeAspect="1"/>
             </wp:cNvGraphicFramePr>
@@ -3834,7 +4078,7 @@
                     <pic:cNvPicPr/>
                   </pic:nvPicPr>
                   <pic:blipFill>
-                    <a:blip r:embed="rId13"/>
+                    <a:blip r:embed="rId18"/>
                     <a:stretch>
                       <a:fillRect/>
                     </a:stretch>
@@ -3854,10 +4098,11 @@
       </w:r>
     </w:p>
     <w:p>
-      <w:pPr>
-        <w:pStyle w:val="Heading3"/>
-      </w:pPr>
-      <w:r>
+      <w:pPr/>
+      <w:r>
+        <w:rPr>
+          <w:b/>
+        </w:rPr>
         <w:t>Kịch bản phiên bản 2 – Đặt phòng</w:t>
       </w:r>
     </w:p>
@@ -4110,7 +4355,7 @@
     </w:p>
     <w:p>
       <w:pPr>
-        <w:pStyle w:val="Heading3"/>
+        <w:pStyle w:val="Heading4"/>
       </w:pPr>
       <w:r>
         <w:t>b) Chức năng "Huỷ phòng"</w:t>
@@ -4124,7 +4369,7 @@
         <w:drawing>
           <wp:inline xmlns:a="http://schemas.openxmlformats.org/drawingml/2006/main" xmlns:pic="http://schemas.openxmlformats.org/drawingml/2006/picture">
             <wp:extent cx="5486400" cy="4385015"/>
-            <wp:docPr id="6" name="Picture 6"/>
+            <wp:docPr id="11" name="Picture 11"/>
             <wp:cNvGraphicFramePr>
               <a:graphicFrameLocks noChangeAspect="1"/>
             </wp:cNvGraphicFramePr>
@@ -4136,7 +4381,7 @@
                     <pic:cNvPicPr/>
                   </pic:nvPicPr>
                   <pic:blipFill>
-                    <a:blip r:embed="rId14"/>
+                    <a:blip r:embed="rId19"/>
                     <a:stretch>
                       <a:fillRect/>
                     </a:stretch>
@@ -4156,10 +4401,11 @@
       </w:r>
     </w:p>
     <w:p>
-      <w:pPr>
-        <w:pStyle w:val="Heading3"/>
-      </w:pPr>
-      <w:r>
+      <w:pPr/>
+      <w:r>
+        <w:rPr>
+          <w:b/>
+        </w:rPr>
         <w:t>Kịch bản phiên bản 2 – Huỷ phòng</w:t>
       </w:r>
     </w:p>
@@ -4330,7 +4576,7 @@
     </w:p>
     <w:p>
       <w:pPr>
-        <w:pStyle w:val="Heading3"/>
+        <w:pStyle w:val="Heading4"/>
       </w:pPr>
       <w:r>
         <w:t>c) Chức năng "Check-in"</w:t>
@@ -4344,7 +4590,7 @@
         <w:drawing>
           <wp:inline xmlns:a="http://schemas.openxmlformats.org/drawingml/2006/main" xmlns:pic="http://schemas.openxmlformats.org/drawingml/2006/picture">
             <wp:extent cx="5486400" cy="3491345"/>
-            <wp:docPr id="7" name="Picture 7"/>
+            <wp:docPr id="12" name="Picture 12"/>
             <wp:cNvGraphicFramePr>
               <a:graphicFrameLocks noChangeAspect="1"/>
             </wp:cNvGraphicFramePr>
@@ -4356,7 +4602,7 @@
                     <pic:cNvPicPr/>
                   </pic:nvPicPr>
                   <pic:blipFill>
-                    <a:blip r:embed="rId15"/>
+                    <a:blip r:embed="rId20"/>
                     <a:stretch>
                       <a:fillRect/>
                     </a:stretch>
@@ -4376,10 +4622,11 @@
       </w:r>
     </w:p>
     <w:p>
-      <w:pPr>
-        <w:pStyle w:val="Heading3"/>
-      </w:pPr>
-      <w:r>
+      <w:pPr/>
+      <w:r>
+        <w:rPr>
+          <w:b/>
+        </w:rPr>
         <w:t>Kịch bản phiên bản 2 – Check-in</w:t>
       </w:r>
     </w:p>
@@ -4520,7 +4767,7 @@
     </w:p>
     <w:p>
       <w:pPr>
-        <w:pStyle w:val="Heading3"/>
+        <w:pStyle w:val="Heading4"/>
       </w:pPr>
       <w:r>
         <w:t>d) Chức năng "Check-out"</w:t>
@@ -4534,7 +4781,7 @@
         <w:drawing>
           <wp:inline xmlns:a="http://schemas.openxmlformats.org/drawingml/2006/main" xmlns:pic="http://schemas.openxmlformats.org/drawingml/2006/picture">
             <wp:extent cx="5486400" cy="3650261"/>
-            <wp:docPr id="8" name="Picture 8"/>
+            <wp:docPr id="13" name="Picture 13"/>
             <wp:cNvGraphicFramePr>
               <a:graphicFrameLocks noChangeAspect="1"/>
             </wp:cNvGraphicFramePr>
@@ -4546,7 +4793,7 @@
                     <pic:cNvPicPr/>
                   </pic:nvPicPr>
                   <pic:blipFill>
-                    <a:blip r:embed="rId16"/>
+                    <a:blip r:embed="rId21"/>
                     <a:stretch>
                       <a:fillRect/>
                     </a:stretch>
@@ -4566,10 +4813,11 @@
       </w:r>
     </w:p>
     <w:p>
-      <w:pPr>
-        <w:pStyle w:val="Heading3"/>
-      </w:pPr>
-      <w:r>
+      <w:pPr/>
+      <w:r>
+        <w:rPr>
+          <w:b/>
+        </w:rPr>
         <w:t>Kịch bản phiên bản 2 – Check-out</w:t>
       </w:r>
     </w:p>
@@ -5740,7 +5988,7 @@
         <w:drawing>
           <wp:inline xmlns:a="http://schemas.openxmlformats.org/drawingml/2006/main" xmlns:pic="http://schemas.openxmlformats.org/drawingml/2006/picture">
             <wp:extent cx="5486400" cy="8460223"/>
-            <wp:docPr id="9" name="Picture 9"/>
+            <wp:docPr id="14" name="Picture 14"/>
             <wp:cNvGraphicFramePr>
               <a:graphicFrameLocks noChangeAspect="1"/>
             </wp:cNvGraphicFramePr>
@@ -5752,7 +6000,7 @@
                     <pic:cNvPicPr/>
                   </pic:nvPicPr>
                   <pic:blipFill>
-                    <a:blip r:embed="rId17"/>
+                    <a:blip r:embed="rId22"/>
                     <a:stretch>
                       <a:fillRect/>
                     </a:stretch>
@@ -6496,7 +6744,7 @@
         <w:drawing>
           <wp:inline xmlns:a="http://schemas.openxmlformats.org/drawingml/2006/main" xmlns:pic="http://schemas.openxmlformats.org/drawingml/2006/picture">
             <wp:extent cx="5486400" cy="5904105"/>
-            <wp:docPr id="10" name="Picture 10"/>
+            <wp:docPr id="15" name="Picture 15"/>
             <wp:cNvGraphicFramePr>
               <a:graphicFrameLocks noChangeAspect="1"/>
             </wp:cNvGraphicFramePr>
@@ -6508,7 +6756,7 @@
                     <pic:cNvPicPr/>
                   </pic:nvPicPr>
                   <pic:blipFill>
-                    <a:blip r:embed="rId18"/>
+                    <a:blip r:embed="rId23"/>
                     <a:stretch>
                       <a:fillRect/>
                     </a:stretch>
@@ -7081,10 +7329,11 @@
       </w:r>
     </w:p>
     <w:p>
-      <w:pPr>
-        <w:pStyle w:val="Heading4"/>
-      </w:pPr>
-      <w:r>
+      <w:pPr/>
+      <w:r>
+        <w:rPr>
+          <w:b/>
+        </w:rPr>
         <w:t>1. Tầng giao diện (Boundary)</w:t>
       </w:r>
     </w:p>
@@ -7346,10 +7595,11 @@
       </w:tr>
     </w:tbl>
     <w:p>
-      <w:pPr>
-        <w:pStyle w:val="Heading4"/>
-      </w:pPr>
-      <w:r>
+      <w:pPr/>
+      <w:r>
+        <w:rPr>
+          <w:b/>
+        </w:rPr>
         <w:t>2. Tầng điều khiển (Control)</w:t>
       </w:r>
     </w:p>
@@ -7684,10 +7934,11 @@
       </w:r>
     </w:p>
     <w:p>
-      <w:pPr>
-        <w:pStyle w:val="Heading4"/>
-      </w:pPr>
-      <w:r>
+      <w:pPr/>
+      <w:r>
+        <w:rPr>
+          <w:b/>
+        </w:rPr>
         <w:t>3. Tầng thực thể (Entity)</w:t>
       </w:r>
     </w:p>
@@ -7909,10 +8160,11 @@
       </w:r>
     </w:p>
     <w:p>
-      <w:pPr>
-        <w:pStyle w:val="Heading4"/>
-      </w:pPr>
-      <w:r>
+      <w:pPr/>
+      <w:r>
+        <w:rPr>
+          <w:b/>
+        </w:rPr>
         <w:t>1. Tầng giao diện (Boundary)</w:t>
       </w:r>
     </w:p>
@@ -8030,10 +8282,11 @@
       </w:tr>
     </w:tbl>
     <w:p>
-      <w:pPr>
-        <w:pStyle w:val="Heading4"/>
-      </w:pPr>
-      <w:r>
+      <w:pPr/>
+      <w:r>
+        <w:rPr>
+          <w:b/>
+        </w:rPr>
         <w:t>2. Tầng điều khiển (Control)</w:t>
       </w:r>
     </w:p>
@@ -8188,10 +8441,11 @@
       </w:r>
     </w:p>
     <w:p>
-      <w:pPr>
-        <w:pStyle w:val="Heading4"/>
-      </w:pPr>
-      <w:r>
+      <w:pPr/>
+      <w:r>
+        <w:rPr>
+          <w:b/>
+        </w:rPr>
         <w:t>3. Tầng thực thể (Entity)</w:t>
       </w:r>
     </w:p>
@@ -8365,10 +8619,11 @@
       </w:r>
     </w:p>
     <w:p>
-      <w:pPr>
-        <w:pStyle w:val="Heading4"/>
-      </w:pPr>
-      <w:r>
+      <w:pPr/>
+      <w:r>
+        <w:rPr>
+          <w:b/>
+        </w:rPr>
         <w:t>1. Tầng giao diện (Boundary)</w:t>
       </w:r>
     </w:p>
@@ -8534,10 +8789,11 @@
       </w:tr>
     </w:tbl>
     <w:p>
-      <w:pPr>
-        <w:pStyle w:val="Heading4"/>
-      </w:pPr>
-      <w:r>
+      <w:pPr/>
+      <w:r>
+        <w:rPr>
+          <w:b/>
+        </w:rPr>
         <w:t>2. Tầng điều khiển (Control)</w:t>
       </w:r>
     </w:p>
@@ -8767,10 +9023,11 @@
       </w:r>
     </w:p>
     <w:p>
-      <w:pPr>
-        <w:pStyle w:val="Heading4"/>
-      </w:pPr>
-      <w:r>
+      <w:pPr/>
+      <w:r>
+        <w:rPr>
+          <w:b/>
+        </w:rPr>
         <w:t>3. Tầng thực thể (Entity)</w:t>
       </w:r>
     </w:p>
@@ -8992,10 +9249,11 @@
       </w:r>
     </w:p>
     <w:p>
-      <w:pPr>
-        <w:pStyle w:val="Heading4"/>
-      </w:pPr>
-      <w:r>
+      <w:pPr/>
+      <w:r>
+        <w:rPr>
+          <w:b/>
+        </w:rPr>
         <w:t>1. Tầng giao diện (Boundary)</w:t>
       </w:r>
     </w:p>
@@ -9113,10 +9371,11 @@
       </w:tr>
     </w:tbl>
     <w:p>
-      <w:pPr>
-        <w:pStyle w:val="Heading4"/>
-      </w:pPr>
-      <w:r>
+      <w:pPr/>
+      <w:r>
+        <w:rPr>
+          <w:b/>
+        </w:rPr>
         <w:t>2. Tầng điều khiển (Control)</w:t>
       </w:r>
     </w:p>
@@ -9271,10 +9530,11 @@
       </w:r>
     </w:p>
     <w:p>
-      <w:pPr>
-        <w:pStyle w:val="Heading4"/>
-      </w:pPr>
-      <w:r>
+      <w:pPr/>
+      <w:r>
+        <w:rPr>
+          <w:b/>
+        </w:rPr>
         <w:t>3. Tầng thực thể (Entity)</w:t>
       </w:r>
     </w:p>
@@ -9461,7 +9721,7 @@
         <w:drawing>
           <wp:inline xmlns:a="http://schemas.openxmlformats.org/drawingml/2006/main" xmlns:pic="http://schemas.openxmlformats.org/drawingml/2006/picture">
             <wp:extent cx="5486400" cy="5214604"/>
-            <wp:docPr id="11" name="Picture 11"/>
+            <wp:docPr id="16" name="Picture 16"/>
             <wp:cNvGraphicFramePr>
               <a:graphicFrameLocks noChangeAspect="1"/>
             </wp:cNvGraphicFramePr>
@@ -9473,7 +9733,7 @@
                     <pic:cNvPicPr/>
                   </pic:nvPicPr>
                   <pic:blipFill>
-                    <a:blip r:embed="rId19"/>
+                    <a:blip r:embed="rId24"/>
                     <a:stretch>
                       <a:fillRect/>
                     </a:stretch>
@@ -9503,7 +9763,7 @@
     </w:p>
     <w:p>
       <w:pPr>
-        <w:pStyle w:val="Heading2"/>
+        <w:pStyle w:val="Heading3"/>
       </w:pPr>
       <w:r>
         <w:t>4.1. Chức năng "Đặt phòng"</w:t>
@@ -9511,7 +9771,7 @@
     </w:p>
     <w:p>
       <w:pPr>
-        <w:pStyle w:val="Heading3"/>
+        <w:pStyle w:val="Heading4"/>
       </w:pPr>
       <w:r>
         <w:t>a) Biểu đồ tuần tự</w:t>
@@ -9531,7 +9791,7 @@
         <w:drawing>
           <wp:inline xmlns:a="http://schemas.openxmlformats.org/drawingml/2006/main" xmlns:pic="http://schemas.openxmlformats.org/drawingml/2006/picture">
             <wp:extent cx="5486400" cy="5318489"/>
-            <wp:docPr id="12" name="Picture 12"/>
+            <wp:docPr id="17" name="Picture 17"/>
             <wp:cNvGraphicFramePr>
               <a:graphicFrameLocks noChangeAspect="1"/>
             </wp:cNvGraphicFramePr>
@@ -9543,7 +9803,7 @@
                     <pic:cNvPicPr/>
                   </pic:nvPicPr>
                   <pic:blipFill>
-                    <a:blip r:embed="rId20"/>
+                    <a:blip r:embed="rId25"/>
                     <a:stretch>
                       <a:fillRect/>
                     </a:stretch>
@@ -9564,17 +9824,18 @@
     </w:p>
     <w:p>
       <w:pPr>
-        <w:pStyle w:val="Heading3"/>
+        <w:pStyle w:val="Heading4"/>
       </w:pPr>
       <w:r>
         <w:t>b) Kịch bản phiên bản 3</w:t>
       </w:r>
     </w:p>
     <w:p>
-      <w:pPr>
-        <w:pStyle w:val="Heading3"/>
-      </w:pPr>
-      <w:r>
+      <w:pPr/>
+      <w:r>
+        <w:rPr>
+          <w:b/>
+        </w:rPr>
         <w:t>Kịch bản phiên bản 3 - Đặt phòng</w:t>
       </w:r>
     </w:p>
@@ -9605,229 +9866,211 @@
     <w:p>
       <w:pPr/>
       <w:r>
-        <w:t>5. Nhân viên hỏi khách hàng thời gian đặt phòng.</w:t>
+        <w:t>5. Nhân viên nhập thời gian bắt đầu (startTime), thời gian kết thúc (endTime) và chọn chi nhánh (branchId).</w:t>
       </w:r>
     </w:p>
     <w:p>
       <w:pPr/>
       <w:r>
-        <w:t>6. Khách hàng trả lời.</w:t>
+        <w:t>6. Nhân viên click nút [Tìm phòng trống].</w:t>
       </w:r>
     </w:p>
     <w:p>
       <w:pPr/>
       <w:r>
-        <w:t>7. Nhân viên nhập thời gian bắt đầu (startTime), thời gian kết thúc (endTime) và chọn chi nhánh (branchId).</w:t>
+        <w:t>7. Phương thức btnSearchClick() của lớp SearchFreeRoomForm được gọi.</w:t>
       </w:r>
     </w:p>
     <w:p>
       <w:pPr/>
       <w:r>
-        <w:t>8. Nhân viên click nút [Tìm phòng trống].</w:t>
+        <w:t>8. Phương thức btnSearchClick() gọi phương thức searchFreeRoom(startTime: Date, endTime: Date, branchId: int) của lớp BookingController.</w:t>
       </w:r>
     </w:p>
     <w:p>
       <w:pPr/>
       <w:r>
-        <w:t>9. Phương thức btnSearchClick() của lớp SearchFreeRoomForm được gọi.</w:t>
+        <w:t>9. Phương thức searchFreeRoom() gọi phương thức findByTimeAndBranch(startTime, endTime, branchId) của lớp Entity Room.</w:t>
       </w:r>
     </w:p>
     <w:p>
       <w:pPr/>
       <w:r>
-        <w:t>10. Phương thức btnSearchClick() gọi phương thức searchFreeRoom(startTime: Date, endTime: Date, branchId: int) của lớp BookingController.</w:t>
+        <w:t>10. Lớp Room trả kết quả danh sách phòng trống về cho phương thức searchFreeRoom().</w:t>
       </w:r>
     </w:p>
     <w:p>
       <w:pPr/>
       <w:r>
-        <w:t>11. Phương thức searchFreeRoom() gọi phương thức findByTimeAndBranch(startTime, endTime, branchId) của lớp Entity Room.</w:t>
+        <w:t>11. Phương thức searchFreeRoom() trả kết quả về cho phương thức btnSearchClick().</w:t>
       </w:r>
     </w:p>
     <w:p>
       <w:pPr/>
       <w:r>
-        <w:t>12. Lớp Room trả kết quả danh sách phòng trống về cho phương thức searchFreeRoom().</w:t>
+        <w:t>12. Lớp SearchFreeRoomForm hiển thị danh sách phòng trống cho nhân viên.</w:t>
       </w:r>
     </w:p>
     <w:p>
       <w:pPr/>
       <w:r>
-        <w:t>13. Phương thức searchFreeRoom() trả kết quả về cho phương thức btnSearchClick().</w:t>
+        <w:t>13. Nhân viên ấn vào phòng trống.</w:t>
       </w:r>
     </w:p>
     <w:p>
       <w:pPr/>
       <w:r>
-        <w:t>14. Lớp SearchFreeRoomForm hiển thị danh sách phòng trống cho nhân viên.</w:t>
+        <w:t>14. Phương thức tblRoomsClick(selectedRow: int) của lớp SearchFreeRoomForm được gọi.</w:t>
       </w:r>
     </w:p>
     <w:p>
       <w:pPr/>
       <w:r>
-        <w:t>15. Nhân viên ấn vào phòng trống.</w:t>
+        <w:t>15. Phương thức tblRoomsClick() gọi phương thức navigate(roomId) của lớp SearchClientForm.</w:t>
       </w:r>
     </w:p>
     <w:p>
       <w:pPr/>
       <w:r>
-        <w:t>16. Phương thức tblRoomsClick(selectedRow: int) của lớp SearchFreeRoomForm được gọi.</w:t>
+        <w:t>16. Lớp SearchClientForm hiển thị form tìm khách hàng cho nhân viên.</w:t>
       </w:r>
     </w:p>
     <w:p>
       <w:pPr/>
       <w:r>
-        <w:t>17. Phương thức tblRoomsClick() gọi phương thức navigate(roomId) của lớp SearchClientForm.</w:t>
+        <w:t>17. Nhân viên nhập thông tin khách hàng (tên hoặc số điện thoại).</w:t>
       </w:r>
     </w:p>
     <w:p>
       <w:pPr/>
       <w:r>
-        <w:t>18. Lớp SearchClientForm hiển thị form tìm khách hàng cho nhân viên.</w:t>
+        <w:t>18. Nhân viên click [Tìm kiếm].</w:t>
       </w:r>
     </w:p>
     <w:p>
       <w:pPr/>
       <w:r>
-        <w:t>19. Nhân viên hỏi khách hàng về thông tin khách hàng.</w:t>
+        <w:t>19. Phương thức btnSearchClick() của lớp SearchClientForm được gọi.</w:t>
       </w:r>
     </w:p>
     <w:p>
       <w:pPr/>
       <w:r>
-        <w:t>20. Khách hàng trả lời.</w:t>
+        <w:t>20. Phương thức btnSearchClick() gọi phương thức searchClient(keyword: String) của lớp BookingController.</w:t>
       </w:r>
     </w:p>
     <w:p>
       <w:pPr/>
       <w:r>
-        <w:t>21. Nhân viên nhập thông tin khách hàng (tên hoặc số điện thoại) và click [Tìm kiếm].</w:t>
+        <w:t>21. Phương thức searchClient() gọi phương thức findByKeyword(keyword) của lớp Entity Client.</w:t>
       </w:r>
     </w:p>
     <w:p>
       <w:pPr/>
       <w:r>
-        <w:t>22. Phương thức btnSearchClick() của lớp SearchClientForm được gọi.</w:t>
+        <w:t>22. Lớp Client trả kết quả danh sách khách hàng về cho phương thức searchClient().</w:t>
       </w:r>
     </w:p>
     <w:p>
       <w:pPr/>
       <w:r>
-        <w:t>23. Phương thức btnSearchClick() gọi phương thức searchClient(keyword: String) của lớp BookingController.</w:t>
+        <w:t>23. Phương thức searchClient() trả kết quả về cho phương thức btnSearchClick().</w:t>
       </w:r>
     </w:p>
     <w:p>
       <w:pPr/>
       <w:r>
-        <w:t>24. Phương thức searchClient() gọi phương thức findByKeyword(keyword) của lớp Entity Client.</w:t>
+        <w:t>24. Lớp SearchClientForm hiển thị danh sách khách hàng khớp.</w:t>
       </w:r>
     </w:p>
     <w:p>
       <w:pPr/>
       <w:r>
-        <w:t>25. Lớp Client trả kết quả danh sách khách hàng về cho phương thức searchClient().</w:t>
+        <w:t>25. Nhân viên chọn thông tin khách hàng tương ứng.</w:t>
       </w:r>
     </w:p>
     <w:p>
       <w:pPr/>
       <w:r>
-        <w:t>26. Phương thức searchClient() trả kết quả về cho phương thức btnSearchClick().</w:t>
+        <w:t>26. Phương thức tblClientsClick(selectedRow: int) của lớp SearchClientForm được gọi.</w:t>
       </w:r>
     </w:p>
     <w:p>
       <w:pPr/>
       <w:r>
-        <w:t>27. Lớp SearchClientForm hiển thị danh sách khách hàng khớp.</w:t>
+        <w:t>27. Phương thức tblClientsClick() gọi phương thức navigate(roomId, clientId, timeRange) của lớp ConfirmBookingModal.</w:t>
       </w:r>
     </w:p>
     <w:p>
       <w:pPr/>
       <w:r>
-        <w:t>28. Nhân viên chọn thông tin khách hàng tương ứng.</w:t>
+        <w:t>28. Lớp ConfirmBookingModal hiển thị thông tin xác nhận đặt phòng.</w:t>
       </w:r>
     </w:p>
     <w:p>
       <w:pPr/>
       <w:r>
-        <w:t>29. Phương thức tblClientsClick(selectedRow: int) của lớp SearchClientForm được gọi.</w:t>
+        <w:t>29. Nhân viên ấn nút xác nhận.</w:t>
       </w:r>
     </w:p>
     <w:p>
       <w:pPr/>
       <w:r>
-        <w:t>30. Phương thức tblClientsClick() gọi phương thức navigate(roomId, clientId, timeRange) của lớp ConfirmBookingModal.</w:t>
+        <w:t>30. Phương thức btnConfirmClick() của lớp ConfirmBookingModal được gọi.</w:t>
       </w:r>
     </w:p>
     <w:p>
       <w:pPr/>
       <w:r>
-        <w:t>31. Lớp ConfirmBookingModal hiển thị thông tin xác nhận đặt phòng.</w:t>
+        <w:t>31. Phương thức btnConfirmClick() gọi phương thức createBooking(clientId: int, roomId: int, startTime: Date, endTime: Date, staffId: int) của lớp BookingController.</w:t>
       </w:r>
     </w:p>
     <w:p>
       <w:pPr/>
       <w:r>
-        <w:t>32. Nhân viên ấn nút xác nhận.</w:t>
+        <w:t>32. Phương thức createBooking() gọi phương thức updateStatus(roomId, "Chờ nhận") của lớp Entity Room_receipt.</w:t>
       </w:r>
     </w:p>
     <w:p>
       <w:pPr/>
       <w:r>
-        <w:t>33. Phương thức btnConfirmClick() của lớp ConfirmBookingModal được gọi.</w:t>
+        <w:t>33. Lớp Room_receipt cập nhật trạng thái và trả kết quả về cho phương thức createBooking().</w:t>
       </w:r>
     </w:p>
     <w:p>
       <w:pPr/>
       <w:r>
-        <w:t>34. Phương thức btnConfirmClick() gọi phương thức createBooking(clientId: int, roomId: int, startTime: Date, endTime: Date, staffId: int) của lớp BookingController.</w:t>
+        <w:t>34. Phương thức createBooking() lưu booking vào CSDL và trả BookingResponse về cho phương thức btnConfirmClick().</w:t>
       </w:r>
     </w:p>
     <w:p>
       <w:pPr/>
       <w:r>
-        <w:t>35. Phương thức createBooking() gọi phương thức updateStatus(roomId, "Chờ nhận") của lớp Entity Room_receipt.</w:t>
+        <w:t>35. Lớp ConfirmBookingModal hiển thị thông báo "Đặt phòng thành công!".</w:t>
       </w:r>
     </w:p>
     <w:p>
       <w:pPr/>
       <w:r>
-        <w:t>36. Lớp Room_receipt cập nhật trạng thái và trả kết quả về cho phương thức createBooking().</w:t>
+        <w:t>36. Nhân viên ấn nút OK.</w:t>
       </w:r>
     </w:p>
     <w:p>
       <w:pPr/>
       <w:r>
-        <w:t>37. Phương thức createBooking() lưu booking vào CSDL và trả BookingResponse về cho phương thức btnConfirmClick().</w:t>
+        <w:t>37. Phương thức showMessage() của lớp ConfirmBookingModal được gọi.</w:t>
       </w:r>
     </w:p>
     <w:p>
       <w:pPr/>
       <w:r>
-        <w:t>38. Lớp ConfirmBookingModal hiển thị thông báo "Đặt phòng thành công!".</w:t>
+        <w:t>38. Phương thức showMessage() gọi phương thức navigate() của lớp ReceptionistHomePage.</w:t>
       </w:r>
     </w:p>
     <w:p>
       <w:pPr/>
       <w:r>
-        <w:t>39. Nhân viên ấn nút OK.</w:t>
-      </w:r>
-    </w:p>
-    <w:p>
-      <w:pPr/>
-      <w:r>
-        <w:t>40. Phương thức showMessage() của lớp ConfirmBookingModal được gọi.</w:t>
-      </w:r>
-    </w:p>
-    <w:p>
-      <w:pPr/>
-      <w:r>
-        <w:t>41. Phương thức showMessage() gọi phương thức navigate() của lớp ReceptionistHomePage.</w:t>
-      </w:r>
-    </w:p>
-    <w:p>
-      <w:pPr/>
-      <w:r>
-        <w:t>42. Hệ thống quay về giao diện chính ReceptionistHomePage.</w:t>
+        <w:t>39. Hệ thống quay về giao diện chính ReceptionistHomePage.</w:t>
       </w:r>
     </w:p>
     <w:p>
@@ -9870,76 +10113,7 @@
     <w:p>
       <w:pPr/>
       <w:r>
-        <w:t>17. Phương thức createBooking(clientId: int, roomId: int, startTime: Date, endTime: Date, staffId: int) của lớp BookingController được gọi.</w:t>
-      </w:r>
-    </w:p>
-    <w:p>
-      <w:pPr/>
-      <w:r>
-        <w:t>18. BookingController cập nhật trạng thái phòng thành "Chờ nhận" và lưu booking vào CSDL.</w:t>
-      </w:r>
-    </w:p>
-    <w:p>
-      <w:pPr/>
-      <w:r>
-        <w:t>19. ConfirmBookingModal hiển thị thông báo "Đặt phòng thành công!".</w:t>
-      </w:r>
-    </w:p>
-    <w:p>
-      <w:pPr/>
-      <w:r>
-        <w:t>20. Nhân viên click [OK], hệ thống quay về ReceptionistHomePage.</w:t>
-      </w:r>
-    </w:p>
-    <w:p>
-      <w:pPr/>
-      <w:r>
-        <w:rPr>
-          <w:b/>
-        </w:rPr>
-        <w:t>Ngoại lệ:</w:t>
-      </w:r>
-    </w:p>
-    <w:p>
-      <w:pPr>
-        <w:pStyle w:val="ListBullet"/>
-      </w:pPr>
-      <w:r>
-        <w:rPr>
-          <w:b/>
-        </w:rPr>
-        <w:t>Phòng trống không tìm thấy:</w:t>
-      </w:r>
-      <w:r>
-        <w:t xml:space="preserve"> BookingController trả về danh sách rỗng. SearchFreeRoomForm hiển thị "Không có phòng trống trong khung giờ này."</w:t>
-      </w:r>
-    </w:p>
-    <w:p>
-      <w:pPr>
-        <w:pStyle w:val="ListBullet"/>
-      </w:pPr>
-      <w:r>
-        <w:rPr>
-          <w:b/>
-        </w:rPr>
-        <w:t>Khách hàng chưa có trong CSDL:</w:t>
-      </w:r>
-      <w:r>
-        <w:t xml:space="preserve"> SearchClientForm hiển thị nút [Đăng ký nhanh]. Nhân viên nhập thông tin mới, hệ thống tạo khách hàng mới trước khi tiếp tục.</w:t>
-      </w:r>
-    </w:p>
-    <w:p>
-      <w:pPr/>
-      <w:r>
         <w:t>---</w:t>
-      </w:r>
-    </w:p>
-    <w:p>
-      <w:pPr>
-        <w:pStyle w:val="Heading2"/>
-      </w:pPr>
-      <w:r>
-        <w:t>4.2. Chức năng "Check-in"</w:t>
       </w:r>
     </w:p>
     <w:p>
@@ -9947,6 +10121,14 @@
         <w:pStyle w:val="Heading3"/>
       </w:pPr>
       <w:r>
+        <w:t>4.2. Chức năng "Check-in"</w:t>
+      </w:r>
+    </w:p>
+    <w:p>
+      <w:pPr>
+        <w:pStyle w:val="Heading4"/>
+      </w:pPr>
+      <w:r>
         <w:t>a) Biểu đồ tuần tự</w:t>
       </w:r>
     </w:p>
@@ -9963,8 +10145,8 @@
       <w:r>
         <w:drawing>
           <wp:inline xmlns:a="http://schemas.openxmlformats.org/drawingml/2006/main" xmlns:pic="http://schemas.openxmlformats.org/drawingml/2006/picture">
-            <wp:extent cx="5486400" cy="4732713"/>
-            <wp:docPr id="13" name="Picture 13"/>
+            <wp:extent cx="5486400" cy="4667034"/>
+            <wp:docPr id="18" name="Picture 18"/>
             <wp:cNvGraphicFramePr>
               <a:graphicFrameLocks noChangeAspect="1"/>
             </wp:cNvGraphicFramePr>
@@ -9976,7 +10158,7 @@
                     <pic:cNvPicPr/>
                   </pic:nvPicPr>
                   <pic:blipFill>
-                    <a:blip r:embed="rId21"/>
+                    <a:blip r:embed="rId26"/>
                     <a:stretch>
                       <a:fillRect/>
                     </a:stretch>
@@ -9984,7 +10166,7 @@
                   <pic:spPr>
                     <a:xfrm>
                       <a:off x="0" y="0"/>
-                      <a:ext cx="5486400" cy="4732713"/>
+                      <a:ext cx="5486400" cy="4667034"/>
                     </a:xfrm>
                     <a:prstGeom prst="rect"/>
                   </pic:spPr>
@@ -9997,17 +10179,18 @@
     </w:p>
     <w:p>
       <w:pPr>
-        <w:pStyle w:val="Heading3"/>
+        <w:pStyle w:val="Heading4"/>
       </w:pPr>
       <w:r>
         <w:t>b) Kịch bản phiên bản 3</w:t>
       </w:r>
     </w:p>
     <w:p>
-      <w:pPr>
-        <w:pStyle w:val="Heading3"/>
-      </w:pPr>
-      <w:r>
+      <w:pPr/>
+      <w:r>
+        <w:rPr>
+          <w:b/>
+        </w:rPr>
         <w:t>Kịch bản phiên bản 3 - Check-in</w:t>
       </w:r>
     </w:p>
@@ -10032,157 +10215,139 @@
     <w:p>
       <w:pPr/>
       <w:r>
-        <w:t>4. Lớp CheckInPage hiển thị danh sách booking chờ nhận phòng.</w:t>
+        <w:t>4. Phương thức formLoad() của lớp CheckInPage được gọi.</w:t>
       </w:r>
     </w:p>
     <w:p>
       <w:pPr/>
       <w:r>
-        <w:t>5. Phương thức formLoad() của lớp CheckInPage được gọi.</w:t>
+        <w:t>5. Phương thức formLoad() gọi phương thức getPendingBookings(branchId: int, date: Date) của lớp BookingController.</w:t>
       </w:r>
     </w:p>
     <w:p>
       <w:pPr/>
       <w:r>
-        <w:t>6. Phương thức formLoad() gọi phương thức getPendingBookings(branchId: int, date: Date) của lớp BookingController.</w:t>
+        <w:t>6. Phương thức getPendingBookings() gọi phương thức findByStatus("Chờ nhận") của lớp Entity Room.</w:t>
       </w:r>
     </w:p>
     <w:p>
       <w:pPr/>
       <w:r>
-        <w:t>7. Phương thức getPendingBookings() gọi phương thức findByStatus("Chờ nhận") của lớp Entity Room.</w:t>
+        <w:t>7. Lớp Room trả kết quả danh sách booking về cho phương thức getPendingBookings().</w:t>
       </w:r>
     </w:p>
     <w:p>
       <w:pPr/>
       <w:r>
-        <w:t>8. Lớp Room trả kết quả danh sách booking về cho phương thức getPendingBookings().</w:t>
+        <w:t>8. Phương thức getPendingBookings() trả kết quả về cho phương thức formLoad().</w:t>
       </w:r>
     </w:p>
     <w:p>
       <w:pPr/>
       <w:r>
-        <w:t>9. Phương thức getPendingBookings() trả kết quả về cho phương thức formLoad().</w:t>
+        <w:t>9. Lớp CheckInPage hiển thị danh sách booking "Chờ nhận" hôm nay cho nhân viên.</w:t>
       </w:r>
     </w:p>
     <w:p>
       <w:pPr/>
       <w:r>
-        <w:t>10. Lớp CheckInPage hiển thị danh sách booking "Chờ nhận" hôm nay cho nhân viên.</w:t>
+        <w:t>10. Nhân viên ấn chọn booking tương ứng cần check-in trên danh sách.</w:t>
       </w:r>
     </w:p>
     <w:p>
       <w:pPr/>
       <w:r>
-        <w:t>11. Nhân viên hỏi khách hàng thông tin (tên hoặc mã đặt phòng) để đối chiếu.</w:t>
+        <w:t>11. Phương thức tblPendingBookingsClick(selectedRow: int) của lớp CheckInPage được gọi.</w:t>
       </w:r>
     </w:p>
     <w:p>
       <w:pPr/>
       <w:r>
-        <w:t>12. Khách hàng trả lời.</w:t>
+        <w:t>12. Phương thức tblPendingBookingsClick() gọi phương thức navigate(bookingId) của lớp ConfirmCheckInView.</w:t>
       </w:r>
     </w:p>
     <w:p>
       <w:pPr/>
       <w:r>
-        <w:t>13. Nhân viên ấn chọn booking tương ứng cần check-in trên danh sách.</w:t>
+        <w:t>13. Lớp ConfirmCheckInView hiển thị thông tin chi tiết của phòng và khách hàng.</w:t>
       </w:r>
     </w:p>
     <w:p>
       <w:pPr/>
       <w:r>
-        <w:t>14. Phương thức tblPendingBookingsClick(selectedRow: int) của lớp CheckInPage được gọi.</w:t>
+        <w:t>14. Nhân viên ấn nút xác nhận check-in.</w:t>
       </w:r>
     </w:p>
     <w:p>
       <w:pPr/>
       <w:r>
-        <w:t>15. Phương thức tblPendingBookingsClick() gọi phương thức navigate(bookingId) của lớp ConfirmCheckInView.</w:t>
+        <w:t>15. Phương thức btnCheckInClick() của lớp ConfirmCheckInView được gọi.</w:t>
       </w:r>
     </w:p>
     <w:p>
       <w:pPr/>
       <w:r>
-        <w:t>16. Lớp ConfirmCheckInView hiển thị thông tin chi tiết của phòng và khách hàng.</w:t>
+        <w:t>16. Phương thức btnCheckInClick() gọi phương thức checkIn(bookingId: int) của lớp BookingController.</w:t>
       </w:r>
     </w:p>
     <w:p>
       <w:pPr/>
       <w:r>
-        <w:t>17. Nhân viên ấn nút xác nhận check-in.</w:t>
+        <w:t>17. Phương thức checkIn() gọi phương thức updateStatus(roomId, "Đang hoạt động") của lớp Entity Room.</w:t>
       </w:r>
     </w:p>
     <w:p>
       <w:pPr/>
       <w:r>
-        <w:t>18. Phương thức btnCheckInClick() của lớp ConfirmCheckInView được gọi.</w:t>
+        <w:t>18. Lớp Room cập nhật trạng thái và trả kết quả về cho phương thức checkIn().</w:t>
       </w:r>
     </w:p>
     <w:p>
       <w:pPr/>
       <w:r>
-        <w:t>19. Phương thức btnCheckInClick() gọi phương thức checkIn(bookingId: int) của lớp BookingController.</w:t>
+        <w:t>19. Phương thức checkIn() gọi phương thức setStartTime(now) của lớp Entity Room_receipt.</w:t>
       </w:r>
     </w:p>
     <w:p>
       <w:pPr/>
       <w:r>
-        <w:t>20. Phương thức checkIn() gọi phương thức updateStatus(roomId, "Đang hoạt động") của lớp Entity Room.</w:t>
+        <w:t>20. Lớp Room_receipt ghi nhận thời gian bắt đầu và trả kết quả về cho phương thức checkIn().</w:t>
       </w:r>
     </w:p>
     <w:p>
       <w:pPr/>
       <w:r>
-        <w:t>21. Lớp Room cập nhật trạng thái và trả kết quả về cho phương thức checkIn().</w:t>
+        <w:t>21. Phương thức checkIn() trả BookingResponse về cho phương thức btnCheckInClick().</w:t>
       </w:r>
     </w:p>
     <w:p>
       <w:pPr/>
       <w:r>
-        <w:t>22. Phương thức checkIn() gọi phương thức setStartTime(now) của lớp Entity Room_receipt.</w:t>
+        <w:t>22. Lớp ConfirmCheckInView hiển thị thông báo "Check-in thành công! Phòng [tên phòng] đã sẵn sàng."</w:t>
       </w:r>
     </w:p>
     <w:p>
       <w:pPr/>
       <w:r>
-        <w:t>23. Lớp Room_receipt ghi nhận thời gian bắt đầu và trả kết quả về cho phương thức checkIn().</w:t>
+        <w:t>23. Nhân viên ấn nút quay lại.</w:t>
       </w:r>
     </w:p>
     <w:p>
       <w:pPr/>
       <w:r>
-        <w:t>24. Phương thức checkIn() trả BookingResponse về cho phương thức btnCheckInClick().</w:t>
+        <w:t>24. Phương thức showMessage() của lớp ConfirmCheckInView được gọi.</w:t>
       </w:r>
     </w:p>
     <w:p>
       <w:pPr/>
       <w:r>
-        <w:t>25. Lớp ConfirmCheckInView hiển thị thông báo "Check-in thành công! Phòng [tên phòng] đã sẵn sàng."</w:t>
+        <w:t>25. Phương thức showMessage() gọi phương thức navigate() của lớp ReceptionistHomePage.</w:t>
       </w:r>
     </w:p>
     <w:p>
       <w:pPr/>
       <w:r>
-        <w:t>26. Nhân viên ấn nút quay lại.</w:t>
-      </w:r>
-    </w:p>
-    <w:p>
-      <w:pPr/>
-      <w:r>
-        <w:t>27. Phương thức showMessage() của lớp ConfirmCheckInView được gọi.</w:t>
-      </w:r>
-    </w:p>
-    <w:p>
-      <w:pPr/>
-      <w:r>
-        <w:t>28. Phương thức showMessage() gọi phương thức navigate() của lớp ReceptionistHomePage.</w:t>
-      </w:r>
-    </w:p>
-    <w:p>
-      <w:pPr/>
-      <w:r>
-        <w:t>29. Hệ thống quay về giao diện chính ReceptionistHomePage.</w:t>
+        <w:t>26. Hệ thống quay về giao diện chính ReceptionistHomePage.</w:t>
       </w:r>
     </w:p>
     <w:p>
@@ -10230,7 +10395,7 @@
     </w:p>
     <w:p>
       <w:pPr>
-        <w:pStyle w:val="Heading2"/>
+        <w:pStyle w:val="Heading3"/>
       </w:pPr>
       <w:r>
         <w:t>4.3. Chức năng "Check-out"</w:t>
@@ -10238,7 +10403,7 @@
     </w:p>
     <w:p>
       <w:pPr>
-        <w:pStyle w:val="Heading3"/>
+        <w:pStyle w:val="Heading4"/>
       </w:pPr>
       <w:r>
         <w:t>a) Biểu đồ tuần tự</w:t>
@@ -10258,7 +10423,7 @@
         <w:drawing>
           <wp:inline xmlns:a="http://schemas.openxmlformats.org/drawingml/2006/main" xmlns:pic="http://schemas.openxmlformats.org/drawingml/2006/picture">
             <wp:extent cx="5486400" cy="5403954"/>
-            <wp:docPr id="14" name="Picture 14"/>
+            <wp:docPr id="19" name="Picture 19"/>
             <wp:cNvGraphicFramePr>
               <a:graphicFrameLocks noChangeAspect="1"/>
             </wp:cNvGraphicFramePr>
@@ -10270,7 +10435,7 @@
                     <pic:cNvPicPr/>
                   </pic:nvPicPr>
                   <pic:blipFill>
-                    <a:blip r:embed="rId22"/>
+                    <a:blip r:embed="rId27"/>
                     <a:stretch>
                       <a:fillRect/>
                     </a:stretch>
@@ -10291,17 +10456,18 @@
     </w:p>
     <w:p>
       <w:pPr>
-        <w:pStyle w:val="Heading3"/>
+        <w:pStyle w:val="Heading4"/>
       </w:pPr>
       <w:r>
         <w:t>b) Kịch bản phiên bản 3</w:t>
       </w:r>
     </w:p>
     <w:p>
-      <w:pPr>
-        <w:pStyle w:val="Heading3"/>
-      </w:pPr>
-      <w:r>
+      <w:pPr/>
+      <w:r>
+        <w:rPr>
+          <w:b/>
+        </w:rPr>
         <w:t>Kịch bản phiên bản 3 - Check-out</w:t>
       </w:r>
     </w:p>
@@ -10326,259 +10492,235 @@
     <w:p>
       <w:pPr/>
       <w:r>
-        <w:t>4. Lớp CheckOutPage hiển thị danh sách phòng đang hoạt động.</w:t>
+        <w:t>4. Phương thức formLoad() của lớp CheckOutPage được gọi.</w:t>
       </w:r>
     </w:p>
     <w:p>
       <w:pPr/>
       <w:r>
-        <w:t>5. Phương thức formLoad() của lớp CheckOutPage được gọi.</w:t>
+        <w:t>5. Phương thức formLoad() gọi phương thức getActiveRooms(branchId: int) của lớp BookingController.</w:t>
       </w:r>
     </w:p>
     <w:p>
       <w:pPr/>
       <w:r>
-        <w:t>6. Phương thức formLoad() gọi phương thức getActiveRooms(branchId: int) của lớp BookingController.</w:t>
+        <w:t>6. Phương thức getActiveRooms() gọi phương thức findByStatus("Đang hoạt động") của lớp Entity Room.</w:t>
       </w:r>
     </w:p>
     <w:p>
       <w:pPr/>
       <w:r>
-        <w:t>7. Phương thức getActiveRooms() gọi phương thức findByStatus("Đang hoạt động") của lớp Entity Room.</w:t>
+        <w:t>7. Lớp Room trả kết quả danh sách phòng về cho phương thức getActiveRooms().</w:t>
       </w:r>
     </w:p>
     <w:p>
       <w:pPr/>
       <w:r>
-        <w:t>8. Lớp Room trả kết quả danh sách phòng về cho phương thức getActiveRooms().</w:t>
+        <w:t>8. Phương thức getActiveRooms() trả kết quả về cho phương thức formLoad().</w:t>
       </w:r>
     </w:p>
     <w:p>
       <w:pPr/>
       <w:r>
-        <w:t>9. Phương thức getActiveRooms() trả kết quả về cho phương thức formLoad().</w:t>
+        <w:t>9. Lớp CheckOutPage hiển thị danh sách phòng đang sử dụng cho nhân viên.</w:t>
       </w:r>
     </w:p>
     <w:p>
       <w:pPr/>
       <w:r>
-        <w:t>10. Lớp CheckOutPage hiển thị danh sách phòng đang sử dụng cho nhân viên.</w:t>
+        <w:t>10. Nhân viên chọn phòng tương ứng trên danh sách.</w:t>
       </w:r>
     </w:p>
     <w:p>
       <w:pPr/>
       <w:r>
-        <w:t>11. Nhân viên hỏi khách hàng số phòng cần trả.</w:t>
+        <w:t>11. Phương thức tblActiveRoomsClick(selectedRow: int) của lớp CheckOutPage được gọi.</w:t>
       </w:r>
     </w:p>
     <w:p>
       <w:pPr/>
       <w:r>
-        <w:t>12. Khách hàng trả lời.</w:t>
+        <w:t>12. Phương thức tblActiveRoomsClick() gọi phương thức navigate(room_receipt_ID) của lớp InvoicePanel.</w:t>
       </w:r>
     </w:p>
     <w:p>
       <w:pPr/>
       <w:r>
-        <w:t>13. Nhân viên chọn phòng tương ứng trên danh sách.</w:t>
+        <w:t>13. Phương thức formLoad(invoice: Room_receipt) của lớp InvoicePanel được gọi.</w:t>
       </w:r>
     </w:p>
     <w:p>
       <w:pPr/>
       <w:r>
-        <w:t>14. Phương thức tblActiveRoomsClick(selectedRow: int) của lớp CheckOutPage được gọi.</w:t>
+        <w:t>14. Phương thức formLoad() gọi phương thức calculateInvoice(room_receipt_ID: int) của lớp BookingController.</w:t>
       </w:r>
     </w:p>
     <w:p>
       <w:pPr/>
       <w:r>
-        <w:t>15. Phương thức tblActiveRoomsClick() gọi phương thức navigate(room_receipt_ID) của lớp InvoicePanel.</w:t>
+        <w:t>15. Phương thức calculateInvoice() gọi phương thức calculateTimeFee() + calculateServiceFee() của lớp Entity Room_receipt.</w:t>
       </w:r>
     </w:p>
     <w:p>
       <w:pPr/>
       <w:r>
-        <w:t>16. Lớp InvoicePanel hiển thị chi tiết hóa đơn.</w:t>
+        <w:t>16. Lớp Room_receipt trả kết quả hóa đơn về cho phương thức calculateInvoice().</w:t>
       </w:r>
     </w:p>
     <w:p>
       <w:pPr/>
       <w:r>
-        <w:t>17. Phương thức formLoad(invoice: Room_receipt) của lớp InvoicePanel được gọi.</w:t>
+        <w:t>17. Phương thức calculateInvoice() trả Room_receipt về cho phương thức formLoad().</w:t>
       </w:r>
     </w:p>
     <w:p>
       <w:pPr/>
       <w:r>
-        <w:t>18. Phương thức formLoad() gọi phương thức calculateInvoice(room_receipt_ID: int) của lớp BookingController.</w:t>
+        <w:t>18. Lớp InvoicePanel hiển thị chi tiết tiền phòng, dịch vụ, thời gian sử dụng và tổng tiền.</w:t>
       </w:r>
     </w:p>
     <w:p>
       <w:pPr/>
       <w:r>
-        <w:t>19. Phương thức calculateInvoice() gọi phương thức calculateTimeFee() + calculateServiceFee() của lớp Entity Room_receipt.</w:t>
+        <w:t>19. Nhân viên thông báo tổng tiền cho khách hàng.</w:t>
       </w:r>
     </w:p>
     <w:p>
       <w:pPr/>
       <w:r>
-        <w:t>20. Lớp Room_receipt trả kết quả hóa đơn về cho phương thức calculateInvoice().</w:t>
+        <w:t>20. Khách hàng cung cấp mã ưu đãi (nếu có).</w:t>
       </w:r>
     </w:p>
     <w:p>
       <w:pPr/>
       <w:r>
-        <w:t>21. Phương thức calculateInvoice() trả Room_receipt về cho phương thức formLoad().</w:t>
+        <w:t>21. Nhân viên nhập mã và ấn áp dụng.</w:t>
       </w:r>
     </w:p>
     <w:p>
       <w:pPr/>
       <w:r>
-        <w:t>22. Lớp InvoicePanel hiển thị chi tiết tiền phòng, dịch vụ, thời gian sử dụng và tổng tiền.</w:t>
+        <w:t>22. Phương thức btnApply() của lớp InvoicePanel được gọi.</w:t>
       </w:r>
     </w:p>
     <w:p>
       <w:pPr/>
       <w:r>
-        <w:t>23. Nhân viên thông báo tổng tiền cho khách hàng.</w:t>
+        <w:t>23. Phương thức btnApply() gọi phương thức applyPromotion(room_receipt_ID: int) của lớp BookingController.</w:t>
       </w:r>
     </w:p>
     <w:p>
       <w:pPr/>
       <w:r>
-        <w:t>24. Khách hàng cung cấp mã ưu đãi (nếu có).</w:t>
+        <w:t>24. Phương thức applyPromotion() gọi phương thức applyVoucher() của lớp Entity Promotion.</w:t>
       </w:r>
     </w:p>
     <w:p>
       <w:pPr/>
       <w:r>
-        <w:t>25. Nhân viên nhập mã và ấn áp dụng.</w:t>
+        <w:t>25. Lớp Promotion trả kết quả giảm giá về cho phương thức applyPromotion().</w:t>
       </w:r>
     </w:p>
     <w:p>
       <w:pPr/>
       <w:r>
-        <w:t>26. Phương thức btnApply() của lớp InvoicePanel được gọi.</w:t>
+        <w:t>26. Phương thức applyPromotion() trả kết quả về cho phương thức btnApply().</w:t>
       </w:r>
     </w:p>
     <w:p>
       <w:pPr/>
       <w:r>
-        <w:t>27. Phương thức btnApply() gọi phương thức applyPromotion(room_receipt_ID: int) của lớp BookingController.</w:t>
+        <w:t>27. Lớp InvoicePanel cập nhật lại tổng tiền sau giảm giá.</w:t>
       </w:r>
     </w:p>
     <w:p>
       <w:pPr/>
       <w:r>
-        <w:t>28. Phương thức applyPromotion() gọi phương thức applyVoucher() của lớp Entity Promotion.</w:t>
+        <w:t>28. Khách hàng đưa tiền mặt cho nhân viên.</w:t>
       </w:r>
     </w:p>
     <w:p>
       <w:pPr/>
       <w:r>
-        <w:t>29. Lớp Promotion trả kết quả giảm giá về cho phương thức applyPromotion().</w:t>
+        <w:t>29. Nhân viên chọn phương thức thanh toán và click nút xác nhận thanh toán.</w:t>
       </w:r>
     </w:p>
     <w:p>
       <w:pPr/>
       <w:r>
-        <w:t>30. Phương thức applyPromotion() trả kết quả về cho phương thức btnApply().</w:t>
+        <w:t>30. Phương thức btnThanhToanClick() của lớp InvoicePanel được gọi.</w:t>
       </w:r>
     </w:p>
     <w:p>
       <w:pPr/>
       <w:r>
-        <w:t>31. Lớp InvoicePanel cập nhật lại tổng tiền sau giảm giá.</w:t>
+        <w:t>31. Phương thức btnThanhToanClick() gọi phương thức confirmPayment(room_receipt_ID: int, paymentMethod: String, voucherCode: String) của lớp BookingController.</w:t>
       </w:r>
     </w:p>
     <w:p>
       <w:pPr/>
       <w:r>
-        <w:t>32. Khách hàng đưa tiền mặt cho nhân viên.</w:t>
+        <w:t>32. Phương thức confirmPayment() gọi phương thức updateStatus("Đã thanh toán") của lớp Entity Room_receipt.</w:t>
       </w:r>
     </w:p>
     <w:p>
       <w:pPr/>
       <w:r>
-        <w:t>33. Nhân viên chọn phương thức thanh toán và click nút xác nhận thanh toán.</w:t>
+        <w:t>33. Phương thức confirmPayment() gọi phương thức updateStatus("Trống") của lớp Entity Room.</w:t>
       </w:r>
     </w:p>
     <w:p>
       <w:pPr/>
       <w:r>
-        <w:t>34. Phương thức btnThanhToanClick() của lớp InvoicePanel được gọi.</w:t>
+        <w:t>34. Phương thức confirmPayment() gọi phương thức addPoints(base_score) của lớp Entity Client.</w:t>
       </w:r>
     </w:p>
     <w:p>
       <w:pPr/>
       <w:r>
-        <w:t>35. Phương thức btnThanhToanClick() gọi phương thức confirmPayment(room_receipt_ID: int, paymentMethod: String, voucherCode: String) của lớp BookingController.</w:t>
+        <w:t>35. Các lớp Entity trả kết quả lưu trữ về cho phương thức confirmPayment().</w:t>
       </w:r>
     </w:p>
     <w:p>
       <w:pPr/>
       <w:r>
-        <w:t>36. Phương thức confirmPayment() gọi phương thức updateStatus("Đã thanh toán") của lớp Entity Room_receipt.</w:t>
+        <w:t>36. Phương thức confirmPayment() trả Room_receipt về cho phương thức btnThanhToanClick().</w:t>
       </w:r>
     </w:p>
     <w:p>
       <w:pPr/>
       <w:r>
-        <w:t>37. Phương thức confirmPayment() gọi phương thức updateStatus("Trống") của lớp Entity Room.</w:t>
+        <w:t>37. Lớp InvoicePanel hiển thị thông báo "Check-out thành công! Tổng tiền: [X]đ."</w:t>
       </w:r>
     </w:p>
     <w:p>
       <w:pPr/>
       <w:r>
-        <w:t>38. Phương thức confirmPayment() gọi phương thức addPoints(base_score) của lớp Entity Client.</w:t>
+        <w:t>38. Nhân viên click nút in hóa đơn (để đưa cho khách hàng) và ấn hoàn tất.</w:t>
       </w:r>
     </w:p>
     <w:p>
       <w:pPr/>
       <w:r>
-        <w:t>39. Các lớp Entity trả kết quả lưu trữ về cho phương thức confirmPayment().</w:t>
+        <w:t>39. Phương thức btnInHoaDonClick() của lớp InvoicePanel được gọi.</w:t>
       </w:r>
     </w:p>
     <w:p>
       <w:pPr/>
       <w:r>
-        <w:t>40. Phương thức confirmPayment() trả Room_receipt về cho phương thức btnThanhToanClick().</w:t>
+        <w:t>40. Phương thức btnInHoaDonClick() gọi phương thức showMessage() của lớp InvoicePanel.</w:t>
       </w:r>
     </w:p>
     <w:p>
       <w:pPr/>
       <w:r>
-        <w:t>41. Lớp InvoicePanel hiển thị thông báo "Check-out thành công! Tổng tiền: [X]đ."</w:t>
+        <w:t>41. Phương thức showMessage() gọi phương thức navigate() của lớp ReceptionistHomePage.</w:t>
       </w:r>
     </w:p>
     <w:p>
       <w:pPr/>
       <w:r>
-        <w:t>42. Nhân viên click nút in hóa đơn (để đưa cho khách hàng) và ấn hoàn tất.</w:t>
-      </w:r>
-    </w:p>
-    <w:p>
-      <w:pPr/>
-      <w:r>
-        <w:t>43. Phương thức btnInHoaDonClick() của lớp InvoicePanel được gọi.</w:t>
-      </w:r>
-    </w:p>
-    <w:p>
-      <w:pPr/>
-      <w:r>
-        <w:t>44. Phương thức btnInHoaDonClick() gọi phương thức showMessage() của lớp InvoicePanel.</w:t>
-      </w:r>
-    </w:p>
-    <w:p>
-      <w:pPr/>
-      <w:r>
-        <w:t>45. Phương thức showMessage() gọi phương thức navigate() của lớp ReceptionistHomePage.</w:t>
-      </w:r>
-    </w:p>
-    <w:p>
-      <w:pPr/>
-      <w:r>
-        <w:t>46. Hệ thống quay về giao diện chính ReceptionistHomePage.</w:t>
+        <w:t>42. Hệ thống quay về giao diện chính ReceptionistHomePage.</w:t>
       </w:r>
     </w:p>
     <w:p>
@@ -10626,7 +10768,7 @@
     </w:p>
     <w:p>
       <w:pPr>
-        <w:pStyle w:val="Heading2"/>
+        <w:pStyle w:val="Heading3"/>
       </w:pPr>
       <w:r>
         <w:t>4.4. Chức năng "Huỷ phòng"</w:t>
@@ -10634,7 +10776,7 @@
     </w:p>
     <w:p>
       <w:pPr>
-        <w:pStyle w:val="Heading3"/>
+        <w:pStyle w:val="Heading4"/>
       </w:pPr>
       <w:r>
         <w:t>a) Biểu đồ tuần tự</w:t>
@@ -10653,8 +10795,8 @@
       <w:r>
         <w:drawing>
           <wp:inline xmlns:a="http://schemas.openxmlformats.org/drawingml/2006/main" xmlns:pic="http://schemas.openxmlformats.org/drawingml/2006/picture">
-            <wp:extent cx="5486400" cy="6114928"/>
-            <wp:docPr id="15" name="Picture 15"/>
+            <wp:extent cx="5486400" cy="5989095"/>
+            <wp:docPr id="20" name="Picture 20"/>
             <wp:cNvGraphicFramePr>
               <a:graphicFrameLocks noChangeAspect="1"/>
             </wp:cNvGraphicFramePr>
@@ -10666,7 +10808,7 @@
                     <pic:cNvPicPr/>
                   </pic:nvPicPr>
                   <pic:blipFill>
-                    <a:blip r:embed="rId23"/>
+                    <a:blip r:embed="rId28"/>
                     <a:stretch>
                       <a:fillRect/>
                     </a:stretch>
@@ -10674,7 +10816,7 @@
                   <pic:spPr>
                     <a:xfrm>
                       <a:off x="0" y="0"/>
-                      <a:ext cx="5486400" cy="6114928"/>
+                      <a:ext cx="5486400" cy="5989095"/>
                     </a:xfrm>
                     <a:prstGeom prst="rect"/>
                   </pic:spPr>
@@ -10687,17 +10829,18 @@
     </w:p>
     <w:p>
       <w:pPr>
-        <w:pStyle w:val="Heading3"/>
+        <w:pStyle w:val="Heading4"/>
       </w:pPr>
       <w:r>
         <w:t>b) Kịch bản phiên bản 3</w:t>
       </w:r>
     </w:p>
     <w:p>
-      <w:pPr>
-        <w:pStyle w:val="Heading3"/>
-      </w:pPr>
-      <w:r>
+      <w:pPr/>
+      <w:r>
+        <w:rPr>
+          <w:b/>
+        </w:rPr>
         <w:t>Kịch bản phiên bản 3 - Huỷ phòng</w:t>
       </w:r>
     </w:p>
@@ -10728,49 +10871,49 @@
     <w:p>
       <w:pPr/>
       <w:r>
-        <w:t>5. Nhân viên hỏi khách hàng thông tin tra cứu (họ tên, số điện thoại hoặc mã phòng đã đặt).</w:t>
+        <w:t>5. Nhân viên nhập thông tin tìm kiếm (họ tên, số điện thoại hoặc mã phòng đã đặt) và ấn nút tìm kiếm.</w:t>
       </w:r>
     </w:p>
     <w:p>
       <w:pPr/>
       <w:r>
-        <w:t>6. Khách hàng trả lời.</w:t>
+        <w:t>6. Phương thức btnSearchClick() của lớp CancelBookingPage được gọi.</w:t>
       </w:r>
     </w:p>
     <w:p>
       <w:pPr/>
       <w:r>
-        <w:t>7. Nhân viên nhập thông tin tìm kiếm và ấn nút tìm kiếm.</w:t>
+        <w:t>7. Phương thức btnSearchClick() gọi phương thức searchBooking(keyword: String) của lớp BookingController.</w:t>
       </w:r>
     </w:p>
     <w:p>
       <w:pPr/>
       <w:r>
-        <w:t>8. Phương thức btnSearchClick() của lớp CancelBookingPage được gọi.</w:t>
+        <w:t>8. Phương thức searchBooking() gọi phương thức findByKeyword(keyword) của lớp Entity Room.</w:t>
       </w:r>
     </w:p>
     <w:p>
       <w:pPr/>
       <w:r>
-        <w:t>9. Phương thức btnSearchClick() gọi phương thức searchBooking(keyword: String) của lớp BookingController.</w:t>
+        <w:t>9. Lớp Room trả kết quả danh sách phòng về cho phương thức searchBooking().</w:t>
       </w:r>
     </w:p>
     <w:p>
       <w:pPr/>
       <w:r>
-        <w:t>10. Phương thức searchBooking() gọi phương thức findByKeyword(keyword) của lớp Entity Room.</w:t>
+        <w:t>10. Phương thức searchBooking() gọi phương thức findByKeyword(keyword) của lớp Entity Room_receipt.</w:t>
       </w:r>
     </w:p>
     <w:p>
       <w:pPr/>
       <w:r>
-        <w:t>11. Lớp Room trả kết quả danh sách booking về cho phương thức searchBooking().</w:t>
+        <w:t>11. Lớp Room_receipt trả kết quả danh sách hóa đơn về cho phương thức searchBooking().</w:t>
       </w:r>
     </w:p>
     <w:p>
       <w:pPr/>
       <w:r>
-        <w:t>12. Phương thức searchBooking() trả kết quả về cho phương thức btnSearchClick().</w:t>
+        <w:t>12. Phương thức searchBooking() tổng hợp và trả kết quả về cho phương thức btnSearchClick().</w:t>
       </w:r>
     </w:p>
     <w:p>
@@ -10842,43 +10985,49 @@
     <w:p>
       <w:pPr/>
       <w:r>
-        <w:t>24. Phương thức cancelBooking() cập nhật trạng thái booking sang "Đã hủy" trong CSDL.</w:t>
+        <w:t>24. Phương thức cancelBooking() gọi phương thức updateStatus("Đã hủy") của lớp Entity Room_receipt.</w:t>
       </w:r>
     </w:p>
     <w:p>
       <w:pPr/>
       <w:r>
-        <w:t>25. Phương thức cancelBooking() trả BookingResponse về cho phương thức btnCancelClick().</w:t>
+        <w:t>25. Lớp Room_receipt cập nhật trạng thái và trả kết quả về cho phương thức cancelBooking().</w:t>
       </w:r>
     </w:p>
     <w:p>
       <w:pPr/>
       <w:r>
-        <w:t>26. Lớp CancelBookingPage hiển thị thông báo "Hủy đặt phòng thành công."</w:t>
+        <w:t>26. Phương thức cancelBooking() trả BookingResponse về cho phương thức btnCancelClick().</w:t>
       </w:r>
     </w:p>
     <w:p>
       <w:pPr/>
       <w:r>
-        <w:t>27. Nhân viên ấn nút quay lại.</w:t>
+        <w:t>27. Lớp CancelBookingPage hiển thị thông báo "Hủy đặt phòng thành công."</w:t>
       </w:r>
     </w:p>
     <w:p>
       <w:pPr/>
       <w:r>
-        <w:t>28. Phương thức showMessage() của lớp CancelBookingPage được gọi.</w:t>
+        <w:t>28. Nhân viên ấn nút quay lại.</w:t>
       </w:r>
     </w:p>
     <w:p>
       <w:pPr/>
       <w:r>
-        <w:t>29. Phương thức showMessage() gọi phương thức navigate() của lớp ReceptionistHomePage.</w:t>
+        <w:t>29. Phương thức showMessage() của lớp CancelBookingPage được gọi.</w:t>
       </w:r>
     </w:p>
     <w:p>
       <w:pPr/>
       <w:r>
-        <w:t>30. Hệ thống quay về giao diện chính ReceptionistHomePage.</w:t>
+        <w:t>30. Phương thức showMessage() gọi phương thức navigate() của lớp ReceptionistHomePage.</w:t>
+      </w:r>
+    </w:p>
+    <w:p>
+      <w:pPr/>
+      <w:r>
+        <w:t>31. Hệ thống quay về giao diện chính ReceptionistHomePage.</w:t>
       </w:r>
     </w:p>
     <w:p>
@@ -10933,19 +11082,15 @@
     </w:p>
     <w:p>
       <w:pPr>
-        <w:pStyle w:val="Heading1"/>
+        <w:pStyle w:val="Heading2"/>
       </w:pPr>
       <w:r>
-        <w:rPr>
-          <w:color w:val="0000C8"/>
-          <w:u w:val="single" w:color="0000C8"/>
-        </w:rPr>
         <w:t>IV. PHA CÀI ĐẶT VÀ KIỂM THỬ</w:t>
       </w:r>
     </w:p>
     <w:p>
       <w:pPr>
-        <w:pStyle w:val="Heading2"/>
+        <w:pStyle w:val="Heading3"/>
       </w:pPr>
       <w:r>
         <w:t>1.1. Lập kế hoạch test</w:t>
@@ -12045,7 +12190,7 @@
     </w:p>
     <w:p>
       <w:pPr>
-        <w:pStyle w:val="Heading2"/>
+        <w:pStyle w:val="Heading3"/>
       </w:pPr>
       <w:r>
         <w:t>1.2. Các test case cho từng chức năng</w:t>
@@ -12059,7 +12204,7 @@
     </w:p>
     <w:p>
       <w:pPr>
-        <w:pStyle w:val="Heading3"/>
+        <w:pStyle w:val="Heading4"/>
       </w:pPr>
       <w:r>
         <w:t>TC01: Đặt phòng thành công</w:t>
@@ -14201,7 +14346,7 @@
     </w:p>
     <w:p>
       <w:pPr>
-        <w:pStyle w:val="Heading3"/>
+        <w:pStyle w:val="Heading4"/>
       </w:pPr>
       <w:r>
         <w:t>TC02: Không tìm thấy phòng trống theo thời gian yêu cầu</w:t>
@@ -14825,7 +14970,7 @@
     </w:p>
     <w:p>
       <w:pPr>
-        <w:pStyle w:val="Heading3"/>
+        <w:pStyle w:val="Heading4"/>
       </w:pPr>
       <w:r>
         <w:t>TC03: Khách hàng chưa có trong CSDL</w:t>
@@ -15508,7 +15653,7 @@
     </w:p>
     <w:p>
       <w:pPr>
-        <w:pStyle w:val="Heading3"/>
+        <w:pStyle w:val="Heading4"/>
       </w:pPr>
       <w:r>
         <w:t>TC04: Đặt phòng trực tuyến thành công</w:t>
@@ -16282,7 +16427,7 @@
     </w:p>
     <w:p>
       <w:pPr>
-        <w:pStyle w:val="Heading3"/>
+        <w:pStyle w:val="Heading4"/>
       </w:pPr>
       <w:r>
         <w:t>TC05: Check-in thành công</w:t>
@@ -17202,7 +17347,7 @@
     </w:p>
     <w:p>
       <w:pPr>
-        <w:pStyle w:val="Heading3"/>
+        <w:pStyle w:val="Heading4"/>
       </w:pPr>
       <w:r>
         <w:t>TC06: Phòng đang dọn dẹp, không thể check-in</w:t>
@@ -17692,7 +17837,7 @@
     </w:p>
     <w:p>
       <w:pPr>
-        <w:pStyle w:val="Heading3"/>
+        <w:pStyle w:val="Heading4"/>
       </w:pPr>
       <w:r>
         <w:t>TC07: Check-in phòng Super VIP</w:t>
@@ -18553,7 +18698,7 @@
     </w:p>
     <w:p>
       <w:pPr>
-        <w:pStyle w:val="Heading3"/>
+        <w:pStyle w:val="Heading4"/>
       </w:pPr>
       <w:r>
         <w:t>TC08: Check-out thành công, thanh toán tiền mặt</w:t>
@@ -20060,7 +20205,7 @@
     </w:p>
     <w:p>
       <w:pPr>
-        <w:pStyle w:val="Heading3"/>
+        <w:pStyle w:val="Heading4"/>
       </w:pPr>
       <w:r>
         <w:t>TC09: Check-out với voucher giảm giá</w:t>
@@ -21011,7 +21156,7 @@
     </w:p>
     <w:p>
       <w:pPr>
-        <w:pStyle w:val="Heading3"/>
+        <w:pStyle w:val="Heading4"/>
       </w:pPr>
       <w:r>
         <w:t>TC10: Check-out với hội viên Vàng</w:t>
@@ -21818,7 +21963,7 @@
     </w:p>
     <w:p>
       <w:pPr>
-        <w:pStyle w:val="Heading3"/>
+        <w:pStyle w:val="Heading4"/>
       </w:pPr>
       <w:r>
         <w:t>TC11: Voucher không hợp lệ</w:t>
@@ -22209,7 +22354,7 @@
     </w:p>
     <w:p>
       <w:pPr>
-        <w:pStyle w:val="Heading3"/>
+        <w:pStyle w:val="Heading4"/>
       </w:pPr>
       <w:r>
         <w:t>TC12: Check-out chuyển khoản</w:t>
@@ -22900,7 +23045,7 @@
     </w:p>
     <w:p>
       <w:pPr>
-        <w:pStyle w:val="Heading3"/>
+        <w:pStyle w:val="Heading4"/>
       </w:pPr>
       <w:r>
         <w:t>TC13: Hủy đặt phòng thành công</w:t>
@@ -23720,7 +23865,7 @@
     </w:p>
     <w:p>
       <w:pPr>
-        <w:pStyle w:val="Heading3"/>
+        <w:pStyle w:val="Heading4"/>
       </w:pPr>
       <w:r>
         <w:t>TC14: Không tìm thấy booking</w:t>
@@ -24008,7 +24153,7 @@
     </w:p>
     <w:p>
       <w:pPr>
-        <w:pStyle w:val="Heading3"/>
+        <w:pStyle w:val="Heading4"/>
       </w:pPr>
       <w:r>
         <w:t>TC15: Booking đã quá thời gian hủy</w:t>
@@ -24465,7 +24610,7 @@
     </w:p>
     <w:p>
       <w:pPr>
-        <w:pStyle w:val="Heading2"/>
+        <w:pStyle w:val="Heading3"/>
       </w:pPr>
       <w:r>
         <w:t>1.3. Tóm tắt kết quả test</w:t>

</xml_diff>

<commit_message>
fix: entity/MVC classes match Google Docs - Customer to Client, add Apply_promotion
- Fix Customer to Client in entity tables (Check-in, Check-out sections)
- Fix Vietnamese class names: Phong to Room, KhachHang to Client, HoaDon to Room_receipt
- Add Apply_promotion junction table (Room_receipt n-n Promotion) per Google Docs section 2.4
- Add Apply_promotion to entity class diagram and MVC entity package
- Update entity class diagram with Apply_promotion relationships
</commit_message>
<xml_diff>
--- a/output/booking_module.docx
+++ b/output/booking_module.docx
@@ -5987,7 +5987,7 @@
       <w:r>
         <w:drawing>
           <wp:inline xmlns:a="http://schemas.openxmlformats.org/drawingml/2006/main" xmlns:pic="http://schemas.openxmlformats.org/drawingml/2006/picture">
-            <wp:extent cx="5486400" cy="8460223"/>
+            <wp:extent cx="5486400" cy="10305207"/>
             <wp:docPr id="14" name="Picture 14"/>
             <wp:cNvGraphicFramePr>
               <a:graphicFrameLocks noChangeAspect="1"/>
@@ -6008,7 +6008,7 @@
                   <pic:spPr>
                     <a:xfrm>
                       <a:off x="0" y="0"/>
-                      <a:ext cx="5486400" cy="8460223"/>
+                      <a:ext cx="5486400" cy="10305207"/>
                     </a:xfrm>
                     <a:prstGeom prst="rect"/>
                   </pic:spPr>
@@ -7702,7 +7702,7 @@
           <w:rFonts w:ascii="Courier New" w:hAnsi="Courier New"/>
           <w:sz w:val="20"/>
         </w:rPr>
-        <w:t>searchFreeRoom(): List&lt;Phong&gt;</w:t>
+        <w:t>searchFreeRoom(): List&lt;Room&gt;</w:t>
       </w:r>
       <w:r>
         <w:t xml:space="preserve"> → chọn (trả về danh sách phòng)</w:t>
@@ -7777,7 +7777,7 @@
           <w:rFonts w:ascii="Courier New" w:hAnsi="Courier New"/>
           <w:sz w:val="20"/>
         </w:rPr>
-        <w:t>searchClient(): List&lt;KhachHang&gt;</w:t>
+        <w:t>searchClient(): List&lt;Client&gt;</w:t>
       </w:r>
       <w:r>
         <w:t xml:space="preserve"> → chọn</w:t>
@@ -7927,7 +7927,7 @@
           <w:rFonts w:ascii="Courier New" w:hAnsi="Courier New"/>
           <w:sz w:val="20"/>
         </w:rPr>
-        <w:t>updateRoomStatus(): Phong</w:t>
+        <w:t>updateRoomStatus(): Room</w:t>
       </w:r>
       <w:r>
         <w:t xml:space="preserve"> → chọn</w:t>
@@ -8574,7 +8574,7 @@
                 <w:b/>
                 <w:sz w:val="20"/>
               </w:rPr>
-              <w:t>Customer</w:t>
+              <w:t>Client</w:t>
             </w:r>
           </w:p>
         </w:tc>
@@ -8589,7 +8589,7 @@
               <w:rPr>
                 <w:sz w:val="20"/>
               </w:rPr>
-              <w:t>customerID, name, phone_number</w:t>
+              <w:t>clientID, name, phone_number, account_status, rankingID</w:t>
             </w:r>
           </w:p>
         </w:tc>
@@ -8604,7 +8604,7 @@
               <w:rPr>
                 <w:sz w:val="20"/>
               </w:rPr>
-              <w:t>—</w:t>
+              <w:t>ManyToOne→MemberRanking</w:t>
             </w:r>
           </w:p>
         </w:tc>
@@ -8866,7 +8866,7 @@
           <w:rFonts w:ascii="Courier New" w:hAnsi="Courier New"/>
           <w:sz w:val="20"/>
         </w:rPr>
-        <w:t>getActiveRooms(): List&lt;Phong&gt;</w:t>
+        <w:t>getActiveRooms(): List&lt;Room&gt;</w:t>
       </w:r>
       <w:r>
         <w:t xml:space="preserve"> → chọn</w:t>
@@ -8941,7 +8941,7 @@
           <w:rFonts w:ascii="Courier New" w:hAnsi="Courier New"/>
           <w:sz w:val="20"/>
         </w:rPr>
-        <w:t>calculateInvoice(): HoaDon</w:t>
+        <w:t>calculateInvoice(): Room_receipt</w:t>
       </w:r>
       <w:r>
         <w:t xml:space="preserve"> → chọn</w:t>
@@ -9016,7 +9016,7 @@
           <w:rFonts w:ascii="Courier New" w:hAnsi="Courier New"/>
           <w:sz w:val="20"/>
         </w:rPr>
-        <w:t>confirmPayment(): HoaDon</w:t>
+        <w:t>confirmPayment(): Room_receipt</w:t>
       </w:r>
       <w:r>
         <w:t xml:space="preserve"> → chọn</w:t>
@@ -9239,6 +9239,54 @@
           </w:p>
         </w:tc>
       </w:tr>
+      <w:tr>
+        <w:tc>
+          <w:tcPr>
+            <w:tcW w:type="dxa" w:w="2880"/>
+          </w:tcPr>
+          <w:p>
+            <w:pPr/>
+            <w:r/>
+            <w:r>
+              <w:rPr>
+                <w:b/>
+                <w:sz w:val="20"/>
+              </w:rPr>
+              <w:t>Apply_promotion</w:t>
+            </w:r>
+          </w:p>
+        </w:tc>
+        <w:tc>
+          <w:tcPr>
+            <w:tcW w:type="dxa" w:w="2880"/>
+          </w:tcPr>
+          <w:p>
+            <w:pPr/>
+            <w:r/>
+            <w:r>
+              <w:rPr>
+                <w:sz w:val="20"/>
+              </w:rPr>
+              <w:t>apply_promotion_ID, room_receipt_ID, promotionID, discount</w:t>
+            </w:r>
+          </w:p>
+        </w:tc>
+        <w:tc>
+          <w:tcPr>
+            <w:tcW w:type="dxa" w:w="2880"/>
+          </w:tcPr>
+          <w:p>
+            <w:pPr/>
+            <w:r/>
+            <w:r>
+              <w:rPr>
+                <w:sz w:val="20"/>
+              </w:rPr>
+              <w:t>ManyToOne→Room_receipt, ManyToOne→Promotion</w:t>
+            </w:r>
+          </w:p>
+        </w:tc>
+      </w:tr>
     </w:tbl>
     <w:p>
       <w:pPr>
@@ -9663,7 +9711,7 @@
                 <w:b/>
                 <w:sz w:val="20"/>
               </w:rPr>
-              <w:t>Customer</w:t>
+              <w:t>Client</w:t>
             </w:r>
           </w:p>
         </w:tc>
@@ -9678,7 +9726,7 @@
               <w:rPr>
                 <w:sz w:val="20"/>
               </w:rPr>
-              <w:t>customerID, name, phone_number</w:t>
+              <w:t>clientID, name, phone_number, account_status, rankingID</w:t>
             </w:r>
           </w:p>
         </w:tc>
@@ -9693,7 +9741,7 @@
               <w:rPr>
                 <w:sz w:val="20"/>
               </w:rPr>
-              <w:t>—</w:t>
+              <w:t>ManyToOne→MemberRanking</w:t>
             </w:r>
           </w:p>
         </w:tc>

</xml_diff>

<commit_message>
fix: strict 3-level heading hierarchy, all black text
- Remove H4: cap heading level at 3 (#### becomes H3)
- Remove blue underline from H1: all headings black text
- Fix IV phase header: H1 like other phases (not H2)
- Heading count: H1=4, H2=17, H3=66, H4=0
</commit_message>
<xml_diff>
--- a/output/booking_module.docx
+++ b/output/booking_module.docx
@@ -8,8 +8,7 @@
       </w:pPr>
       <w:r>
         <w:rPr>
-          <w:color w:val="0000C8"/>
-          <w:u w:val="single" w:color="0000C8"/>
+          <w:color w:val="000000"/>
         </w:rPr>
         <w:t>I. PHA XÁC ĐỊNH YÊU CẦU</w:t>
       </w:r>
@@ -19,6 +18,9 @@
         <w:pStyle w:val="Heading2"/>
       </w:pPr>
       <w:r>
+        <w:rPr>
+          <w:color w:val="000000"/>
+        </w:rPr>
         <w:t>Bảng thuật ngữ</w:t>
       </w:r>
     </w:p>
@@ -562,6 +564,9 @@
         <w:pStyle w:val="Heading2"/>
       </w:pPr>
       <w:r>
+        <w:rPr>
+          <w:color w:val="000000"/>
+        </w:rPr>
         <w:t>Mô hình nghiệp vụ bằng ngôn ngữ tự nhiên</w:t>
       </w:r>
     </w:p>
@@ -570,6 +575,9 @@
         <w:pStyle w:val="Heading3"/>
       </w:pPr>
       <w:r>
+        <w:rPr>
+          <w:color w:val="000000"/>
+        </w:rPr>
         <w:t>2.1. Mục tiêu mô-đun</w:t>
       </w:r>
     </w:p>
@@ -584,6 +592,9 @@
         <w:pStyle w:val="Heading3"/>
       </w:pPr>
       <w:r>
+        <w:rPr>
+          <w:color w:val="000000"/>
+        </w:rPr>
         <w:t>2.2. Phạm vi mô-đun</w:t>
       </w:r>
     </w:p>
@@ -598,6 +609,9 @@
         <w:pStyle w:val="Heading3"/>
       </w:pPr>
       <w:r>
+        <w:rPr>
+          <w:color w:val="000000"/>
+        </w:rPr>
         <w:t>2.3. Ai có thể sử dụng mô-đun?</w:t>
       </w:r>
     </w:p>
@@ -640,6 +654,9 @@
         <w:pStyle w:val="Heading3"/>
       </w:pPr>
       <w:r>
+        <w:rPr>
+          <w:color w:val="000000"/>
+        </w:rPr>
         <w:t>2.4. Người dùng có những chức năng gì?</w:t>
       </w:r>
     </w:p>
@@ -754,6 +771,9 @@
         <w:pStyle w:val="Heading3"/>
       </w:pPr>
       <w:r>
+        <w:rPr>
+          <w:color w:val="000000"/>
+        </w:rPr>
         <w:t>2.5. Mỗi chức năng hoạt động như thế nào?</w:t>
       </w:r>
     </w:p>
@@ -834,6 +854,9 @@
         <w:pStyle w:val="Heading3"/>
       </w:pPr>
       <w:r>
+        <w:rPr>
+          <w:color w:val="000000"/>
+        </w:rPr>
         <w:t>2.6. Những thông tin/ đối tượng mà mô-đun cần xử lý</w:t>
       </w:r>
     </w:p>
@@ -946,6 +969,9 @@
         <w:pStyle w:val="Heading3"/>
       </w:pPr>
       <w:r>
+        <w:rPr>
+          <w:color w:val="000000"/>
+        </w:rPr>
         <w:t>2.7. Quan hệ giữa các đối tượng</w:t>
       </w:r>
     </w:p>
@@ -1000,6 +1026,9 @@
         <w:pStyle w:val="Heading2"/>
       </w:pPr>
       <w:r>
+        <w:rPr>
+          <w:color w:val="000000"/>
+        </w:rPr>
         <w:t>Mô hình nghiệp vụ bằng UML</w:t>
       </w:r>
     </w:p>
@@ -1008,6 +1037,9 @@
         <w:pStyle w:val="Heading3"/>
       </w:pPr>
       <w:r>
+        <w:rPr>
+          <w:color w:val="000000"/>
+        </w:rPr>
         <w:t>3.1. Danh sách Actor</w:t>
       </w:r>
     </w:p>
@@ -1175,6 +1207,9 @@
         <w:pStyle w:val="Heading3"/>
       </w:pPr>
       <w:r>
+        <w:rPr>
+          <w:color w:val="000000"/>
+        </w:rPr>
         <w:t>3.2. Các Use Case cho từng Actor</w:t>
       </w:r>
     </w:p>
@@ -1399,6 +1434,9 @@
         <w:pStyle w:val="Heading3"/>
       </w:pPr>
       <w:r>
+        <w:rPr>
+          <w:color w:val="000000"/>
+        </w:rPr>
         <w:t>3.3. Biểu đồ Use Case tổng quan của mô-đun</w:t>
       </w:r>
     </w:p>
@@ -1407,6 +1445,9 @@
         <w:pStyle w:val="Heading3"/>
       </w:pPr>
       <w:r>
+        <w:rPr>
+          <w:color w:val="000000"/>
+        </w:rPr>
         <w:t>3.4. Biểu đồ Use Case phân rã của mô-đun</w:t>
       </w:r>
     </w:p>
@@ -1416,6 +1457,9 @@
         <w:pStyle w:val="Heading2"/>
       </w:pPr>
       <w:r>
+        <w:rPr>
+          <w:color w:val="000000"/>
+        </w:rPr>
         <w:t>Biểu đồ Use Case tổng quan</w:t>
       </w:r>
     </w:p>
@@ -1463,6 +1507,9 @@
         <w:pStyle w:val="Heading2"/>
       </w:pPr>
       <w:r>
+        <w:rPr>
+          <w:color w:val="000000"/>
+        </w:rPr>
         <w:t>Biểu đồ Use Case phân rã</w:t>
       </w:r>
     </w:p>
@@ -1471,6 +1518,9 @@
         <w:pStyle w:val="Heading3"/>
       </w:pPr>
       <w:r>
+        <w:rPr>
+          <w:color w:val="000000"/>
+        </w:rPr>
         <w:t>a) Use Case "Đặt phòng"</w:t>
       </w:r>
     </w:p>
@@ -1518,6 +1568,9 @@
         <w:pStyle w:val="Heading3"/>
       </w:pPr>
       <w:r>
+        <w:rPr>
+          <w:color w:val="000000"/>
+        </w:rPr>
         <w:t>b) Use Case "Huỷ phòng"</w:t>
       </w:r>
     </w:p>
@@ -1565,6 +1618,9 @@
         <w:pStyle w:val="Heading3"/>
       </w:pPr>
       <w:r>
+        <w:rPr>
+          <w:color w:val="000000"/>
+        </w:rPr>
         <w:t>c) Use Case "Check-in"</w:t>
       </w:r>
     </w:p>
@@ -1612,6 +1668,9 @@
         <w:pStyle w:val="Heading3"/>
       </w:pPr>
       <w:r>
+        <w:rPr>
+          <w:color w:val="000000"/>
+        </w:rPr>
         <w:t>d) Use Case "Check-out"</w:t>
       </w:r>
     </w:p>
@@ -1661,8 +1720,7 @@
       </w:pPr>
       <w:r>
         <w:rPr>
-          <w:color w:val="0000C8"/>
-          <w:u w:val="single" w:color="0000C8"/>
+          <w:color w:val="000000"/>
         </w:rPr>
         <w:t>II. PHA PHÂN TÍCH</w:t>
       </w:r>
@@ -1672,6 +1730,9 @@
         <w:pStyle w:val="Heading2"/>
       </w:pPr>
       <w:r>
+        <w:rPr>
+          <w:color w:val="000000"/>
+        </w:rPr>
         <w:t>1.1. Kịch bản "Đặt phòng tại chi nhánh"</w:t>
       </w:r>
     </w:p>
@@ -2060,6 +2121,9 @@
         <w:pStyle w:val="Heading2"/>
       </w:pPr>
       <w:r>
+        <w:rPr>
+          <w:color w:val="000000"/>
+        </w:rPr>
         <w:t>1.2. Kịch bản "Check-in"</w:t>
       </w:r>
     </w:p>
@@ -2420,6 +2484,9 @@
         <w:pStyle w:val="Heading2"/>
       </w:pPr>
       <w:r>
+        <w:rPr>
+          <w:color w:val="000000"/>
+        </w:rPr>
         <w:t>1.3. Kịch bản "Check-out"</w:t>
       </w:r>
     </w:p>
@@ -2834,6 +2901,9 @@
         <w:pStyle w:val="Heading2"/>
       </w:pPr>
       <w:r>
+        <w:rPr>
+          <w:color w:val="000000"/>
+        </w:rPr>
         <w:t>1.4. Kịch bản "Huỷ phòng"</w:t>
       </w:r>
     </w:p>
@@ -3222,6 +3292,9 @@
         <w:pStyle w:val="Heading2"/>
       </w:pPr>
       <w:r>
+        <w:rPr>
+          <w:color w:val="000000"/>
+        </w:rPr>
         <w:t>2.5. Biểu đồ phân tích chức năng</w:t>
       </w:r>
     </w:p>
@@ -3230,6 +3303,9 @@
         <w:pStyle w:val="Heading3"/>
       </w:pPr>
       <w:r>
+        <w:rPr>
+          <w:color w:val="000000"/>
+        </w:rPr>
         <w:t>a) Chức năng "Đặt phòng"</w:t>
       </w:r>
     </w:p>
@@ -3451,6 +3527,9 @@
         <w:pStyle w:val="Heading3"/>
       </w:pPr>
       <w:r>
+        <w:rPr>
+          <w:color w:val="000000"/>
+        </w:rPr>
         <w:t>b) Chức năng "Huỷ phòng"</w:t>
       </w:r>
     </w:p>
@@ -3617,6 +3696,9 @@
         <w:pStyle w:val="Heading3"/>
       </w:pPr>
       <w:r>
+        <w:rPr>
+          <w:color w:val="000000"/>
+        </w:rPr>
         <w:t>c) Chức năng "Check-in"</w:t>
       </w:r>
     </w:p>
@@ -3783,6 +3865,9 @@
         <w:pStyle w:val="Heading3"/>
       </w:pPr>
       <w:r>
+        <w:rPr>
+          <w:color w:val="000000"/>
+        </w:rPr>
         <w:t>d) Chức năng "Check-out"</w:t>
       </w:r>
     </w:p>
@@ -4039,6 +4124,9 @@
         <w:pStyle w:val="Heading2"/>
       </w:pPr>
       <w:r>
+        <w:rPr>
+          <w:color w:val="000000"/>
+        </w:rPr>
         <w:t>4. Mô hình hóa động</w:t>
       </w:r>
     </w:p>
@@ -4047,14 +4135,20 @@
         <w:pStyle w:val="Heading3"/>
       </w:pPr>
       <w:r>
+        <w:rPr>
+          <w:color w:val="000000"/>
+        </w:rPr>
         <w:t>4.1. Biểu đồ tuần tự phân tích</w:t>
       </w:r>
     </w:p>
     <w:p>
       <w:pPr>
-        <w:pStyle w:val="Heading4"/>
+        <w:pStyle w:val="Heading3"/>
       </w:pPr>
       <w:r>
+        <w:rPr>
+          <w:color w:val="000000"/>
+        </w:rPr>
         <w:t>a) Chức năng "Đặt phòng"</w:t>
       </w:r>
     </w:p>
@@ -4355,9 +4449,12 @@
     </w:p>
     <w:p>
       <w:pPr>
-        <w:pStyle w:val="Heading4"/>
+        <w:pStyle w:val="Heading3"/>
       </w:pPr>
       <w:r>
+        <w:rPr>
+          <w:color w:val="000000"/>
+        </w:rPr>
         <w:t>b) Chức năng "Huỷ phòng"</w:t>
       </w:r>
     </w:p>
@@ -4576,9 +4673,12 @@
     </w:p>
     <w:p>
       <w:pPr>
-        <w:pStyle w:val="Heading4"/>
+        <w:pStyle w:val="Heading3"/>
       </w:pPr>
       <w:r>
+        <w:rPr>
+          <w:color w:val="000000"/>
+        </w:rPr>
         <w:t>c) Chức năng "Check-in"</w:t>
       </w:r>
     </w:p>
@@ -4767,9 +4867,12 @@
     </w:p>
     <w:p>
       <w:pPr>
-        <w:pStyle w:val="Heading4"/>
+        <w:pStyle w:val="Heading3"/>
       </w:pPr>
       <w:r>
+        <w:rPr>
+          <w:color w:val="000000"/>
+        </w:rPr>
         <w:t>d) Chức năng "Check-out"</w:t>
       </w:r>
     </w:p>
@@ -5021,8 +5124,7 @@
       </w:pPr>
       <w:r>
         <w:rPr>
-          <w:color w:val="0000C8"/>
-          <w:u w:val="single" w:color="0000C8"/>
+          <w:color w:val="000000"/>
         </w:rPr>
         <w:t>III. PHA THIẾT KẾ</w:t>
       </w:r>
@@ -5032,6 +5134,9 @@
         <w:pStyle w:val="Heading2"/>
       </w:pPr>
       <w:r>
+        <w:rPr>
+          <w:color w:val="000000"/>
+        </w:rPr>
         <w:t>Thiết kế lớp thực thể</w:t>
       </w:r>
     </w:p>
@@ -5040,11 +5145,15 @@
         <w:pStyle w:val="Heading3"/>
       </w:pPr>
       <w:r>
+        <w:rPr>
+          <w:color w:val="000000"/>
+        </w:rPr>
         <w:t xml:space="preserve">Bước 1 – Bổ sung thuộc tính </w:t>
       </w:r>
       <w:r>
         <w:rPr>
           <w:rFonts w:ascii="Courier New" w:hAnsi="Courier New"/>
+          <w:color w:val="000000"/>
         </w:rPr>
         <w:t>id</w:t>
       </w:r>
@@ -5190,6 +5299,9 @@
         <w:pStyle w:val="Heading3"/>
       </w:pPr>
       <w:r>
+        <w:rPr>
+          <w:color w:val="000000"/>
+        </w:rPr>
         <w:t>Bước 2 – Thêm kiểu dữ liệu</w:t>
       </w:r>
     </w:p>
@@ -5734,6 +5846,9 @@
         <w:pStyle w:val="Heading3"/>
       </w:pPr>
       <w:r>
+        <w:rPr>
+          <w:color w:val="000000"/>
+        </w:rPr>
         <w:t>Bước 3 – Chuyển quan hệ association thành aggregation/composition</w:t>
       </w:r>
     </w:p>
@@ -5868,6 +5983,9 @@
         <w:pStyle w:val="Heading3"/>
       </w:pPr>
       <w:r>
+        <w:rPr>
+          <w:color w:val="000000"/>
+        </w:rPr>
         <w:t>Bước 4 – Bổ sung thuộc tính kiểu đối tượng</w:t>
       </w:r>
     </w:p>
@@ -5971,6 +6089,9 @@
         <w:pStyle w:val="Heading3"/>
       </w:pPr>
       <w:r>
+        <w:rPr>
+          <w:color w:val="000000"/>
+        </w:rPr>
         <w:t>Biểu đồ lớp thực thể</w:t>
       </w:r>
     </w:p>
@@ -6025,6 +6146,9 @@
         <w:pStyle w:val="Heading2"/>
       </w:pPr>
       <w:r>
+        <w:rPr>
+          <w:color w:val="000000"/>
+        </w:rPr>
         <w:t>Thiết kế CSDL</w:t>
       </w:r>
     </w:p>
@@ -6033,6 +6157,9 @@
         <w:pStyle w:val="Heading3"/>
       </w:pPr>
       <w:r>
+        <w:rPr>
+          <w:color w:val="000000"/>
+        </w:rPr>
         <w:t>Bước 1 – Tạo bảng cho mỗi lớp thực thể</w:t>
       </w:r>
     </w:p>
@@ -6344,6 +6471,9 @@
         <w:pStyle w:val="Heading3"/>
       </w:pPr>
       <w:r>
+        <w:rPr>
+          <w:color w:val="000000"/>
+        </w:rPr>
         <w:t>Bước 2 – Chuyển kiểu dữ liệu</w:t>
       </w:r>
     </w:p>
@@ -6527,6 +6657,9 @@
         <w:pStyle w:val="Heading3"/>
       </w:pPr>
       <w:r>
+        <w:rPr>
+          <w:color w:val="000000"/>
+        </w:rPr>
         <w:t>Bước 3 – Xử lý quan hệ cardinality</w:t>
       </w:r>
     </w:p>
@@ -6655,6 +6788,9 @@
         <w:pStyle w:val="Heading3"/>
       </w:pPr>
       <w:r>
+        <w:rPr>
+          <w:color w:val="000000"/>
+        </w:rPr>
         <w:t>Bước 4 – Bổ sung PK/FK</w:t>
       </w:r>
     </w:p>
@@ -6703,6 +6839,9 @@
         <w:pStyle w:val="Heading3"/>
       </w:pPr>
       <w:r>
+        <w:rPr>
+          <w:color w:val="000000"/>
+        </w:rPr>
         <w:t>Bước 5 – Loại bỏ thuộc tính dư thừa</w:t>
       </w:r>
     </w:p>
@@ -6727,6 +6866,9 @@
         <w:pStyle w:val="Heading3"/>
       </w:pPr>
       <w:r>
+        <w:rPr>
+          <w:color w:val="000000"/>
+        </w:rPr>
         <w:t>Biểu đồ ERD</w:t>
       </w:r>
     </w:p>
@@ -6781,6 +6923,9 @@
         <w:pStyle w:val="Heading2"/>
       </w:pPr>
       <w:r>
+        <w:rPr>
+          <w:color w:val="000000"/>
+        </w:rPr>
         <w:t>3.1. Thiết kế giao diện</w:t>
       </w:r>
     </w:p>
@@ -6789,6 +6934,9 @@
         <w:pStyle w:val="Heading3"/>
       </w:pPr>
       <w:r>
+        <w:rPr>
+          <w:color w:val="000000"/>
+        </w:rPr>
         <w:t>Màn hình 1: ReceptionistHomePage — Giao diện chính lễ tân</w:t>
       </w:r>
     </w:p>
@@ -6856,6 +7004,9 @@
         <w:pStyle w:val="Heading3"/>
       </w:pPr>
       <w:r>
+        <w:rPr>
+          <w:color w:val="000000"/>
+        </w:rPr>
         <w:t>Màn hình 2: SearchFreeRoomForm — Tìm phòng trống</w:t>
       </w:r>
     </w:p>
@@ -6923,6 +7074,9 @@
         <w:pStyle w:val="Heading3"/>
       </w:pPr>
       <w:r>
+        <w:rPr>
+          <w:color w:val="000000"/>
+        </w:rPr>
         <w:t>Màn hình 3: SearchClientForm — Tìm thông tin khách hàng</w:t>
       </w:r>
     </w:p>
@@ -6992,6 +7146,9 @@
         <w:pStyle w:val="Heading3"/>
       </w:pPr>
       <w:r>
+        <w:rPr>
+          <w:color w:val="000000"/>
+        </w:rPr>
         <w:t>Màn hình 4: ConfirmBookingModal — Xác nhận đặt phòng</w:t>
       </w:r>
     </w:p>
@@ -7053,6 +7210,9 @@
         <w:pStyle w:val="Heading3"/>
       </w:pPr>
       <w:r>
+        <w:rPr>
+          <w:color w:val="000000"/>
+        </w:rPr>
         <w:t>Màn hình 5: CheckOutPage — Thanh toán check-out</w:t>
       </w:r>
     </w:p>
@@ -7126,6 +7286,9 @@
         <w:pStyle w:val="Heading3"/>
       </w:pPr>
       <w:r>
+        <w:rPr>
+          <w:color w:val="000000"/>
+        </w:rPr>
         <w:t>Màn hình 6: CancelBookingPage — Quản lý đặt phòng (Huỷ)</w:t>
       </w:r>
     </w:p>
@@ -7199,6 +7362,9 @@
         <w:pStyle w:val="Heading3"/>
       </w:pPr>
       <w:r>
+        <w:rPr>
+          <w:color w:val="000000"/>
+        </w:rPr>
         <w:t>Màn hình 7: CheckInPage — Check-in phòng</w:t>
       </w:r>
     </w:p>
@@ -7269,6 +7435,9 @@
         <w:pStyle w:val="Heading2"/>
       </w:pPr>
       <w:r>
+        <w:rPr>
+          <w:color w:val="000000"/>
+        </w:rPr>
         <w:t>3.2. Thiết kế mô hình MVC</w:t>
       </w:r>
     </w:p>
@@ -7325,6 +7494,9 @@
         <w:pStyle w:val="Heading3"/>
       </w:pPr>
       <w:r>
+        <w:rPr>
+          <w:color w:val="000000"/>
+        </w:rPr>
         <w:t>a) Chức năng Đặt phòng</w:t>
       </w:r>
     </w:p>
@@ -8156,6 +8328,9 @@
         <w:pStyle w:val="Heading3"/>
       </w:pPr>
       <w:r>
+        <w:rPr>
+          <w:color w:val="000000"/>
+        </w:rPr>
         <w:t>b) Chức năng Check-in</w:t>
       </w:r>
     </w:p>
@@ -8615,6 +8790,9 @@
         <w:pStyle w:val="Heading3"/>
       </w:pPr>
       <w:r>
+        <w:rPr>
+          <w:color w:val="000000"/>
+        </w:rPr>
         <w:t>c) Chức năng Check-out</w:t>
       </w:r>
     </w:p>
@@ -9293,6 +9471,9 @@
         <w:pStyle w:val="Heading3"/>
       </w:pPr>
       <w:r>
+        <w:rPr>
+          <w:color w:val="000000"/>
+        </w:rPr>
         <w:t>d) Chức năng Huỷ phòng</w:t>
       </w:r>
     </w:p>
@@ -9752,6 +9933,9 @@
         <w:pStyle w:val="Heading3"/>
       </w:pPr>
       <w:r>
+        <w:rPr>
+          <w:color w:val="000000"/>
+        </w:rPr>
         <w:t>Sơ đồ lớp thiết kế</w:t>
       </w:r>
     </w:p>
@@ -9806,6 +9990,9 @@
         <w:pStyle w:val="Heading2"/>
       </w:pPr>
       <w:r>
+        <w:rPr>
+          <w:color w:val="000000"/>
+        </w:rPr>
         <w:t>4. Biểu đồ tuần tự thiết kế</w:t>
       </w:r>
     </w:p>
@@ -9814,14 +10001,20 @@
         <w:pStyle w:val="Heading3"/>
       </w:pPr>
       <w:r>
+        <w:rPr>
+          <w:color w:val="000000"/>
+        </w:rPr>
         <w:t>4.1. Chức năng "Đặt phòng"</w:t>
       </w:r>
     </w:p>
     <w:p>
       <w:pPr>
-        <w:pStyle w:val="Heading4"/>
+        <w:pStyle w:val="Heading3"/>
       </w:pPr>
       <w:r>
+        <w:rPr>
+          <w:color w:val="000000"/>
+        </w:rPr>
         <w:t>a) Biểu đồ tuần tự</w:t>
       </w:r>
     </w:p>
@@ -9872,9 +10065,12 @@
     </w:p>
     <w:p>
       <w:pPr>
-        <w:pStyle w:val="Heading4"/>
+        <w:pStyle w:val="Heading3"/>
       </w:pPr>
       <w:r>
+        <w:rPr>
+          <w:color w:val="000000"/>
+        </w:rPr>
         <w:t>b) Kịch bản phiên bản 3</w:t>
       </w:r>
     </w:p>
@@ -10169,14 +10365,20 @@
         <w:pStyle w:val="Heading3"/>
       </w:pPr>
       <w:r>
+        <w:rPr>
+          <w:color w:val="000000"/>
+        </w:rPr>
         <w:t>4.2. Chức năng "Check-in"</w:t>
       </w:r>
     </w:p>
     <w:p>
       <w:pPr>
-        <w:pStyle w:val="Heading4"/>
+        <w:pStyle w:val="Heading3"/>
       </w:pPr>
       <w:r>
+        <w:rPr>
+          <w:color w:val="000000"/>
+        </w:rPr>
         <w:t>a) Biểu đồ tuần tự</w:t>
       </w:r>
     </w:p>
@@ -10227,9 +10429,12 @@
     </w:p>
     <w:p>
       <w:pPr>
-        <w:pStyle w:val="Heading4"/>
+        <w:pStyle w:val="Heading3"/>
       </w:pPr>
       <w:r>
+        <w:rPr>
+          <w:color w:val="000000"/>
+        </w:rPr>
         <w:t>b) Kịch bản phiên bản 3</w:t>
       </w:r>
     </w:p>
@@ -10446,14 +10651,20 @@
         <w:pStyle w:val="Heading3"/>
       </w:pPr>
       <w:r>
+        <w:rPr>
+          <w:color w:val="000000"/>
+        </w:rPr>
         <w:t>4.3. Chức năng "Check-out"</w:t>
       </w:r>
     </w:p>
     <w:p>
       <w:pPr>
-        <w:pStyle w:val="Heading4"/>
+        <w:pStyle w:val="Heading3"/>
       </w:pPr>
       <w:r>
+        <w:rPr>
+          <w:color w:val="000000"/>
+        </w:rPr>
         <w:t>a) Biểu đồ tuần tự</w:t>
       </w:r>
     </w:p>
@@ -10504,9 +10715,12 @@
     </w:p>
     <w:p>
       <w:pPr>
-        <w:pStyle w:val="Heading4"/>
+        <w:pStyle w:val="Heading3"/>
       </w:pPr>
       <w:r>
+        <w:rPr>
+          <w:color w:val="000000"/>
+        </w:rPr>
         <w:t>b) Kịch bản phiên bản 3</w:t>
       </w:r>
     </w:p>
@@ -10819,14 +11033,20 @@
         <w:pStyle w:val="Heading3"/>
       </w:pPr>
       <w:r>
+        <w:rPr>
+          <w:color w:val="000000"/>
+        </w:rPr>
         <w:t>4.4. Chức năng "Huỷ phòng"</w:t>
       </w:r>
     </w:p>
     <w:p>
       <w:pPr>
-        <w:pStyle w:val="Heading4"/>
+        <w:pStyle w:val="Heading3"/>
       </w:pPr>
       <w:r>
+        <w:rPr>
+          <w:color w:val="000000"/>
+        </w:rPr>
         <w:t>a) Biểu đồ tuần tự</w:t>
       </w:r>
     </w:p>
@@ -10877,9 +11097,12 @@
     </w:p>
     <w:p>
       <w:pPr>
-        <w:pStyle w:val="Heading4"/>
+        <w:pStyle w:val="Heading3"/>
       </w:pPr>
       <w:r>
+        <w:rPr>
+          <w:color w:val="000000"/>
+        </w:rPr>
         <w:t>b) Kịch bản phiên bản 3</w:t>
       </w:r>
     </w:p>
@@ -11118,9 +11341,23 @@
     <w:p/>
     <w:p>
       <w:pPr>
+        <w:pStyle w:val="Heading1"/>
+      </w:pPr>
+      <w:r>
+        <w:rPr>
+          <w:color w:val="000000"/>
+        </w:rPr>
+        <w:t>IV. PHA CÀI ĐẶT VÀ KIỂM THỬ</w:t>
+      </w:r>
+    </w:p>
+    <w:p>
+      <w:pPr>
         <w:pStyle w:val="Heading2"/>
       </w:pPr>
       <w:r>
+        <w:rPr>
+          <w:color w:val="000000"/>
+        </w:rPr>
         <w:t>IV. PHA CÀI ĐẶT VÀ KIỂM THỬ</w:t>
       </w:r>
     </w:p>
@@ -11129,6 +11366,9 @@
         <w:pStyle w:val="Heading3"/>
       </w:pPr>
       <w:r>
+        <w:rPr>
+          <w:color w:val="000000"/>
+        </w:rPr>
         <w:t>1.1. Lập kế hoạch test</w:t>
       </w:r>
     </w:p>
@@ -11978,14 +12218,20 @@
         <w:pStyle w:val="Heading3"/>
       </w:pPr>
       <w:r>
+        <w:rPr>
+          <w:color w:val="000000"/>
+        </w:rPr>
         <w:t>1.2. Các test case cho từng chức năng</w:t>
       </w:r>
     </w:p>
     <w:p>
       <w:pPr>
-        <w:pStyle w:val="Heading4"/>
+        <w:pStyle w:val="Heading3"/>
       </w:pPr>
       <w:r>
+        <w:rPr>
+          <w:color w:val="000000"/>
+        </w:rPr>
         <w:t>a) Chức năng "Đặt phòng"</w:t>
       </w:r>
     </w:p>
@@ -16626,9 +16872,12 @@
     </w:p>
     <w:p>
       <w:pPr>
-        <w:pStyle w:val="Heading4"/>
+        <w:pStyle w:val="Heading3"/>
       </w:pPr>
       <w:r>
+        <w:rPr>
+          <w:color w:val="000000"/>
+        </w:rPr>
         <w:t>b) Chức năng "Check-in"</w:t>
       </w:r>
     </w:p>
@@ -19041,9 +19290,12 @@
     </w:p>
     <w:p>
       <w:pPr>
-        <w:pStyle w:val="Heading4"/>
+        <w:pStyle w:val="Heading3"/>
       </w:pPr>
       <w:r>
+        <w:rPr>
+          <w:color w:val="000000"/>
+        </w:rPr>
         <w:t>c) Chức năng "Check-out"</w:t>
       </w:r>
     </w:p>
@@ -24539,9 +24791,12 @@
     </w:p>
     <w:p>
       <w:pPr>
-        <w:pStyle w:val="Heading4"/>
+        <w:pStyle w:val="Heading3"/>
       </w:pPr>
       <w:r>
+        <w:rPr>
+          <w:color w:val="000000"/>
+        </w:rPr>
         <w:t>d) Chức năng "Huỷ phòng"</w:t>
       </w:r>
     </w:p>
@@ -26356,6 +26611,9 @@
         <w:pStyle w:val="Heading3"/>
       </w:pPr>
       <w:r>
+        <w:rPr>
+          <w:color w:val="000000"/>
+        </w:rPr>
         <w:t>1.3. Tóm tắt kết quả test</w:t>
       </w:r>
     </w:p>

</xml_diff>

<commit_message>
fix: bookingId to room_receipt_ID, BookingResponse to Room_receipt
- No separate Booking entity in Google Docs; booking = Room_receipt with status 'Chờ nhận'
- Fix all method signatures: checkIn(bookingId) -> checkIn(room_receipt_ID)
- Fix all return types: BookingResponse -> Room_receipt
- Fix sequence diagrams: all bookingId references -> room_receipt_ID
- BookingController name kept as business concept (handles booking operations)
</commit_message>
<xml_diff>
--- a/output/booking_module.docx
+++ b/output/booking_module.docx
@@ -8024,7 +8024,7 @@
           <w:rFonts w:ascii="Courier New" w:hAnsi="Courier New"/>
           <w:sz w:val="20"/>
         </w:rPr>
-        <w:t>createBooking(): BookingResponse</w:t>
+        <w:t>createBooking(): Room_receipt</w:t>
       </w:r>
       <w:r>
         <w:t xml:space="preserve"> → chọn (trả về thông tin booking)</w:t>
@@ -8534,7 +8534,7 @@
           <w:rFonts w:ascii="Courier New" w:hAnsi="Courier New"/>
           <w:sz w:val="20"/>
         </w:rPr>
-        <w:t>getPendingBookings(): List&lt;BookingResponse&gt;</w:t>
+        <w:t>getPendingBookings(): List&lt;Room_receipt&gt;</w:t>
       </w:r>
       <w:r>
         <w:t xml:space="preserve"> → chọn</w:t>
@@ -8586,7 +8586,7 @@
           <w:rFonts w:ascii="Courier New" w:hAnsi="Courier New"/>
           <w:sz w:val="20"/>
         </w:rPr>
-        <w:t>checkIn(bookingId: int)</w:t>
+        <w:t>checkIn(room_receipt_ID: int)</w:t>
       </w:r>
       <w:r>
         <w:t xml:space="preserve"> → chọn</w:t>
@@ -8609,7 +8609,7 @@
           <w:rFonts w:ascii="Courier New" w:hAnsi="Courier New"/>
           <w:sz w:val="20"/>
         </w:rPr>
-        <w:t>checkIn(): BookingResponse</w:t>
+        <w:t>checkIn(): Room_receipt</w:t>
       </w:r>
       <w:r>
         <w:t xml:space="preserve"> → chọn</w:t>
@@ -9096,7 +9096,7 @@
           <w:rFonts w:ascii="Courier New" w:hAnsi="Courier New"/>
           <w:sz w:val="20"/>
         </w:rPr>
-        <w:t>calculateInvoice(bookingId: int)</w:t>
+        <w:t>calculateInvoice(room_receipt_ID: int)</w:t>
       </w:r>
       <w:r>
         <w:t xml:space="preserve"> → chọn</w:t>
@@ -9677,7 +9677,7 @@
           <w:rFonts w:ascii="Courier New" w:hAnsi="Courier New"/>
           <w:sz w:val="20"/>
         </w:rPr>
-        <w:t>searchBooking(): List&lt;BookingResponse&gt;</w:t>
+        <w:t>searchBooking(): List&lt;Room_receipt&gt;</w:t>
       </w:r>
       <w:r>
         <w:t xml:space="preserve"> → chọn</w:t>
@@ -9729,7 +9729,7 @@
           <w:rFonts w:ascii="Courier New" w:hAnsi="Courier New"/>
           <w:sz w:val="20"/>
         </w:rPr>
-        <w:t>cancelBooking(bookingId: int)</w:t>
+        <w:t>cancelBooking(room_receipt_ID: int)</w:t>
       </w:r>
       <w:r>
         <w:t xml:space="preserve"> → chọn</w:t>
@@ -9752,7 +9752,7 @@
           <w:rFonts w:ascii="Courier New" w:hAnsi="Courier New"/>
           <w:sz w:val="20"/>
         </w:rPr>
-        <w:t>cancelBooking(): BookingResponse</w:t>
+        <w:t>cancelBooking(): Room_receipt</w:t>
       </w:r>
       <w:r>
         <w:t xml:space="preserve"> → chọn</w:t>
@@ -10284,7 +10284,7 @@
     <w:p>
       <w:pPr/>
       <w:r>
-        <w:t>34. Phương thức createBooking() lưu booking vào CSDL và trả BookingResponse về cho phương thức btnConfirmClick().</w:t>
+        <w:t>34. Phương thức createBooking() lưu booking vào CSDL và trả Room_receipt về cho phương thức btnConfirmClick().</w:t>
       </w:r>
     </w:p>
     <w:p>
@@ -10516,7 +10516,7 @@
     <w:p>
       <w:pPr/>
       <w:r>
-        <w:t>12. Phương thức tblPendingBookingsClick() gọi phương thức navigate(bookingId) của lớp ConfirmCheckInView.</w:t>
+        <w:t>12. Phương thức tblPendingBookingsClick() gọi phương thức navigate(room_receipt_ID) của lớp ConfirmCheckInView.</w:t>
       </w:r>
     </w:p>
     <w:p>
@@ -10540,7 +10540,7 @@
     <w:p>
       <w:pPr/>
       <w:r>
-        <w:t>16. Phương thức btnCheckInClick() gọi phương thức checkIn(bookingId: int) của lớp BookingController.</w:t>
+        <w:t>16. Phương thức btnCheckInClick() gọi phương thức checkIn(room_receipt_ID: int) của lớp BookingController.</w:t>
       </w:r>
     </w:p>
     <w:p>
@@ -10570,7 +10570,7 @@
     <w:p>
       <w:pPr/>
       <w:r>
-        <w:t>21. Phương thức checkIn() trả BookingResponse về cho phương thức btnCheckInClick().</w:t>
+        <w:t>21. Phương thức checkIn() trả Room_receipt về cho phương thức btnCheckInClick().</w:t>
       </w:r>
     </w:p>
     <w:p>
@@ -11238,7 +11238,7 @@
     <w:p>
       <w:pPr/>
       <w:r>
-        <w:t>21. Phương thức btnCancelClick() gọi phương thức cancelBooking(bookingId: int) của lớp BookingController.</w:t>
+        <w:t>21. Phương thức btnCancelClick() gọi phương thức cancelBooking(room_receipt_ID: int) của lớp BookingController.</w:t>
       </w:r>
     </w:p>
     <w:p>
@@ -11268,7 +11268,7 @@
     <w:p>
       <w:pPr/>
       <w:r>
-        <w:t>26. Phương thức cancelBooking() trả BookingResponse về cho phương thức btnCancelClick().</w:t>
+        <w:t>26. Phương thức cancelBooking() trả Room_receipt về cho phương thức btnCancelClick().</w:t>
       </w:r>
     </w:p>
     <w:p>

</xml_diff>